<commit_message>
Audit and finalize 15-slide presentation Bao_Cao_Giua_Ky_DT05_Final and Word presentation script
</commit_message>
<xml_diff>
--- a/Kich_Ban_Thuyet_Trinh_Va_Demo_DT005.docx
+++ b/Kich_Ban_Thuyet_Trinh_Va_Demo_DT005.docx
@@ -33,7 +33,7 @@
           <w:color w:val="0F172A"/>
           <w:sz w:val="26"/>
         </w:rPr>
-        <w:t>Đề tài DT005: Hệ thống kiểm tra toàn vẹn tệp bằng SHA-256, HMAC và cây Merkle phân cấp động</w:t>
+        <w:t>Đề tài DT005: Hệ thống kiểm tra toàn vẹn tệp bằng SHA-256, HMAC và cây Merkle phân cấp</w:t>
         <w:br/>
       </w:r>
       <w:r>
@@ -124,9 +124,9 @@
           <w:color w:val="334155"/>
           <w:sz w:val="21"/>
         </w:rPr>
-        <w:t>"Báo cáo tiến độ đồ án giữa kỳ đề tài DT005: Xây dựng hệ thống kiểm tra toàn vẹn tệp dựa trên SHA-256, HMAC và Cây Merkle phân cấp động; kết hợp thẩm định học thuật bài báo 'The adversary: the philosophy of cryptography' của Tiến sĩ Harry Halpin, xuất bản năm 2025 trên tạp chí Journal of Cybersecurity thuộc Đại học Oxford.</w:t>
+        <w:t>"Báo cáo tiến độ đồ án giữa kỳ đề tài DT005: Xây dựng hệ thống kiểm tra toàn vẹn tệp dựa trên SHA-256, HMAC và Cây Merkle phân cấp; kết hợp thẩm định học thuật bài báo 'The adversary: the philosophy of cryptography' của Tiến sĩ Harry Halpin, xuất bản năm 2025 trên tạp chí Journal of Cybersecurity thuộc Đại học Oxford.</w:t>
         <w:br/>
-        <w:t>Nội dung báo cáo gồm 3 trọng tâm: (1) Khảo cứu các luận điểm nhận thức luận và tiến trình hình thức hóa kẻ đối đầu trong mật mã học; (2) Phân định phương pháp luận giữa khảo sát triết học lý thuyết của tác giả và hệ thống thực nghiệm độc lập do nhóm tự phát triển; (3) Diễn tập thực tế mô hình đối kháng an ninh Red Team vs Blue Team trên tập dữ liệu thực tế 2.483 tệp tin."</w:t>
+        <w:t>Nội dung báo cáo gồm 3 trọng tâm: (1) Khảo cứu các luận điểm nhận thức luận và tiến trình hình thức hóa kẻ đối đầu trong mật mã học; (2) Phân định phương pháp luận giữa khảo sát triết học lý thuyết của tác giả và hệ thống thực nghiệm độc lập do nhóm tự phát triển; (3) Diễn tập thực tế mô hình đối kháng an ninh Red Team vs Blue Team trên tập dữ liệu thực tế."</w:t>
       </w:r>
     </w:p>
     <w:p>
@@ -140,7 +140,7 @@
           <w:color w:val="64748B"/>
           <w:sz w:val="19"/>
         </w:rPr>
-        <w:t>• Lưu ý trình bày: Điểm nhấn trình bày: Bố cục rõ ràng, nhận diện trang trọng, xác định chuẩn mục tiêu đồ án giữa kỳ.</w:t>
+        <w:t>• Lưu ý trình bày: Bố cục rõ ràng, nhận diện trang trọng, xác định chuẩn mục tiêu đồ án giữa kỳ.</w:t>
       </w:r>
     </w:p>
     <w:p>
@@ -202,7 +202,7 @@
           <w:color w:val="64748B"/>
           <w:sz w:val="19"/>
         </w:rPr>
-        <w:t>• Lưu ý trình bày: Điểm nhấn trình bày: Nêu bật nghịch lý triết học và 3 đóng góp lớn của Halpin.</w:t>
+        <w:t>• Lưu ý trình bày: Nêu bật nghịch lý triết học và 3 đóng góp lớn của Halpin.</w:t>
       </w:r>
     </w:p>
     <w:p>
@@ -246,13 +246,13 @@
           <w:color w:val="334155"/>
           <w:sz w:val="21"/>
         </w:rPr>
-        <w:t>"Nền tảng lý thuyết của Halpin dựa trên 2 trụ cột triết học nhận thức luận:</w:t>
+        <w:t>"Nền tảng lý thuyết của Halpin dựa trên các trụ cột triết học nhận thức luận và xã hội:</w:t>
         <w:br/>
-        <w:t>1. Bản thể học thông tin của Brian Cantwell Smith (1996): Thực tại khởi nguồn từ một dòng chảy siêu hình nguyên thủy không biên giới. Con người và hệ thống định hình thế giới bằng cách 'đăng ký đối tượng' (registration of objects). Trong mật mã học, các đối tượng như thông điệp, bản mã và khóa được đăng ký nhằm kiểm soát dòng thông tin giữa các tác nhân ở xa nhau (distal agents).</w:t>
+        <w:t>1. Bản thể học thông tin của Brian Cantwell Smith (1996): Thực tại khởi nguồn từ một dòng chảy siêu hình nguyên thủy không biên giới. Con người và hệ thống định hình thế giới bằng cách 'đăng ký đối tượng' (registration of objects). Trong mật mã học, các đối tượng như thông điệp M, bản mã C và khóa K được đăng ký nhằm kiểm soát dòng thông tin giữa các tác nhân ở xa (distal agents).</w:t>
         <w:br/>
-        <w:t>2. Thuyết thông tin khách quan của Fred Dretske (1981): Thông tin là một trạng thái khách quan gắn liền với quy luật tự nhiên, độc lập với người quan sát. Bản rõ chứa đựng thông tin về nguồn phát; hệ mật mã hoàn hảo đảm bảo bản mã không để rò rỉ bất kỳ thông tin nào về bản rõ nếu không có khóa.</w:t>
+        <w:t>2. Thuyết thông tin khách quan của Fred Dretske (1981): Thông tin là một trạng thái khách quan gắn liền với quy luật tự nhiên, độc lập với người quan sát.</w:t>
         <w:br/>
-        <w:t>Khác với nhiễu ngẫu nhiên trong vật lý, Kẻ đối đầu mật mã là một tác nhân có chủ đích (intentional agent), có ý chí và năng lực khai thác lỗ hổng cấu trúc hệ thống."</w:t>
+        <w:t>3. Phân biệt tri thức công khai (Public Knowledge) và tri thức chung (Common Knowledge) theo David Lewis (1969): Tri thức chung là trạng thái mọi tác nhân trong một quần thể đều biết thông tin và đều biết rằng những người khác cũng biết. Trong khi đó, Tri thức công khai là khái niệm yếu hơn, chỉ thông tin mà bất kỳ tác nhân nào cũng có khả năng tiếp cận (chẳng hạn qua rò rỉ dữ liệu). Bí mật (Secrets) không phải là bản rõ hay bản mã, mà được định nghĩa là 'Tri thức không phổ biến' (Uncommon Knowledge) — nó là một mối quan hệ xã hội giữa người giữ bí mật và đối thủ bên ngoài."</w:t>
       </w:r>
     </w:p>
     <w:p>
@@ -266,7 +266,7 @@
           <w:color w:val="64748B"/>
           <w:sz w:val="19"/>
         </w:rPr>
-        <w:t>• Lưu ý trình bày: Điểm nhấn trình bày: Phân tích sự chuyển dịch từ đối tượng vật lý sang bản thể thông tin mật mã.</w:t>
+        <w:t>• Lưu ý trình bày: Phân định chuẩn xác Public Knowledge vs Common Knowledge theo Halpin và David Lewis; không đồng nhất với bản mã hay bản rõ.</w:t>
       </w:r>
     </w:p>
     <w:p>
@@ -312,7 +312,7 @@
         </w:rPr>
         <w:t>"Sơ đồ 1 hệ thống hóa tiến trình 5 giai đoạn tiến hóa mô hình đối thủ trong hơn 70 năm qua:</w:t>
         <w:br/>
-        <w:t>• Giai đoạn 1 (1948–1949): Mô hình Shannon, định nghĩa Bí mật hoàn hảo (One-Time Pad) dựa trên lý thuyết xác suất và giả định sai lệch bắt nguồn từ nhiễu ngẫu nhiên.</w:t>
+        <w:t>• Giai đoạn 1 (1948–1949): Mô hình Claude Shannon. Định nghĩa Bí mật hoàn hảo (Perfect Secrecy: H(M|C) = H(M), dẫn đến H(K) &gt;= H(M) qua One-Time Pad). Shannon mô hình hóa hệ thống truyền thông bảo mật điểm-điểm, nhưng việc giản lược đối thủ thành một kẻ nghe lén trừu tượng trên đường truyền đã bỏ qua chi phí phân phối/quản lý khóa và các bề mặt tấn công vật lý thế giới thực.</w:t>
         <w:br/>
         <w:t>• Giai đoạn 2 (1976): Cách mạng khóa công khai của Diffie-Hellman và Merkle, giải quyết bài toán phân phối khóa bằng các bài toán độ phức tạp tính toán một chiều.</w:t>
         <w:br/>
@@ -334,7 +334,7 @@
           <w:color w:val="64748B"/>
           <w:sz w:val="19"/>
         </w:rPr>
-        <w:t>• Lưu ý trình bày: Điểm nhấn trình bày: Trình bày mạch lạc 5 mốc lịch sử từ Shannon đến Snowden.</w:t>
+        <w:t>• Lưu ý trình bày: Mô tả chính xác mô hình Shannon và giới hạn trừu tượng hóa, không diễn giải sai lệch về nhiễu ngẫu nhiên.</w:t>
       </w:r>
     </w:p>
     <w:p>
@@ -380,9 +380,9 @@
         </w:rPr>
         <w:t>"Sơ đồ 2 so sánh trực diện hai mô hình truyền thông:</w:t>
         <w:br/>
-        <w:t>• Panel trái: Mô hình điểm-điểm cổ điển của Shannon (1949). Alice gửi bản rõ M mã hóa bằng khóa K qua kênh truyền đến Bob. Đối thủ Eve chỉ là kẻ nghe lén thụ động (passive eavesdropper) trên đường truyền. Điểm mù của Shannon là giả định sai lệch do nhiễu ngẫu nhiên và bỏ qua chi phí lưu trữ, phân phối khóa cũng như rò rỉ vật lý.</w:t>
+        <w:t>• Panel trái: Hệ thống bảo mật điểm-điểm cổ điển của Shannon (1949). Alice gửi bản rõ M mã hóa bằng khóa K qua kênh truyền đến Bob. Đối thủ Eve được mô hình hóa như một kẻ nghe lén thụ động (passive eavesdropper) trên đường truyền. Giới hạn là sự cô lập toán học, bỏ qua chi phí phân phối khóa bí mật và không bao quát các bề mặt tấn công vật lý.</w:t>
         <w:br/>
-        <w:t>• Panel phải: Thực tế mạng xã hội - kỹ thuật phức hợp theo Halpin (2025). Hệ thống không còn là đường truyền đóng kín đơn thuần, mà thông tin luân chuyển giữa Nhóm giữ bí mật (Secret Keepers) và Hạ tầng mở/ISP/Đám mây. Đối thủ thể chế (NSA, Five Eyes) là tác nhân toàn cục cả thụ động lẫn chủ động, tấn công qua 4 con đường thực tế: (1) Kênh kề thời gian/điện năng; (2) Giám sát siêu dữ liệu luồng gói tin; (3) Cài cắm cửa sau chuỗi cung ứng phần cứng; (4) Lỗi phản bội nội bộ Byzantine. Mục tiêu phòng thủ hiện đại vì thế phải chuyển dịch sang bảo vệ siêu dữ liệu và kháng kênh kề."</w:t>
+        <w:t>• Panel phải: Thực tế mạng xã hội - kỹ thuật phức hợp theo Halpin (2025). Hệ thống thông tin luân chuyển giữa Nhóm giữ bí mật (Secret Keepers) và Hạ tầng mở / ISP / Đám mây. Đối thủ thể chế là tác nhân toàn cục cả thụ động lẫn chủ động, tấn công qua 4 con đường thực tế: (1) Kênh kề thời gian/điện năng; (2) Giám sát siêu dữ liệu luồng gói tin; (3) Cài cắm cửa sau chuỗi cung ứng phần cứng; (4) Lỗi phản bội nội bộ Byzantine. Mục tiêu phòng thủ hiện đại vì thế phải chuyển dịch sang bảo vệ siêu dữ liệu và kháng kênh kề."</w:t>
       </w:r>
     </w:p>
     <w:p>
@@ -396,7 +396,7 @@
           <w:color w:val="64748B"/>
           <w:sz w:val="19"/>
         </w:rPr>
-        <w:t>• Lưu ý trình bày: Điểm nhấn trình bày: Thuyết minh bám sát sơ đồ draw.io đã nhúng trên slide, phân tích rõ sự tương phản giữa 2 bên.</w:t>
+        <w:t>• Lưu ý trình bày: Thuyết minh bám sát sơ đồ draw.io đã nhúng trên slide, phân tích rõ sự tương phản giữa 2 bên.</w:t>
       </w:r>
     </w:p>
     <w:p>
@@ -460,7 +460,7 @@
           <w:color w:val="64748B"/>
           <w:sz w:val="19"/>
         </w:rPr>
-        <w:t>• Lưu ý trình bày: Điểm nhấn trình bày: Định nghĩa chính xác 3 mô hình hình thức toán học cốt lõi.</w:t>
+        <w:t>• Lưu ý trình bày: Định nghĩa chính xác 3 mô hình hình thức toán học cốt lõi.</w:t>
       </w:r>
     </w:p>
     <w:p>
@@ -504,13 +504,13 @@
           <w:color w:val="334155"/>
           <w:sz w:val="21"/>
         </w:rPr>
-        <w:t>"Section 5 nêu bật các giới hạn thực tế mà các mô hình toán học trừu tượng bỏ sót:</w:t>
+        <w:t>"Section 5 của Halpin nêu bật các giới hạn thực tế mà các mô hình toán học trừu tượng bỏ sót:</w:t>
         <w:br/>
         <w:t>• Tấn công kênh kề (Side-channel attacks): Paul Kocher (1996) chứng minh việc đo đạc thời gian thực thi, bức xạ điện từ và tiêu thụ điện năng có thể khôi phục khóa mã mà không cần bẻ gãy thuật toán toán học.</w:t>
         <w:br/>
-        <w:t>• Rò rỉ qua độ dài bản mã: Các giao thức như HTTPS, SSH vẫn làm lộ kích thước thông điệp và siêu dữ liệu luồng truyền thông, cho phép đối thủ suy đoán loại nội dung truyền tải.</w:t>
+        <w:t>• Rò rỉ qua độ dài bản mã và siêu dữ liệu: Các giao thức như HTTPS, SSH vẫn làm lộ kích thước thông điệp và siêu dữ liệu luồng truyền thông, cho phép đối thủ suy đoán nội dung truyền tải.</w:t>
         <w:br/>
-        <w:t>• Phê phán của Ross Anderson (2001): Đại đa số hệ thống an ninh thất bại trong thực tế không phải do thuật toán mật mã bị bẻ gãy, mà do lỗi quản lý khóa, lỗi giao diện người dùng, cấu hình sai và tấn công kỹ nghệ xã hội (Social Engineering)."</w:t>
+        <w:t>• Phê phán của Ross Anderson (2001): Đại đa số hệ thống an ninh thất bại trong thực tế không phải do thuật toán mật mã bị bẻ gãy, mà do lỗi quản lý khóa, lỗi giao thức, lỗi giao diện người dùng, cấu hình sai và tấn công kỹ nghệ xã hội (Social Engineering)."</w:t>
       </w:r>
     </w:p>
     <w:p>
@@ -524,7 +524,7 @@
           <w:color w:val="64748B"/>
           <w:sz w:val="19"/>
         </w:rPr>
-        <w:t>• Lưu ý trình bày: Điểm nhấn trình bày: Làm rõ khoảng cách giữa bài toán trên giấy và thực tế triển khai hệ thống.</w:t>
+        <w:t>• Lưu ý trình bày: Không gán Node-Leaf Confusion cho Halpin tại slide này. Tập trung vào Kocher, rò rỉ độ dài và Anderson.</w:t>
       </w:r>
     </w:p>
     <w:p>
@@ -588,7 +588,7 @@
           <w:color w:val="64748B"/>
           <w:sz w:val="19"/>
         </w:rPr>
-        <w:t>• Lưu ý trình bày: Điểm nhấn trình bày: Nhấn mạnh ý nghĩa lịch sử của sự kiện Snowden đối với nhận thức luận an ninh.</w:t>
+        <w:t>• Lưu ý trình bày: Nhấn mạnh ý nghĩa lịch sử của sự kiện Snowden đối với nhận thức luận an ninh.</w:t>
       </w:r>
     </w:p>
     <w:p>
@@ -654,7 +654,7 @@
           <w:color w:val="64748B"/>
           <w:sz w:val="19"/>
         </w:rPr>
-        <w:t>• Lưu ý trình bày: Điểm nhấn trình bày: Trình bày cô đọng 4 câu hỏi nghiên cứu lớn của tác giả.</w:t>
+        <w:t>• Lưu ý trình bày: Trình bày cô đọng 4 câu hỏi nghiên cứu lớn của tác giả.</w:t>
       </w:r>
     </w:p>
     <w:p>
@@ -704,7 +704,7 @@
         <w:br/>
         <w:t>• Nguyên tắc tái lập khoa học: Nhóm không ngụy tạo kết quả của tác giả. Thay vào đó, nhóm thực hiện tái lập theo phương pháp: Trích xuất các khái niệm lý thuyết cốt lõi của bài báo và tự thiết kế độc lập một hệ thống phần mềm thực nghiệm để kiểm chứng và minh họa các khái niệm đó.</w:t>
         <w:br/>
-        <w:t>• Bộ dữ liệu Kaggle Resume Dataset (2.483 tệp, 112 MB) và bộ công cụ đo đạc đối kháng là sản phẩm tự phát triển của sinh viên, đóng vai trò công cụ minh họa trực quan cho các lập luận của Halpin."</w:t>
+        <w:t>• Bộ dữ liệu và các kịch bản đối kháng là sản phẩm tự xây dựng của sinh viên (được kiểm toán chi tiết trong MIDTERM_CODE_AUDIT.md), đóng vai trò công cụ minh họa trực quan cho các lập luận của Halpin."</w:t>
       </w:r>
     </w:p>
     <w:p>
@@ -718,7 +718,7 @@
           <w:color w:val="64748B"/>
           <w:sz w:val="19"/>
         </w:rPr>
-        <w:t>• Lưu ý trình bày: Điểm nhấn trình bày: Khẳng định trung thực học thuật: Bài báo là lý thuyết, phần mềm là mô hình minh họa độc lập.</w:t>
+        <w:t>• Lưu ý trình bày: Khẳng định trung thực học thuật: Bài báo là lý thuyết, phần mềm là mô hình minh họa độc lập. Xác nhận MIDTERM_CODE_AUDIT.md tồn tại.</w:t>
       </w:r>
     </w:p>
     <w:p>
@@ -762,13 +762,13 @@
           <w:color w:val="334155"/>
           <w:sz w:val="21"/>
         </w:rPr>
-        <w:t>"Sơ đồ 4 đối chiếu minh bạch ba ví dụ chuyển đổi từ luận điểm bài báo sang mã nguồn thực nghiệm:</w:t>
+        <w:t>"Sơ đồ 4 đối chiếu minh bạch ba ví dụ chuyển đổi từ luận điểm bài báo sang mã nguồn thực nghiệm, phân định rõ luận điểm gốc và đóng góp của sinh viên:</w:t>
         <w:br/>
-        <w:t>• Ví dụ 1 (Nhiễu vs Kẻ thù chủ đích): Halpin chỉ rõ mã kiểm tra lỗi CRC32 chỉ chống được nhiễu ngẫu nhiên. Nhóm triển khai thuật toán giải hệ phương trình bù trên trường nhị phân GF(2), tìm 4 byte patch làm giả tệp tin mà CRC32 vẫn trùng khớp 100%. Ngược lại, hàm băm SHA-256 phát hiện thay đổi ngay lập tức. Giới hạn: Thí nghiệm chỉ minh họa tính phi tuyến của hàm băm, không đại diện cho an toàn toàn diện của toàn hệ thống.</w:t>
+        <w:t>• Ví dụ 1 (Nhiễu ngẫu nhiên vs Kẻ đối đầu có chủ đích): Halpin chỉ rõ mã kiểm tra tuyến tính chỉ được thiết kế để chống lại lỗi ngẫu nhiên. Nhóm sinh viên minh họa độc lập bằng kịch bản tấn công chủ đích: Giải hệ phương trình tuyến tính trên GF(2) để chèn 4 byte bù (patch), làm giả nội dung tệp mà giá trị CRC32 vẫn trùng khớp 100%. Ngược lại, hàm băm SHA-256 phát hiện thay đổi ngay lập tức nhờ tính phi tuyến. Giới hạn diễn giải: Không khẳng định CRC32 hoàn toàn bất lực trong mọi trường hợp (nó vẫn hiệu quả bắt lỗi ngẫu nhiên trong phần cứng/mạng); thí nghiệm chỉ mô tả đúng kịch bản can thiệp có chủ đích đã kiểm thử.</w:t>
         <w:br/>
-        <w:t>• Ví dụ 2 (Nhập nhằng nút lá trong cây Merkle): Phép ghép thô H(L || R) có nguy cơ làm lẫn lộn nút nhánh nội bộ với nút lá. Nhóm cài đặt chuẩn phân tách miền RFC 6962: Tiền tố 0x00 cho lá và 0x01 cho nhánh, triệt tiêu hoàn toàn nhập nhằng cấu trúc. Giới hạn: Chỉ giải quyết va chạm cấu trúc tầng cây, không loại trừ va chạm ngẫu nhiên 2^256 của SHA-256.</w:t>
+        <w:t>• Ví dụ 2 (Cây Merkle &amp; Phân tách miền): Halpin không đề xuất kỹ thuật này. Đây là phần minh họa độc lập do DT005 xây dựng, trích dẫn khuyến nghị từ IETF RFC 6962 (Certificate Transparency): Dùng tiền tố 0x00 cho nút lá và 0x01 cho nút nhánh nội bộ để triệt tiêu nguy cơ nhập nhằng nút lá (Node-leaf ambiguity). Giới hạn diễn giải: Kỹ thuật này giải quyết vấn đề cấu trúc cây, không triệt tiêu xác suất va chạm ngẫu nhiên của hàm băm nền tảng.</w:t>
         <w:br/>
-        <w:t>• Ví dụ 3 (Tấn công kênh kề thời gian): Dừng sớm khi so sánh chuỗi làm rò rỉ dữ liệu qua thời gian thực thi. Nhóm đo đạc so sánh tuần tự và chứng minh hàm hmac.compare_digest triệt tiêu độ lệch thời gian. Giới hạn: Phép đo trên Python có độ trễ hệ điều hành, chỉ minh họa ở mức thư viện phần mềm."</w:t>
+        <w:t>• Ví dụ 3 (Tấn công kênh kề thời gian): Halpin dẫn chứng Paul Kocher (1996) về việc thời gian xử lý làm rò rỉ khóa. Nhóm sinh viên minh họa độc lập bằng việc so sánh chuỗi tuần tự có cơ chế ngắt sớm (early return) làm rò rỉ tiền tố, và áp dụng `hmac.compare_digest` để đạt thời gian thực thi hằng số. Giới hạn diễn giải: Phép đo trên Python chịu ảnh hưởng độ trễ lập lịch của hệ điều hành, chỉ minh họa ở mức thư viện phần mềm."</w:t>
       </w:r>
     </w:p>
     <w:p>
@@ -782,7 +782,7 @@
           <w:color w:val="64748B"/>
           <w:sz w:val="19"/>
         </w:rPr>
-        <w:t>• Lưu ý trình bày: Điểm nhấn trình bày: Bám sát 3 cột trên slide: Luận điểm bài báo, Mã nguồn DT005, Giới hạn diễn giải.</w:t>
+        <w:t>• Lưu ý trình bày: Phân định rạch ròi giữa luận điểm Halpin và mã nguồn DT005; ghi rõ RFC 6962 là minh họa độc lập, không nói Halpin đề xuất; không khẳng định CRC32 bất lực trong mọi trường hợp.</w:t>
       </w:r>
     </w:p>
     <w:p>
@@ -803,7 +803,7 @@
           <w:color w:val="64748B"/>
           <w:sz w:val="20"/>
         </w:rPr>
-        <w:t>[0:15]</w:t>
+        <w:t>[0:20]</w:t>
       </w:r>
     </w:p>
     <w:p>
@@ -826,7 +826,9 @@
           <w:color w:val="334155"/>
           <w:sz w:val="21"/>
         </w:rPr>
-        <w:t>"Sau phần phân tích lý thuyết và đối chiếu phương pháp luận, nhóm chuyển sang phần Diễn tập An ninh Thực nghiệm trực tiếp: Mô hình đối kháng hai màn hình giữa Hệ thống phòng thủ Blue Team (Port 8080) và Động cơ tấn công đối kháng Red Team (Port 8081) trên tập dữ liệu thực tế 2.483 tệp tin."</w:t>
+        <w:t>"Sau phần phân tích lý thuyết và đối chiếu phương pháp luận, nhóm chuyển sang phần Diễn tập An ninh Thực nghiệm trực tiếp: Mô hình đối kháng hai màn hình giữa Hệ thống phòng thủ Blue Team (Port 8080) và Động cơ tấn công đối kháng Red Team (Port 8081).</w:t>
+        <w:br/>
+        <w:t>Trên slide hiển thị ảnh chụp màn hình thực tế từ phiên chạy thử nghiệm thành công: Blue Team Dashboard tại cổng 8080 bắt quả tang tệp Resume/Resume.csv bị can thiệp trái phép, kích hoạt trạng thái cảnh báo đỏ và truy vết đường dẫn sai lệch."</w:t>
       </w:r>
     </w:p>
     <w:p>
@@ -840,7 +842,7 @@
           <w:color w:val="64748B"/>
           <w:sz w:val="19"/>
         </w:rPr>
-        <w:t>• Lưu ý trình bày: Điểm nhấn trình bày: Chuyển tiếp dứt khoát, giới thiệu các cổng demo trực quan.</w:t>
+        <w:t>• Lưu ý trình bày: Ảnh chụp giao diện thật từ lần chạy thành công, không dùng ảnh giả lập hay mockup.</w:t>
       </w:r>
     </w:p>
     <w:p>
@@ -884,13 +886,15 @@
           <w:color w:val="334155"/>
           <w:sz w:val="21"/>
         </w:rPr>
-        <w:t>"Sơ đồ 5 mô tả kiến trúc tương tác thời gian thực giữa hai bên:</w:t>
+        <w:t>"Sơ đồ 5 mô tả kiến trúc diễn tập đối kháng (Demo Architecture):</w:t>
         <w:br/>
-        <w:t>• Blue Team (Port 8080 - Hệ thống phòng thủ &amp; giám sát): Nạp toàn bộ tập dữ liệu 2.483 tệp (112 MB) để thiết lập Mốc tin cậy ban đầu (Root Hash H_0 sạch). Khi phát hiện can thiệp, cơ chế Dirty Path O(log N) định vị chính xác vị trí tệp tin bị biến đổi trong ~1.06 ms (tốc độ quét đạt 2.325 tệp/giây).</w:t>
+        <w:t>• Bộ dữ liệu thực nghiệm: Đối chiếu số liệu kỹ thuật, báo cáo benchmark trong mã nguồn ghi nhận tập dữ liệu gồm 2.485 tệp tin với dung lượng khoảng 112.81 MiB (phiên bản nạp kiểm thử cục bộ hiện tại gồm 2.483 tệp).</w:t>
         <w:br/>
-        <w:t>• Red Team (Port 8081 - Động cơ tấn công đối kháng Adversary Engine): Mô phỏng các vector can thiệp thực tế: Sửa byte tệp ngẫu nhiên (In-place Tamper), bù 4 byte GF(2) qua mặt CRC32, đánh tráo Merkle Proof trên đường truyền Dolev-Yao, và chèn backdoor/xóa tệp.</w:t>
+        <w:t>• Blue Team (Port 8080 - Hệ thống phòng thủ &amp; giám sát): Nạp tập dữ liệu để thiết lập Mốc tin cậy ban đầu (Root Hash H_0). Khi hệ thống kiểm tra toàn vẹn, cơ chế duyệt cây phân cấp định vị chính xác vị trí tệp tin bị biến đổi với tốc độ quét thực tế vượt 2.000 tệp/giây.</w:t>
         <w:br/>
-        <w:t>• Cơ chế Rollback an toàn: Thư mục sao lưu .adversary_backups/ cho phép phục hồi nguyên trạng 100% dữ liệu gốc chỉ với 1 cú click chuột sau mỗi đợt diễn tập."</w:t>
+        <w:t>• Red Team (Port 8081 - Động cơ tấn công đối kháng): Mô phỏng các vector can thiệp thực tế: Sửa byte tệp ngẫu nhiên (In-place Tamper), bù 4 byte GF(2) qua mặt CRC32, đánh tráo Merkle Proof trên đường truyền Dolev-Yao, và chèn backdoor/xóa tệp.</w:t>
+        <w:br/>
+        <w:t>• Cơ chế Rollback an toàn: Thư mục sao lưu .adversary_backups/ cho phép phục hồi nguyên trạng dữ liệu gốc sau mỗi kịch bản diễn tập."</w:t>
       </w:r>
     </w:p>
     <w:p>
@@ -904,7 +908,7 @@
           <w:color w:val="64748B"/>
           <w:sz w:val="19"/>
         </w:rPr>
-        <w:t>• Lưu ý trình bày: Điểm nhấn trình bày: Thuyết minh theo sơ đồ draw.io kiến trúc Red vs Blue, nhấn mạnh cơ chế phát hiện và rollback an toàn.</w:t>
+        <w:t>• Lưu ý trình bày: Tiêu đề chuẩn Demo Architecture, số liệu đối chiếu chuẩn xác với benchmark_results.json, không đưa số liệu chưa xác minh.</w:t>
       </w:r>
     </w:p>
     <w:p>
@@ -952,9 +956,9 @@
         <w:br/>
         <w:t>1. Về mặt học thuật: Hoàn thành thẩm định khoa học bài báo của Halpin (2025), phân tích đúng đắn cơ sở triết học và các mô hình kẻ đối đầu qua các thời kỳ lịch sử.</w:t>
         <w:br/>
-        <w:t>2. Về mặt thực nghiệm: Xây dựng thành công bộ công cụ diễn tập đối kháng Red Team vs Blue Team minh họa sinh động 3 luận điểm kỹ thuật chính của bài báo.</w:t>
+        <w:t>2. Về mặt thực nghiệm: Xây dựng thành công bộ công cụ diễn tập đối kháng Red Team vs Blue Team minh họa trực quan các luận điểm an ninh chính của bài báo.</w:t>
         <w:br/>
-        <w:t>3. Đề xuất lộ trình nghiên cứu cuối kỳ: Nhóm tiếp tục hoàn thiện và tối ưu hóa giải pháp thuật toán Cây Merkle phân cấp động (HD-MerkleTree): Cơ chế cập nhật cục bộ Dirty-Path Cache đạt độ phức tạp O(log N) (~0.24 ms/tệp), chuẩn phân tách miền RFC 6962, tối ưu hóa kích thước bằng chứng CompactProof (256 bytes) và thực hiện kiểm thử độ bền (Ablation Study) toàn diện."</w:t>
+        <w:t>3. Về định hướng nghiên cứu cuối kỳ: Nhóm tiếp tục nghiên cứu cấu trúc dữ liệu xác thực phân cấp (authenticated data structures), cơ chế bộ đệm cập nhật cục bộ nhằm giảm chi phí tính toán lại, hoàn thiện chuẩn hóa phân tách miền và mở rộng kiểm định đối kháng trên các quy mô dữ liệu lớn hơn."</w:t>
       </w:r>
     </w:p>
     <w:p>
@@ -968,7 +972,7 @@
           <w:color w:val="64748B"/>
           <w:sz w:val="19"/>
         </w:rPr>
-        <w:t>• Lưu ý trình bày: Điểm nhấn trình bày: Tóm tắt 3 kết quả đạt được giữa kỳ và lộ trình kỹ thuật cuối kỳ rõ ràng.</w:t>
+        <w:t>• Lưu ý trình bày: Đã loại bỏ các tuyên bố chưa kiểm chứng như O(1), ~0.24 ms khỏi kết luận giữa kỳ; trình bày định hướng cuối kỳ mang tính học thuật khái quát.</w:t>
       </w:r>
     </w:p>
     <w:p>
@@ -1026,7 +1030,7 @@
           <w:color w:val="64748B"/>
           <w:sz w:val="19"/>
         </w:rPr>
-        <w:t>• Lưu ý trình bày: Điểm nhấn trình bày: Kết thúc tự tin, sẵn sàng chuyển sang phần Demo hoặc trả lời câu hỏi.</w:t>
+        <w:t>• Lưu ý trình bày: Kết thúc tự tin, sẵn sàng chuyển sang phần Demo hoặc trả lời câu hỏi.</w:t>
       </w:r>
     </w:p>
     <w:p>
@@ -1123,7 +1127,7 @@
           <w:color w:val="334155"/>
           <w:sz w:val="20"/>
         </w:rPr>
-        <w:t>Tại cổng 8080, chọn thư mục 'kaggle_dataset' (chứa 2.483 tệp tin, dung lượng 112.81 MB).</w:t>
+        <w:t>Tại cổng 8080, chọn thư mục 'kaggle_dataset' (chứa tập dữ liệu thực tế ~112.8 MB).</w:t>
         <w:br/>
         <w:t>Bấm nút 'Nạp &amp; Tính toán Toàn vẹn'. Hệ thống tính toán và hiển thị Root Hash ban đầu H_0 sạch với trạng thái xanh: '100% NGUYÊN VẸN'.</w:t>
       </w:r>
@@ -1189,9 +1193,9 @@
         <w:br/>
         <w:t>• Hệ thống đổi sang trạng thái cảnh báo đỏ: 'CẢNH BÁO: PHÁT HIỆN CAN THIỆP DỮ LIỆU!'.</w:t>
         <w:br/>
-        <w:t>• Cột Dirty Path O(log N) chỉ ra chính xác đường dẫn nhánh cây bị sai lệch chỉ trong ~1.06 ms.</w:t>
+        <w:t>• Hệ thống chỉ ra chính xác đường dẫn tệp tin và nhánh cây bị sai lệch (ví dụ: Resume/Resume.csv).</w:t>
         <w:br/>
-        <w:t>• Bảng đối chứng hiển thị: Thuật toán CRC32 bị qua mặt hoàn toàn (Báo khớp sai sự thật), trong khi SHA-256 và Merkle Tree phát hiện tức thì.</w:t>
+        <w:t>• Bảng đối chứng hiển thị: Trong kịch bản tấn công bù GF(2), CRC32 bị qua mặt (báo khớp sai), trong khi SHA-256 và Merkle Tree phát hiện tức thì.</w:t>
       </w:r>
     </w:p>
     <w:p>
@@ -1205,7 +1209,7 @@
           <w:color w:val="1E40AF"/>
           <w:sz w:val="21"/>
         </w:rPr>
-        <w:t xml:space="preserve">Bước 5: Hoàn nguyên dữ liệu sạch 100% (Rollback All): </w:t>
+        <w:t xml:space="preserve">Bước 5: Hoàn nguyên dữ liệu sạch (Rollback All): </w:t>
       </w:r>
     </w:p>
     <w:p>
@@ -1218,9 +1222,9 @@
           <w:color w:val="334155"/>
           <w:sz w:val="20"/>
         </w:rPr>
-        <w:t>Tại giao diện Red Team (Port 8081), bấm nút 'ROLLBACK ALL'. Toàn bộ các tệp tin bị tác động trên đĩa được khôi phục nguyên vẹn từ thư mục .adversary_backups/.</w:t>
+        <w:t>Tại giao diện Red Team (Port 8081), bấm nút 'ROLLBACK ALL'. Toàn bộ các tệp tin bị tác động trên đĩa được khôi phục nguyên vẹn từ thư mục sao lưu .adversary_backups/.</w:t>
         <w:br/>
-        <w:t>Tại Blue Team bấm kiểm tra lại: Hệ thống trở về trạng thái xanh an toàn 100%.</w:t>
+        <w:t>Tại Blue Team bấm kiểm tra lại: Hệ thống trở về trạng thái an toàn.</w:t>
       </w:r>
     </w:p>
     <w:p>
@@ -1245,18 +1249,18 @@
           <w:color w:val="334155"/>
           <w:sz w:val="20"/>
         </w:rPr>
-        <w:t>1. Chạy Suite 7 Kiểm định Toán học Tự động:</w:t>
+        <w:t>1. Chạy Suite Kiểm định Toán học Đối kháng:</w:t>
         <w:br/>
         <w:t xml:space="preserve">   Lệnh: python -m src.proposed_model.security_games</w:t>
         <w:br/>
-        <w:t xml:space="preserve">   Kết quả: Thực hiện toàn bộ 7 phép đo bám sát bài báo (tính phi tuyến, hiệu ứng tuyết lở SAC ~50%, bẻ gãy CRC32 trên GF(2), phân tách miền RFC 6962, và kênh kề thời gian so sánh chuỗi). Toàn bộ 7 kiểm định hoàn thành đạt chuẩn trong ~2.885 ms.</w:t>
+        <w:t xml:space="preserve">   Kết quả: Thực hiện các phép đo bám sát luận điểm bài báo (tính phi tuyến, hiệu ứng tuyết lở SAC ~50%, can thiệp CRC32 trên GF(2), phân tách miền RFC 6962, và kênh kề thời gian so sánh chuỗi).</w:t>
         <w:br/>
         <w:br/>
         <w:t>2. Diễn tập 2 Terminal Red Team vs Blue Team:</w:t>
         <w:br/>
         <w:t xml:space="preserve">   • Terminal 1 (Red Team): Chạy 'python src/adversary/red_team_cli.py'. Bấm phím '1' để can thiệp tệp, hoặc phím '4' để bù mã CRC32.</w:t>
         <w:br/>
-        <w:t xml:space="preserve">   • Terminal 2 (Blue Team): Chạy 'python -m src.baselines.sha256_manifest --dir kaggle_dataset --verify'. Blue Team phát hiện vi phạm ngay lập tức: MODIFIED_FILE: Resume/Resume.csv.</w:t>
+        <w:t xml:space="preserve">   • Terminal 2 (Blue Team): Chạy 'python -m src.baselines.sha256_manifest --dir kaggle_dataset --verify'. Blue Team phát hiện vi phạm: MODIFIED_FILE: Resume/Resume.csv.</w:t>
         <w:br/>
         <w:t xml:space="preserve">   • Terminal 1: Bấm phím '9' để Rollback All khôi phục đĩa cứng an toàn.</w:t>
       </w:r>
@@ -1309,7 +1313,7 @@
         <w:br/>
         <w:t>2. Lời kêu gọi về một 'Khoa học an ninh thực nghiệm': Halpin phê phán việc toán học hóa trừu tượng đã làm mật mã học xa rời thực tế vật lý. Tác giả kêu gọi xây dựng một nền an ninh thực nghiệm. Bài toán kiểm tra toàn vẹn tệp tin trên hệ thống đĩa cứng thực là bài toán kinh điển, cho phép đưa các khái niệm trừu tượng vào kiểm định vật lý.</w:t>
         <w:br/>
-        <w:t>3. Mô hình hóa trọn vẹn các đối thủ trong bài báo: Hệ thống toàn vẹn tệp tin cho phép mô hình hóa và kiểm chứng đầy đủ các dạng đối thủ được Halpin mổ xẻ: Từ kẻ nghe lén của Shannon, kẻ can thiệp mạng Dolev-Yao, kẻ khai thác kênh kề Kocher, đến các đòn tấn công can thiệp dữ liệu và chèn backdoor chuỗi cung ứng.</w:t>
+        <w:t>3. Minh họa các đối thủ trong bài báo: Hệ thống toàn vẹn tệp tin cho phép mô hình hóa và kiểm chứng trực quan các dạng đối thủ được Halpin mổ xẻ: Từ kẻ nghe lén của Shannon, kẻ can thiệp mạng Dolev-Yao, kẻ khai thác kênh kề Kocher, đến các đòn tấn công can thiệp dữ liệu và chèn backdoor chuỗi cung ứng.</w:t>
       </w:r>
     </w:p>
     <w:p>
@@ -1337,9 +1341,9 @@
         </w:rPr>
         <w:t>Luận điểm phản biện &amp; Căn cứ khoa học:</w:t>
         <w:br/>
-        <w:t>1. Bản chất bài khảo cứu: Bài báo của Halpin là một bài tổng quan triết học (philosophical survey) dài 17 trang, 134 trích dẫn là kho tàng tài liệu lịch sử trải dài từ năm 1883 đến 2024, bao gồm cả sách triết học siêu hình (Dretske, Cantwell Smith), tài liệu lưu trữ chính phủ về NSA, và các hệ thống chứng minh định lý tự động (như Isabelle chứng minh giao thức TLS của Paulson). Về mặt phương pháp luận nghiên cứu, không một công trình kỹ thuật nào có thể hay bắt buộc phải tái lập toàn bộ 134 tài liệu nền đó.</w:t>
+        <w:t>1. Bản chất bài khảo cứu: Bài báo của Halpin là một bài tổng quan triết học (philosophical survey) dài 17 trang, 134 trích dẫn là kho tàng tài liệu lịch sử trải dài từ năm 1883 đến 2024, bao gồm cả sách triết học siêu hình (Dretske, Cantwell Smith), tài liệu lưu trữ chính phủ về NSA, và các hệ thống chứng minh định lý tự động. Về mặt phương pháp luận nghiên cứu, không một công trình kỹ thuật nào có thể hay bắt buộc phải tái lập toàn bộ 134 tài liệu nền đó.</w:t>
         <w:br/>
-        <w:t>2. Phương pháp tinh lọc trọng tâm: Thẩm định một bài báo lý thuyết là tinh lọc các trụ cột kỹ thuật trực tiếp liên quan đến bài toán an ninh. Đề tài DT005 đã tinh lọc và hiện thực hóa thành công 8 tài liệu kỹ thuật cốt lõi: Ref [2, 3] của Shannon (Mã tuyến tính vs Hàm băm), Ref [21] của Biba (Toàn vẹn phân cấp), Ref [33, 34] của Goldwasser-Micali (Trò chơi an ninh PPT), Ref [36] của Kocher (Kênh kề thời gian), Ref [40] của Bellare-Rogaway (Random Oracle), Ref [52] của Dolev-Yao (Mạng thù địch), Ref [100, 101] về Snowden/NSA (Đối thủ thể chế), và Ref [109] của Ben Laurie (RFC 6962 Certificate Transparency).</w:t>
+        <w:t>2. Phương pháp tinh lọc trọng tâm: Thẩm định một bài báo lý thuyết là tinh lọc các trụ cột kỹ thuật trực tiếp liên quan đến bài toán an ninh. Đề tài DT005 đã tinh lọc và kết nối với các tài liệu kỹ thuật cốt lõi: Ref [2, 3] của Shannon (Mã tuyến tính vs Hàm băm), Ref [21] của Biba (Toàn vẹn phân cấp), Ref [33, 34] của Goldwasser-Micali (Trò chơi an ninh PPT), Ref [36] của Kocher (Kênh kề thời gian), Ref [40] của Bellare-Rogaway (Random Oracle), Ref [52] của Dolev-Yao (Mạng thù địch), Ref [100, 101] về Snowden/NSA (Đối thủ thể chế), và bổ sung tài liệu kỹ thuật chuẩn IETF RFC 6962 về phân tách miền cho Cây Merkle.</w:t>
       </w:r>
     </w:p>
     <w:p>
@@ -1352,7 +1356,7 @@
           <w:color w:val="0F172A"/>
           <w:sz w:val="22"/>
         </w:rPr>
-        <w:t>Câu hỏi 3: Tập dữ liệu kaggle_dataset (2.483 tệp tin, 112 MB) từ đâu ra? Có xuất hiện trong bài báo gốc không?</w:t>
+        <w:t>Câu hỏi 3: Tập dữ liệu kaggle_dataset từ đâu ra? Có xuất hiện trong bài báo gốc không?</w:t>
       </w:r>
     </w:p>
     <w:p>
@@ -1369,7 +1373,7 @@
         <w:br/>
         <w:t>1. Khẳng định minh bạch khoa học: Bài báo gốc của Harry Halpin hoàn toàn KHÔNG CÓ bất kỳ tập dữ liệu, bảng số liệu thực nghiệm hay mã nguồn nào. Bài báo là công trình khảo luận nhận thức luận trên tạp chí lý thuyết.</w:t>
         <w:br/>
-        <w:t>2. Mục đích đưa tập dữ liệu vào nghiên cứu: Tập dữ liệu Kaggle Resume Dataset (gồm 2.483 tệp tin PDF và CSV thuộc 24 ngành nghề) do nhóm sinh viên tự chọn và tiền xử lý. Lý do chọn tập dữ liệu này là để cung cấp một môi trường cây thư mục doanh nghiệp nhiều tầng thực tế, kích thước tệp biến thiên, phản ánh trung thực tải làm việc thực tế nhằm đo đạc năng lực định vị sai lệch O(log N) và khả năng chịu tải đối kháng, hoàn toàn không phải ngụy tạo số liệu của tác giả.</w:t>
+        <w:t>2. Mục đích đưa tập dữ liệu vào nghiên cứu: Tập dữ liệu Kaggle Resume Dataset (báo cáo benchmark ghi nhận 2.485 tệp tin, ~112.81 MiB) do nhóm sinh viên tự chọn và tiền xử lý. Lý do chọn tập dữ liệu này là để cung cấp một môi trường cây thư mục doanh nghiệp nhiều tầng thực tế, kích thước tệp biến thiên, phản ánh trung thực tải làm việc thực tế nhằm đo đạc năng lực định vị sai lệch và khả năng chịu tải đối kháng, hoàn toàn không phải ngụy tạo số liệu của tác giả.</w:t>
       </w:r>
     </w:p>
     <w:p>
@@ -1382,7 +1386,7 @@
           <w:color w:val="0F172A"/>
           <w:sz w:val="22"/>
         </w:rPr>
-        <w:t>Câu hỏi 4: Tại sao mã kiểm tra lỗi tuyến tính CRC32 bị bẻ gãy 100% trên trường nhị phân GF(2), trong khi SHA-256 lại phát hiện được gian lận?</w:t>
+        <w:t>Câu hỏi 4: Tại sao mã kiểm tra lỗi CRC32 bị qua mặt trong kịch bản giải hệ trên GF(2), trong khi SHA-256 lại phát hiện được gian lận?</w:t>
       </w:r>
     </w:p>
     <w:p>
@@ -1397,9 +1401,9 @@
         </w:rPr>
         <w:t>Luận điểm phản biện &amp; Căn cứ khoa học:</w:t>
         <w:br/>
-        <w:t>1. Tính chất tuyến tính của CRC32: CRC32 hoạt động dựa trên phép chia đa thức trên trường nhị phân hữu hạn GF(2). Do tính chất tuyến tính, giá trị CRC của một thông điệp sửa đổi CRC(M XOR Delta) có thể tính toán trực tiếp từ CRC(M) và CRC(Delta). Kẻ đối đầu có chủ đích chỉ cần giải một hệ phương trình đại số tuyến tính bằng thuật toán khử Gauss để tìm ra 4 byte bù (patch) nối vào cuối tệp tin, khiến cho CRC32 của tệp giả mạo trùng khớp 100% với tệp gốc ban đầu.</w:t>
+        <w:t>1. Tính chất tuyến tính của CRC32: CRC32 hoạt động dựa trên phép chia đa thức trên trường nhị phân hữu hạn GF(2). Do tính chất tuyến tính, giá trị CRC của một thông điệp sửa đổi CRC(M XOR Delta) có thể tính toán từ CRC(M) và CRC(Delta). Kẻ đối đầu có chủ đích có thể giải hệ phương trình đại số tuyến tính bằng thuật toán khử Gauss để tìm ra 4 byte bù (patch) nối vào cuối tệp tin, khiến cho CRC32 của tệp giả mạo trùng khớp với tệp gốc ban đầu trong kịch bản kiểm thử này.</w:t>
         <w:br/>
-        <w:t>2. Tính phi tuyến của SHA-256: SHA-256 là hàm băm mật mã học xây dựng trên cấu trúc lặp Merkle-Damgard và phép nén Davies-Meyer với các hàm phi tuyến (Ch, Maj, Sigma). Hàm băm đạt hiệu ứng tuyết lở (Strict Avalanche Criterion - SAC ~50%): Chỉ cần thay đổi 1 bit đầu vào thì trung bình 50% số bit đầu ra bị đảo ngẫu nhiên. Bài toán tìm tiền ảnh thứ hai trên SHA-256 có độ phức tạp 2^256, vượt quá hoàn toàn năng lực tính toán của đối thủ đa thức xác suất (PPT Adversary).</w:t>
+        <w:t>2. Tính phi tuyến của SHA-256: SHA-256 là hàm băm mật mã học xây dựng trên cấu trúc lặp Merkle-Damgard và phép nén Davies-Meyer với các hàm phi tuyến (Ch, Maj, Sigma). Hàm băm đạt hiệu ứng tuyết lở (Strict Avalanche Criterion - SAC ~50%): Chỉ cần thay đổi 1 bit đầu vào thì trung bình 50% số bit đầu ra bị đảo ngẫu nhiên. Bài toán tìm tiền ảnh thứ hai trên SHA-256 có độ phức tạp 2^256, vượt quá năng lực tính toán của đối thủ đa thức xác suất (PPT Adversary).</w:t>
       </w:r>
     </w:p>
     <w:p>
@@ -1427,9 +1431,9 @@
         </w:rPr>
         <w:t>Luận điểm phản biện &amp; Căn cứ khoa học:</w:t>
         <w:br/>
-        <w:t>1. Cơ chế rò rỉ: Hàm so sánh chuỗi thông thường (như toán tử == trong nhiều ngôn ngữ) thực hiện so sánh tuần tự từng ký tự từ trái sang phải và dừng ngay lập tức (early-return) khi phát hiện ký tự sai khác đầu tiên. Kẻ tấn công gửi các chuỗi thử nghiệm và đo thời gian phản hồi: Thời gian thực thi càng dài đồng nghĩa số lượng ký tự tiền tố đoán đúng càng nhiều. Từ đó, đối thủ khôi phục được mã băm hoặc khóa bí mật mà không cần giải mã.</w:t>
+        <w:t>1. Cơ chế rò rỉ: Hàm so sánh chuỗi thông thường (như toán tử == trong nhiều ngôn ngữ) thực hiện so sánh tuần tự từng ký tự từ trái sang phải và ngắt sớm (early return) khi phát hiện ký tự sai khác đầu tiên. Kẻ tấn công gửi các chuỗi thử nghiệm và đo thời gian phản hồi: Thời gian thực thi càng dài đồng nghĩa số lượng ký tự tiền tố đoán đúng càng nhiều. Từ đó, đối thủ khôi phục được mã băm hoặc khóa bí mật mà không cần giải mã.</w:t>
         <w:br/>
-        <w:t>2. Giải pháp kỹ thuật: Chuyển sang sử dụng hàm so sánh thời gian hằng số (Constant-time comparison) `hmac.compare_digest`. Hàm này luôn duyệt qua toàn bộ độ dài của chuỗi bằng phép toán bitwise XOR tích lũy, đảm bảo thời gian thực thi độc lập hoàn toàn với vị trí xuất hiện ký tự sai khác, triệt tiêu kênh rò rỉ thời gian ở mức phần mềm.</w:t>
+        <w:t>2. Giải pháp kỹ thuật: Chuyển sang sử dụng hàm so sánh thời gian hằng số (Constant-time comparison) `hmac.compare_digest`. Hàm này luôn duyệt qua toàn bộ độ dài của chuỗi bằng phép toán bitwise XOR tích lũy, đảm bảo thời gian thực thi độc lập với vị trí xuất hiện ký tự sai khác, triệt tiêu kênh rò rỉ thời gian ở mức phần mềm.</w:t>
       </w:r>
     </w:p>
     <w:p>
@@ -1442,7 +1446,7 @@
           <w:color w:val="0F172A"/>
           <w:sz w:val="22"/>
         </w:rPr>
-        <w:t>Câu hỏi 6: Giải pháp Cây Merkle phân cấp động (HD-MerkleTree) của đề tài có ưu thế kỹ thuật gì so với Cây Merkle truyền thống?</w:t>
+        <w:t>Câu hỏi 6: Giải pháp Cây Merkle phân cấp và phân tách miền RFC 6962 đóng vai trò gì trong đề tài?</w:t>
       </w:r>
     </w:p>
     <w:p>
@@ -1457,11 +1461,11 @@
         </w:rPr>
         <w:t>Luận điểm phản biện &amp; Căn cứ khoa học:</w:t>
         <w:br/>
-        <w:t>1. Cắt giảm độ phức tạp cập nhật từ O(N) xuống O(log N): Cây Merkle nhị phân truyền thống làm phẳng toàn bộ danh mục tệp lên một mảng nút lá. Khi có 1 tệp tin được thêm mới hoặc xóa đi, cấu trúc chẵn lẻ của mảng bị phá vỡ, buộc hệ thống phải Rebuild lại toàn bộ cây với chi phí O(N) mất ~283 ms trên 2.483 tệp. HD-Merkle ánh xạ trực tiếp cấu trúc cây thư mục doanh nghiệp; cơ chế Dirty-Path Cache chỉ tính toán lại duy nhất nhánh cha bị tác động từ nút lá lên nút gốc với chi phí logarit O(log N) chỉ mất ~0.24 ms (nhanh hơn ~1.200 lần).</w:t>
+        <w:t>1. Minh họa độc lập của nhóm: Bài báo của Halpin không đề xuất Cây Merkle hay chuẩn RFC 6962. Đây là phần nghiên cứu và triển khai độc lập của nhóm DT005 nhằm giải quyết bài toán toàn vẹn dữ liệu tệp tin.</w:t>
         <w:br/>
-        <w:t>2. Chuẩn phân tách miền RFC 6962: HD-Merkle áp dụng tiền tố 0x00 cho nút lá và 0x01 cho nút nhánh nội bộ, triệt tiêu 100% lỗ hổng va chạm tiền ảnh thứ hai cấp cấu trúc (Node-Leaf confusion).</w:t>
+        <w:t>2. Phân tách miền RFC 6962: Phép ghép băm thông thường H(L || R) có nguy cơ dẫn đến lỗ hổng nhập nhằng nút lá (Node-leaf ambiguity) khi một nút lá có cấu trúc 64 byte bị kẻ tấn công đánh tráo thành cặp băm của nút nhánh nội bộ. Nhóm áp dụng chuẩn RFC 6962: Tiền tố 0x00 cho nút lá và 0x01 cho nút nhánh nội bộ, triệt tiêu hoàn toàn nhập nhằng cấu trúc ở cấp độ cây.</w:t>
         <w:br/>
-        <w:t>3. Tối ưu hóa băng thông bằng chứng: Gói bằng chứng CompactProof được nén xuống 256 Bytes, tiết kiệm hơn 99% băng thông so với việc truyền tải toàn bộ danh mục băm phẳng (253 KB).</w:t>
+        <w:t>3. Định hướng hoàn thiện cuối kỳ: Nhóm tiếp tục tối ưu hóa cơ chế bộ đệm cập nhật cục bộ và đo đạc thực nghiệm độ bền (Ablation Study) trên các quy mô dữ liệu lớn hơn.</w:t>
       </w:r>
     </w:p>
     <w:sectPr>

</xml_diff>

<commit_message>
Update Slide 12 to clean DEMO-only slide and streamline demo script for core Halpin paper scenarios
</commit_message>
<xml_diff>
--- a/Kich_Ban_Thuyet_Trinh_Va_Demo_DT005.docx
+++ b/Kich_Ban_Thuyet_Trinh_Va_Demo_DT005.docx
@@ -795,7 +795,7 @@
           <w:color w:val="1E40AF"/>
           <w:sz w:val="24"/>
         </w:rPr>
-        <w:t xml:space="preserve">► SLIDE 12: SLIDE CHUYỂN TIẾP: DEMO TRỰC TIẾP </w:t>
+        <w:t xml:space="preserve">► SLIDE 12: SLIDE CHUYỂN TIẾP: DEMO </w:t>
       </w:r>
       <w:r>
         <w:rPr>
@@ -803,7 +803,7 @@
           <w:color w:val="64748B"/>
           <w:sz w:val="20"/>
         </w:rPr>
-        <w:t>[0:20]</w:t>
+        <w:t>[0:15]</w:t>
       </w:r>
     </w:p>
     <w:p>
@@ -826,9 +826,7 @@
           <w:color w:val="334155"/>
           <w:sz w:val="21"/>
         </w:rPr>
-        <w:t>"Sau phần phân tích lý thuyết và đối chiếu phương pháp luận, nhóm chuyển sang phần Diễn tập An ninh Thực nghiệm trực tiếp: Mô hình đối kháng hai màn hình giữa Hệ thống phòng thủ Blue Team (Port 8080) và Động cơ tấn công đối kháng Red Team (Port 8081).</w:t>
-        <w:br/>
-        <w:t>Trên slide hiển thị ảnh chụp màn hình thực tế từ phiên chạy thử nghiệm thành công: Blue Team Dashboard tại cổng 8080 bắt quả tang tệp Resume/Resume.csv bị can thiệp trái phép, kích hoạt trạng thái cảnh báo đỏ và truy vết đường dẫn sai lệch."</w:t>
+        <w:t>"Chuyển sang phần Diễn tập An ninh Thực nghiệm trực tiếp (Live Demo). Nhóm sử dụng mô hình đối kháng hai màn hình giữa Hệ thống phòng thủ Blue Team (Port 8080) và Động cơ tấn công đối kháng Red Team (Port 8081) để trực quan hóa và kiểm chứng thực tế các luận điểm triết học cốt lõi của bài báo Harry Halpin."</w:t>
       </w:r>
     </w:p>
     <w:p>
@@ -842,7 +840,7 @@
           <w:color w:val="64748B"/>
           <w:sz w:val="19"/>
         </w:rPr>
-        <w:t>• Lưu ý trình bày: Ảnh chụp giao diện thật từ lần chạy thành công, không dùng ảnh giả lập hay mockup.</w:t>
+        <w:t>• Lưu ý trình bày: Slide chuyển tiếp tối giản nền sáng, chỉ hiển thị đúng một chữ DEMO ở chính giữa để tạo nhịp nghỉ trang trọng trước khi bắt đầu phần thực hành.</w:t>
       </w:r>
     </w:p>
     <w:p>
@@ -1054,7 +1052,7 @@
     </w:p>
     <w:p>
       <w:r>
-        <w:t>Hệ thống demo hỗ trợ 2 hình thức diễn tập tùy thuộc vào yêu cầu của buổi báo cáo: Giao diện Web Trực quan (Khuyến nghị ưu tiên) và Dòng lệnh Terminal CLI độc lập.</w:t>
+        <w:t>Mục tiêu diễn tập giữa kỳ: Chỉ tập trung trình diễn các kịch bản đối kháng cốt lõi phản ánh trực tiếp luận điểm bài báo Harry Halpin (2025). Các chức năng nghiên cứu mở rộng phục vụ đồ án cuối kỳ (như đánh tráo Merkle Proof phân tán, đo đạc độ sâu động, nén CompactProof) được lược bỏ để đảm bảo thời lượng và làm nổi bật trọng tâm khoa học.</w:t>
       </w:r>
     </w:p>
     <w:p>
@@ -1067,7 +1065,7 @@
           <w:color w:val="0F172A"/>
           <w:sz w:val="24"/>
         </w:rPr>
-        <w:t>Phương án 1: Diễn tập Đối kháng 2 Màn hình trên Trình duyệt Web (Ưu tiên hàng đầu)</w:t>
+        <w:t>Phương án 1: Diễn tập Đối kháng 2 Màn hình trên Trình duyệt Web (Khuyến nghị ưu tiên)</w:t>
       </w:r>
     </w:p>
     <w:p>
@@ -1081,7 +1079,7 @@
           <w:color w:val="1E40AF"/>
           <w:sz w:val="21"/>
         </w:rPr>
-        <w:t xml:space="preserve">Bước 1: Khởi động 2 máy chủ Web trong nền: </w:t>
+        <w:t xml:space="preserve">Bước 1: Khởi động 2 dịch vụ Web trong nền: </w:t>
       </w:r>
     </w:p>
     <w:p>
@@ -1100,7 +1098,7 @@
         <w:br/>
         <w:t>• Red Team Service:   python -m src.demo.red_team_web --port 8081</w:t>
         <w:br/>
-        <w:t>Mở 2 cửa sổ trình duyệt đặt cạnh nhau (Split Screen): Cửa sổ trái mở http://localhost:8080; cửa sổ phải mở http://localhost:8081.</w:t>
+        <w:t>Mở 2 cửa sổ trình duyệt chia đôi màn hình (Split Screen): Cửa sổ bên trái truy cập http://localhost:8080 (Blue Team); cửa sổ bên phải truy cập http://localhost:8081 (Red Team).</w:t>
       </w:r>
     </w:p>
     <w:p>
@@ -1114,7 +1112,7 @@
           <w:color w:val="1E40AF"/>
           <w:sz w:val="21"/>
         </w:rPr>
-        <w:t xml:space="preserve">Bước 2: Thiết lập mốc tin cậy sạch tại Blue Team Dashboard (Port 8080): </w:t>
+        <w:t xml:space="preserve">Bước 2: Thiết lập mốc tin cậy sạch ban đầu tại Blue Team (Port 8080): </w:t>
       </w:r>
     </w:p>
     <w:p>
@@ -1127,9 +1125,11 @@
           <w:color w:val="334155"/>
           <w:sz w:val="20"/>
         </w:rPr>
-        <w:t>Tại cổng 8080, chọn thư mục 'kaggle_dataset' (chứa tập dữ liệu thực tế ~112.8 MB).</w:t>
+        <w:t>Tại cổng 8080, chọn thư mục dữ liệu thực tế 'kaggle_dataset' (~112.8 MB).</w:t>
         <w:br/>
-        <w:t>Bấm nút 'Nạp &amp; Tính toán Toàn vẹn'. Hệ thống tính toán và hiển thị Root Hash ban đầu H_0 sạch với trạng thái xanh: '100% NGUYÊN VẸN'.</w:t>
+        <w:t>Bấm nút 'Nạp &amp; Tính toán Toàn vẹn'. Hệ thống tính toán và hiển thị Root Hash ban đầu H_0 với trạng thái màu xanh an toàn: '100% NGUYÊN VẸN'.</w:t>
+        <w:br/>
+        <w:t>Ý nghĩa học thuật: Minh họa khái niệm 'đăng ký đối tượng' (registration of objects) theo Cantwell Smith và thiết lập trạng thái tin cậy khách quan theo Dretske.</w:t>
       </w:r>
     </w:p>
     <w:p>
@@ -1143,7 +1143,7 @@
           <w:color w:val="1E40AF"/>
           <w:sz w:val="21"/>
         </w:rPr>
-        <w:t xml:space="preserve">Bước 3: Phát động tấn công tại Red Team Adversary Engine (Port 8081): </w:t>
+        <w:t xml:space="preserve">Bước 3: Phát động Kịch bản 1 — Can thiệp tệp tin có chủ đích tại Red Team (Port 8081): </w:t>
       </w:r>
     </w:p>
     <w:p>
@@ -1156,13 +1156,15 @@
           <w:color w:val="334155"/>
           <w:sz w:val="20"/>
         </w:rPr>
-        <w:t>Tại cổng 8081, thực hiện lần lượt các kịch bản tấn công đối kháng:</w:t>
+        <w:t>Tại cổng 8081, bấm nút 'Can thiệp tệp tin ngẫu nhiên' (In-place Tampering). Red Team sửa đổi trực tiếp dữ liệu tệp tin trên ổ đĩa (ví dụ: Resume/Resume.csv).</w:t>
         <w:br/>
-        <w:t>• Kịch bản 1 (In-place Tamper): Bấm nút 'Can thiệp tệp tin ngẫu nhiên'. Red Team tự động chọn một tệp (ví dụ: Resume/Resume.csv) và sửa đổi nội dung trực tiếp trên ổ đĩa.</w:t>
+        <w:t>Quay lại Blue Team (Port 8080), bấm nút 'Kiểm tra toàn vẹn':</w:t>
         <w:br/>
-        <w:t>• Kịch bản 2 (CRC32 Forge): Bấm nút 'Tấn công bù 4 byte GF(2)'. Hệ thống giải hệ phương trình tuyến tính, làm sai lệch tệp mà mã CRC32 vẫn giữ nguyên 100%.</w:t>
+        <w:t>• Hệ thống ngay lập tức đổi sang trạng thái cảnh báo đỏ: 'CẢNH BÁO: PHÁT HIỆN CAN THIỆP DỮ LIỆU!'.</w:t>
         <w:br/>
-        <w:t>• Kịch bản 3 (Dolev-Yao MitM): Bấm nút 'Đánh tráo Merkle Proof trên mạng'. Mô phỏng kẻ thù chặn và thay thế chuỗi chứng minh toàn vẹn.</w:t>
+        <w:t>• Bảng truy vết chỉ ra chính xác tệp tin Resume/Resume.csv bị tác động.</w:t>
+        <w:br/>
+        <w:t>Ý nghĩa học thuật: Minh chứng luận điểm Halpin — Kẻ đối đầu mật mã học là tác nhân có chủ đích (intentional agent), hàm băm mật mã học lập tức bắt quả tang mọi sai lệch dù chỉ 1 bit.</w:t>
       </w:r>
     </w:p>
     <w:p>
@@ -1176,7 +1178,7 @@
           <w:color w:val="1E40AF"/>
           <w:sz w:val="21"/>
         </w:rPr>
-        <w:t xml:space="preserve">Bước 4: Kiểm tra và bắt quả tang tại Blue Team Dashboard (Port 8080): </w:t>
+        <w:t xml:space="preserve">Bước 4: Phát động Kịch bản 2 — Tấn công bù 4 byte GF(2) qua mặt CRC32 tại Red Team (Port 8081): </w:t>
       </w:r>
     </w:p>
     <w:p>
@@ -1189,13 +1191,15 @@
           <w:color w:val="334155"/>
           <w:sz w:val="20"/>
         </w:rPr>
-        <w:t>Quay trở lại cổng 8080, bấm nút 'Kiểm tra toàn vẹn'.</w:t>
+        <w:t>Tại cổng 8081, bấm nút 'Tấn công bù 4 byte GF(2)' (CRC32 Forge Attack). Động cơ Red Team giải hệ phương trình tuyến tính, làm sai lệch nội dung tệp nhưng bù 4 byte patch khiến cho mã CRC32 không đổi.</w:t>
         <w:br/>
-        <w:t>• Hệ thống đổi sang trạng thái cảnh báo đỏ: 'CẢNH BÁO: PHÁT HIỆN CAN THIỆP DỮ LIỆU!'.</w:t>
+        <w:t>Quay lại Blue Team (Port 8080), bấm nút 'Kiểm tra toàn vẹn':</w:t>
         <w:br/>
-        <w:t>• Hệ thống chỉ ra chính xác đường dẫn tệp tin và nhánh cây bị sai lệch (ví dụ: Resume/Resume.csv).</w:t>
+        <w:t>• Bảng đối chứng hiển thị rõ: Thuật toán kiểm tra lỗi CRC32 bị qua mặt hoàn toàn (báo khớp sai sự thật do tính chất tuyến tính của đa thức chia).</w:t>
         <w:br/>
-        <w:t>• Bảng đối chứng hiển thị: Trong kịch bản tấn công bù GF(2), CRC32 bị qua mặt (báo khớp sai), trong khi SHA-256 và Merkle Tree phát hiện tức thì.</w:t>
+        <w:t>• Ngược lại, hàm băm SHA-256 phát hiện vi phạm ngay lập tức nhờ tính phi tuyến và hiệu ứng tuyết lở (~50%).</w:t>
+        <w:br/>
+        <w:t>Ý nghĩa học thuật: Trực quan hóa luận điểm mấu chốt của bài báo Halpin — phân biệt rạch ròi giữa mã phát hiện lỗi ngẫu nhiên của Shannon và mật mã học trước kẻ thù có chủ đích.</w:t>
       </w:r>
     </w:p>
     <w:p>
@@ -1209,7 +1213,7 @@
           <w:color w:val="1E40AF"/>
           <w:sz w:val="21"/>
         </w:rPr>
-        <w:t xml:space="preserve">Bước 5: Hoàn nguyên dữ liệu sạch (Rollback All): </w:t>
+        <w:t xml:space="preserve">Bước 5: Hoàn nguyên dữ liệu sạch 100% (Rollback All): </w:t>
       </w:r>
     </w:p>
     <w:p>
@@ -1222,9 +1226,9 @@
           <w:color w:val="334155"/>
           <w:sz w:val="20"/>
         </w:rPr>
-        <w:t>Tại giao diện Red Team (Port 8081), bấm nút 'ROLLBACK ALL'. Toàn bộ các tệp tin bị tác động trên đĩa được khôi phục nguyên vẹn từ thư mục sao lưu .adversary_backups/.</w:t>
+        <w:t>Tại giao diện Red Team (Port 8081), bấm nút 'ROLLBACK ALL'. Toàn bộ các tệp tin bị sửa đổi được khôi phục nguyên vẹn từ thư mục sao lưu an toàn .adversary_backups/.</w:t>
         <w:br/>
-        <w:t>Tại Blue Team bấm kiểm tra lại: Hệ thống trở về trạng thái an toàn.</w:t>
+        <w:t>Tại Blue Team bấm kiểm tra lại: Hệ thống trở về trạng thái an toàn màu xanh.</w:t>
       </w:r>
     </w:p>
     <w:p>
@@ -1253,14 +1257,14 @@
         <w:br/>
         <w:t xml:space="preserve">   Lệnh: python -m src.proposed_model.security_games</w:t>
         <w:br/>
-        <w:t xml:space="preserve">   Kết quả: Thực hiện các phép đo bám sát luận điểm bài báo (tính phi tuyến, hiệu ứng tuyết lở SAC ~50%, can thiệp CRC32 trên GF(2), phân tách miền RFC 6962, và kênh kề thời gian so sánh chuỗi).</w:t>
+        <w:t xml:space="preserve">   Kết quả: Đo đạc thực tế tính phi tuyến của SHA-256, hiệu ứng tuyết lở SAC ~50%, kịch bản bẻ gãy mã tuyến tính CRC32 trên GF(2), và kênh kề thời gian so sánh chuỗi.</w:t>
         <w:br/>
         <w:br/>
         <w:t>2. Diễn tập 2 Terminal Red Team vs Blue Team:</w:t>
         <w:br/>
         <w:t xml:space="preserve">   • Terminal 1 (Red Team): Chạy 'python src/adversary/red_team_cli.py'. Bấm phím '1' để can thiệp tệp, hoặc phím '4' để bù mã CRC32.</w:t>
         <w:br/>
-        <w:t xml:space="preserve">   • Terminal 2 (Blue Team): Chạy 'python -m src.baselines.sha256_manifest --dir kaggle_dataset --verify'. Blue Team phát hiện vi phạm: MODIFIED_FILE: Resume/Resume.csv.</w:t>
+        <w:t xml:space="preserve">   • Terminal 2 (Blue Team): Chạy 'python -m src.baselines.sha256_manifest --dir kaggle_dataset --verify'. Blue Team phát hiện vi phạm ngay lập tức: MODIFIED_FILE: Resume/Resume.csv.</w:t>
         <w:br/>
         <w:t xml:space="preserve">   • Terminal 1: Bấm phím '9' để Rollback All khôi phục đĩa cứng an toàn.</w:t>
       </w:r>

</xml_diff>

<commit_message>
Update Word presentation script to record exact slide text with seamless concise expansions
</commit_message>
<xml_diff>
--- a/Kich_Ban_Thuyet_Trinh_Va_Demo_DT005.docx
+++ b/Kich_Ban_Thuyet_Trinh_Va_Demo_DT005.docx
@@ -22,7 +22,7 @@
         <w:rPr>
           <w:b/>
           <w:color w:val="1E40AF"/>
-          <w:sz w:val="36"/>
+          <w:sz w:val="34"/>
         </w:rPr>
         <w:t>KỊCH BẢN THUYẾT TRÌNH &amp; HƯỚNG DẪN DIỄN TẬP DEMO GIỮA KỲ</w:t>
         <w:br/>
@@ -31,26 +31,26 @@
         <w:rPr>
           <w:b/>
           <w:color w:val="0F172A"/>
-          <w:sz w:val="26"/>
-        </w:rPr>
-        <w:t>Đề tài DT005: Hệ thống kiểm tra toàn vẹn tệp bằng SHA-256, HMAC và cây Merkle phân cấp</w:t>
+          <w:sz w:val="25"/>
+        </w:rPr>
+        <w:t>Đề tài DT005: Hệ thống kiểm tra toàn vẹn tệp bằng SHA-256, HMAC và cây Merkle phân cấp động</w:t>
         <w:br/>
       </w:r>
       <w:r>
         <w:rPr>
           <w:i/>
           <w:color w:val="64748B"/>
-          <w:sz w:val="21"/>
+          <w:sz w:val="20"/>
         </w:rPr>
         <w:t>Khảo sát và Thẩm định học thuật bài báo: "The adversary: the philosophy of cryptography"</w:t>
         <w:br/>
-        <w:t>TS. Harry Halpin — Journal of Cybersecurity, Oxford Academic, Vol. 11, No. 1, 2025</w:t>
+        <w:t>TS. Harry Halpin — Journal of Cybersecurity, Oxford Academic, Vol. 11, No. 1, 2025 (DOI: 10.1093/cybsec/tyaf006)</w:t>
         <w:br/>
       </w:r>
     </w:p>
     <w:p>
       <w:pPr>
-        <w:spacing w:after="360"/>
+        <w:spacing w:after="320"/>
         <w:jc w:val="center"/>
       </w:pPr>
       <w:r>
@@ -66,26 +66,26 @@
     </w:p>
     <w:p>
       <w:pPr>
-        <w:spacing w:after="120"/>
+        <w:spacing w:after="80"/>
       </w:pPr>
     </w:p>
     <w:p>
       <w:pPr>
         <w:pStyle w:val="Heading1"/>
-        <w:spacing w:before="240" w:after="200"/>
+        <w:spacing w:before="240" w:after="160"/>
       </w:pPr>
       <w:r>
         <w:rPr>
           <w:b/>
           <w:color w:val="1E40AF"/>
-          <w:sz w:val="28"/>
-        </w:rPr>
-        <w:t>PHẦN 1: KỊCH BẢN THUYẾT MINH CHI TIẾT THEO 15 SLIDE</w:t>
+          <w:sz w:val="27"/>
+        </w:rPr>
+        <w:t>PHẦN 1: NỘI DUNG TRÊN SLIDE &amp; LỜI THOẠI THUYẾT MINH CHI TIẾT (15 SLIDE)</w:t>
       </w:r>
     </w:p>
     <w:p>
       <w:pPr>
-        <w:spacing w:before="200" w:after="40"/>
+        <w:spacing w:before="240" w:after="40"/>
       </w:pPr>
       <w:r>
         <w:rPr>
@@ -106,7 +106,23 @@
     </w:p>
     <w:p>
       <w:pPr>
-        <w:spacing w:before="40" w:after="80"/>
+        <w:spacing w:before="20" w:after="80"/>
+        <w:ind w:left="288"/>
+      </w:pPr>
+      <w:r>
+        <w:rPr>
+          <w:i/>
+          <w:color w:val="475569"/>
+          <w:sz w:val="19"/>
+        </w:rPr>
+        <w:t>• Tiêu đề phụ / Section trên Slide: Trường ĐH Tài nguyên và Môi trường TP.HCM — Khoa Công nghệ thông tin</w:t>
+        <w:br/>
+        <w:t xml:space="preserve">  Báo cáo thuyết trình đồ án giữa kỳ — Đề tài DT005</w:t>
+      </w:r>
+    </w:p>
+    <w:p>
+      <w:pPr>
+        <w:spacing w:before="60" w:after="20"/>
         <w:ind w:left="288"/>
       </w:pPr>
       <w:r>
@@ -115,37 +131,102 @@
           <w:color w:val="0F172A"/>
           <w:sz w:val="21"/>
         </w:rPr>
-        <w:t>Nội dung trình bày:</w:t>
-        <w:br/>
-      </w:r>
-      <w:r>
-        <w:rPr>
-          <w:i w:val="0"/>
-          <w:color w:val="334155"/>
-          <w:sz w:val="21"/>
-        </w:rPr>
-        <w:t>"Báo cáo tiến độ đồ án giữa kỳ đề tài DT005: Xây dựng hệ thống kiểm tra toàn vẹn tệp dựa trên SHA-256, HMAC và Cây Merkle phân cấp; kết hợp thẩm định học thuật bài báo 'The adversary: the philosophy of cryptography' của Tiến sĩ Harry Halpin, xuất bản năm 2025 trên tạp chí Journal of Cybersecurity thuộc Đại học Oxford.</w:t>
-        <w:br/>
-        <w:t>Nội dung báo cáo gồm 3 trọng tâm: (1) Khảo cứu các luận điểm nhận thức luận và tiến trình hình thức hóa kẻ đối đầu trong mật mã học; (2) Phân định phương pháp luận giữa khảo sát triết học lý thuyết của tác giả và hệ thống thực nghiệm độc lập do nhóm tự phát triển; (3) Diễn tập thực tế mô hình đối kháng an ninh Red Team vs Blue Team trên tập dữ liệu thực tế."</w:t>
+        <w:t>Thông tin báo cáo trên Slide:</w:t>
       </w:r>
     </w:p>
     <w:p>
       <w:pPr>
-        <w:spacing w:before="40" w:after="160"/>
-        <w:ind w:left="288"/>
-      </w:pPr>
-      <w:r>
-        <w:rPr>
-          <w:i/>
-          <w:color w:val="64748B"/>
-          <w:sz w:val="19"/>
-        </w:rPr>
-        <w:t>• Lưu ý trình bày: Bố cục rõ ràng, nhận diện trang trọng, xác định chuẩn mục tiêu đồ án giữa kỳ.</w:t>
+        <w:spacing w:before="20" w:after="40"/>
+        <w:ind w:left="504"/>
+      </w:pPr>
+      <w:r>
+        <w:rPr>
+          <w:b/>
+          <w:color w:val="1E293B"/>
+          <w:sz w:val="20"/>
+        </w:rPr>
+        <w:t xml:space="preserve">– Đề tài: </w:t>
+      </w:r>
+      <w:r>
+        <w:rPr>
+          <w:color w:val="334155"/>
+          <w:sz w:val="20"/>
+        </w:rPr>
+        <w:t>Hệ thống kiểm tra toàn vẹn tệp bằng SHA-256, HMAC và cây Merkle phân cấp động.</w:t>
       </w:r>
     </w:p>
     <w:p>
       <w:pPr>
-        <w:spacing w:before="200" w:after="40"/>
+        <w:spacing w:before="20" w:after="40"/>
+        <w:ind w:left="504"/>
+      </w:pPr>
+      <w:r>
+        <w:rPr>
+          <w:b/>
+          <w:color w:val="1E293B"/>
+          <w:sz w:val="20"/>
+        </w:rPr>
+        <w:t xml:space="preserve">– Bài báo khảo sát: </w:t>
+      </w:r>
+      <w:r>
+        <w:rPr>
+          <w:color w:val="334155"/>
+          <w:sz w:val="20"/>
+        </w:rPr>
+        <w:t>The adversary: the philosophy of cryptography — TS. Harry Halpin (Journal of Cybersecurity, Oxford Academic, 2025).</w:t>
+      </w:r>
+    </w:p>
+    <w:p>
+      <w:pPr>
+        <w:spacing w:before="20" w:after="40"/>
+        <w:ind w:left="504"/>
+      </w:pPr>
+      <w:r>
+        <w:rPr>
+          <w:b/>
+          <w:color w:val="1E293B"/>
+          <w:sz w:val="20"/>
+        </w:rPr>
+        <w:t xml:space="preserve">– Thông tin quản lý: </w:t>
+      </w:r>
+      <w:r>
+        <w:rPr>
+          <w:color w:val="334155"/>
+          <w:sz w:val="20"/>
+        </w:rPr>
+        <w:t>Học phần: An toàn và bảo mật hệ thống thông tin | GVHD: ThS. Phạm Trọng Huynh | SVTH: Võ Anh Kiệt — MSSV: 1150080143 — Lớp: 11_CNPM2.</w:t>
+      </w:r>
+    </w:p>
+    <w:p>
+      <w:pPr>
+        <w:spacing w:before="60" w:after="40"/>
+        <w:ind w:left="288"/>
+      </w:pPr>
+      <w:r>
+        <w:rPr>
+          <w:i/>
+          <w:color w:val="1E40AF"/>
+          <w:sz w:val="20"/>
+        </w:rPr>
+        <w:t>Lời thuyết minh tiếp nối: Báo cáo giữa kỳ đề tài DT005 tập trung vào 3 trọng tâm: (1) Thẩm định nhận thức luận về Kẻ thù trong mật mã học của Halpin; (2) Phân định phương pháp luận minh bạch giữa khảo cứu triết học lý thuyết của tác giả và hệ thống phần mềm minh họa độc lập do sinh viên xây dựng; (3) Diễn tập thực nghiệm đối kháng an ninh Red Team vs Blue Team trên tập dữ liệu thực tế.</w:t>
+      </w:r>
+    </w:p>
+    <w:p>
+      <w:pPr>
+        <w:spacing w:before="20" w:after="160"/>
+        <w:ind w:left="288"/>
+      </w:pPr>
+      <w:r>
+        <w:rPr>
+          <w:color w:val="94A3B8"/>
+          <w:sz w:val="18"/>
+        </w:rPr>
+        <w:t>• Ghi chú chân Slide: Bản trình chiếu chính thức phục vụ nghiệm thu đồ án giữa kỳ.</w:t>
+      </w:r>
+    </w:p>
+    <w:p>
+      <w:pPr>
+        <w:spacing w:before="240" w:after="40"/>
       </w:pPr>
       <w:r>
         <w:rPr>
@@ -153,7 +234,7 @@
           <w:color w:val="1E40AF"/>
           <w:sz w:val="24"/>
         </w:rPr>
-        <w:t xml:space="preserve">► SLIDE 2: BỐI CẢNH, MỤC TIÊU &amp; BA ĐÓNG GÓP CỦA BÀI BÁO (SECTION 1) </w:t>
+        <w:t xml:space="preserve">► SLIDE 2: BỐI CẢNH, MỤC TIÊU &amp; BA ĐÓNG GÓP CỦA BÀI BÁO </w:t>
       </w:r>
       <w:r>
         <w:rPr>
@@ -166,7 +247,23 @@
     </w:p>
     <w:p>
       <w:pPr>
-        <w:spacing w:before="40" w:after="80"/>
+        <w:spacing w:before="20" w:after="80"/>
+        <w:ind w:left="288"/>
+      </w:pPr>
+      <w:r>
+        <w:rPr>
+          <w:i/>
+          <w:color w:val="475569"/>
+          <w:sz w:val="19"/>
+        </w:rPr>
+        <w:t>• Tiêu đề phụ / Section trên Slide: SECTION 1 — GIỚI THIỆU &amp; MỤC TIÊU BÀI BÁO (TRANG 1–2)</w:t>
+        <w:br/>
+        <w:t xml:space="preserve">  Khảo cứu nhận thức luận về Kẻ thù trong Mật mã học và Chương trình nghiên cứu tương lai</w:t>
+      </w:r>
+    </w:p>
+    <w:p>
+      <w:pPr>
+        <w:spacing w:before="60" w:after="20"/>
         <w:ind w:left="288"/>
       </w:pPr>
       <w:r>
@@ -175,39 +272,179 @@
           <w:color w:val="0F172A"/>
           <w:sz w:val="21"/>
         </w:rPr>
-        <w:t>Nội dung trình bày:</w:t>
-        <w:br/>
-      </w:r>
-      <w:r>
-        <w:rPr>
-          <w:i w:val="0"/>
-          <w:color w:val="334155"/>
-          <w:sz w:val="21"/>
-        </w:rPr>
-        <w:t>"Mật mã học trong kỷ nguyên số là khoa học về việc duy trì liên lạc bảo mật khi có sự hiện diện của đối thủ có chủ đích trên môi trường mạng mở.</w:t>
-        <w:br/>
-        <w:t>Bài báo của Halpin chỉ ra một nghịch lý nhận thức luận sâu sắc: Trong khi lý thuyết thông tin của Claude Shannon được triết học khảo cứu rộng rãi suốt nhiều thập kỷ, thì chính mật mã học — cái nôi khai sinh ra khái niệm thông tin và tính ngẫu nhiên — lại bị giới triết học bỏ quên.</w:t>
-        <w:br/>
-        <w:t>Bài báo đưa ra ba đóng góp học thuật cốt lõi: Thứ nhất, định hình lại lịch sử mật mã qua lăng kính triết học bản thể luận về 'Kẻ thù' (The Adversary). Thứ hai, phê phán sự trừu tượng hóa toán học thái quá khi biến đối thủ thành các hàm lý tưởng và bỏ qua các vector tấn công thế giới thực (kênh kề, siêu dữ liệu, lỗi phần cứng). Thứ ba, đề xuất một chương trình nghiên cứu liên ngành mở với 4 câu hỏi định hướng cho khoa học an ninh tương lai."</w:t>
+        <w:t>1. Bối Cảnh Mật Mã Học &amp; Nghịch Lý Nhận Thức Luận:</w:t>
       </w:r>
     </w:p>
     <w:p>
       <w:pPr>
-        <w:spacing w:before="40" w:after="160"/>
-        <w:ind w:left="288"/>
-      </w:pPr>
-      <w:r>
-        <w:rPr>
-          <w:i/>
-          <w:color w:val="64748B"/>
-          <w:sz w:val="19"/>
-        </w:rPr>
-        <w:t>• Lưu ý trình bày: Nêu bật nghịch lý triết học và 3 đóng góp lớn của Halpin.</w:t>
+        <w:spacing w:before="20" w:after="40"/>
+        <w:ind w:left="504"/>
+      </w:pPr>
+      <w:r>
+        <w:rPr>
+          <w:b/>
+          <w:color w:val="1E293B"/>
+          <w:sz w:val="20"/>
+        </w:rPr>
+        <w:t xml:space="preserve">– Mật mã học trong kỷ nguyên số: </w:t>
+      </w:r>
+      <w:r>
+        <w:rPr>
+          <w:color w:val="334155"/>
+          <w:sz w:val="20"/>
+        </w:rPr>
+        <w:t>Khoa học về truyền thông bí mật khi có sự hiện diện của đối thủ có chủ đích. Internet biến không gian mạng thành nơi tương tác với vô vàn đối thủ tiềm tàng, xa lạ — qua đó cho thấy giả định về kênh truyền đóng kín không còn phù hợp.</w:t>
       </w:r>
     </w:p>
     <w:p>
       <w:pPr>
-        <w:spacing w:before="200" w:after="40"/>
+        <w:spacing w:before="20" w:after="40"/>
+        <w:ind w:left="504"/>
+      </w:pPr>
+      <w:r>
+        <w:rPr>
+          <w:b/>
+          <w:color w:val="1E293B"/>
+          <w:sz w:val="20"/>
+        </w:rPr>
+        <w:t xml:space="preserve">– Nghịch lý nhận thức luận: </w:t>
+      </w:r>
+      <w:r>
+        <w:rPr>
+          <w:color w:val="334155"/>
+          <w:sz w:val="20"/>
+        </w:rPr>
+        <w:t>Lý thuyết thông tin của Shannon (1948) được triết học khảo cứu sâu sắc, nhưng chính mật mã học — cái nôi khai sinh lý thuyết thông tin — lại bị triết học bỏ quên suốt nhiều thập kỷ — bài báo của Halpin là công trình tiên phong giải quyết khoảng trống này.</w:t>
+      </w:r>
+    </w:p>
+    <w:p>
+      <w:pPr>
+        <w:spacing w:before="20" w:after="40"/>
+        <w:ind w:left="504"/>
+      </w:pPr>
+      <w:r>
+        <w:rPr>
+          <w:b/>
+          <w:color w:val="1E293B"/>
+          <w:sz w:val="20"/>
+        </w:rPr>
+        <w:t xml:space="preserve">– Cái giá của sự trừu tượng hóa: </w:t>
+      </w:r>
+      <w:r>
+        <w:rPr>
+          <w:color w:val="334155"/>
+          <w:sz w:val="20"/>
+        </w:rPr>
+        <w:t>Khi mật mã học biến thành các bài toán toán học thuần túy trên giấy, nó tạo ra điểm mù nguy hiểm trước các đòn tấn công vật lý trong thế giới thực — khiến hệ thống dù có chứng minh an toàn toán học vẫn sụp đổ trước các kênh rò rỉ phụ.</w:t>
+      </w:r>
+    </w:p>
+    <w:p>
+      <w:pPr>
+        <w:spacing w:before="60" w:after="20"/>
+        <w:ind w:left="288"/>
+      </w:pPr>
+      <w:r>
+        <w:rPr>
+          <w:b/>
+          <w:color w:val="0F172A"/>
+          <w:sz w:val="21"/>
+        </w:rPr>
+        <w:t>2. Ba Đóng Góp Học Thuật Chính Của Harry Halpin:</w:t>
+      </w:r>
+    </w:p>
+    <w:p>
+      <w:pPr>
+        <w:spacing w:before="20" w:after="40"/>
+        <w:ind w:left="504"/>
+      </w:pPr>
+      <w:r>
+        <w:rPr>
+          <w:b/>
+          <w:color w:val="1E293B"/>
+          <w:sz w:val="20"/>
+        </w:rPr>
+        <w:t xml:space="preserve">– Khảo sát Lịch sử &amp; Triết học: </w:t>
+      </w:r>
+      <w:r>
+        <w:rPr>
+          <w:color w:val="334155"/>
+          <w:sz w:val="20"/>
+        </w:rPr>
+        <w:t>Hệ thống hóa toàn diện quá trình tiến hóa mô hình đối thủ: từ Shannon (1949), PPT Adversary (1984), Dolev-Yao (1983) đến Random Oracle Model (1993) — làm rõ sự chuyển dịch từ an toàn thông tin sang độ phức tạp tính toán.</w:t>
+      </w:r>
+    </w:p>
+    <w:p>
+      <w:pPr>
+        <w:spacing w:before="20" w:after="40"/>
+        <w:ind w:left="504"/>
+      </w:pPr>
+      <w:r>
+        <w:rPr>
+          <w:b/>
+          <w:color w:val="1E293B"/>
+          <w:sz w:val="20"/>
+        </w:rPr>
+        <w:t xml:space="preserve">– Phê phán Giới hạn Hình thức hóa: </w:t>
+      </w:r>
+      <w:r>
+        <w:rPr>
+          <w:color w:val="334155"/>
+          <w:sz w:val="20"/>
+        </w:rPr>
+        <w:t>Chỉ rõ sự sụp đổ của các mô hình toán học trước thực tiễn: rò rỉ kênh kề (Kocher 1996), độ dài bản mã, rò rỉ siêu dữ liệu và giám sát hàng loạt của NSA (Snowden 2013) — khẳng định an ninh lý thuyết không đồng nghĩa với an ninh vật lý.</w:t>
+      </w:r>
+    </w:p>
+    <w:p>
+      <w:pPr>
+        <w:spacing w:before="20" w:after="40"/>
+        <w:ind w:left="504"/>
+      </w:pPr>
+      <w:r>
+        <w:rPr>
+          <w:b/>
+          <w:color w:val="1E293B"/>
+          <w:sz w:val="20"/>
+        </w:rPr>
+        <w:t xml:space="preserve">– Đề xuất Chương trình Mới: </w:t>
+      </w:r>
+      <w:r>
+        <w:rPr>
+          <w:color w:val="334155"/>
+          <w:sz w:val="20"/>
+        </w:rPr>
+        <w:t>Thiết lập 4 câu hỏi nghiên cứu mở (Section 7) nhằm mở rộng mật mã học từ một nhánh toán học biệt lập thành một khoa học an ninh hoàn chỉnh kết hợp thực nghiệm — định hướng liên ngành giữa triết học, an ninh mạng và khoa học xã hội.</w:t>
+      </w:r>
+    </w:p>
+    <w:p>
+      <w:pPr>
+        <w:spacing w:before="60" w:after="40"/>
+        <w:ind w:left="288"/>
+      </w:pPr>
+      <w:r>
+        <w:rPr>
+          <w:i/>
+          <w:color w:val="1E40AF"/>
+          <w:sz w:val="20"/>
+        </w:rPr>
+        <w:t>Lời thuyết minh tiếp nối: Ba đóng góp này tạo nên sợi chỉ đỏ xuyên suốt: Phê phán sự cô lập của mô hình toán học thuần túy và kêu gọi đưa mật mã học trở về với thế giới vật lý thực tế.</w:t>
+      </w:r>
+    </w:p>
+    <w:p>
+      <w:pPr>
+        <w:spacing w:before="20" w:after="160"/>
+        <w:ind w:left="288"/>
+      </w:pPr>
+      <w:r>
+        <w:rPr>
+          <w:color w:val="94A3B8"/>
+          <w:sz w:val="18"/>
+        </w:rPr>
+        <w:t>• Ghi chú chân Slide: Trích dẫn: Harry Halpin (2025), Section 1: Introduction, Journal of Cybersecurity, tr. 1–2.</w:t>
+      </w:r>
+    </w:p>
+    <w:p>
+      <w:pPr>
+        <w:spacing w:before="240" w:after="40"/>
       </w:pPr>
       <w:r>
         <w:rPr>
@@ -215,7 +452,7 @@
           <w:color w:val="1E40AF"/>
           <w:sz w:val="24"/>
         </w:rPr>
-        <w:t xml:space="preserve">► SLIDE 3: CƠ SỞ TRIẾT HỌC VỀ THÔNG TIN &amp; BẢN THỂ HỌC (SECTION 2) </w:t>
+        <w:t xml:space="preserve">► SLIDE 3: CƠ SỞ TRIẾT HỌC: THÔNG TIN, BÍ MẬT VÀ TÁC NHÂN </w:t>
       </w:r>
       <w:r>
         <w:rPr>
@@ -228,7 +465,23 @@
     </w:p>
     <w:p>
       <w:pPr>
-        <w:spacing w:before="40" w:after="80"/>
+        <w:spacing w:before="20" w:after="80"/>
+        <w:ind w:left="288"/>
+      </w:pPr>
+      <w:r>
+        <w:rPr>
+          <w:i/>
+          <w:color w:val="475569"/>
+          <w:sz w:val="19"/>
+        </w:rPr>
+        <w:t>• Tiêu đề phụ / Section trên Slide: SECTION 2 &amp; 3 — CƠ SỞ TRIẾT HỌC VỀ THÔNG TIN (TRANG 2–5)</w:t>
+        <w:br/>
+        <w:t xml:space="preserve">  Khung nhận thức luận của Fred Dretske và Brian Cantwell Smith ứng dụng trong Mật mã học</w:t>
+      </w:r>
+    </w:p>
+    <w:p>
+      <w:pPr>
+        <w:spacing w:before="60" w:after="20"/>
         <w:ind w:left="288"/>
       </w:pPr>
       <w:r>
@@ -237,41 +490,256 @@
           <w:color w:val="0F172A"/>
           <w:sz w:val="21"/>
         </w:rPr>
-        <w:t>Nội dung trình bày:</w:t>
-        <w:br/>
-      </w:r>
-      <w:r>
-        <w:rPr>
-          <w:i w:val="0"/>
-          <w:color w:val="334155"/>
-          <w:sz w:val="21"/>
-        </w:rPr>
-        <w:t>"Nền tảng lý thuyết của Halpin dựa trên các trụ cột triết học nhận thức luận và xã hội:</w:t>
-        <w:br/>
-        <w:t>1. Bản thể học thông tin của Brian Cantwell Smith (1996): Thực tại khởi nguồn từ một dòng chảy siêu hình nguyên thủy không biên giới. Con người và hệ thống định hình thế giới bằng cách 'đăng ký đối tượng' (registration of objects). Trong mật mã học, các đối tượng như thông điệp M, bản mã C và khóa K được đăng ký nhằm kiểm soát dòng thông tin giữa các tác nhân ở xa (distal agents).</w:t>
-        <w:br/>
-        <w:t>2. Thuyết thông tin khách quan của Fred Dretske (1981): Thông tin là một trạng thái khách quan gắn liền với quy luật tự nhiên, độc lập với người quan sát.</w:t>
-        <w:br/>
-        <w:t>3. Phân biệt tri thức công khai (Public Knowledge) và tri thức chung (Common Knowledge) theo David Lewis (1969): Tri thức chung là trạng thái mọi tác nhân trong một quần thể đều biết thông tin và đều biết rằng những người khác cũng biết. Trong khi đó, Tri thức công khai là khái niệm yếu hơn, chỉ thông tin mà bất kỳ tác nhân nào cũng có khả năng tiếp cận (chẳng hạn qua rò rỉ dữ liệu). Bí mật (Secrets) không phải là bản rõ hay bản mã, mà được định nghĩa là 'Tri thức không phổ biến' (Uncommon Knowledge) — nó là một mối quan hệ xã hội giữa người giữ bí mật và đối thủ bên ngoài."</w:t>
+        <w:t>1. Bản Thể Học Thông Tin — Brian Cantwell Smith (1996):</w:t>
       </w:r>
     </w:p>
     <w:p>
       <w:pPr>
-        <w:spacing w:before="40" w:after="160"/>
-        <w:ind w:left="288"/>
-      </w:pPr>
-      <w:r>
-        <w:rPr>
-          <w:i/>
-          <w:color w:val="64748B"/>
-          <w:sz w:val="19"/>
-        </w:rPr>
-        <w:t>• Lưu ý trình bày: Phân định chuẩn xác Public Knowledge vs Common Knowledge theo Halpin và David Lewis; không đồng nhất với bản mã hay bản rõ.</w:t>
+        <w:spacing w:before="20" w:after="40"/>
+        <w:ind w:left="504"/>
+      </w:pPr>
+      <w:r>
+        <w:rPr>
+          <w:b/>
+          <w:color w:val="1E293B"/>
+          <w:sz w:val="20"/>
+        </w:rPr>
+        <w:t xml:space="preserve">– Dòng chảy nguyên thủy: </w:t>
+      </w:r>
+      <w:r>
+        <w:rPr>
+          <w:color w:val="334155"/>
+          <w:sz w:val="20"/>
+        </w:rPr>
+        <w:t>Thế giới khởi đầu từ dòng chảy siêu hình không biên giới (primordial metaphysical flux) — mọi ranh giới đều do con người và hệ thống kiến tạo.</w:t>
       </w:r>
     </w:p>
     <w:p>
       <w:pPr>
-        <w:spacing w:before="200" w:after="40"/>
+        <w:spacing w:before="20" w:after="40"/>
+        <w:ind w:left="504"/>
+      </w:pPr>
+      <w:r>
+        <w:rPr>
+          <w:b/>
+          <w:color w:val="1E293B"/>
+          <w:sz w:val="20"/>
+        </w:rPr>
+        <w:t xml:space="preserve">– Phân ranh giới: </w:t>
+      </w:r>
+      <w:r>
+        <w:rPr>
+          <w:color w:val="334155"/>
+          <w:sz w:val="20"/>
+        </w:rPr>
+        <w:t>Con người và hệ thống định hình thực tại bằng cách đăng ký đối tượng (registration of objects) — trong mật mã, thông điệp M, bản mã C và khóa K được đăng ký để kiểm soát luồng dữ liệu.</w:t>
+      </w:r>
+    </w:p>
+    <w:p>
+      <w:pPr>
+        <w:spacing w:before="20" w:after="40"/>
+        <w:ind w:left="504"/>
+      </w:pPr>
+      <w:r>
+        <w:rPr>
+          <w:b/>
+          <w:color w:val="1E293B"/>
+          <w:sz w:val="20"/>
+        </w:rPr>
+        <w:t xml:space="preserve">– Tác nhân xa (Distal): </w:t>
+      </w:r>
+      <w:r>
+        <w:rPr>
+          <w:color w:val="334155"/>
+          <w:sz w:val="20"/>
+        </w:rPr>
+        <w:t>Thông tin mật mã ra đời để truyền đạt trạng thái giữa các thực thể ở xa nhau mà không thể tương tác trực tiếp — tạo cơ sở bản thể luận cho bài toán liên lạc từ xa qua mạng.</w:t>
+      </w:r>
+    </w:p>
+    <w:p>
+      <w:pPr>
+        <w:spacing w:before="60" w:after="20"/>
+        <w:ind w:left="288"/>
+      </w:pPr>
+      <w:r>
+        <w:rPr>
+          <w:b/>
+          <w:color w:val="0F172A"/>
+          <w:sz w:val="21"/>
+        </w:rPr>
+        <w:t>2. Thuyết Thông Tin Khách Quan — Fred Dretske (1981):</w:t>
+      </w:r>
+    </w:p>
+    <w:p>
+      <w:pPr>
+        <w:spacing w:before="20" w:after="40"/>
+        <w:ind w:left="504"/>
+      </w:pPr>
+      <w:r>
+        <w:rPr>
+          <w:b/>
+          <w:color w:val="1E293B"/>
+          <w:sz w:val="20"/>
+        </w:rPr>
+        <w:t xml:space="preserve">– Thông tin khách quan: </w:t>
+      </w:r>
+      <w:r>
+        <w:rPr>
+          <w:color w:val="334155"/>
+          <w:sz w:val="20"/>
+        </w:rPr>
+        <w:t>Thông tin là tính quy luật của trạng thái sự vật (state of affairs), hoàn toàn độc lập với việc có ai đọc hay không — mang tính quy luật tự nhiên.</w:t>
+      </w:r>
+    </w:p>
+    <w:p>
+      <w:pPr>
+        <w:spacing w:before="20" w:after="40"/>
+        <w:ind w:left="504"/>
+      </w:pPr>
+      <w:r>
+        <w:rPr>
+          <w:b/>
+          <w:color w:val="1E293B"/>
+          <w:sz w:val="20"/>
+        </w:rPr>
+        <w:t xml:space="preserve">– Thông tin và Bí mật: </w:t>
+      </w:r>
+      <w:r>
+        <w:rPr>
+          <w:color w:val="334155"/>
+          <w:sz w:val="20"/>
+        </w:rPr>
+        <w:t>Bản rõ chứa đựng thông tin về nguồn; bản mã khi được mã hóa hoàn hảo sẽ không làm rò rỉ bất kỳ thông tin nào về nguồn — ngăn chặn đối thủ suy diễn bản rõ.</w:t>
+      </w:r>
+    </w:p>
+    <w:p>
+      <w:pPr>
+        <w:spacing w:before="20" w:after="40"/>
+        <w:ind w:left="504"/>
+      </w:pPr>
+      <w:r>
+        <w:rPr>
+          <w:b/>
+          <w:color w:val="1E293B"/>
+          <w:sz w:val="20"/>
+        </w:rPr>
+        <w:t xml:space="preserve">– Dòng chảy thông tin: </w:t>
+      </w:r>
+      <w:r>
+        <w:rPr>
+          <w:color w:val="334155"/>
+          <w:sz w:val="20"/>
+        </w:rPr>
+        <w:t>Nhiệm vụ của mật mã là kiểm soát dòng chảy thông tin chỉ đi đến người nhận được ủy quyền — ngăn chặn phát tán đến các tác nhân trái phép.</w:t>
+      </w:r>
+    </w:p>
+    <w:p>
+      <w:pPr>
+        <w:spacing w:before="60" w:after="20"/>
+        <w:ind w:left="288"/>
+      </w:pPr>
+      <w:r>
+        <w:rPr>
+          <w:b/>
+          <w:color w:val="0F172A"/>
+          <w:sz w:val="21"/>
+        </w:rPr>
+        <w:t>3. Tác Nhân Có Chủ Đích — Bản chất của đối thủ:</w:t>
+      </w:r>
+    </w:p>
+    <w:p>
+      <w:pPr>
+        <w:spacing w:before="20" w:after="40"/>
+        <w:ind w:left="504"/>
+      </w:pPr>
+      <w:r>
+        <w:rPr>
+          <w:b/>
+          <w:color w:val="1E293B"/>
+          <w:sz w:val="20"/>
+        </w:rPr>
+        <w:t xml:space="preserve">– Tính chủ đích (Intentionality): </w:t>
+      </w:r>
+      <w:r>
+        <w:rPr>
+          <w:color w:val="334155"/>
+          <w:sz w:val="20"/>
+        </w:rPr>
+        <w:t>Đối thủ không phải là 'nhiễu ngẫu nhiên' mà là thực thể có niềm tin, mục tiêu và ý chí khai thác lỗ hổng — phân biệt triệt để mật mã với truyền thông vật lý thông thường.</w:t>
+      </w:r>
+    </w:p>
+    <w:p>
+      <w:pPr>
+        <w:spacing w:before="20" w:after="40"/>
+        <w:ind w:left="504"/>
+      </w:pPr>
+      <w:r>
+        <w:rPr>
+          <w:b/>
+          <w:color w:val="1E293B"/>
+          <w:sz w:val="20"/>
+        </w:rPr>
+        <w:t xml:space="preserve">– Tính tương đối của bí mật: </w:t>
+      </w:r>
+      <w:r>
+        <w:rPr>
+          <w:color w:val="334155"/>
+          <w:sz w:val="20"/>
+        </w:rPr>
+        <w:t>Bí mật không tồn tại tự thân; nó là mối quan hệ giữa nhóm người giữ bí mật và thế giới bên ngoài trong một khoảng thời gian — sẽ mất đi khi mối quan hệ này bị phá vỡ.</w:t>
+      </w:r>
+    </w:p>
+    <w:p>
+      <w:pPr>
+        <w:spacing w:before="20" w:after="40"/>
+        <w:ind w:left="504"/>
+      </w:pPr>
+      <w:r>
+        <w:rPr>
+          <w:b/>
+          <w:color w:val="1E293B"/>
+          <w:sz w:val="20"/>
+        </w:rPr>
+        <w:t xml:space="preserve">– Public vs Common Knowledge: </w:t>
+      </w:r>
+      <w:r>
+        <w:rPr>
+          <w:color w:val="334155"/>
+          <w:sz w:val="20"/>
+        </w:rPr>
+        <w:t>Common Knowledge (David Lewis 1969): Mọi tác nhân đều biết và tin trạng thái sự việc. Public Knowledge: Thông tin mà bất kỳ ai cũng có tiềm năng tiếp cận (như khi bị rò rỉ). Bí mật là 'tri thức không phổ biến', không đồng nhất với bản rõ hay bản mã.</w:t>
+      </w:r>
+    </w:p>
+    <w:p>
+      <w:pPr>
+        <w:spacing w:before="60" w:after="40"/>
+        <w:ind w:left="288"/>
+      </w:pPr>
+      <w:r>
+        <w:rPr>
+          <w:i/>
+          <w:color w:val="1E40AF"/>
+          <w:sz w:val="20"/>
+        </w:rPr>
+        <w:t>Lời thuyết minh tiếp nối: Hai trụ cột triết học này xác lập rằng Kẻ đối đầu mật mã học là tác nhân có chủ đích, và bí mật là mối quan hệ mang tính vị thế xã hội chứ không phải thuộc tính tự thân của chuỗi bit.</w:t>
+      </w:r>
+    </w:p>
+    <w:p>
+      <w:pPr>
+        <w:spacing w:before="20" w:after="160"/>
+        <w:ind w:left="288"/>
+      </w:pPr>
+      <w:r>
+        <w:rPr>
+          <w:color w:val="94A3B8"/>
+          <w:sz w:val="18"/>
+        </w:rPr>
+        <w:t>• Ghi chú chân Slide: Trích dẫn khoa học: Dretske (1981, Ref [1]); Cantwell Smith (1996, Ref [5]); Halpin (2025), tr. 2–5.</w:t>
+      </w:r>
+    </w:p>
+    <w:p>
+      <w:pPr>
+        <w:spacing w:before="240" w:after="40"/>
       </w:pPr>
       <w:r>
         <w:rPr>
@@ -279,7 +747,7 @@
           <w:color w:val="1E40AF"/>
           <w:sz w:val="24"/>
         </w:rPr>
-        <w:t xml:space="preserve">► SLIDE 4: TIẾN TRÌNH LỊCH SỬ MÔ HÌNH HÓA ĐỐI THỦ [SƠ ĐỒ 1: TIMELINE] </w:t>
+        <w:t xml:space="preserve">► SLIDE 4: TIẾN TRÌNH LỊCH SỬ MÔ HÌNH HÓA ĐỐI THỦ TRONG MẬT MÃ </w:t>
       </w:r>
       <w:r>
         <w:rPr>
@@ -292,7 +760,23 @@
     </w:p>
     <w:p>
       <w:pPr>
-        <w:spacing w:before="40" w:after="80"/>
+        <w:spacing w:before="20" w:after="80"/>
+        <w:ind w:left="288"/>
+      </w:pPr>
+      <w:r>
+        <w:rPr>
+          <w:i/>
+          <w:color w:val="475569"/>
+          <w:sz w:val="19"/>
+        </w:rPr>
+        <w:t>• Tiêu đề phụ / Section trên Slide: SƠ ĐỒ 1: DÒNG THỜI GIAN TIẾN HÓA MÔ HÌNH ĐỐI THỦ</w:t>
+        <w:br/>
+        <w:t xml:space="preserve">  Sự dịch chuyển từ Lý thuyết thông tin sang Giả định độ phức tạp tính toán và Phê phán hậu Snowden</w:t>
+      </w:r>
+    </w:p>
+    <w:p>
+      <w:pPr>
+        <w:spacing w:before="60" w:after="20"/>
         <w:ind w:left="288"/>
       </w:pPr>
       <w:r>
@@ -301,45 +785,144 @@
           <w:color w:val="0F172A"/>
           <w:sz w:val="21"/>
         </w:rPr>
-        <w:t>Nội dung trình bày:</w:t>
-        <w:br/>
-      </w:r>
-      <w:r>
-        <w:rPr>
-          <w:i w:val="0"/>
-          <w:color w:val="334155"/>
-          <w:sz w:val="21"/>
-        </w:rPr>
-        <w:t>"Sơ đồ 1 hệ thống hóa tiến trình 5 giai đoạn tiến hóa mô hình đối thủ trong hơn 70 năm qua:</w:t>
-        <w:br/>
-        <w:t>• Giai đoạn 1 (1948–1949): Mô hình Claude Shannon. Định nghĩa Bí mật hoàn hảo (Perfect Secrecy: H(M|C) = H(M), dẫn đến H(K) &gt;= H(M) qua One-Time Pad). Shannon mô hình hóa hệ thống truyền thông bảo mật điểm-điểm, nhưng việc giản lược đối thủ thành một kẻ nghe lén trừu tượng trên đường truyền đã bỏ qua chi phí phân phối/quản lý khóa và các bề mặt tấn công vật lý thế giới thực.</w:t>
-        <w:br/>
-        <w:t>• Giai đoạn 2 (1976): Cách mạng khóa công khai của Diffie-Hellman và Merkle, giải quyết bài toán phân phối khóa bằng các bài toán độ phức tạp tính toán một chiều.</w:t>
-        <w:br/>
-        <w:t>• Giai đoạn 3 (1982–1984): Mô hình PPT Adversary và Trò chơi An ninh (Security Games) của Goldwasser và Micali, hình thức hóa an toàn ngữ nghĩa và chứng minh an toàn bằng quy dẫn toán học đa thức xác suất.</w:t>
-        <w:br/>
-        <w:t>• Giai đoạn 4 (1981–1993): Dolev-Yao mô hình hóa kẻ thù kiểm soát hoàn toàn kênh mạng logic; Bellare-Rogaway đề xuất Random Oracle Model (ROM) ứng dụng cho hàm băm thực hành.</w:t>
-        <w:br/>
-        <w:t>• Giai đoạn 5 (2013–2025): Phê phán hậu Snowden, bộc lộ khoảng cách giữa mô hình toán học trên giấy và năng lực thực tế của đối thủ thể chế (kênh kề, backdoor chuẩn NIST, can thiệp chuỗi cung ứng)."</w:t>
+        <w:t>Nội dung dòng thời gian 5 giai đoạn:</w:t>
       </w:r>
     </w:p>
     <w:p>
       <w:pPr>
-        <w:spacing w:before="40" w:after="160"/>
-        <w:ind w:left="288"/>
-      </w:pPr>
-      <w:r>
-        <w:rPr>
-          <w:i/>
-          <w:color w:val="64748B"/>
-          <w:sz w:val="19"/>
-        </w:rPr>
-        <w:t>• Lưu ý trình bày: Mô tả chính xác mô hình Shannon và giới hạn trừu tượng hóa, không diễn giải sai lệch về nhiễu ngẫu nhiên.</w:t>
+        <w:spacing w:before="20" w:after="40"/>
+        <w:ind w:left="504"/>
+      </w:pPr>
+      <w:r>
+        <w:rPr>
+          <w:b/>
+          <w:color w:val="1E293B"/>
+          <w:sz w:val="20"/>
+        </w:rPr>
+        <w:t xml:space="preserve">– Giai đoạn 1 (1948–1949) — [MÔ HÌNH SHANNON]: </w:t>
+      </w:r>
+      <w:r>
+        <w:rPr>
+          <w:color w:val="334155"/>
+          <w:sz w:val="20"/>
+        </w:rPr>
+        <w:t>Mô hình truyền thông bảo mật điểm - điểm; định nghĩa Bí mật hoàn hảo H(K) &gt;= H(M). Giới hạn: Giản lược đối thủ thành kẻ nghe lén trên kênh trừu tượng, bỏ qua chi phí phân phối khóa và thực tế xã hội - kỹ thuật — đặt nền móng lý thuyết nhưng cô lập với thực tế triển khai.</w:t>
       </w:r>
     </w:p>
     <w:p>
       <w:pPr>
-        <w:spacing w:before="200" w:after="40"/>
+        <w:spacing w:before="20" w:after="40"/>
+        <w:ind w:left="504"/>
+      </w:pPr>
+      <w:r>
+        <w:rPr>
+          <w:b/>
+          <w:color w:val="1E293B"/>
+          <w:sz w:val="20"/>
+        </w:rPr>
+        <w:t xml:space="preserve">– Giai đoạn 2 (1976) — [CÁCH MẠNG KHÓA CÔNG KHAI]: </w:t>
+      </w:r>
+      <w:r>
+        <w:rPr>
+          <w:color w:val="334155"/>
+          <w:sz w:val="20"/>
+        </w:rPr>
+        <w:t>Diffie-Hellman và Merkle giải quyết bài toán phân phối khóa; chuyển gánh nặng bảo mật sang độ phức tạp tính toán một chiều — khởi xướng thời kỳ bảo mật dựa trên độ khó toán học.</w:t>
+      </w:r>
+    </w:p>
+    <w:p>
+      <w:pPr>
+        <w:spacing w:before="20" w:after="40"/>
+        <w:ind w:left="504"/>
+      </w:pPr>
+      <w:r>
+        <w:rPr>
+          <w:b/>
+          <w:color w:val="1E293B"/>
+          <w:sz w:val="20"/>
+        </w:rPr>
+        <w:t xml:space="preserve">– Giai đoạn 3 (1982–1984) — [PPT ADVERSARY &amp; SECURITY GAMES]: </w:t>
+      </w:r>
+      <w:r>
+        <w:rPr>
+          <w:color w:val="334155"/>
+          <w:sz w:val="20"/>
+        </w:rPr>
+        <w:t>Goldwasser-Micali định nghĩa an toàn ngữ nghĩa và đối thủ thời gian đa thức xác suất (PPT). Chứng minh an toàn bằng quy dẫn toán học — chuẩn hóa phương pháp luận chứng minh hình thức.</w:t>
+      </w:r>
+    </w:p>
+    <w:p>
+      <w:pPr>
+        <w:spacing w:before="20" w:after="40"/>
+        <w:ind w:left="504"/>
+      </w:pPr>
+      <w:r>
+        <w:rPr>
+          <w:b/>
+          <w:color w:val="1E293B"/>
+          <w:sz w:val="20"/>
+        </w:rPr>
+        <w:t xml:space="preserve">– Giai đoạn 4 (1981–1993) — [DOLEV-YAO &amp; RANDOM ORACLE]: </w:t>
+      </w:r>
+      <w:r>
+        <w:rPr>
+          <w:color w:val="334155"/>
+          <w:sz w:val="20"/>
+        </w:rPr>
+        <w:t>Dolev-Yao mô hình hóa đối thủ mạng kiểm soát hoàn toàn kênh truyền. Bellare-Rogaway đề xuất Random Oracle Model (ROM) ứng dụng thực hành — áp dụng kiểm chứng logic cho giao thức và hàm băm.</w:t>
+      </w:r>
+    </w:p>
+    <w:p>
+      <w:pPr>
+        <w:spacing w:before="20" w:after="40"/>
+        <w:ind w:left="504"/>
+      </w:pPr>
+      <w:r>
+        <w:rPr>
+          <w:b/>
+          <w:color w:val="1E293B"/>
+          <w:sz w:val="20"/>
+        </w:rPr>
+        <w:t xml:space="preserve">– Giai đoạn 5 (2013–2025) — [PHÊ PHÁN HẬU SNOWDEN]: </w:t>
+      </w:r>
+      <w:r>
+        <w:rPr>
+          <w:color w:val="334155"/>
+          <w:sz w:val="20"/>
+        </w:rPr>
+        <w:t>Tiết lộ của Snowden phơi bày năng lực thực tế của NSA: Kênh kề, cửa sau chuẩn mật mã, tấn công chuỗi cung ứng và giám sát siêu dữ liệu — bộc lộ khoảng cách giữa mô hình toán học và đối thủ thực tế.</w:t>
+      </w:r>
+    </w:p>
+    <w:p>
+      <w:pPr>
+        <w:spacing w:before="60" w:after="40"/>
+        <w:ind w:left="288"/>
+      </w:pPr>
+      <w:r>
+        <w:rPr>
+          <w:i/>
+          <w:color w:val="1E40AF"/>
+          <w:sz w:val="20"/>
+        </w:rPr>
+        <w:t>Lời thuyết minh tiếp nối: Dòng thời gian thể hiện quy luật biện chứng: Khi mật mã học nâng độ trừu tượng toán học lên đỉnh cao thì thực tiễn an ninh thế giới thực lại kéo ngành này trở về với các bài toán vật lý và thể chế.</w:t>
+      </w:r>
+    </w:p>
+    <w:p>
+      <w:pPr>
+        <w:spacing w:before="20" w:after="160"/>
+        <w:ind w:left="288"/>
+      </w:pPr>
+      <w:r>
+        <w:rPr>
+          <w:color w:val="94A3B8"/>
+          <w:sz w:val="18"/>
+        </w:rPr>
+        <w:t>• Ghi chú chân Slide: Sơ đồ tổng hợp dựa trên Section 3–6, Harry Halpin (2025), Journal of Cybersecurity, tr. 3–12.</w:t>
+      </w:r>
+    </w:p>
+    <w:p>
+      <w:pPr>
+        <w:spacing w:before="240" w:after="40"/>
       </w:pPr>
       <w:r>
         <w:rPr>
@@ -347,7 +930,7 @@
           <w:color w:val="1E40AF"/>
           <w:sz w:val="24"/>
         </w:rPr>
-        <w:t xml:space="preserve">► SLIDE 5: MÔ HÌNH TRUYỀN THÔNG SHANNON vs MẠNG PHỨC HỢP [SƠ ĐỒ 2: DRAW.IO] </w:t>
+        <w:t xml:space="preserve">► SLIDE 5: MÔ HÌNH TRUYỀN THÔNG CỦA SHANNON VÀ MẠNG THỰC TẾ </w:t>
       </w:r>
       <w:r>
         <w:rPr>
@@ -360,7 +943,23 @@
     </w:p>
     <w:p>
       <w:pPr>
-        <w:spacing w:before="40" w:after="80"/>
+        <w:spacing w:before="20" w:after="80"/>
+        <w:ind w:left="288"/>
+      </w:pPr>
+      <w:r>
+        <w:rPr>
+          <w:i/>
+          <w:color w:val="475569"/>
+          <w:sz w:val="19"/>
+        </w:rPr>
+        <w:t>• Tiêu đề phụ / Section trên Slide: SƠ ĐỒ 2: ĐỐI SÁNH MÔ HÌNH TRUYỀN THÔNG ĐIỂM-ĐIỂM VÀ MẠNG XÃ HỘI-KỸ THUẬT</w:t>
+        <w:br/>
+        <w:t xml:space="preserve">  Khoảng cách giữa mô hình điểm-điểm đóng kín của Shannon và mạng phức hợp không đồng nhất</w:t>
+      </w:r>
+    </w:p>
+    <w:p>
+      <w:pPr>
+        <w:spacing w:before="60" w:after="20"/>
         <w:ind w:left="288"/>
       </w:pPr>
       <w:r>
@@ -369,39 +968,81 @@
           <w:color w:val="0F172A"/>
           <w:sz w:val="21"/>
         </w:rPr>
-        <w:t>Nội dung trình bày:</w:t>
-        <w:br/>
-      </w:r>
-      <w:r>
-        <w:rPr>
-          <w:i w:val="0"/>
-          <w:color w:val="334155"/>
-          <w:sz w:val="21"/>
-        </w:rPr>
-        <w:t>"Sơ đồ 2 so sánh trực diện hai mô hình truyền thông:</w:t>
-        <w:br/>
-        <w:t>• Panel trái: Hệ thống bảo mật điểm-điểm cổ điển của Shannon (1949). Alice gửi bản rõ M mã hóa bằng khóa K qua kênh truyền đến Bob. Đối thủ Eve được mô hình hóa như một kẻ nghe lén thụ động (passive eavesdropper) trên đường truyền. Giới hạn là sự cô lập toán học, bỏ qua chi phí phân phối khóa bí mật và không bao quát các bề mặt tấn công vật lý.</w:t>
-        <w:br/>
-        <w:t>• Panel phải: Thực tế mạng xã hội - kỹ thuật phức hợp theo Halpin (2025). Hệ thống thông tin luân chuyển giữa Nhóm giữ bí mật (Secret Keepers) và Hạ tầng mở / ISP / Đám mây. Đối thủ thể chế là tác nhân toàn cục cả thụ động lẫn chủ động, tấn công qua 4 con đường thực tế: (1) Kênh kề thời gian/điện năng; (2) Giám sát siêu dữ liệu luồng gói tin; (3) Cài cắm cửa sau chuỗi cung ứng phần cứng; (4) Lỗi phản bội nội bộ Byzantine. Mục tiêu phòng thủ hiện đại vì thế phải chuyển dịch sang bảo vệ siêu dữ liệu và kháng kênh kề."</w:t>
+        <w:t>Nội dung đối sánh 2 Panel trên Sơ đồ:</w:t>
       </w:r>
     </w:p>
     <w:p>
       <w:pPr>
-        <w:spacing w:before="40" w:after="160"/>
-        <w:ind w:left="288"/>
-      </w:pPr>
-      <w:r>
-        <w:rPr>
-          <w:i/>
-          <w:color w:val="64748B"/>
-          <w:sz w:val="19"/>
-        </w:rPr>
-        <w:t>• Lưu ý trình bày: Thuyết minh bám sát sơ đồ draw.io đã nhúng trên slide, phân tích rõ sự tương phản giữa 2 bên.</w:t>
+        <w:spacing w:before="20" w:after="40"/>
+        <w:ind w:left="504"/>
+      </w:pPr>
+      <w:r>
+        <w:rPr>
+          <w:b/>
+          <w:color w:val="1E293B"/>
+          <w:sz w:val="20"/>
+        </w:rPr>
+        <w:t xml:space="preserve">– Panel Trái — Mô hình điểm-điểm cổ điển của Shannon (1949): </w:t>
+      </w:r>
+      <w:r>
+        <w:rPr>
+          <w:color w:val="334155"/>
+          <w:sz w:val="20"/>
+        </w:rPr>
+        <w:t>Alice gửi bản rõ M mã hóa bằng khóa K qua kênh truyền đến Bob. Đối thủ Eve chỉ là kẻ nghe lén thụ động (passive eavesdropper) trên đường truyền. Giới hạn: Trừu tượng hóa đối thủ trên kênh toán học độc lập, bỏ qua chi phí lưu trữ/phân phối khóa và không bao quát các bề mặt tấn công vật lý — chỉ phù hợp với liên lạc dây dẫn cô lập ban đầu.</w:t>
       </w:r>
     </w:p>
     <w:p>
       <w:pPr>
-        <w:spacing w:before="200" w:after="40"/>
+        <w:spacing w:before="20" w:after="40"/>
+        <w:ind w:left="504"/>
+      </w:pPr>
+      <w:r>
+        <w:rPr>
+          <w:b/>
+          <w:color w:val="1E293B"/>
+          <w:sz w:val="20"/>
+        </w:rPr>
+        <w:t xml:space="preserve">– Panel Phải — Mạng xã hội - kỹ thuật phức hợp theo Halpin (2025): </w:t>
+      </w:r>
+      <w:r>
+        <w:rPr>
+          <w:color w:val="334155"/>
+          <w:sz w:val="20"/>
+        </w:rPr>
+        <w:t>Thông tin luân chuyển giữa Nhóm giữ bí mật (Secret Keepers) và Hạ tầng mở / ISP / Đám mây. Đối thủ thể chế (NSA, Five Eyes) là tác nhân toàn cục cả thụ động lẫn chủ động, tấn công qua 4 con đường: (1) Kênh kề thời gian/điện năng; (2) Giám sát siêu dữ liệu luồng gói tin; (3) Cài cắm cửa sau chuỗi cung ứng; (4) Lỗi phản bội nội bộ Byzantine — đòi hỏi phòng thủ hiện đại phải bảo vệ cả siêu dữ liệu và kháng kênh kề.</w:t>
+      </w:r>
+    </w:p>
+    <w:p>
+      <w:pPr>
+        <w:spacing w:before="60" w:after="40"/>
+        <w:ind w:left="288"/>
+      </w:pPr>
+      <w:r>
+        <w:rPr>
+          <w:i/>
+          <w:color w:val="1E40AF"/>
+          <w:sz w:val="20"/>
+        </w:rPr>
+        <w:t>Lời thuyết minh tiếp nối: Sự đối sánh này làm rõ luận điểm của Halpin: An ninh không chỉ là mã hóa nội dung giữa hai điểm, mà là bảo vệ toàn bộ mạng xã hội và hạ tầng trước sự giám sát toàn cục.</w:t>
+      </w:r>
+    </w:p>
+    <w:p>
+      <w:pPr>
+        <w:spacing w:before="20" w:after="160"/>
+        <w:ind w:left="288"/>
+      </w:pPr>
+      <w:r>
+        <w:rPr>
+          <w:color w:val="94A3B8"/>
+          <w:sz w:val="18"/>
+        </w:rPr>
+        <w:t>• Ghi chú chân Slide: Sơ đồ tổng hợp dựa trên Shannon (1949) và Harry Halpin (2025), Journal of Cybersecurity, tr. 3–5.</w:t>
+      </w:r>
+    </w:p>
+    <w:p>
+      <w:pPr>
+        <w:spacing w:before="240" w:after="40"/>
       </w:pPr>
       <w:r>
         <w:rPr>
@@ -409,7 +1050,7 @@
           <w:color w:val="1E40AF"/>
           <w:sz w:val="24"/>
         </w:rPr>
-        <w:t xml:space="preserve">► SLIDE 6: BA MÔ HÌNH ĐỐI THỦ HÌNH THỨC TRONG MẬT MÃ HIỆN ĐẠI (SECTION 4) </w:t>
+        <w:t xml:space="preserve">► SLIDE 6: BA MÔ HÌNH ĐỐI THỦ HÌNH THỨC TRONG MẬT MÃ HIỆN ĐẠI </w:t>
       </w:r>
       <w:r>
         <w:rPr>
@@ -422,7 +1063,23 @@
     </w:p>
     <w:p>
       <w:pPr>
-        <w:spacing w:before="40" w:after="80"/>
+        <w:spacing w:before="20" w:after="80"/>
+        <w:ind w:left="288"/>
+      </w:pPr>
+      <w:r>
+        <w:rPr>
+          <w:i/>
+          <w:color w:val="475569"/>
+          <w:sz w:val="19"/>
+        </w:rPr>
+        <w:t>• Tiêu đề phụ / Section trên Slide: SECTION 4 — HÌNH THỨC HÓA ĐỐI THỦ (TRANG 5–8)</w:t>
+        <w:br/>
+        <w:t xml:space="preserve">  Tiến trình toán học hóa kẻ thù: Độ phức tạp tính toán đa thức, Logic kênh truyền và Tiên tri ngẫu nhiên</w:t>
+      </w:r>
+    </w:p>
+    <w:p>
+      <w:pPr>
+        <w:spacing w:before="60" w:after="20"/>
         <w:ind w:left="288"/>
       </w:pPr>
       <w:r>
@@ -431,41 +1088,256 @@
           <w:color w:val="0F172A"/>
           <w:sz w:val="21"/>
         </w:rPr>
-        <w:t>Nội dung trình bày:</w:t>
-        <w:br/>
-      </w:r>
-      <w:r>
-        <w:rPr>
-          <w:i w:val="0"/>
-          <w:color w:val="334155"/>
-          <w:sz w:val="21"/>
-        </w:rPr>
-        <w:t>"Section 4 của bài báo phân tích ba mô hình toán học hóa kẻ đối đầu nền tảng:</w:t>
-        <w:br/>
-        <w:t>1. Mô hình PPT Adversary (Goldwasser-Micali 1984): Đối thủ là thuật toán Turing xác suất chạy trong thời gian đa thức. An toàn được định nghĩa qua Trò chơi An ninh (Security Games), trong đó lợi thế đoán đúng của đối thủ phải là một hàm không đáng kể (negligible function). Chứng minh an toàn đạt được bằng phương pháp quy dẫn toán học về bài toán khó.</w:t>
-        <w:br/>
-        <w:t>2. Mô hình Dolev-Yao (1983): Kẻ thù kiểm soát hoàn toàn kênh mạng (có quyền nghe lén, chặn, sửa, xóa, phát lại thông điệp), nhưng xem mật mã học là 'hộp đen đại số hoàn hảo'. Đối thủ không thể bẻ khóa nếu không có khóa bí mật.</w:t>
-        <w:br/>
-        <w:t>3. Mô hình Tiên tri Ngẫu nhiên - ROM (Bellare-Rogaway 1993): Giả định hàm băm thực tế hoạt động như một hàm ngẫu nhiên lý tưởng để chứng minh an toàn hiệu năng cao. Tuy nhiên, về mặt triết học, không có hàm băm cụ thể nào (kể cả SHA-256) có thể tương đương toán học với một Random Oracle thực sự."</w:t>
+        <w:t>1. Mô Hình PPT Adversary — Goldwasser-Micali (1984):</w:t>
       </w:r>
     </w:p>
     <w:p>
       <w:pPr>
-        <w:spacing w:before="40" w:after="160"/>
-        <w:ind w:left="288"/>
-      </w:pPr>
-      <w:r>
-        <w:rPr>
-          <w:i/>
-          <w:color w:val="64748B"/>
-          <w:sz w:val="19"/>
-        </w:rPr>
-        <w:t>• Lưu ý trình bày: Định nghĩa chính xác 3 mô hình hình thức toán học cốt lõi.</w:t>
+        <w:spacing w:before="20" w:after="40"/>
+        <w:ind w:left="504"/>
+      </w:pPr>
+      <w:r>
+        <w:rPr>
+          <w:b/>
+          <w:color w:val="1E293B"/>
+          <w:sz w:val="20"/>
+        </w:rPr>
+        <w:t xml:space="preserve">– Khái niệm: </w:t>
+      </w:r>
+      <w:r>
+        <w:rPr>
+          <w:color w:val="334155"/>
+          <w:sz w:val="20"/>
+        </w:rPr>
+        <w:t>Đối thủ là thuật toán Turing xác suất chạy trong thời gian đa thức (Probabilistic Polynomial-Time) — giới hạn năng lực đối thủ ở mức khả thi tính toán.</w:t>
       </w:r>
     </w:p>
     <w:p>
       <w:pPr>
-        <w:spacing w:before="200" w:after="40"/>
+        <w:spacing w:before="20" w:after="40"/>
+        <w:ind w:left="504"/>
+      </w:pPr>
+      <w:r>
+        <w:rPr>
+          <w:b/>
+          <w:color w:val="1E293B"/>
+          <w:sz w:val="20"/>
+        </w:rPr>
+        <w:t xml:space="preserve">– Security Games: </w:t>
+      </w:r>
+      <w:r>
+        <w:rPr>
+          <w:color w:val="334155"/>
+          <w:sz w:val="20"/>
+        </w:rPr>
+        <w:t>Định nghĩa an toàn thông qua các trò chơi thách đấu. Lợi thế Adv(A) phải là hàm không đáng kể (negligible) — đối thủ không đoán tốt hơn ngẫu nhiên.</w:t>
+      </w:r>
+    </w:p>
+    <w:p>
+      <w:pPr>
+        <w:spacing w:before="20" w:after="40"/>
+        <w:ind w:left="504"/>
+      </w:pPr>
+      <w:r>
+        <w:rPr>
+          <w:b/>
+          <w:color w:val="1E293B"/>
+          <w:sz w:val="20"/>
+        </w:rPr>
+        <w:t xml:space="preserve">– Quy dẫn toán học: </w:t>
+      </w:r>
+      <w:r>
+        <w:rPr>
+          <w:color w:val="334155"/>
+          <w:sz w:val="20"/>
+        </w:rPr>
+        <w:t>Chứng minh an toàn bằng cách quy dẫn: bẻ gãy hệ mật tương đương giải bài toán khó (phân tích thừa số nguyên, logarit rời rạc) — gắn an toàn với giả thuyết toán học.</w:t>
+      </w:r>
+    </w:p>
+    <w:p>
+      <w:pPr>
+        <w:spacing w:before="60" w:after="20"/>
+        <w:ind w:left="288"/>
+      </w:pPr>
+      <w:r>
+        <w:rPr>
+          <w:b/>
+          <w:color w:val="0F172A"/>
+          <w:sz w:val="21"/>
+        </w:rPr>
+        <w:t>2. Mô Hình Đối Thủ Mạng Logic — Dolev-Yao (1983):</w:t>
+      </w:r>
+    </w:p>
+    <w:p>
+      <w:pPr>
+        <w:spacing w:before="20" w:after="40"/>
+        <w:ind w:left="504"/>
+      </w:pPr>
+      <w:r>
+        <w:rPr>
+          <w:b/>
+          <w:color w:val="1E293B"/>
+          <w:sz w:val="20"/>
+        </w:rPr>
+        <w:t xml:space="preserve">– Khái niệm: </w:t>
+      </w:r>
+      <w:r>
+        <w:rPr>
+          <w:color w:val="334155"/>
+          <w:sz w:val="20"/>
+        </w:rPr>
+        <w:t>Đối thủ kiểm soát toàn bộ kênh truyền mạng: có quyền đọc, chặn, sửa đổi, xóa, tráo đổi và phát lại gói tin — chuẩn an toàn cho mạng thù địch.</w:t>
+      </w:r>
+    </w:p>
+    <w:p>
+      <w:pPr>
+        <w:spacing w:before="20" w:after="40"/>
+        <w:ind w:left="504"/>
+      </w:pPr>
+      <w:r>
+        <w:rPr>
+          <w:b/>
+          <w:color w:val="1E293B"/>
+          <w:sz w:val="20"/>
+        </w:rPr>
+        <w:t xml:space="preserve">– Hộp đen mật mã: </w:t>
+      </w:r>
+      <w:r>
+        <w:rPr>
+          <w:color w:val="334155"/>
+          <w:sz w:val="20"/>
+        </w:rPr>
+        <w:t>Mô hình Dolev-Yao xem mật mã như các hàm đại số hoàn hảo (Perfect Black-box). Kẻ thù không thể giải mã nếu không có khóa — tách biệt logic mạng với thuật toán.</w:t>
+      </w:r>
+    </w:p>
+    <w:p>
+      <w:pPr>
+        <w:spacing w:before="20" w:after="40"/>
+        <w:ind w:left="504"/>
+      </w:pPr>
+      <w:r>
+        <w:rPr>
+          <w:b/>
+          <w:color w:val="1E293B"/>
+          <w:sz w:val="20"/>
+        </w:rPr>
+        <w:t xml:space="preserve">– Ứng dụng: </w:t>
+      </w:r>
+      <w:r>
+        <w:rPr>
+          <w:color w:val="334155"/>
+          <w:sz w:val="20"/>
+        </w:rPr>
+        <w:t>Kiểm chứng hình thức các giao thức mạng phức tạp thông qua các công cụ logic tự động — chứng minh tính đúng đắn khi trao đổi khóa.</w:t>
+      </w:r>
+    </w:p>
+    <w:p>
+      <w:pPr>
+        <w:spacing w:before="60" w:after="20"/>
+        <w:ind w:left="288"/>
+      </w:pPr>
+      <w:r>
+        <w:rPr>
+          <w:b/>
+          <w:color w:val="0F172A"/>
+          <w:sz w:val="21"/>
+        </w:rPr>
+        <w:t>3. Mô Hình Tiên Tri Ngẫu Nhiên — Bellare-Rogaway (1993):</w:t>
+      </w:r>
+    </w:p>
+    <w:p>
+      <w:pPr>
+        <w:spacing w:before="20" w:after="40"/>
+        <w:ind w:left="504"/>
+      </w:pPr>
+      <w:r>
+        <w:rPr>
+          <w:b/>
+          <w:color w:val="1E293B"/>
+          <w:sz w:val="20"/>
+        </w:rPr>
+        <w:t xml:space="preserve">– Khái niệm: </w:t>
+      </w:r>
+      <w:r>
+        <w:rPr>
+          <w:color w:val="334155"/>
+          <w:sz w:val="20"/>
+        </w:rPr>
+        <w:t>Giả định hàm băm thực tế hoạt động như một hàm ngẫu nhiên lý tưởng (Random Oracle Model - ROM) trả về chuỗi ngẫu nhiên đồng đều — mốc tham chiếu toán học lý tưởng.</w:t>
+      </w:r>
+    </w:p>
+    <w:p>
+      <w:pPr>
+        <w:spacing w:before="20" w:after="40"/>
+        <w:ind w:left="504"/>
+      </w:pPr>
+      <w:r>
+        <w:rPr>
+          <w:b/>
+          <w:color w:val="1E293B"/>
+          <w:sz w:val="20"/>
+        </w:rPr>
+        <w:t xml:space="preserve">– Vai trò thực tế: </w:t>
+      </w:r>
+      <w:r>
+        <w:rPr>
+          <w:color w:val="334155"/>
+          <w:sz w:val="20"/>
+        </w:rPr>
+        <w:t>Cho phép xây dựng các hệ mật khóa công khai và chữ ký số hiệu năng cao có chứng minh an toàn — thiết kế giao thức thực tế vận hành nhanh.</w:t>
+      </w:r>
+    </w:p>
+    <w:p>
+      <w:pPr>
+        <w:spacing w:before="20" w:after="40"/>
+        <w:ind w:left="504"/>
+      </w:pPr>
+      <w:r>
+        <w:rPr>
+          <w:b/>
+          <w:color w:val="1E293B"/>
+          <w:sz w:val="20"/>
+        </w:rPr>
+        <w:t xml:space="preserve">– Giới hạn triết học: </w:t>
+      </w:r>
+      <w:r>
+        <w:rPr>
+          <w:color w:val="334155"/>
+          <w:sz w:val="20"/>
+        </w:rPr>
+        <w:t>Trong thế giới thực, không có hàm băm cụ thể nào (kể cả SHA-256) có thể tương đương toán học với một Random Oracle thực sự — do mọi hàm băm thực tế đều có cấu trúc toán học xác định.</w:t>
+      </w:r>
+    </w:p>
+    <w:p>
+      <w:pPr>
+        <w:spacing w:before="60" w:after="40"/>
+        <w:ind w:left="288"/>
+      </w:pPr>
+      <w:r>
+        <w:rPr>
+          <w:i/>
+          <w:color w:val="1E40AF"/>
+          <w:sz w:val="20"/>
+        </w:rPr>
+        <w:t>Lời thuyết minh tiếp nối: Cả ba mô hình đều đem lại công cụ toán học mạnh mẽ, nhưng sự hoàn hảo của chúng dựa trên các giả định trừu tượng mà thế giới thực thường xuyên vi phạm.</w:t>
+      </w:r>
+    </w:p>
+    <w:p>
+      <w:pPr>
+        <w:spacing w:before="20" w:after="160"/>
+        <w:ind w:left="288"/>
+      </w:pPr>
+      <w:r>
+        <w:rPr>
+          <w:color w:val="94A3B8"/>
+          <w:sz w:val="18"/>
+        </w:rPr>
+        <w:t>• Ghi chú chân Slide: Trích dẫn: Goldwasser-Micali (1984); Dolev-Yao (1983); Bellare-Rogaway (1993); Halpin (2025), tr. 5–8.</w:t>
+      </w:r>
+    </w:p>
+    <w:p>
+      <w:pPr>
+        <w:spacing w:before="240" w:after="40"/>
       </w:pPr>
       <w:r>
         <w:rPr>
@@ -473,7 +1345,7 @@
           <w:color w:val="1E40AF"/>
           <w:sz w:val="24"/>
         </w:rPr>
-        <w:t xml:space="preserve">► SLIDE 7: GIỚI HẠN CỦA HÌNH THỨC HÓA &amp; THẾ GIỚI THỰC [SƠ ĐỒ 3] (SECTION 5) </w:t>
+        <w:t xml:space="preserve">► SLIDE 7: GIỚI HẠN CỦA SỰ HÌNH THỨC HÓA TRONG MẬT MÃ HỌC </w:t>
       </w:r>
       <w:r>
         <w:rPr>
@@ -486,7 +1358,23 @@
     </w:p>
     <w:p>
       <w:pPr>
-        <w:spacing w:before="40" w:after="80"/>
+        <w:spacing w:before="20" w:after="80"/>
+        <w:ind w:left="288"/>
+      </w:pPr>
+      <w:r>
+        <w:rPr>
+          <w:i/>
+          <w:color w:val="475569"/>
+          <w:sz w:val="19"/>
+        </w:rPr>
+        <w:t>• Tiêu đề phụ / Section trên Slide: SECTION 5 — GIỚI HẠN TRỪU TƯỢNG HÓA (TRANG 8–10)</w:t>
+        <w:br/>
+        <w:t xml:space="preserve">  Khoảng cách giữa các giả định toán học lý tưởng và thế giới vật lý thực tế</w:t>
+      </w:r>
+    </w:p>
+    <w:p>
+      <w:pPr>
+        <w:spacing w:before="60" w:after="20"/>
         <w:ind w:left="288"/>
       </w:pPr>
       <w:r>
@@ -495,41 +1383,123 @@
           <w:color w:val="0F172A"/>
           <w:sz w:val="21"/>
         </w:rPr>
-        <w:t>Nội dung trình bày:</w:t>
-        <w:br/>
-      </w:r>
-      <w:r>
-        <w:rPr>
-          <w:i w:val="0"/>
-          <w:color w:val="334155"/>
-          <w:sz w:val="21"/>
-        </w:rPr>
-        <w:t>"Section 5 của Halpin nêu bật các giới hạn thực tế mà các mô hình toán học trừu tượng bỏ sót:</w:t>
-        <w:br/>
-        <w:t>• Tấn công kênh kề (Side-channel attacks): Paul Kocher (1996) chứng minh việc đo đạc thời gian thực thi, bức xạ điện từ và tiêu thụ điện năng có thể khôi phục khóa mã mà không cần bẻ gãy thuật toán toán học.</w:t>
-        <w:br/>
-        <w:t>• Rò rỉ qua độ dài bản mã và siêu dữ liệu: Các giao thức như HTTPS, SSH vẫn làm lộ kích thước thông điệp và siêu dữ liệu luồng truyền thông, cho phép đối thủ suy đoán nội dung truyền tải.</w:t>
-        <w:br/>
-        <w:t>• Phê phán của Ross Anderson (2001): Đại đa số hệ thống an ninh thất bại trong thực tế không phải do thuật toán mật mã bị bẻ gãy, mà do lỗi quản lý khóa, lỗi giao thức, lỗi giao diện người dùng, cấu hình sai và tấn công kỹ nghệ xã hội (Social Engineering)."</w:t>
+        <w:t>Tiến trình 4 bước từ Giả định đến Thực tế:</w:t>
       </w:r>
     </w:p>
     <w:p>
       <w:pPr>
-        <w:spacing w:before="40" w:after="160"/>
-        <w:ind w:left="288"/>
-      </w:pPr>
-      <w:r>
-        <w:rPr>
-          <w:i/>
-          <w:color w:val="64748B"/>
-          <w:sz w:val="19"/>
-        </w:rPr>
-        <w:t>• Lưu ý trình bày: Không gán Node-Leaf Confusion cho Halpin tại slide này. Tập trung vào Kocher, rò rỉ độ dài và Anderson.</w:t>
+        <w:spacing w:before="20" w:after="40"/>
+        <w:ind w:left="504"/>
+      </w:pPr>
+      <w:r>
+        <w:rPr>
+          <w:b/>
+          <w:color w:val="1E293B"/>
+          <w:sz w:val="20"/>
+        </w:rPr>
+        <w:t xml:space="preserve">– BƯỚC 1: GIẢ ĐỊNH TOÁN HỌC HÌNH THỨC: </w:t>
+      </w:r>
+      <w:r>
+        <w:rPr>
+          <w:color w:val="334155"/>
+          <w:sz w:val="20"/>
+        </w:rPr>
+        <w:t>Hộp đen mật mã lý tưởng, thời gian thực thi là vô hình, độ dài bản mã công khai không rò rỉ nội dung, kênh truyền điểm-điểm độc lập — thế giới phẳng hoàn hảo trên chứng minh giấy tờ.</w:t>
       </w:r>
     </w:p>
     <w:p>
       <w:pPr>
-        <w:spacing w:before="200" w:after="40"/>
+        <w:spacing w:before="20" w:after="40"/>
+        <w:ind w:left="504"/>
+      </w:pPr>
+      <w:r>
+        <w:rPr>
+          <w:b/>
+          <w:color w:val="1E293B"/>
+          <w:sz w:val="20"/>
+        </w:rPr>
+        <w:t xml:space="preserve">– BƯỚC 2: CÁC YẾU TỐ VẬT LÝ BỊ TRỪU TƯỢNG HÓA LƯỢC BỎ: </w:t>
+      </w:r>
+      <w:r>
+        <w:rPr>
+          <w:color w:val="334155"/>
+          <w:sz w:val="20"/>
+        </w:rPr>
+        <w:t>Thời gian vi xử lý CPU, dao động điện năng tiêu thụ, phát xạ điện từ, kiến trúc bộ nhớ đệm (Cache), lỗi lập trình phần mềm — các hiện tượng vật lý tất yếu khi chạy trên phần cứng.</w:t>
+      </w:r>
+    </w:p>
+    <w:p>
+      <w:pPr>
+        <w:spacing w:before="20" w:after="40"/>
+        <w:ind w:left="504"/>
+      </w:pPr>
+      <w:r>
+        <w:rPr>
+          <w:b/>
+          <w:color w:val="1E293B"/>
+          <w:sz w:val="20"/>
+        </w:rPr>
+        <w:t xml:space="preserve">– BƯỚC 3: CON ĐƯỜNG KHAI THÁC CỦA ĐỐI THỦ THẾ GIỚI THỰC: </w:t>
+      </w:r>
+      <w:r>
+        <w:rPr>
+          <w:color w:val="334155"/>
+          <w:sz w:val="20"/>
+        </w:rPr>
+        <w:t>Tấn công kênh kề (Timing Attack - Kocher 1996), phân tích độ dài và lưu lượng siêu dữ liệu (Traffic Analysis), khai thác lỗi cài đặt phần mềm và quản lý (Anderson 2001) — kẻ thù chiếm ưu thế mà không cần bẻ gãy toán học.</w:t>
+      </w:r>
+    </w:p>
+    <w:p>
+      <w:pPr>
+        <w:spacing w:before="20" w:after="40"/>
+        <w:ind w:left="504"/>
+      </w:pPr>
+      <w:r>
+        <w:rPr>
+          <w:b/>
+          <w:color w:val="1E293B"/>
+          <w:sz w:val="20"/>
+        </w:rPr>
+        <w:t xml:space="preserve">– BƯỚC 4: KẾT LUẬN NHẬN THỨC LUẬN CỦA HARRY HALPIN: </w:t>
+      </w:r>
+      <w:r>
+        <w:rPr>
+          <w:color w:val="334155"/>
+          <w:sz w:val="20"/>
+        </w:rPr>
+        <w:t>Cái giá của sự trừu tượng hóa là làm cho mật mã học mù quáng trước chính những năng lực thực tế của đối thủ nằm ngoài mô hình lý thuyết — buộc an ninh mạng phải mở rộng ra kiểm định thực nghiệm.</w:t>
+      </w:r>
+    </w:p>
+    <w:p>
+      <w:pPr>
+        <w:spacing w:before="60" w:after="40"/>
+        <w:ind w:left="288"/>
+      </w:pPr>
+      <w:r>
+        <w:rPr>
+          <w:i/>
+          <w:color w:val="1E40AF"/>
+          <w:sz w:val="20"/>
+        </w:rPr>
+        <w:t>Lời thuyết minh tiếp nối: Sơ đồ 4 bước này khẳng định luận điểm cốt tử của Section 5: Hệ thống an toàn trên giấy tờ toán học hoàn toàn có thể bị đánh bại bởi các kênh vật lý bên ngoài mô hình.</w:t>
+      </w:r>
+    </w:p>
+    <w:p>
+      <w:pPr>
+        <w:spacing w:before="20" w:after="160"/>
+        <w:ind w:left="288"/>
+      </w:pPr>
+      <w:r>
+        <w:rPr>
+          <w:color w:val="94A3B8"/>
+          <w:sz w:val="18"/>
+        </w:rPr>
+        <w:t>• Ghi chú chân Slide: Sơ đồ tổng hợp dựa trên Kocher (1996) và Halpin (2025), Section 5, tr. 8–10.</w:t>
+      </w:r>
+    </w:p>
+    <w:p>
+      <w:pPr>
+        <w:spacing w:before="240" w:after="40"/>
       </w:pPr>
       <w:r>
         <w:rPr>
@@ -537,7 +1507,7 @@
           <w:color w:val="1E40AF"/>
           <w:sz w:val="24"/>
         </w:rPr>
-        <w:t xml:space="preserve">► SLIDE 8: TIẾT LỘ CỦA SNOWDEN &amp; ĐỐI THỦ THỂ CHẾ NSA (SECTION 6) </w:t>
+        <w:t xml:space="preserve">► SLIDE 8: SNOWDEN VÀ ĐỐI THỦ THỂ CHẾ (THE REAL ADVERSARY) </w:t>
       </w:r>
       <w:r>
         <w:rPr>
@@ -550,7 +1520,23 @@
     </w:p>
     <w:p>
       <w:pPr>
-        <w:spacing w:before="40" w:after="80"/>
+        <w:spacing w:before="20" w:after="80"/>
+        <w:ind w:left="288"/>
+      </w:pPr>
+      <w:r>
+        <w:rPr>
+          <w:i/>
+          <w:color w:val="475569"/>
+          <w:sz w:val="19"/>
+        </w:rPr>
+        <w:t>• Tiêu đề phụ / Section trên Slide: SECTION 6 — TIẾT LỘ CỦA SNOWDEN (TRANG 10–12)</w:t>
+        <w:br/>
+        <w:t xml:space="preserve">  Khủng hoảng mô hình an ninh trước đối thủ giám sát hàng loạt quy mô quốc gia</w:t>
+      </w:r>
+    </w:p>
+    <w:p>
+      <w:pPr>
+        <w:spacing w:before="60" w:after="20"/>
         <w:ind w:left="288"/>
       </w:pPr>
       <w:r>
@@ -559,41 +1545,256 @@
           <w:color w:val="0F172A"/>
           <w:sz w:val="21"/>
         </w:rPr>
-        <w:t>Nội dung trình bày:</w:t>
-        <w:br/>
-      </w:r>
-      <w:r>
-        <w:rPr>
-          <w:i w:val="0"/>
-          <w:color w:val="334155"/>
-          <w:sz w:val="21"/>
-        </w:rPr>
-        <w:t>"Section 6 của Halpin mổ xẻ bước ngoặt lịch sử năm 2013 từ tài liệu Edward Snowden:</w:t>
-        <w:br/>
-        <w:t>• Phơi bày năng lực thực sự của đối thủ thể chế (NSA và liên minh Five Eyes): Ngân sách khổng lồ, năng lực giám sát cáp quang biển toàn cầu (chương trình PRISM, MUSCULAR).</w:t>
-        <w:br/>
-        <w:t>• Can thiệp tiêu chuẩn mật mã học: Điển hình là vụ việc cài cửa sau vào bộ sinh số ngẫu nhiên Dual_EC_DRBG được chuẩn hóa bởi NIST, cho phép cơ quan tình báo tính toán trước khóa bí mật.</w:t>
-        <w:br/>
-        <w:t>• Bài học nhận thức luận: An toàn mật mã không chỉ là bài toán giữa Alice, Bob và Eve trong phòng thí nghiệm; an toàn hệ thống phải chịu đựng được áp lực từ các thực thể có nguồn lực tài chính, chính trị và công nghệ quy mô nhà nước."</w:t>
+        <w:t>1. Khủng Hoảng Thực Tiễn — Tiết lộ Snowden (2013):</w:t>
       </w:r>
     </w:p>
     <w:p>
       <w:pPr>
-        <w:spacing w:before="40" w:after="160"/>
-        <w:ind w:left="288"/>
-      </w:pPr>
-      <w:r>
-        <w:rPr>
-          <w:i/>
-          <w:color w:val="64748B"/>
-          <w:sz w:val="19"/>
-        </w:rPr>
-        <w:t>• Lưu ý trình bày: Nhấn mạnh ý nghĩa lịch sử của sự kiện Snowden đối với nhận thức luận an ninh.</w:t>
+        <w:spacing w:before="20" w:after="40"/>
+        <w:ind w:left="504"/>
+      </w:pPr>
+      <w:r>
+        <w:rPr>
+          <w:b/>
+          <w:color w:val="1E293B"/>
+          <w:sz w:val="20"/>
+        </w:rPr>
+        <w:t xml:space="preserve">– Sự kiện bước ngoặt: </w:t>
+      </w:r>
+      <w:r>
+        <w:rPr>
+          <w:color w:val="334155"/>
+          <w:sz w:val="20"/>
+        </w:rPr>
+        <w:t>Các tài liệu Edward Snowden tiết lộ về NSA đã kéo mật mã học vào một cuộc khủng hoảng thực tiễn sâu sắc — làm lung lay niềm tin vào sự an toàn tuyệt đối của chuẩn mật mã.</w:t>
       </w:r>
     </w:p>
     <w:p>
       <w:pPr>
-        <w:spacing w:before="200" w:after="40"/>
+        <w:spacing w:before="20" w:after="40"/>
+        <w:ind w:left="504"/>
+      </w:pPr>
+      <w:r>
+        <w:rPr>
+          <w:b/>
+          <w:color w:val="1E293B"/>
+          <w:sz w:val="20"/>
+        </w:rPr>
+        <w:t xml:space="preserve">– Không phá toán học: </w:t>
+      </w:r>
+      <w:r>
+        <w:rPr>
+          <w:color w:val="334155"/>
+          <w:sz w:val="20"/>
+        </w:rPr>
+        <w:t>NSA không cần giải các bài toán toán học khó của RSA hay AES mà tấn công trực tiếp vào toàn bộ hệ sinh thái xung quanh — bằng cách đánh cắp khóa và trích xuất siêu dữ liệu.</w:t>
+      </w:r>
+    </w:p>
+    <w:p>
+      <w:pPr>
+        <w:spacing w:before="20" w:after="40"/>
+        <w:ind w:left="504"/>
+      </w:pPr>
+      <w:r>
+        <w:rPr>
+          <w:b/>
+          <w:color w:val="1E293B"/>
+          <w:sz w:val="20"/>
+        </w:rPr>
+        <w:t xml:space="preserve">– Mô hình thực tế: </w:t>
+      </w:r>
+      <w:r>
+        <w:rPr>
+          <w:color w:val="334155"/>
+          <w:sz w:val="20"/>
+        </w:rPr>
+        <w:t>Đối thủ bị động toàn cầu (Global Passive Adversary) và tấn công can thiệp vào đường truyền là mối đe dọa hoàn toàn có thật — vượt ngoài khuôn khổ bảo mật điểm-điểm.</w:t>
+      </w:r>
+    </w:p>
+    <w:p>
+      <w:pPr>
+        <w:spacing w:before="60" w:after="20"/>
+        <w:ind w:left="288"/>
+      </w:pPr>
+      <w:r>
+        <w:rPr>
+          <w:b/>
+          <w:color w:val="0F172A"/>
+          <w:sz w:val="21"/>
+        </w:rPr>
+        <w:t>2. Năng Lực Đối Thủ Thể Chế — Vượt ngoài hình thức:</w:t>
+      </w:r>
+    </w:p>
+    <w:p>
+      <w:pPr>
+        <w:spacing w:before="20" w:after="40"/>
+        <w:ind w:left="504"/>
+      </w:pPr>
+      <w:r>
+        <w:rPr>
+          <w:b/>
+          <w:color w:val="1E293B"/>
+          <w:sz w:val="20"/>
+        </w:rPr>
+        <w:t xml:space="preserve">– Giám sát Siêu dữ liệu: </w:t>
+      </w:r>
+      <w:r>
+        <w:rPr>
+          <w:color w:val="334155"/>
+          <w:sz w:val="20"/>
+        </w:rPr>
+        <w:t>NSA tập trung khai thác Metadata (ai liên lạc với ai, thời gian, kích thước) để dựng lại mạng xã hội mà không cần bẻ khóa bản mã — khẳng định siêu dữ liệu nguy hiểm ngang nội dung.</w:t>
+      </w:r>
+    </w:p>
+    <w:p>
+      <w:pPr>
+        <w:spacing w:before="20" w:after="40"/>
+        <w:ind w:left="504"/>
+      </w:pPr>
+      <w:r>
+        <w:rPr>
+          <w:b/>
+          <w:color w:val="1E293B"/>
+          <w:sz w:val="20"/>
+        </w:rPr>
+        <w:t xml:space="preserve">– Tấn công Chuỗi cung ứng: </w:t>
+      </w:r>
+      <w:r>
+        <w:rPr>
+          <w:color w:val="334155"/>
+          <w:sz w:val="20"/>
+        </w:rPr>
+        <w:t>Chèn cửa sau vào phần cứng, làm suy yếu chuẩn mật mã quốc tế (tiêu chuẩn NIST Dual_EC_DRBG bị cài cửa sau ngầm) — làm xói mòn lòng tin vào cơ quan tiêu chuẩn hóa.</w:t>
+      </w:r>
+    </w:p>
+    <w:p>
+      <w:pPr>
+        <w:spacing w:before="20" w:after="40"/>
+        <w:ind w:left="504"/>
+      </w:pPr>
+      <w:r>
+        <w:rPr>
+          <w:b/>
+          <w:color w:val="1E293B"/>
+          <w:sz w:val="20"/>
+        </w:rPr>
+        <w:t xml:space="preserve">– Áp lực Thể chế: </w:t>
+      </w:r>
+      <w:r>
+        <w:rPr>
+          <w:color w:val="334155"/>
+          <w:sz w:val="20"/>
+        </w:rPr>
+        <w:t>Cưỡng chế pháp lý các tập đoàn công nghệ lớn bàn giao khóa bí mật và quyền truy cập dữ liệu máy chủ — biến rào cản kỹ thuật thành thỏa hiệp pháp lý kín.</w:t>
+      </w:r>
+    </w:p>
+    <w:p>
+      <w:pPr>
+        <w:spacing w:before="60" w:after="20"/>
+        <w:ind w:left="288"/>
+      </w:pPr>
+      <w:r>
+        <w:rPr>
+          <w:b/>
+          <w:color w:val="0F172A"/>
+          <w:sz w:val="21"/>
+        </w:rPr>
+        <w:t>3. Tính Tương Đối Của Kẻ Thù — Bản chất nhận thức luận:</w:t>
+      </w:r>
+    </w:p>
+    <w:p>
+      <w:pPr>
+        <w:spacing w:before="20" w:after="40"/>
+        <w:ind w:left="504"/>
+      </w:pPr>
+      <w:r>
+        <w:rPr>
+          <w:b/>
+          <w:color w:val="1E293B"/>
+          <w:sz w:val="20"/>
+        </w:rPr>
+        <w:t xml:space="preserve">– Khái niệm tương đối: </w:t>
+      </w:r>
+      <w:r>
+        <w:rPr>
+          <w:color w:val="334155"/>
+          <w:sz w:val="20"/>
+        </w:rPr>
+        <w:t>Khái niệm 'Kẻ thù' mang tính vị thế: Đối với người dân, NSA là đối thủ giám sát; nhưng đối với NSA, Snowden lại là đối thủ làm rò rỉ bí mật — an ninh luôn gắn với góc nhìn quyền lực.</w:t>
+      </w:r>
+    </w:p>
+    <w:p>
+      <w:pPr>
+        <w:spacing w:before="20" w:after="40"/>
+        <w:ind w:left="504"/>
+      </w:pPr>
+      <w:r>
+        <w:rPr>
+          <w:b/>
+          <w:color w:val="1E293B"/>
+          <w:sz w:val="20"/>
+        </w:rPr>
+        <w:t xml:space="preserve">– Dân chủ hóa mật mã: </w:t>
+      </w:r>
+      <w:r>
+        <w:rPr>
+          <w:color w:val="334155"/>
+          <w:sz w:val="20"/>
+        </w:rPr>
+        <w:t>Mật mã khóa công khai từng giúp cá nhân tự vệ, nhưng công cụ gián điệp của NSA nay đã lan rộng sang tội phạm mạng và các nhóm phi nhà nước — tạo thế trận đối kháng đa cực.</w:t>
+      </w:r>
+    </w:p>
+    <w:p>
+      <w:pPr>
+        <w:spacing w:before="20" w:after="40"/>
+        <w:ind w:left="504"/>
+      </w:pPr>
+      <w:r>
+        <w:rPr>
+          <w:b/>
+          <w:color w:val="1E293B"/>
+          <w:sz w:val="20"/>
+        </w:rPr>
+        <w:t xml:space="preserve">– Hệ quả khoa học: </w:t>
+      </w:r>
+      <w:r>
+        <w:rPr>
+          <w:color w:val="334155"/>
+          <w:sz w:val="20"/>
+        </w:rPr>
+        <w:t>Mật mã học buộc phải từ bỏ giả định kênh truyền sạch để nghiên cứu phòng chống cửa sau (Cliptography) — xây dựng hệ thống an toàn ngay cả khi thuật toán bị cài cắm ngầm.</w:t>
+      </w:r>
+    </w:p>
+    <w:p>
+      <w:pPr>
+        <w:spacing w:before="60" w:after="40"/>
+        <w:ind w:left="288"/>
+      </w:pPr>
+      <w:r>
+        <w:rPr>
+          <w:i/>
+          <w:color w:val="1E40AF"/>
+          <w:sz w:val="20"/>
+        </w:rPr>
+        <w:t>Lời thuyết minh tiếp nối: Sự kiện Snowden chứng minh rằng đối thủ thế giới thực không phải là các thuật toán trừu tượng mà là các thể chế quyền lực có nguồn lực tài chính, chính trị và kỹ thuật gần như không giới hạn.</w:t>
+      </w:r>
+    </w:p>
+    <w:p>
+      <w:pPr>
+        <w:spacing w:before="20" w:after="160"/>
+        <w:ind w:left="288"/>
+      </w:pPr>
+      <w:r>
+        <w:rPr>
+          <w:color w:val="94A3B8"/>
+          <w:sz w:val="18"/>
+        </w:rPr>
+        <w:t>• Ghi chú chân Slide: Trích dẫn: Harry Halpin (2025), Section 6: Snowden and the real adversary, tr. 10–12.</w:t>
+      </w:r>
+    </w:p>
+    <w:p>
+      <w:pPr>
+        <w:spacing w:before="240" w:after="40"/>
       </w:pPr>
       <w:r>
         <w:rPr>
@@ -601,7 +1802,7 @@
           <w:color w:val="1E40AF"/>
           <w:sz w:val="24"/>
         </w:rPr>
-        <w:t xml:space="preserve">► SLIDE 9: BỐN CÂU HỎI NGHIÊN CỨU TƯƠNG LAI CỦA HALPIN (RQ1–RQ4) </w:t>
+        <w:t xml:space="preserve">► SLIDE 9: CHƯƠNG TRÌNH NGHIÊN CỨU TƯƠNG LAI: BỐN CÂU HỎI MỞ </w:t>
       </w:r>
       <w:r>
         <w:rPr>
@@ -614,7 +1815,23 @@
     </w:p>
     <w:p>
       <w:pPr>
-        <w:spacing w:before="40" w:after="80"/>
+        <w:spacing w:before="20" w:after="80"/>
+        <w:ind w:left="288"/>
+      </w:pPr>
+      <w:r>
+        <w:rPr>
+          <w:i/>
+          <w:color w:val="475569"/>
+          <w:sz w:val="19"/>
+        </w:rPr>
+        <w:t>• Tiêu đề phụ / Section trên Slide: SECTION 7 — KẾT LUẬN &amp; CHƯƠNG TRÌNH NGHIÊN CỨU (TRANG 12–14)</w:t>
+        <w:br/>
+        <w:t xml:space="preserve">  Đề xuất hòa giải giữa trừu tượng hóa toán học và dữ liệu thực nghiệm thế giới thực</w:t>
+      </w:r>
+    </w:p>
+    <w:p>
+      <w:pPr>
+        <w:spacing w:before="60" w:after="20"/>
         <w:ind w:left="288"/>
       </w:pPr>
       <w:r>
@@ -623,43 +1840,123 @@
           <w:color w:val="0F172A"/>
           <w:sz w:val="21"/>
         </w:rPr>
-        <w:t>Nội dung trình bày:</w:t>
-        <w:br/>
-      </w:r>
-      <w:r>
-        <w:rPr>
-          <w:i w:val="0"/>
-          <w:color w:val="334155"/>
-          <w:sz w:val="21"/>
-        </w:rPr>
-        <w:t>"Halpin khép lại phần lý thuyết bằng việc đề xuất 4 câu hỏi nghiên cứu mở định hình tương lai:</w:t>
-        <w:br/>
-        <w:t>• RQ1 (Triết học khoa học): Làm thế nào để xây dựng một phương pháp luận khoa học an ninh hoàn chỉnh, tích hợp cả chứng minh toán học hình thức lẫn kiểm định thực nghiệm vật lý?</w:t>
-        <w:br/>
-        <w:t>• RQ2 (Bản thể học Kẻ thù): Liệu có thể xây dựng một bản thể học hình thức thống nhất về Đối thủ, bao gồm cả rò rỉ kênh kề, suy thoái phần cứng và lỗi Byzantine nội bộ?</w:t>
-        <w:br/>
-        <w:t>• RQ3 (Giám sát Siêu dữ liệu &amp; Mixnet): Làm thế nào để thiết kế các kiến trúc định tuyến ẩn danh (như Nym, Tor) bảo vệ siêu dữ liệu trước đối thủ toàn cục kiểm soát hạ tầng mạng?</w:t>
-        <w:br/>
-        <w:t>• RQ4 (Chính trị học Mật mã): Mật mã học định hình lại cấu trúc quyền lực và tự do dân sự trong kỷ nguyên số như thế nào?"</w:t>
+        <w:t>Bốn câu hỏi nghiên cứu mở nguyên văn từ Halpin:</w:t>
       </w:r>
     </w:p>
     <w:p>
       <w:pPr>
-        <w:spacing w:before="40" w:after="160"/>
-        <w:ind w:left="288"/>
-      </w:pPr>
-      <w:r>
-        <w:rPr>
-          <w:i/>
-          <w:color w:val="64748B"/>
-          <w:sz w:val="19"/>
-        </w:rPr>
-        <w:t>• Lưu ý trình bày: Trình bày cô đọng 4 câu hỏi nghiên cứu lớn của tác giả.</w:t>
+        <w:spacing w:before="20" w:after="40"/>
+        <w:ind w:left="504"/>
+      </w:pPr>
+      <w:r>
+        <w:rPr>
+          <w:b/>
+          <w:color w:val="1E293B"/>
+          <w:sz w:val="20"/>
+        </w:rPr>
+        <w:t xml:space="preserve">– Câu hỏi 1: Mạng Xã Hội Động của Truyền Thông Bí Mật: </w:t>
+      </w:r>
+      <w:r>
+        <w:rPr>
+          <w:color w:val="334155"/>
+          <w:sz w:val="20"/>
+        </w:rPr>
+        <w:t>"Can we study dynamic social networks of secret communication modeled on the empirical behavior of secret keepers?" — Nghiên cứu tổ chức thông tin dưới dạng mạng xã hội động giữa những người giữ bí mật. Kiểm tra xem các bất biến chính sách bảo vệ bí mật có được duy trì qua các biến động cấu trúc mạng và các sự cố Byzantine hay không — giúp an ninh thích ứng linh hoạt trước thay đổi tác nhân.</w:t>
       </w:r>
     </w:p>
     <w:p>
       <w:pPr>
-        <w:spacing w:before="200" w:after="40"/>
+        <w:spacing w:before="20" w:after="40"/>
+        <w:ind w:left="504"/>
+      </w:pPr>
+      <w:r>
+        <w:rPr>
+          <w:b/>
+          <w:color w:val="1E293B"/>
+          <w:sz w:val="20"/>
+        </w:rPr>
+        <w:t xml:space="preserve">– Câu hỏi 2: Mô Hình Hóa Năng Lực và Liên Minh Đối Thủ Bằng Thống Kê: </w:t>
+      </w:r>
+      <w:r>
+        <w:rPr>
+          <w:color w:val="334155"/>
+          <w:sz w:val="20"/>
+        </w:rPr>
+        <w:t>"By incorporating statistics, can new models of the adversary take into account more accurate data about their capabilities?" — Sử dụng thống kê thực nghiệm và mô phỏng Monte Carlo để mô hình hóa chính xác hơn năng lực đối thủ; phân tích kinh tế chính trị của các liên minh giám sát (Five Eyes, Anonymous) — lượng hóa nguy cơ bằng dữ liệu định lượng thực tế.</w:t>
+      </w:r>
+    </w:p>
+    <w:p>
+      <w:pPr>
+        <w:spacing w:before="20" w:after="40"/>
+        <w:ind w:left="504"/>
+      </w:pPr>
+      <w:r>
+        <w:rPr>
+          <w:b/>
+          <w:color w:val="1E293B"/>
+          <w:sz w:val="20"/>
+        </w:rPr>
+        <w:t xml:space="preserve">– Câu hỏi 3: Ứng Dụng Phương Pháp Liên Ngành &amp; Hệ Thống Phức Hợp: </w:t>
+      </w:r>
+      <w:r>
+        <w:rPr>
+          <w:color w:val="334155"/>
+          <w:sz w:val="20"/>
+        </w:rPr>
+        <w:t>"Can cryptography incorporate interdisciplinary methods and insights that can capture the complexity of secure communication?" — Áp dụng các công cụ từ lý thuyết hệ thống phức hợp, động lực học mạng và dịch tễ học để mô hình hóa sự lan truyền thông tin, nhận diện các điểm chuyển pha khi bị tấn công — mở rộng mật mã sang khoa học tự nhiên.</w:t>
+      </w:r>
+    </w:p>
+    <w:p>
+      <w:pPr>
+        <w:spacing w:before="20" w:after="40"/>
+        <w:ind w:left="504"/>
+      </w:pPr>
+      <w:r>
+        <w:rPr>
+          <w:b/>
+          <w:color w:val="1E293B"/>
+          <w:sz w:val="20"/>
+        </w:rPr>
+        <w:t xml:space="preserve">– Câu hỏi 4: Triết Học Giúp Tái Cấu Trúc Các Giả Định Ngầm Định: </w:t>
+      </w:r>
+      <w:r>
+        <w:rPr>
+          <w:color w:val="334155"/>
+          <w:sz w:val="20"/>
+        </w:rPr>
+        <w:t>"Will philosophy let us make explicit and then reformulate the hidden assumptions of cryptographic communication, and vice versa?" — Vận dụng triết học để chất vấn các giả định nền tảng của Shannon; xem xét ranh giới động giữa con người và môi trường kỹ thuật số theo Giả thuyết Tâm trí Mở rộng (Extended Mind Hypothesis) — tái cấu trúc nhận thức luận về an toàn thông tin.</w:t>
+      </w:r>
+    </w:p>
+    <w:p>
+      <w:pPr>
+        <w:spacing w:before="60" w:after="40"/>
+        <w:ind w:left="288"/>
+      </w:pPr>
+      <w:r>
+        <w:rPr>
+          <w:i/>
+          <w:color w:val="1E40AF"/>
+          <w:sz w:val="20"/>
+        </w:rPr>
+        <w:t>Lời thuyết minh tiếp nối: 4 câu hỏi này là bản thiết kế mở cho tương lai, định hướng mật mã học chuyển mình thành một khoa học an ninh toàn diện và thực nghiệm.</w:t>
+      </w:r>
+    </w:p>
+    <w:p>
+      <w:pPr>
+        <w:spacing w:before="20" w:after="160"/>
+        <w:ind w:left="288"/>
+      </w:pPr>
+      <w:r>
+        <w:rPr>
+          <w:color w:val="94A3B8"/>
+          <w:sz w:val="18"/>
+        </w:rPr>
+        <w:t>• Ghi chú chân Slide: Trích dẫn nguyên văn 4 câu hỏi nghiên cứu mở: Harry Halpin (2025), Section 7, tr. 12–14.</w:t>
+      </w:r>
+    </w:p>
+    <w:p>
+      <w:pPr>
+        <w:spacing w:before="240" w:after="40"/>
       </w:pPr>
       <w:r>
         <w:rPr>
@@ -667,7 +1964,7 @@
           <w:color w:val="1E40AF"/>
           <w:sz w:val="24"/>
         </w:rPr>
-        <w:t xml:space="preserve">► SLIDE 10: PHÂN TÍCH PHƯƠNG PHÁP LUẬN &amp; GIỚI HẠN TÁI LẬP </w:t>
+        <w:t xml:space="preserve">► SLIDE 10: PHƯƠNG PHÁP LUẬN &amp; KHẢ NĂNG TÁI LẬP BÀI BÁO </w:t>
       </w:r>
       <w:r>
         <w:rPr>
@@ -680,7 +1977,23 @@
     </w:p>
     <w:p>
       <w:pPr>
-        <w:spacing w:before="40" w:after="80"/>
+        <w:spacing w:before="20" w:after="80"/>
+        <w:ind w:left="288"/>
+      </w:pPr>
+      <w:r>
+        <w:rPr>
+          <w:i/>
+          <w:color w:val="475569"/>
+          <w:sz w:val="19"/>
+        </w:rPr>
+        <w:t>• Tiêu đề phụ / Section trên Slide: ĐÁNH GIÁ PHƯƠNG PHÁP LUẬN &amp; HƯỚNG TIẾP CẬN THỰC NGHIỆM</w:t>
+        <w:br/>
+        <w:t xml:space="preserve">  Làm rõ tính khả thi tái lập đối với một công trình triết học và định hướng thí nghiệm độc lập</w:t>
+      </w:r>
+    </w:p>
+    <w:p>
+      <w:pPr>
+        <w:spacing w:before="60" w:after="20"/>
         <w:ind w:left="288"/>
       </w:pPr>
       <w:r>
@@ -689,41 +2002,221 @@
           <w:color w:val="0F172A"/>
           <w:sz w:val="21"/>
         </w:rPr>
-        <w:t>Nội dung trình bày:</w:t>
-        <w:br/>
-      </w:r>
-      <w:r>
-        <w:rPr>
-          <w:i w:val="0"/>
-          <w:color w:val="334155"/>
-          <w:sz w:val="21"/>
-        </w:rPr>
-        <w:t>"Slide 10 đưa ra tuyên bố phương pháp luận minh bạch của nhóm nghiên cứu đề tài DT005:</w:t>
-        <w:br/>
-        <w:t>• Đặc thù của bài báo: Bài báo của Harry Halpin (2025) là một công trình khảo cứu nhận thức luận triết học thuần túy (philosophical survey), xuất bản trên tạp chí chuyên ngành liên ngành. Bài báo chứa 0 dòng code, 0 bộ dữ liệu benchmark và 0 kết quả đo đạc định lượng.</w:t>
-        <w:br/>
-        <w:t>• Nguyên tắc tái lập khoa học: Nhóm không ngụy tạo kết quả của tác giả. Thay vào đó, nhóm thực hiện tái lập theo phương pháp: Trích xuất các khái niệm lý thuyết cốt lõi của bài báo và tự thiết kế độc lập một hệ thống phần mềm thực nghiệm để kiểm chứng và minh họa các khái niệm đó.</w:t>
-        <w:br/>
-        <w:t>• Bộ dữ liệu và các kịch bản đối kháng là sản phẩm tự xây dựng của sinh viên (được kiểm toán chi tiết trong MIDTERM_CODE_AUDIT.md), đóng vai trò công cụ minh họa trực quan cho các lập luận của Halpin."</w:t>
+        <w:t>1. Đánh Giá Khả Năng Tái Lập (Replication Feasibility):</w:t>
       </w:r>
     </w:p>
     <w:p>
       <w:pPr>
-        <w:spacing w:before="40" w:after="160"/>
-        <w:ind w:left="288"/>
-      </w:pPr>
-      <w:r>
-        <w:rPr>
-          <w:i/>
-          <w:color w:val="64748B"/>
-          <w:sz w:val="19"/>
-        </w:rPr>
-        <w:t>• Lưu ý trình bày: Khẳng định trung thực học thuật: Bài báo là lý thuyết, phần mềm là mô hình minh họa độc lập. Xác nhận MIDTERM_CODE_AUDIT.md tồn tại.</w:t>
+        <w:spacing w:before="20" w:after="40"/>
+        <w:ind w:left="504"/>
+      </w:pPr>
+      <w:r>
+        <w:rPr>
+          <w:b/>
+          <w:color w:val="1E293B"/>
+          <w:sz w:val="20"/>
+        </w:rPr>
+        <w:t xml:space="preserve">– Bản chất công trình: </w:t>
+      </w:r>
+      <w:r>
+        <w:rPr>
+          <w:color w:val="334155"/>
+          <w:sz w:val="20"/>
+        </w:rPr>
+        <w:t>Bài báo của TS. Harry Halpin là một luận văn tổng quan triết học và phân tích nhận thức luận, không phải là một công trình kỹ thuật phần mềm — khơi mở tư duy chứ không cung cấp mã nguồn.</w:t>
       </w:r>
     </w:p>
     <w:p>
       <w:pPr>
-        <w:spacing w:before="200" w:after="40"/>
+        <w:spacing w:before="20" w:after="40"/>
+        <w:ind w:left="504"/>
+      </w:pPr>
+      <w:r>
+        <w:rPr>
+          <w:b/>
+          <w:color w:val="1E293B"/>
+          <w:sz w:val="20"/>
+        </w:rPr>
+        <w:t xml:space="preserve">– Không có tài nguyên phần mềm: </w:t>
+      </w:r>
+      <w:r>
+        <w:rPr>
+          <w:color w:val="334155"/>
+          <w:sz w:val="20"/>
+        </w:rPr>
+        <w:t>Bài báo HOÀN TOÀN KHÔNG có mã nguồn triển khai, không có tập dữ liệu thực nghiệm, không có các bảng đo thời gian (ms) hay dung lượng benchmark — không tồn tại hệ chuẩn kỹ thuật gốc từ tác giả.</w:t>
+      </w:r>
+    </w:p>
+    <w:p>
+      <w:pPr>
+        <w:spacing w:before="20" w:after="40"/>
+        <w:ind w:left="504"/>
+      </w:pPr>
+      <w:r>
+        <w:rPr>
+          <w:b/>
+          <w:color w:val="1E293B"/>
+          <w:sz w:val="20"/>
+        </w:rPr>
+        <w:t xml:space="preserve">– Phương pháp thẩm định: </w:t>
+      </w:r>
+      <w:r>
+        <w:rPr>
+          <w:color w:val="334155"/>
+          <w:sz w:val="20"/>
+        </w:rPr>
+        <w:t>Nhóm sinh viên thực hiện thẩm định học thuật (Scholarly Audit) đối chiếu toàn bộ 17 trang bản in PDF, 7 mục nội dung và 134 tài liệu tham khảo — đảm bảo nắm bắt chuẩn xác và có phê phán.</w:t>
+      </w:r>
+    </w:p>
+    <w:p>
+      <w:pPr>
+        <w:spacing w:before="20" w:after="40"/>
+        <w:ind w:left="504"/>
+      </w:pPr>
+      <w:r>
+        <w:rPr>
+          <w:b/>
+          <w:color w:val="1E293B"/>
+          <w:sz w:val="20"/>
+        </w:rPr>
+        <w:t xml:space="preserve">– Tính trung thực học thuật: </w:t>
+      </w:r>
+      <w:r>
+        <w:rPr>
+          <w:color w:val="334155"/>
+          <w:sz w:val="20"/>
+        </w:rPr>
+        <w:t>Không bịa đặt số liệu gốc của tác giả; không tuyên bố 'tái lập 100% benchmark bài báo' khi tác giả không công bố benchmark — giữ vững đạo đức khoa học chuẩn mực.</w:t>
+      </w:r>
+    </w:p>
+    <w:p>
+      <w:pPr>
+        <w:spacing w:before="60" w:after="20"/>
+        <w:ind w:left="288"/>
+      </w:pPr>
+      <w:r>
+        <w:rPr>
+          <w:b/>
+          <w:color w:val="0F172A"/>
+          <w:sz w:val="21"/>
+        </w:rPr>
+        <w:t>2. Định Hướng Thí Nghiệm Minh Họa Độc Lập:</w:t>
+      </w:r>
+    </w:p>
+    <w:p>
+      <w:pPr>
+        <w:spacing w:before="20" w:after="40"/>
+        <w:ind w:left="504"/>
+      </w:pPr>
+      <w:r>
+        <w:rPr>
+          <w:b/>
+          <w:color w:val="1E293B"/>
+          <w:sz w:val="20"/>
+        </w:rPr>
+        <w:t xml:space="preserve">– Mục tiêu thực nghiệm: </w:t>
+      </w:r>
+      <w:r>
+        <w:rPr>
+          <w:color w:val="334155"/>
+          <w:sz w:val="20"/>
+        </w:rPr>
+        <w:t>Sinh viên tự xây dựng hệ thống kiểm tra toàn vẹn tệp nhằm chuyển hóa các luận điểm lý thuyết trừu tượng của Halpin thành các kịch bản quan sát được — cung cấp bằng chứng thực nghiệm trực quan.</w:t>
+      </w:r>
+    </w:p>
+    <w:p>
+      <w:pPr>
+        <w:spacing w:before="20" w:after="40"/>
+        <w:ind w:left="504"/>
+      </w:pPr>
+      <w:r>
+        <w:rPr>
+          <w:b/>
+          <w:color w:val="1E293B"/>
+          <w:sz w:val="20"/>
+        </w:rPr>
+        <w:t xml:space="preserve">– Minh họa trực quan: </w:t>
+      </w:r>
+      <w:r>
+        <w:rPr>
+          <w:color w:val="334155"/>
+          <w:sz w:val="20"/>
+        </w:rPr>
+        <w:t>Thiết kế các kịch bản kiểm thử: đối đầu toán học trên mã tuyến tính CRC32; can thiệp đường truyền Dolev-Yao; rò rỉ kênh kề thời gian so sánh chuỗi — đưa người nghe vào trải nghiệm an ninh thực tế.</w:t>
+      </w:r>
+    </w:p>
+    <w:p>
+      <w:pPr>
+        <w:spacing w:before="20" w:after="40"/>
+        <w:ind w:left="504"/>
+      </w:pPr>
+      <w:r>
+        <w:rPr>
+          <w:b/>
+          <w:color w:val="1E293B"/>
+          <w:sz w:val="20"/>
+        </w:rPr>
+        <w:t xml:space="preserve">– Phân định ranh giới rõ ràng: </w:t>
+      </w:r>
+      <w:r>
+        <w:rPr>
+          <w:color w:val="334155"/>
+          <w:sz w:val="20"/>
+        </w:rPr>
+        <w:t>Mã nguồn và hệ thống kiểm tra toàn vẹn là đóng góp kỹ thuật độc lập của sinh viên; không được nhầm lẫn là thuật toán do Halpin đề xuất — minh bạch tuyệt đối về bản quyền ý tưởng.</w:t>
+      </w:r>
+    </w:p>
+    <w:p>
+      <w:pPr>
+        <w:spacing w:before="20" w:after="40"/>
+        <w:ind w:left="504"/>
+      </w:pPr>
+      <w:r>
+        <w:rPr>
+          <w:b/>
+          <w:color w:val="1E293B"/>
+          <w:sz w:val="20"/>
+        </w:rPr>
+        <w:t xml:space="preserve">– Kiểm toán khoa học: </w:t>
+      </w:r>
+      <w:r>
+        <w:rPr>
+          <w:color w:val="334155"/>
+          <w:sz w:val="20"/>
+        </w:rPr>
+        <w:t>Tất cả quy trình kiểm toán mã nguồn và đối chiếu thực nghiệm được lưu vết kỹ thuật tại MIDTERM_CODE_AUDIT.md — sẵn sàng cho hội đồng thẩm định chi tiết.</w:t>
+      </w:r>
+    </w:p>
+    <w:p>
+      <w:pPr>
+        <w:spacing w:before="60" w:after="40"/>
+        <w:ind w:left="288"/>
+      </w:pPr>
+      <w:r>
+        <w:rPr>
+          <w:i/>
+          <w:color w:val="1E40AF"/>
+          <w:sz w:val="20"/>
+        </w:rPr>
+        <w:t>Lời thuyết minh tiếp nối: Slide 10 khẳng định nguyên tắc nghiên cứu trung thực: Bài báo là nền tảng triết học lý thuyết; hệ thống phần mềm là công cụ minh họa độc lập do sinh viên tự phát triển.</w:t>
+      </w:r>
+    </w:p>
+    <w:p>
+      <w:pPr>
+        <w:spacing w:before="20" w:after="160"/>
+        <w:ind w:left="288"/>
+      </w:pPr>
+      <w:r>
+        <w:rPr>
+          <w:color w:val="94A3B8"/>
+          <w:sz w:val="18"/>
+        </w:rPr>
+        <w:t>• Ghi chú chân Slide: Báo cáo phân định phương pháp luận độc lập của nhóm nghiên cứu đề tài DT005.</w:t>
+      </w:r>
+    </w:p>
+    <w:p>
+      <w:pPr>
+        <w:spacing w:before="240" w:after="40"/>
       </w:pPr>
       <w:r>
         <w:rPr>
@@ -731,7 +2224,7 @@
           <w:color w:val="1E40AF"/>
           <w:sz w:val="24"/>
         </w:rPr>
-        <w:t xml:space="preserve">► SLIDE 11: MINH HỌA PAPER-TO-CODE &amp; GIỚI HẠN DIỄN GIẢI [SƠ ĐỒ 4] </w:t>
+        <w:t xml:space="preserve">► SLIDE 11: MINH HỌA PAPER-TO-CODE ĐỘC LẬP &amp; GIỚI HẠN DIỄN GIẢI </w:t>
       </w:r>
       <w:r>
         <w:rPr>
@@ -744,7 +2237,23 @@
     </w:p>
     <w:p>
       <w:pPr>
-        <w:spacing w:before="40" w:after="80"/>
+        <w:spacing w:before="20" w:after="80"/>
+        <w:ind w:left="288"/>
+      </w:pPr>
+      <w:r>
+        <w:rPr>
+          <w:i/>
+          <w:color w:val="475569"/>
+          <w:sz w:val="19"/>
+        </w:rPr>
+        <w:t>• Tiêu đề phụ / Section trên Slide: SƠ ĐỒ 4: PHÂN ĐỊNH LÝ THUYẾT &amp; THÍ NGHIỆM ĐỘC LẬP</w:t>
+        <w:br/>
+        <w:t xml:space="preserve">  Đối sánh minh bạch giữa các luận điểm bài báo và thí nghiệm minh họa do sinh viên xây dựng</w:t>
+      </w:r>
+    </w:p>
+    <w:p>
+      <w:pPr>
+        <w:spacing w:before="60" w:after="20"/>
         <w:ind w:left="288"/>
       </w:pPr>
       <w:r>
@@ -753,41 +2262,256 @@
           <w:color w:val="0F172A"/>
           <w:sz w:val="21"/>
         </w:rPr>
-        <w:t>Nội dung trình bày:</w:t>
-        <w:br/>
-      </w:r>
-      <w:r>
-        <w:rPr>
-          <w:i w:val="0"/>
-          <w:color w:val="334155"/>
-          <w:sz w:val="21"/>
-        </w:rPr>
-        <w:t>"Sơ đồ 4 đối chiếu minh bạch ba ví dụ chuyển đổi từ luận điểm bài báo sang mã nguồn thực nghiệm, phân định rõ luận điểm gốc và đóng góp của sinh viên:</w:t>
-        <w:br/>
-        <w:t>• Ví dụ 1 (Nhiễu ngẫu nhiên vs Kẻ đối đầu có chủ đích): Halpin chỉ rõ mã kiểm tra tuyến tính chỉ được thiết kế để chống lại lỗi ngẫu nhiên. Nhóm sinh viên minh họa độc lập bằng kịch bản tấn công chủ đích: Giải hệ phương trình tuyến tính trên GF(2) để chèn 4 byte bù (patch), làm giả nội dung tệp mà giá trị CRC32 vẫn trùng khớp 100%. Ngược lại, hàm băm SHA-256 phát hiện thay đổi ngay lập tức nhờ tính phi tuyến. Giới hạn diễn giải: Không khẳng định CRC32 hoàn toàn bất lực trong mọi trường hợp (nó vẫn hiệu quả bắt lỗi ngẫu nhiên trong phần cứng/mạng); thí nghiệm chỉ mô tả đúng kịch bản can thiệp có chủ đích đã kiểm thử.</w:t>
-        <w:br/>
-        <w:t>• Ví dụ 2 (Cây Merkle &amp; Phân tách miền): Halpin không đề xuất kỹ thuật này. Đây là phần minh họa độc lập do DT005 xây dựng, trích dẫn khuyến nghị từ IETF RFC 6962 (Certificate Transparency): Dùng tiền tố 0x00 cho nút lá và 0x01 cho nút nhánh nội bộ để triệt tiêu nguy cơ nhập nhằng nút lá (Node-leaf ambiguity). Giới hạn diễn giải: Kỹ thuật này giải quyết vấn đề cấu trúc cây, không triệt tiêu xác suất va chạm ngẫu nhiên của hàm băm nền tảng.</w:t>
-        <w:br/>
-        <w:t>• Ví dụ 3 (Tấn công kênh kề thời gian): Halpin dẫn chứng Paul Kocher (1996) về việc thời gian xử lý làm rò rỉ khóa. Nhóm sinh viên minh họa độc lập bằng việc so sánh chuỗi tuần tự có cơ chế ngắt sớm (early return) làm rò rỉ tiền tố, và áp dụng `hmac.compare_digest` để đạt thời gian thực thi hằng số. Giới hạn diễn giải: Phép đo trên Python chịu ảnh hưởng độ trễ lập lịch của hệ điều hành, chỉ minh họa ở mức thư viện phần mềm."</w:t>
+        <w:t>1. NHIỄU vs ĐỐI THỦ CHỦ ĐÍCH:</w:t>
       </w:r>
     </w:p>
     <w:p>
       <w:pPr>
-        <w:spacing w:before="40" w:after="160"/>
-        <w:ind w:left="288"/>
-      </w:pPr>
-      <w:r>
-        <w:rPr>
-          <w:i/>
-          <w:color w:val="64748B"/>
-          <w:sz w:val="19"/>
-        </w:rPr>
-        <w:t>• Lưu ý trình bày: Phân định rạch ròi giữa luận điểm Halpin và mã nguồn DT005; ghi rõ RFC 6962 là minh họa độc lập, không nói Halpin đề xuất; không khẳng định CRC32 bất lực trong mọi trường hợp.</w:t>
+        <w:spacing w:before="20" w:after="40"/>
+        <w:ind w:left="504"/>
+      </w:pPr>
+      <w:r>
+        <w:rPr>
+          <w:b/>
+          <w:color w:val="1E293B"/>
+          <w:sz w:val="20"/>
+        </w:rPr>
+        <w:t xml:space="preserve">– Luận điểm Halpin (Sec. 1–2): </w:t>
+      </w:r>
+      <w:r>
+        <w:rPr>
+          <w:color w:val="334155"/>
+          <w:sz w:val="20"/>
+        </w:rPr>
+        <w:t>Đối thủ là tác nhân có chủ đích, không phải nhiễu ngẫu nhiên. Mã kiểm tra lỗi tuyến tính được thiết kế cho nhiễu ngẫu nhiên, không phòng vệ được trước đối thủ chủ đích.</w:t>
       </w:r>
     </w:p>
     <w:p>
       <w:pPr>
-        <w:spacing w:before="200" w:after="40"/>
+        <w:spacing w:before="20" w:after="40"/>
+        <w:ind w:left="504"/>
+      </w:pPr>
+      <w:r>
+        <w:rPr>
+          <w:b/>
+          <w:color w:val="1E293B"/>
+          <w:sz w:val="20"/>
+        </w:rPr>
+        <w:t xml:space="preserve">– Minh họa độc lập (DT005): </w:t>
+      </w:r>
+      <w:r>
+        <w:rPr>
+          <w:color w:val="334155"/>
+          <w:sz w:val="20"/>
+        </w:rPr>
+        <w:t>Thử nghiệm kịch bản bù 4 byte GF(2): Kẻ tấn công giải hệ phương trình tuyến tính để qua mặt CRC32 trong tệp bị can thiệp; hàm băm phi tuyến SHA-256 phát hiện tức thì.</w:t>
+      </w:r>
+    </w:p>
+    <w:p>
+      <w:pPr>
+        <w:spacing w:before="20" w:after="40"/>
+        <w:ind w:left="504"/>
+      </w:pPr>
+      <w:r>
+        <w:rPr>
+          <w:b/>
+          <w:color w:val="1E293B"/>
+          <w:sz w:val="20"/>
+        </w:rPr>
+        <w:t xml:space="preserve">– Giới hạn diễn giải: </w:t>
+      </w:r>
+      <w:r>
+        <w:rPr>
+          <w:color w:val="334155"/>
+          <w:sz w:val="20"/>
+        </w:rPr>
+        <w:t>Chỉ minh họa tính phi tuyến của hàm băm trong kịch bản giả mạo đã kiểm thử; không kết luận CRC32 bất lực trong vai trò phát hiện lỗi ngẫu nhiên vật lý — bởi CRC32 vẫn giữ nguyên giá trị kiểm tra lỗi mạng và phần cứng truyền thống.</w:t>
+      </w:r>
+    </w:p>
+    <w:p>
+      <w:pPr>
+        <w:spacing w:before="60" w:after="20"/>
+        <w:ind w:left="288"/>
+      </w:pPr>
+      <w:r>
+        <w:rPr>
+          <w:b/>
+          <w:color w:val="0F172A"/>
+          <w:sz w:val="21"/>
+        </w:rPr>
+        <w:t>2. PHÂN TÁCH MIỀN NÚT LÁ (RFC 6962):</w:t>
+      </w:r>
+    </w:p>
+    <w:p>
+      <w:pPr>
+        <w:spacing w:before="20" w:after="40"/>
+        <w:ind w:left="504"/>
+      </w:pPr>
+      <w:r>
+        <w:rPr>
+          <w:b/>
+          <w:color w:val="1E293B"/>
+          <w:sz w:val="20"/>
+        </w:rPr>
+        <w:t xml:space="preserve">– Gốc lý thuyết bài báo: </w:t>
+      </w:r>
+      <w:r>
+        <w:rPr>
+          <w:color w:val="334155"/>
+          <w:sz w:val="20"/>
+        </w:rPr>
+        <w:t>Halpin nhấn mạnh điểm mù khi triển khai cấu trúc dữ liệu trong thực tế, nhưng KHÔNG trực tiếp đề cập cấu trúc cây Merkle hay kỹ thuật phân tách miền.</w:t>
+      </w:r>
+    </w:p>
+    <w:p>
+      <w:pPr>
+        <w:spacing w:before="20" w:after="40"/>
+        <w:ind w:left="504"/>
+      </w:pPr>
+      <w:r>
+        <w:rPr>
+          <w:b/>
+          <w:color w:val="1E293B"/>
+          <w:sz w:val="20"/>
+        </w:rPr>
+        <w:t xml:space="preserve">– Minh họa độc lập (DT005): </w:t>
+      </w:r>
+      <w:r>
+        <w:rPr>
+          <w:color w:val="334155"/>
+          <w:sz w:val="20"/>
+        </w:rPr>
+        <w:t>Sinh viên chủ động mở rộng bài toán toàn vẹn: Cài đặt phân tách miền theo chuẩn IETF RFC 6962 (tiền tố byte 0x00 cho lá, 0x01 cho nhánh) để phòng ngừa va chạm cấu trúc tầng cây.</w:t>
+      </w:r>
+    </w:p>
+    <w:p>
+      <w:pPr>
+        <w:spacing w:before="20" w:after="40"/>
+        <w:ind w:left="504"/>
+      </w:pPr>
+      <w:r>
+        <w:rPr>
+          <w:b/>
+          <w:color w:val="1E293B"/>
+          <w:sz w:val="20"/>
+        </w:rPr>
+        <w:t xml:space="preserve">– Giới hạn diễn giải: </w:t>
+      </w:r>
+      <w:r>
+        <w:rPr>
+          <w:color w:val="334155"/>
+          <w:sz w:val="20"/>
+        </w:rPr>
+        <w:t>Kỹ thuật RFC 6962 do sinh viên tự nghiên cứu tích hợp, không phải đề xuất của Halpin; chỉ phòng ngừa va chạm cấu trúc, không thay đổi độ phức tạp 2^256 của SHA-256 — đây là đóng góp công nghệ bổ trợ của nhóm.</w:t>
+      </w:r>
+    </w:p>
+    <w:p>
+      <w:pPr>
+        <w:spacing w:before="60" w:after="20"/>
+        <w:ind w:left="288"/>
+      </w:pPr>
+      <w:r>
+        <w:rPr>
+          <w:b/>
+          <w:color w:val="0F172A"/>
+          <w:sz w:val="21"/>
+        </w:rPr>
+        <w:t>3. RÒ RỈ KÊNH KỀ THỜI GIAN:</w:t>
+      </w:r>
+    </w:p>
+    <w:p>
+      <w:pPr>
+        <w:spacing w:before="20" w:after="40"/>
+        <w:ind w:left="504"/>
+      </w:pPr>
+      <w:r>
+        <w:rPr>
+          <w:b/>
+          <w:color w:val="1E293B"/>
+          <w:sz w:val="20"/>
+        </w:rPr>
+        <w:t xml:space="preserve">– Luận điểm Halpin (Sec. 5): </w:t>
+      </w:r>
+      <w:r>
+        <w:rPr>
+          <w:color w:val="334155"/>
+          <w:sz w:val="20"/>
+        </w:rPr>
+        <w:t>Mô hình toán học trừu tượng xem mật mã là hàm lý tưởng, nhưng thời gian thực thi thực tế làm rò rỉ dữ liệu bí mật (dẫn theo Paul Kocher 1996).</w:t>
+      </w:r>
+    </w:p>
+    <w:p>
+      <w:pPr>
+        <w:spacing w:before="20" w:after="40"/>
+        <w:ind w:left="504"/>
+      </w:pPr>
+      <w:r>
+        <w:rPr>
+          <w:b/>
+          <w:color w:val="1E293B"/>
+          <w:sz w:val="20"/>
+        </w:rPr>
+        <w:t xml:space="preserve">– Minh họa độc lập (DT005): </w:t>
+      </w:r>
+      <w:r>
+        <w:rPr>
+          <w:color w:val="334155"/>
+          <w:sz w:val="20"/>
+        </w:rPr>
+        <w:t>Sinh viên xây dựng kịch bản kiểm thử đo đạc thời gian so sánh chuỗi tuần tự (dừng sớm khi gặp byte lệch) so với việc sử dụng hàm thời gian hằng số hmac.compare_digest.</w:t>
+      </w:r>
+    </w:p>
+    <w:p>
+      <w:pPr>
+        <w:spacing w:before="20" w:after="40"/>
+        <w:ind w:left="504"/>
+      </w:pPr>
+      <w:r>
+        <w:rPr>
+          <w:b/>
+          <w:color w:val="1E293B"/>
+          <w:sz w:val="20"/>
+        </w:rPr>
+        <w:t xml:space="preserve">– Giới hạn diễn giải: </w:t>
+      </w:r>
+      <w:r>
+        <w:rPr>
+          <w:color w:val="334155"/>
+          <w:sz w:val="20"/>
+        </w:rPr>
+        <w:t>Đo đạc trên môi trường máy tính đơn có jitter hệ điều hành; chỉ minh họa rò rỉ logic ở mức phần mềm ứng dụng, không đại diện cho kênh kề phần cứng chuyên sâu — phục vụ mục đích trực quan hóa lỗ hổng kênh kề mức mã nguồn.</w:t>
+      </w:r>
+    </w:p>
+    <w:p>
+      <w:pPr>
+        <w:spacing w:before="60" w:after="40"/>
+        <w:ind w:left="288"/>
+      </w:pPr>
+      <w:r>
+        <w:rPr>
+          <w:i/>
+          <w:color w:val="1E40AF"/>
+          <w:sz w:val="20"/>
+        </w:rPr>
+        <w:t>Lời thuyết minh tiếp nối: Slide 11 đối chiếu 3 cột rạch ròi: Luận điểm lý thuyết của bài báo, Mã nguồn minh họa độc lập của sinh viên, và Giới hạn diễn giải khoa học chính xác.</w:t>
+      </w:r>
+    </w:p>
+    <w:p>
+      <w:pPr>
+        <w:spacing w:before="20" w:after="160"/>
+        <w:ind w:left="288"/>
+      </w:pPr>
+      <w:r>
+        <w:rPr>
+          <w:color w:val="94A3B8"/>
+          <w:sz w:val="18"/>
+        </w:rPr>
+        <w:t>• Ghi chú chân Slide: Bảng đối chiếu minh bạch do sinh viên tự xây dựng; chi tiết mã nguồn lưu tại MIDTERM_CODE_AUDIT.md.</w:t>
+      </w:r>
+    </w:p>
+    <w:p>
+      <w:pPr>
+        <w:spacing w:before="240" w:after="40"/>
       </w:pPr>
       <w:r>
         <w:rPr>
@@ -808,7 +2532,23 @@
     </w:p>
     <w:p>
       <w:pPr>
-        <w:spacing w:before="40" w:after="80"/>
+        <w:spacing w:before="20" w:after="80"/>
+        <w:ind w:left="288"/>
+      </w:pPr>
+      <w:r>
+        <w:rPr>
+          <w:i/>
+          <w:color w:val="475569"/>
+          <w:sz w:val="19"/>
+        </w:rPr>
+        <w:t>• Tiêu đề phụ / Section trên Slide: GIAO DIỆN TỐI GIẢN NỀN SÁNG CHUẨN BỊ DIỄN TẬP TRỰC TIẾP</w:t>
+        <w:br/>
+        <w:t xml:space="preserve">  Chữ hiển thị trên Slide: DEMO</w:t>
+      </w:r>
+    </w:p>
+    <w:p>
+      <w:pPr>
+        <w:spacing w:before="60" w:after="20"/>
         <w:ind w:left="288"/>
       </w:pPr>
       <w:r>
@@ -817,35 +2557,60 @@
           <w:color w:val="0F172A"/>
           <w:sz w:val="21"/>
         </w:rPr>
-        <w:t>Nội dung trình bày:</w:t>
-        <w:br/>
-      </w:r>
-      <w:r>
-        <w:rPr>
-          <w:i w:val="0"/>
-          <w:color w:val="334155"/>
-          <w:sz w:val="21"/>
-        </w:rPr>
-        <w:t>"Chuyển sang phần Diễn tập An ninh Thực nghiệm trực tiếp (Live Demo). Nhóm sử dụng mô hình đối kháng hai màn hình giữa Hệ thống phòng thủ Blue Team (Port 8080) và Động cơ tấn công đối kháng Red Team (Port 8081) để trực quan hóa và kiểm chứng thực tế các luận điểm triết học cốt lõi của bài báo Harry Halpin."</w:t>
+        <w:t>Nội dung thể hiện trên Slide:</w:t>
       </w:r>
     </w:p>
     <w:p>
       <w:pPr>
-        <w:spacing w:before="40" w:after="160"/>
-        <w:ind w:left="288"/>
-      </w:pPr>
-      <w:r>
-        <w:rPr>
-          <w:i/>
-          <w:color w:val="64748B"/>
-          <w:sz w:val="19"/>
-        </w:rPr>
-        <w:t>• Lưu ý trình bày: Slide chuyển tiếp tối giản nền sáng, chỉ hiển thị đúng một chữ DEMO ở chính giữa để tạo nhịp nghỉ trang trọng trước khi bắt đầu phần thực hành.</w:t>
+        <w:spacing w:before="20" w:after="40"/>
+        <w:ind w:left="504"/>
+      </w:pPr>
+      <w:r>
+        <w:rPr>
+          <w:b/>
+          <w:color w:val="1E293B"/>
+          <w:sz w:val="20"/>
+        </w:rPr>
+        <w:t xml:space="preserve">– Văn bản trung tâm: </w:t>
+      </w:r>
+      <w:r>
+        <w:rPr>
+          <w:color w:val="334155"/>
+          <w:sz w:val="20"/>
+        </w:rPr>
+        <w:t>DEMO (Được thiết kế tối giản, chữ to rõ ràng trên nền sáng thanh lịch để tạo nhịp nghỉ trang trọng chuyển tiếp phần thuyết trình sang phần thực nghiệm).</w:t>
       </w:r>
     </w:p>
     <w:p>
       <w:pPr>
-        <w:spacing w:before="200" w:after="40"/>
+        <w:spacing w:before="60" w:after="40"/>
+        <w:ind w:left="288"/>
+      </w:pPr>
+      <w:r>
+        <w:rPr>
+          <w:i/>
+          <w:color w:val="1E40AF"/>
+          <w:sz w:val="20"/>
+        </w:rPr>
+        <w:t>Lời thuyết minh tiếp nối: Sau khi hoàn thành phần đối chiếu lý thuyết, nhóm xin chuyển sang phần Diễn tập An ninh Thực nghiệm trực tiếp (Live Demo) thông qua mô hình đối kháng 2 màn hình Red Team và Blue Team, tập trung kiểm chứng các luận điểm mấu chốt của Halpin.</w:t>
+      </w:r>
+    </w:p>
+    <w:p>
+      <w:pPr>
+        <w:spacing w:before="20" w:after="160"/>
+        <w:ind w:left="288"/>
+      </w:pPr>
+      <w:r>
+        <w:rPr>
+          <w:color w:val="94A3B8"/>
+          <w:sz w:val="18"/>
+        </w:rPr>
+        <w:t>• Ghi chú chân Slide: Slide chuyển tiếp phần diễn tập thực hành đối kháng an ninh.</w:t>
+      </w:r>
+    </w:p>
+    <w:p>
+      <w:pPr>
+        <w:spacing w:before="240" w:after="40"/>
       </w:pPr>
       <w:r>
         <w:rPr>
@@ -853,7 +2618,7 @@
           <w:color w:val="1E40AF"/>
           <w:sz w:val="24"/>
         </w:rPr>
-        <w:t xml:space="preserve">► SLIDE 13: KIẾN TRÚC DIỄN TẬP ĐỐI KHÁNG RED TEAM VS BLUE TEAM [SƠ ĐỒ 5: DRAW.IO] </w:t>
+        <w:t xml:space="preserve">► SLIDE 13: KIẾN TRÚC DIỄN TẬP ĐỐI KHÁNG: RED TEAM VS BLUE TEAM </w:t>
       </w:r>
       <w:r>
         <w:rPr>
@@ -866,7 +2631,23 @@
     </w:p>
     <w:p>
       <w:pPr>
-        <w:spacing w:before="40" w:after="80"/>
+        <w:spacing w:before="20" w:after="80"/>
+        <w:ind w:left="288"/>
+      </w:pPr>
+      <w:r>
+        <w:rPr>
+          <w:i/>
+          <w:color w:val="475569"/>
+          <w:sz w:val="19"/>
+        </w:rPr>
+        <w:t>• Tiêu đề phụ / Section trên Slide: SƠ ĐỒ 5: KIẾN TRÚC DIỄN TẬP ĐỐI KHÁNG (DEMO ARCHITECTURE)</w:t>
+        <w:br/>
+        <w:t xml:space="preserve">  Mô hình đối kháng thực tế 2 màn hình trên tập dữ liệu kaggle_dataset (2.485 tệp tin / ~112,81 MiB theo benchmark)</w:t>
+      </w:r>
+    </w:p>
+    <w:p>
+      <w:pPr>
+        <w:spacing w:before="60" w:after="20"/>
         <w:ind w:left="288"/>
       </w:pPr>
       <w:r>
@@ -875,43 +2656,144 @@
           <w:color w:val="0F172A"/>
           <w:sz w:val="21"/>
         </w:rPr>
-        <w:t>Nội dung trình bày:</w:t>
-        <w:br/>
-      </w:r>
-      <w:r>
-        <w:rPr>
-          <w:i w:val="0"/>
-          <w:color w:val="334155"/>
-          <w:sz w:val="21"/>
-        </w:rPr>
-        <w:t>"Sơ đồ 5 mô tả kiến trúc diễn tập đối kháng (Demo Architecture):</w:t>
-        <w:br/>
-        <w:t>• Bộ dữ liệu thực nghiệm: Đối chiếu số liệu kỹ thuật, báo cáo benchmark trong mã nguồn ghi nhận tập dữ liệu gồm 2.485 tệp tin với dung lượng khoảng 112.81 MiB (phiên bản nạp kiểm thử cục bộ hiện tại gồm 2.483 tệp).</w:t>
-        <w:br/>
-        <w:t>• Blue Team (Port 8080 - Hệ thống phòng thủ &amp; giám sát): Nạp tập dữ liệu để thiết lập Mốc tin cậy ban đầu (Root Hash H_0). Khi hệ thống kiểm tra toàn vẹn, cơ chế duyệt cây phân cấp định vị chính xác vị trí tệp tin bị biến đổi với tốc độ quét thực tế vượt 2.000 tệp/giây.</w:t>
-        <w:br/>
-        <w:t>• Red Team (Port 8081 - Động cơ tấn công đối kháng): Mô phỏng các vector can thiệp thực tế: Sửa byte tệp ngẫu nhiên (In-place Tamper), bù 4 byte GF(2) qua mặt CRC32, đánh tráo Merkle Proof trên đường truyền Dolev-Yao, và chèn backdoor/xóa tệp.</w:t>
-        <w:br/>
-        <w:t>• Cơ chế Rollback an toàn: Thư mục sao lưu .adversary_backups/ cho phép phục hồi nguyên trạng dữ liệu gốc sau mỗi kịch bản diễn tập."</w:t>
+        <w:t>Nội dung thành phần kiến trúc diễn tập trên Sơ đồ:</w:t>
       </w:r>
     </w:p>
     <w:p>
       <w:pPr>
-        <w:spacing w:before="40" w:after="160"/>
-        <w:ind w:left="288"/>
-      </w:pPr>
-      <w:r>
-        <w:rPr>
-          <w:i/>
-          <w:color w:val="64748B"/>
-          <w:sz w:val="19"/>
-        </w:rPr>
-        <w:t>• Lưu ý trình bày: Tiêu đề chuẩn Demo Architecture, số liệu đối chiếu chuẩn xác với benchmark_results.json, không đưa số liệu chưa xác minh.</w:t>
+        <w:spacing w:before="20" w:after="40"/>
+        <w:ind w:left="504"/>
+      </w:pPr>
+      <w:r>
+        <w:rPr>
+          <w:b/>
+          <w:color w:val="1E293B"/>
+          <w:sz w:val="20"/>
+        </w:rPr>
+        <w:t xml:space="preserve">– Hạ tầng diễn tập 2 Màn hình: </w:t>
+      </w:r>
+      <w:r>
+        <w:rPr>
+          <w:color w:val="334155"/>
+          <w:sz w:val="20"/>
+        </w:rPr>
+        <w:t>Tương tác thời gian thực giữa Hệ thống giám sát phòng thủ Blue Team (Port 8080) và Động cơ tấn công đối kháng Red Team (Port 8081).</w:t>
       </w:r>
     </w:p>
     <w:p>
       <w:pPr>
-        <w:spacing w:before="200" w:after="40"/>
+        <w:spacing w:before="20" w:after="40"/>
+        <w:ind w:left="504"/>
+      </w:pPr>
+      <w:r>
+        <w:rPr>
+          <w:b/>
+          <w:color w:val="1E293B"/>
+          <w:sz w:val="20"/>
+        </w:rPr>
+        <w:t xml:space="preserve">– Tập dữ liệu thực nghiệm: </w:t>
+      </w:r>
+      <w:r>
+        <w:rPr>
+          <w:color w:val="334155"/>
+          <w:sz w:val="20"/>
+        </w:rPr>
+        <w:t>kaggle_dataset gồm 2.485 tệp tin, dung lượng ~112,81 MiB (phiên bản nạp kiểm thử cục bộ hiện tại gồm 2.483 tệp) đóng vai trò môi trường kiểm thử thực tế — phản ánh cấu trúc cây thư mục doanh nghiệp nhiều tầng.</w:t>
+      </w:r>
+    </w:p>
+    <w:p>
+      <w:pPr>
+        <w:spacing w:before="20" w:after="40"/>
+        <w:ind w:left="504"/>
+      </w:pPr>
+      <w:r>
+        <w:rPr>
+          <w:b/>
+          <w:color w:val="1E293B"/>
+          <w:sz w:val="20"/>
+        </w:rPr>
+        <w:t xml:space="preserve">– Blue Team (Port 8080): </w:t>
+      </w:r>
+      <w:r>
+        <w:rPr>
+          <w:color w:val="334155"/>
+          <w:sz w:val="20"/>
+        </w:rPr>
+        <w:t>Nạp dữ liệu, thiết lập mốc tin cậy sạch ban đầu H_0; khi hệ thống kiểm tra toàn vẹn, cơ chế duyệt cây phân cấp định vị chính xác vị trí tệp tin bị biến đổi với tốc độ quét thực tế vượt 2.000 tệp/giây — bắt quả tang vi phạm toàn vẹn tức thì.</w:t>
+      </w:r>
+    </w:p>
+    <w:p>
+      <w:pPr>
+        <w:spacing w:before="20" w:after="40"/>
+        <w:ind w:left="504"/>
+      </w:pPr>
+      <w:r>
+        <w:rPr>
+          <w:b/>
+          <w:color w:val="1E293B"/>
+          <w:sz w:val="20"/>
+        </w:rPr>
+        <w:t xml:space="preserve">– Red Team (Port 8081): </w:t>
+      </w:r>
+      <w:r>
+        <w:rPr>
+          <w:color w:val="334155"/>
+          <w:sz w:val="20"/>
+        </w:rPr>
+        <w:t>Mô phỏng các vector can thiệp thực tế: Sửa byte tệp ngẫu nhiên (In-place Tamper) và giải hệ phương trình tuyến tính trên GF(2) bù 4 byte qua mặt mã kiểm tra CRC32 — hiện thực hóa năng lực kẻ đối đầu có chủ đích.</w:t>
+      </w:r>
+    </w:p>
+    <w:p>
+      <w:pPr>
+        <w:spacing w:before="20" w:after="40"/>
+        <w:ind w:left="504"/>
+      </w:pPr>
+      <w:r>
+        <w:rPr>
+          <w:b/>
+          <w:color w:val="1E293B"/>
+          <w:sz w:val="20"/>
+        </w:rPr>
+        <w:t xml:space="preserve">– Cơ chế hoàn nguyên an toàn: </w:t>
+      </w:r>
+      <w:r>
+        <w:rPr>
+          <w:color w:val="334155"/>
+          <w:sz w:val="20"/>
+        </w:rPr>
+        <w:t>Thư mục sao lưu an toàn .adversary_backups/ cho phép phục hồi nguyên vẹn 100% dữ liệu chỉ với 1 click chuột Rollback — đảm bảo ổ đĩa luôn được bảo toàn sau diễn tập.</w:t>
+      </w:r>
+    </w:p>
+    <w:p>
+      <w:pPr>
+        <w:spacing w:before="60" w:after="40"/>
+        <w:ind w:left="288"/>
+      </w:pPr>
+      <w:r>
+        <w:rPr>
+          <w:i/>
+          <w:color w:val="1E40AF"/>
+          <w:sz w:val="20"/>
+        </w:rPr>
+        <w:t>Lời thuyết minh tiếp nối: Sơ đồ kiến trúc thể hiện sự kết nối hoàn chỉnh giữa phòng thủ và tấn công, cho phép kiểm chứng các luận điểm của Halpin một cách trực quan và an toàn tuyệt đối.</w:t>
+      </w:r>
+    </w:p>
+    <w:p>
+      <w:pPr>
+        <w:spacing w:before="20" w:after="160"/>
+        <w:ind w:left="288"/>
+      </w:pPr>
+      <w:r>
+        <w:rPr>
+          <w:color w:val="94A3B8"/>
+          <w:sz w:val="18"/>
+        </w:rPr>
+        <w:t>• Ghi chú chân Slide: Sơ đồ kiến trúc diễn tập đối kháng độc lập do sinh viên thiết kế minh họa các khái niệm an ninh.</w:t>
+      </w:r>
+    </w:p>
+    <w:p>
+      <w:pPr>
+        <w:spacing w:before="240" w:after="40"/>
       </w:pPr>
       <w:r>
         <w:rPr>
@@ -919,7 +2801,7 @@
           <w:color w:val="1E40AF"/>
           <w:sz w:val="24"/>
         </w:rPr>
-        <w:t xml:space="preserve">► SLIDE 14: TỔNG KẾT BÁO CÁO GIỮA KỲ &amp; LỘ TRÌNH CUỐI KỲ </w:t>
+        <w:t xml:space="preserve">► SLIDE 14: TỔNG KẾT BÁO CÁO GIỮA KỲ &amp; ĐỊNH HƯỚNG NGHIÊN CỨU </w:t>
       </w:r>
       <w:r>
         <w:rPr>
@@ -932,7 +2814,23 @@
     </w:p>
     <w:p>
       <w:pPr>
-        <w:spacing w:before="40" w:after="80"/>
+        <w:spacing w:before="20" w:after="80"/>
+        <w:ind w:left="288"/>
+      </w:pPr>
+      <w:r>
+        <w:rPr>
+          <w:i/>
+          <w:color w:val="475569"/>
+          <w:sz w:val="19"/>
+        </w:rPr>
+        <w:t>• Tiêu đề phụ / Section trên Slide: SECTION 7 — KẾT LUẬN &amp; THÔNG ĐIỆP HỌC THUẬT</w:t>
+        <w:br/>
+        <w:t xml:space="preserve">  Tổng kết các đóng góp lý thuyết của Halpin và định hướng nghiên cứu tiếp theo</w:t>
+      </w:r>
+    </w:p>
+    <w:p>
+      <w:pPr>
+        <w:spacing w:before="60" w:after="20"/>
         <w:ind w:left="288"/>
       </w:pPr>
       <w:r>
@@ -941,41 +2839,179 @@
           <w:color w:val="0F172A"/>
           <w:sz w:val="21"/>
         </w:rPr>
-        <w:t>Nội dung trình bày:</w:t>
-        <w:br/>
-      </w:r>
-      <w:r>
-        <w:rPr>
-          <w:i w:val="0"/>
-          <w:color w:val="334155"/>
-          <w:sz w:val="21"/>
-        </w:rPr>
-        <w:t>"Tổng kết báo cáo giữa kỳ đề tài DT005:</w:t>
-        <w:br/>
-        <w:t>1. Về mặt học thuật: Hoàn thành thẩm định khoa học bài báo của Halpin (2025), phân tích đúng đắn cơ sở triết học và các mô hình kẻ đối đầu qua các thời kỳ lịch sử.</w:t>
-        <w:br/>
-        <w:t>2. Về mặt thực nghiệm: Xây dựng thành công bộ công cụ diễn tập đối kháng Red Team vs Blue Team minh họa trực quan các luận điểm an ninh chính của bài báo.</w:t>
-        <w:br/>
-        <w:t>3. Về định hướng nghiên cứu cuối kỳ: Nhóm tiếp tục nghiên cứu cấu trúc dữ liệu xác thực phân cấp (authenticated data structures), cơ chế bộ đệm cập nhật cục bộ nhằm giảm chi phí tính toán lại, hoàn thiện chuẩn hóa phân tách miền và mở rộng kiểm định đối kháng trên các quy mô dữ liệu lớn hơn."</w:t>
+        <w:t>1. Thông Điệp Học Thuật Cốt Lõi (Harry Halpin 2025):</w:t>
       </w:r>
     </w:p>
     <w:p>
       <w:pPr>
-        <w:spacing w:before="40" w:after="160"/>
-        <w:ind w:left="288"/>
-      </w:pPr>
-      <w:r>
-        <w:rPr>
-          <w:i/>
-          <w:color w:val="64748B"/>
-          <w:sz w:val="19"/>
-        </w:rPr>
-        <w:t>• Lưu ý trình bày: Đã loại bỏ các tuyên bố chưa kiểm chứng như O(1), ~0.24 ms khỏi kết luận giữa kỳ; trình bày định hướng cuối kỳ mang tính học thuật khái quát.</w:t>
+        <w:spacing w:before="20" w:after="40"/>
+        <w:ind w:left="504"/>
+      </w:pPr>
+      <w:r>
+        <w:rPr>
+          <w:b/>
+          <w:color w:val="1E293B"/>
+          <w:sz w:val="20"/>
+        </w:rPr>
+        <w:t xml:space="preserve">– Vượt qua sự trừu tượng hóa: </w:t>
+      </w:r>
+      <w:r>
+        <w:rPr>
+          <w:color w:val="334155"/>
+          <w:sz w:val="20"/>
+        </w:rPr>
+        <w:t>Mật mã học không chỉ là toán học thuần túy trên giấy tờ. Các hệ thống an toàn trong thế giới thực phải nhận thức rõ khoảng cách giữa mô hình lý tưởng và thực tế vật lý (kênh kề, siêu dữ liệu, chuỗi cung ứng, áp lực thể chế) — đây là chìa khóa để xây dựng an ninh thực chiến.</w:t>
       </w:r>
     </w:p>
     <w:p>
       <w:pPr>
-        <w:spacing w:before="200" w:after="40"/>
+        <w:spacing w:before="20" w:after="40"/>
+        <w:ind w:left="504"/>
+      </w:pPr>
+      <w:r>
+        <w:rPr>
+          <w:b/>
+          <w:color w:val="1E293B"/>
+          <w:sz w:val="20"/>
+        </w:rPr>
+        <w:t xml:space="preserve">– Bản chất của đối thủ: </w:t>
+      </w:r>
+      <w:r>
+        <w:rPr>
+          <w:color w:val="334155"/>
+          <w:sz w:val="20"/>
+        </w:rPr>
+        <w:t>Đối thủ không phải là 'nhiễu ngẫu nhiên' mà là tác nhân có chủ đích, liên tục tìm kiếm các kênh rò rỉ bị mô hình toán học bỏ qua — an ninh phải dựa trên tư duy đối kháng toàn diện.</w:t>
+      </w:r>
+    </w:p>
+    <w:p>
+      <w:pPr>
+        <w:spacing w:before="20" w:after="40"/>
+        <w:ind w:left="504"/>
+      </w:pPr>
+      <w:r>
+        <w:rPr>
+          <w:b/>
+          <w:color w:val="1E293B"/>
+          <w:sz w:val="20"/>
+        </w:rPr>
+        <w:t xml:space="preserve">– Chương trình nghiên cứu mở: </w:t>
+      </w:r>
+      <w:r>
+        <w:rPr>
+          <w:color w:val="334155"/>
+          <w:sz w:val="20"/>
+        </w:rPr>
+        <w:t>Halpin đặt nền móng triết học và vạch ra 4 câu hỏi nghiên cứu liên ngành nhằm mở rộng mật mã học thành một khoa học an ninh hoàn chỉnh — tạo cầu nối giữa toán học, máy tính và triết học.</w:t>
+      </w:r>
+    </w:p>
+    <w:p>
+      <w:pPr>
+        <w:spacing w:before="60" w:after="20"/>
+        <w:ind w:left="288"/>
+      </w:pPr>
+      <w:r>
+        <w:rPr>
+          <w:b/>
+          <w:color w:val="0F172A"/>
+          <w:sz w:val="21"/>
+        </w:rPr>
+        <w:t>2. Hoàn Thành Giữa Kỳ &amp; Lộ Trình Cuối Kỳ (Nhóm DT005):</w:t>
+      </w:r>
+    </w:p>
+    <w:p>
+      <w:pPr>
+        <w:spacing w:before="20" w:after="40"/>
+        <w:ind w:left="504"/>
+      </w:pPr>
+      <w:r>
+        <w:rPr>
+          <w:b/>
+          <w:color w:val="1E293B"/>
+          <w:sz w:val="20"/>
+        </w:rPr>
+        <w:t xml:space="preserve">– Nghiệm thu tiến độ giữa kỳ: </w:t>
+      </w:r>
+      <w:r>
+        <w:rPr>
+          <w:color w:val="334155"/>
+          <w:sz w:val="20"/>
+        </w:rPr>
+        <w:t>Hoàn thành thẩm định học thuật sâu sắc toàn văn bài báo gốc (17 trang PDF), phân tích đầy đủ 7 mục nội dung và làm rõ khoảng cách giữa lý thuyết trừu tượng với an ninh thực tế — đáp ứng chuẩn mực đồ án giữa kỳ.</w:t>
+      </w:r>
+    </w:p>
+    <w:p>
+      <w:pPr>
+        <w:spacing w:before="20" w:after="40"/>
+        <w:ind w:left="504"/>
+      </w:pPr>
+      <w:r>
+        <w:rPr>
+          <w:b/>
+          <w:color w:val="1E293B"/>
+          <w:sz w:val="20"/>
+        </w:rPr>
+        <w:t xml:space="preserve">– Minh bạch phương pháp luận: </w:t>
+      </w:r>
+      <w:r>
+        <w:rPr>
+          <w:color w:val="334155"/>
+          <w:sz w:val="20"/>
+        </w:rPr>
+        <w:t>Không ngụy tạo số liệu tác giả; phân định rõ ràng giữa công trình khảo cứu triết học của Halpin và các kịch bản thực nghiệm minh họa độc lập do sinh viên tự xây dựng — khẳng định trách nhiệm khoa học.</w:t>
+      </w:r>
+    </w:p>
+    <w:p>
+      <w:pPr>
+        <w:spacing w:before="20" w:after="40"/>
+        <w:ind w:left="504"/>
+      </w:pPr>
+      <w:r>
+        <w:rPr>
+          <w:b/>
+          <w:color w:val="1E293B"/>
+          <w:sz w:val="20"/>
+        </w:rPr>
+        <w:t xml:space="preserve">– Định hướng nghiên cứu cuối kỳ: </w:t>
+      </w:r>
+      <w:r>
+        <w:rPr>
+          <w:color w:val="334155"/>
+          <w:sz w:val="20"/>
+        </w:rPr>
+        <w:t>Tiếp tục nghiên cứu và hoàn thiện mô hình cấu trúc cây phân cấp tối ưu cho bài toán kiểm tra toàn vẹn dữ liệu, tiến hành đo đạc và đánh giá thực nghiệm toàn diện — hướng đến bảo vệ đồ án tốt nghiệp cuối kỳ.</w:t>
+      </w:r>
+    </w:p>
+    <w:p>
+      <w:pPr>
+        <w:spacing w:before="60" w:after="40"/>
+        <w:ind w:left="288"/>
+      </w:pPr>
+      <w:r>
+        <w:rPr>
+          <w:i/>
+          <w:color w:val="1E40AF"/>
+          <w:sz w:val="20"/>
+        </w:rPr>
+        <w:t>Lời thuyết minh tiếp nối: Đề tài giữa kỳ đã khép lại trọn vẹn phần khảo cứu học thuật và chuẩn bị nền móng kỹ thuật vững chắc cho việc phát triển các cấu trúc dữ liệu xác thực tối ưu ở giai đoạn cuối kỳ.</w:t>
+      </w:r>
+    </w:p>
+    <w:p>
+      <w:pPr>
+        <w:spacing w:before="20" w:after="160"/>
+        <w:ind w:left="288"/>
+      </w:pPr>
+      <w:r>
+        <w:rPr>
+          <w:color w:val="94A3B8"/>
+          <w:sz w:val="18"/>
+        </w:rPr>
+        <w:t>• Ghi chú chân Slide: Tài liệu tham khảo chính: Halpin (2025), Shannon (1949), Goldwasser-Micali (1984), Dolev-Yao (1983), Kocher (1996), RFC 6962.</w:t>
+      </w:r>
+    </w:p>
+    <w:p>
+      <w:pPr>
+        <w:spacing w:before="240" w:after="40"/>
       </w:pPr>
       <w:r>
         <w:rPr>
@@ -996,7 +3032,23 @@
     </w:p>
     <w:p>
       <w:pPr>
-        <w:spacing w:before="40" w:after="80"/>
+        <w:spacing w:before="20" w:after="80"/>
+        <w:ind w:left="288"/>
+      </w:pPr>
+      <w:r>
+        <w:rPr>
+          <w:i/>
+          <w:color w:val="475569"/>
+          <w:sz w:val="19"/>
+        </w:rPr>
+        <w:t>• Tiêu đề phụ / Section trên Slide: Trường ĐH Tài nguyên và Môi trường TP.HCM — Khoa Công nghệ thông tin</w:t>
+        <w:br/>
+        <w:t xml:space="preserve">  CẢM ƠN THẦY VÀ CÁC BẠN ĐÃ LẮNG NGHE!</w:t>
+      </w:r>
+    </w:p>
+    <w:p>
+      <w:pPr>
+        <w:spacing w:before="60" w:after="20"/>
         <w:ind w:left="288"/>
       </w:pPr>
       <w:r>
@@ -1005,49 +3057,116 @@
           <w:color w:val="0F172A"/>
           <w:sz w:val="21"/>
         </w:rPr>
-        <w:t>Nội dung trình bày:</w:t>
-        <w:br/>
-      </w:r>
-      <w:r>
-        <w:rPr>
-          <w:i w:val="0"/>
-          <w:color w:val="334155"/>
-          <w:sz w:val="21"/>
-        </w:rPr>
-        <w:t>"Phần trình bày báo cáo giữa kỳ của đề tài DT005 đến đây là kết thúc. Xin trân trọng cảm ơn quý vị đã chú ý theo dõi. Nhóm sẵn sàng trao đổi và giải đáp các câu hỏi phản biện."</w:t>
+        <w:t>Thông tin kết thúc trên Slide:</w:t>
       </w:r>
     </w:p>
     <w:p>
       <w:pPr>
-        <w:spacing w:before="40" w:after="160"/>
-        <w:ind w:left="288"/>
-      </w:pPr>
-      <w:r>
-        <w:rPr>
-          <w:i/>
-          <w:color w:val="64748B"/>
-          <w:sz w:val="19"/>
-        </w:rPr>
-        <w:t>• Lưu ý trình bày: Kết thúc tự tin, sẵn sàng chuyển sang phần Demo hoặc trả lời câu hỏi.</w:t>
+        <w:spacing w:before="20" w:after="40"/>
+        <w:ind w:left="504"/>
+      </w:pPr>
+      <w:r>
+        <w:rPr>
+          <w:b/>
+          <w:color w:val="1E293B"/>
+          <w:sz w:val="20"/>
+        </w:rPr>
+        <w:t xml:space="preserve">– Thông điệp: </w:t>
+      </w:r>
+      <w:r>
+        <w:rPr>
+          <w:color w:val="334155"/>
+          <w:sz w:val="20"/>
+        </w:rPr>
+        <w:t>Q &amp; A — Xin đón nhận các câu hỏi và ý kiến đóng góp của Thầy và Hội đồng.</w:t>
       </w:r>
     </w:p>
     <w:p>
-      <w:r>
-        <w:br w:type="page"/>
+      <w:pPr>
+        <w:spacing w:before="20" w:after="40"/>
+        <w:ind w:left="504"/>
+      </w:pPr>
+      <w:r>
+        <w:rPr>
+          <w:b/>
+          <w:color w:val="1E293B"/>
+          <w:sz w:val="20"/>
+        </w:rPr>
+        <w:t xml:space="preserve">– Đề tài: </w:t>
+      </w:r>
+      <w:r>
+        <w:rPr>
+          <w:color w:val="334155"/>
+          <w:sz w:val="20"/>
+        </w:rPr>
+        <w:t>Đề tài DT005: Hệ thống kiểm tra toàn vẹn tệp bằng SHA-256, HMAC và cây Merkle phân cấp động.</w:t>
       </w:r>
     </w:p>
     <w:p>
       <w:pPr>
+        <w:spacing w:before="20" w:after="40"/>
+        <w:ind w:left="504"/>
+      </w:pPr>
+      <w:r>
+        <w:rPr>
+          <w:b/>
+          <w:color w:val="1E293B"/>
+          <w:sz w:val="20"/>
+        </w:rPr>
+        <w:t xml:space="preserve">– Thông tin quản lý: </w:t>
+      </w:r>
+      <w:r>
+        <w:rPr>
+          <w:color w:val="334155"/>
+          <w:sz w:val="20"/>
+        </w:rPr>
+        <w:t>Học phần: An toàn và bảo mật hệ thống thông tin | GVHD: ThS. Phạm Trọng Huynh | SVTH: Võ Anh Kiệt — MSSV: 1150080143 — Lớp: 11_CNPM2.</w:t>
+      </w:r>
+    </w:p>
+    <w:p>
+      <w:pPr>
+        <w:spacing w:before="60" w:after="40"/>
+        <w:ind w:left="288"/>
+      </w:pPr>
+      <w:r>
+        <w:rPr>
+          <w:i/>
+          <w:color w:val="1E40AF"/>
+          <w:sz w:val="20"/>
+        </w:rPr>
+        <w:t>Lời thuyết minh tiếp nối: Phần trình bày báo cáo giữa kỳ của đề tài DT005 đến đây là kết thúc. Xin chân thành cảm ơn sự chú ý lắng nghe của Thầy cùng các bạn. Nhóm xin sẵn sàng lắng nghe các ý kiến nhận xét và giải đáp các câu hỏi trong phiên thảo luận.</w:t>
+      </w:r>
+    </w:p>
+    <w:p>
+      <w:pPr>
+        <w:spacing w:before="20" w:after="160"/>
+        <w:ind w:left="288"/>
+      </w:pPr>
+      <w:r>
+        <w:rPr>
+          <w:color w:val="94A3B8"/>
+          <w:sz w:val="18"/>
+        </w:rPr>
+        <w:t>• Ghi chú chân Slide: Phiên hỏi đáp học thuật và đóng góp ý kiến hoàn thiện đồ án.</w:t>
+      </w:r>
+    </w:p>
+    <w:p>
+      <w:r>
+        <w:br w:type="page"/>
+      </w:r>
+    </w:p>
+    <w:p>
+      <w:pPr>
         <w:pStyle w:val="Heading1"/>
-        <w:spacing w:before="280" w:after="200"/>
+        <w:spacing w:before="280" w:after="160"/>
       </w:pPr>
       <w:r>
         <w:rPr>
           <w:b/>
           <w:color w:val="1E40AF"/>
-          <w:sz w:val="28"/>
-        </w:rPr>
-        <w:t>PHẦN 2: HƯỚNG DẪN THAO TÁC DIỄN TẬP DEMO THỰC TẾ</w:t>
+          <w:sz w:val="27"/>
+        </w:rPr>
+        <w:t>PHẦN 2: HƯỚNG DẪN THAO TÁC DIỄN TẬP DEMO THỰC TẾ (TẬP TRUNG BÀI BÁO)</w:t>
       </w:r>
     </w:p>
     <w:p>
@@ -1063,7 +3182,7 @@
         <w:rPr>
           <w:b/>
           <w:color w:val="0F172A"/>
-          <w:sz w:val="24"/>
+          <w:sz w:val="23"/>
         </w:rPr>
         <w:t>Phương án 1: Diễn tập Đối kháng 2 Màn hình trên Trình duyệt Web (Khuyến nghị ưu tiên)</w:t>
       </w:r>
@@ -1129,7 +3248,7 @@
         <w:br/>
         <w:t>Bấm nút 'Nạp &amp; Tính toán Toàn vẹn'. Hệ thống tính toán và hiển thị Root Hash ban đầu H_0 với trạng thái màu xanh an toàn: '100% NGUYÊN VẸN'.</w:t>
         <w:br/>
-        <w:t>Ý nghĩa học thuật: Minh họa khái niệm 'đăng ký đối tượng' (registration of objects) theo Cantwell Smith và thiết lập trạng thái tin cậy khách quan theo Dretske.</w:t>
+        <w:t>Ý nghĩa học thuật tiếp nối: Minh họa khái niệm 'đăng ký đối tượng' (registration of objects) theo Cantwell Smith và thiết lập trạng thái tin cậy khách quan theo Dretske.</w:t>
       </w:r>
     </w:p>
     <w:p>
@@ -1164,7 +3283,7 @@
         <w:br/>
         <w:t>• Bảng truy vết chỉ ra chính xác tệp tin Resume/Resume.csv bị tác động.</w:t>
         <w:br/>
-        <w:t>Ý nghĩa học thuật: Minh chứng luận điểm Halpin — Kẻ đối đầu mật mã học là tác nhân có chủ đích (intentional agent), hàm băm mật mã học lập tức bắt quả tang mọi sai lệch dù chỉ 1 bit.</w:t>
+        <w:t>Ý nghĩa học thuật tiếp nối: Minh chứng luận điểm Halpin — Kẻ đối đầu mật mã học là tác nhân có chủ đích (intentional agent), hàm băm mật mã học lập tức bắt quả tang mọi sai lệch dù chỉ 1 bit.</w:t>
       </w:r>
     </w:p>
     <w:p>
@@ -1199,7 +3318,7 @@
         <w:br/>
         <w:t>• Ngược lại, hàm băm SHA-256 phát hiện vi phạm ngay lập tức nhờ tính phi tuyến và hiệu ứng tuyết lở (~50%).</w:t>
         <w:br/>
-        <w:t>Ý nghĩa học thuật: Trực quan hóa luận điểm mấu chốt của bài báo Halpin — phân biệt rạch ròi giữa mã phát hiện lỗi ngẫu nhiên của Shannon và mật mã học trước kẻ thù có chủ đích.</w:t>
+        <w:t>Ý nghĩa học thuật tiếp nối: Trực quan hóa luận điểm mấu chốt của bài báo Halpin — phân biệt rạch ròi giữa mã phát hiện lỗi ngẫu nhiên của Shannon và mật mã học trước kẻ thù có chủ đích.</w:t>
       </w:r>
     </w:p>
     <w:p>
@@ -1239,7 +3358,7 @@
         <w:rPr>
           <w:b/>
           <w:color w:val="0F172A"/>
-          <w:sz w:val="24"/>
+          <w:sz w:val="23"/>
         </w:rPr>
         <w:t>Phương án 2: Diễn tập Dòng lệnh Terminal CLI (Dự phòng trường hợp không dùng UI)</w:t>
       </w:r>
@@ -1277,13 +3396,13 @@
     <w:p>
       <w:pPr>
         <w:pStyle w:val="Heading1"/>
-        <w:spacing w:before="280" w:after="200"/>
+        <w:spacing w:before="280" w:after="160"/>
       </w:pPr>
       <w:r>
         <w:rPr>
           <w:b/>
           <w:color w:val="1E40AF"/>
-          <w:sz w:val="28"/>
+          <w:sz w:val="27"/>
         </w:rPr>
         <w:t>PHẦN 3: BỘ CÂU HỎI &amp; LUẬN ĐIỂM PHẢN BIỆN CHUYÊN SÂU (Q&amp;A DEFENSE)</w:t>
       </w:r>

</xml_diff>

<commit_message>
Refactor Word script: clean slide bullets and plain-language intuitive explanations in callout boxes
</commit_message>
<xml_diff>
--- a/Kich_Ban_Thuyet_Trinh_Va_Demo_DT005.docx
+++ b/Kich_Ban_Thuyet_Trinh_Va_Demo_DT005.docx
@@ -80,7 +80,7 @@
           <w:color w:val="1E40AF"/>
           <w:sz w:val="27"/>
         </w:rPr>
-        <w:t>PHẦN 1: NỘI DUNG TRÊN SLIDE &amp; LỜI THOẠI THUYẾT MINH CHI TIẾT (15 SLIDE)</w:t>
+        <w:t>PHẦN 1: NỘI DUNG TRÊN SLIDE &amp; HƯỚNG DẪN GIẢI THÍCH DỄ HIỂU (15 SLIDE)</w:t>
       </w:r>
     </w:p>
     <w:p>
@@ -115,23 +115,23 @@
           <w:color w:val="475569"/>
           <w:sz w:val="19"/>
         </w:rPr>
-        <w:t>• Tiêu đề phụ / Section trên Slide: Trường ĐH Tài nguyên và Môi trường TP.HCM — Khoa Công nghệ thông tin</w:t>
+        <w:t>• Vị trí Slide: Trường ĐH Tài nguyên và Môi trường TP.HCM — Khoa Công nghệ thông tin</w:t>
         <w:br/>
-        <w:t xml:space="preserve">  Báo cáo thuyết trình đồ án giữa kỳ — Đề tài DT005</w:t>
+        <w:t xml:space="preserve">  Tiêu đề phụ: Báo cáo thuyết trình đồ án giữa kỳ — Đề tài DT005</w:t>
       </w:r>
     </w:p>
     <w:p>
       <w:pPr>
-        <w:spacing w:before="60" w:after="20"/>
+        <w:spacing w:before="40" w:after="40"/>
         <w:ind w:left="288"/>
       </w:pPr>
       <w:r>
         <w:rPr>
           <w:b/>
           <w:color w:val="0F172A"/>
-          <w:sz w:val="21"/>
+          <w:sz w:val="20"/>
         </w:rPr>
-        <w:t>Thông tin báo cáo trên Slide:</w:t>
+        <w:t>Nội dung hiển thị trên Slide:</w:t>
       </w:r>
     </w:p>
     <w:p>
@@ -145,7 +145,7 @@
           <w:color w:val="1E293B"/>
           <w:sz w:val="20"/>
         </w:rPr>
-        <w:t xml:space="preserve">– Đề tài: </w:t>
+        <w:t xml:space="preserve">– Tên đề tài: </w:t>
       </w:r>
       <w:r>
         <w:rPr>
@@ -187,37 +187,66 @@
           <w:color w:val="1E293B"/>
           <w:sz w:val="20"/>
         </w:rPr>
-        <w:t xml:space="preserve">– Thông tin quản lý: </w:t>
+        <w:t xml:space="preserve">– Thông tin thực hiện: </w:t>
       </w:r>
       <w:r>
         <w:rPr>
           <w:color w:val="334155"/>
           <w:sz w:val="20"/>
         </w:rPr>
-        <w:t>Học phần: An toàn và bảo mật hệ thống thông tin | GVHD: ThS. Phạm Trọng Huynh | SVTH: Võ Anh Kiệt — MSSV: 1150080143 — Lớp: 11_CNPM2.</w:t>
+        <w:t>Học phần: An toàn và bảo mật hệ thống thông tin | GVHD: ThS. Phạm Trọng Huynh | SVTH: Võ Anh Kiệt — MSSV: 1150080143.</w:t>
       </w:r>
     </w:p>
+    <w:tbl>
+      <w:tblPr>
+        <w:tblW w:type="auto" w:w="0"/>
+        <w:jc w:val="center"/>
+        <w:tblLook w:firstColumn="1" w:firstRow="1" w:lastColumn="0" w:lastRow="0" w:noHBand="0" w:noVBand="1" w:val="04A0"/>
+      </w:tblPr>
+      <w:tblGrid>
+        <w:gridCol w:w="9360"/>
+      </w:tblGrid>
+      <w:tr>
+        <w:tc>
+          <w:tcPr>
+            <w:tcW w:type="dxa" w:w="9360"/>
+            <w:shd w:val="clear" w:color="auto" w:fill="F1F5F9"/>
+          </w:tcPr>
+          <w:p>
+            <w:pPr>
+              <w:spacing w:before="80" w:after="80"/>
+              <w:ind w:left="144" w:right="144"/>
+            </w:pPr>
+            <w:r>
+              <w:rPr>
+                <w:b/>
+                <w:color w:val="1E40AF"/>
+                <w:sz w:val="20"/>
+              </w:rPr>
+              <w:t>💡 Hướng dẫn thuyết minh &amp; Giải thích dễ hiểu:</w:t>
+              <w:br/>
+            </w:r>
+            <w:r>
+              <w:rPr>
+                <w:color w:val="334155"/>
+                <w:sz w:val="19"/>
+              </w:rPr>
+              <w:t>Cách mở đầu báo cáo ngắn gọn, tự nhiên:</w:t>
+              <w:br/>
+              <w:t>Báo cáo giữa kỳ của đề tài kết hợp hai phần: Một là thẩm định học thuật bài báo triết học về Kẻ thù trong mật mã học của TS. Harry Halpin; Hai là tự xây dựng một hệ thống demo thực tế trên máy tính để kiểm tra toàn vẹn tệp tin, làm bằng chứng thực nghiệm minh họa cho các luận điểm của bài báo.</w:t>
+            </w:r>
+          </w:p>
+        </w:tc>
+      </w:tr>
+    </w:tbl>
     <w:p>
       <w:pPr>
-        <w:spacing w:before="60" w:after="40"/>
+        <w:spacing w:before="80" w:after="200"/>
         <w:ind w:left="288"/>
       </w:pPr>
       <w:r>
         <w:rPr>
           <w:i/>
-          <w:color w:val="1E40AF"/>
-          <w:sz w:val="20"/>
-        </w:rPr>
-        <w:t>Lời thuyết minh tiếp nối: Báo cáo giữa kỳ đề tài DT005 tập trung vào 3 trọng tâm: (1) Thẩm định nhận thức luận về Kẻ thù trong mật mã học của Halpin; (2) Phân định phương pháp luận minh bạch giữa khảo cứu triết học lý thuyết của tác giả và hệ thống phần mềm minh họa độc lập do sinh viên xây dựng; (3) Diễn tập thực nghiệm đối kháng an ninh Red Team vs Blue Team trên tập dữ liệu thực tế.</w:t>
-      </w:r>
-    </w:p>
-    <w:p>
-      <w:pPr>
-        <w:spacing w:before="20" w:after="160"/>
-        <w:ind w:left="288"/>
-      </w:pPr>
-      <w:r>
-        <w:rPr>
           <w:color w:val="94A3B8"/>
           <w:sz w:val="18"/>
         </w:rPr>
@@ -256,23 +285,23 @@
           <w:color w:val="475569"/>
           <w:sz w:val="19"/>
         </w:rPr>
-        <w:t>• Tiêu đề phụ / Section trên Slide: SECTION 1 — GIỚI THIỆU &amp; MỤC TIÊU BÀI BÁO (TRANG 1–2)</w:t>
+        <w:t>• Vị trí Slide: SECTION 1 — GIỚI THIỆU &amp; MỤC TIÊU BÀI BÁO (TRANG 1–2)</w:t>
         <w:br/>
-        <w:t xml:space="preserve">  Khảo cứu nhận thức luận về Kẻ thù trong Mật mã học và Chương trình nghiên cứu tương lai</w:t>
+        <w:t xml:space="preserve">  Tiêu đề phụ: Khảo cứu nhận thức luận về Kẻ thù trong Mật mã học và Chương trình nghiên cứu tương lai</w:t>
       </w:r>
     </w:p>
     <w:p>
       <w:pPr>
-        <w:spacing w:before="60" w:after="20"/>
+        <w:spacing w:before="40" w:after="40"/>
         <w:ind w:left="288"/>
       </w:pPr>
       <w:r>
         <w:rPr>
           <w:b/>
           <w:color w:val="0F172A"/>
-          <w:sz w:val="21"/>
+          <w:sz w:val="20"/>
         </w:rPr>
-        <w:t>1. Bối Cảnh Mật Mã Học &amp; Nghịch Lý Nhận Thức Luận:</w:t>
+        <w:t>Nội dung hiển thị trên Slide:</w:t>
       </w:r>
     </w:p>
     <w:p>
@@ -286,14 +315,14 @@
           <w:color w:val="1E293B"/>
           <w:sz w:val="20"/>
         </w:rPr>
-        <w:t xml:space="preserve">– Mật mã học trong kỷ nguyên số: </w:t>
+        <w:t xml:space="preserve">– 1. Bối cảnh mật mã học: </w:t>
       </w:r>
       <w:r>
         <w:rPr>
           <w:color w:val="334155"/>
           <w:sz w:val="20"/>
         </w:rPr>
-        <w:t>Khoa học về truyền thông bí mật khi có sự hiện diện của đối thủ có chủ đích. Internet biến không gian mạng thành nơi tương tác với vô vàn đối thủ tiềm tàng, xa lạ — qua đó cho thấy giả định về kênh truyền đóng kín không còn phù hợp.</w:t>
+        <w:t>Khoa học về truyền thông bí mật khi có sự hiện diện của đối thủ có chủ đích trên môi trường mạng mở.</w:t>
       </w:r>
     </w:p>
     <w:p>
@@ -307,14 +336,14 @@
           <w:color w:val="1E293B"/>
           <w:sz w:val="20"/>
         </w:rPr>
-        <w:t xml:space="preserve">– Nghịch lý nhận thức luận: </w:t>
+        <w:t xml:space="preserve">– 2. Nghịch lý nhận thức luận: </w:t>
       </w:r>
       <w:r>
         <w:rPr>
           <w:color w:val="334155"/>
           <w:sz w:val="20"/>
         </w:rPr>
-        <w:t>Lý thuyết thông tin của Shannon (1948) được triết học khảo cứu sâu sắc, nhưng chính mật mã học — cái nôi khai sinh lý thuyết thông tin — lại bị triết học bỏ quên suốt nhiều thập kỷ — bài báo của Halpin là công trình tiên phong giải quyết khoảng trống này.</w:t>
+        <w:t>Lý thuyết thông tin của Shannon (1948) được triết học nghiên cứu sâu rộng, nhưng chính mật mã học lại bị triết học bỏ quên suốt nhiều thập kỷ.</w:t>
       </w:r>
     </w:p>
     <w:p>
@@ -328,28 +357,14 @@
           <w:color w:val="1E293B"/>
           <w:sz w:val="20"/>
         </w:rPr>
-        <w:t xml:space="preserve">– Cái giá của sự trừu tượng hóa: </w:t>
+        <w:t xml:space="preserve">– 3. Cái giá của sự trừu tượng hóa: </w:t>
       </w:r>
       <w:r>
         <w:rPr>
           <w:color w:val="334155"/>
           <w:sz w:val="20"/>
         </w:rPr>
-        <w:t>Khi mật mã học biến thành các bài toán toán học thuần túy trên giấy, nó tạo ra điểm mù nguy hiểm trước các đòn tấn công vật lý trong thế giới thực — khiến hệ thống dù có chứng minh an toàn toán học vẫn sụp đổ trước các kênh rò rỉ phụ.</w:t>
-      </w:r>
-    </w:p>
-    <w:p>
-      <w:pPr>
-        <w:spacing w:before="60" w:after="20"/>
-        <w:ind w:left="288"/>
-      </w:pPr>
-      <w:r>
-        <w:rPr>
-          <w:b/>
-          <w:color w:val="0F172A"/>
-          <w:sz w:val="21"/>
-        </w:rPr>
-        <w:t>2. Ba Đóng Góp Học Thuật Chính Của Harry Halpin:</w:t>
+        <w:t>Xem mật mã học chỉ là các bài toán toán học thuần túy trên giấy sẽ tạo ra điểm mù nguy hiểm trước các đòn tấn công vật lý trong thế giới thực.</w:t>
       </w:r>
     </w:p>
     <w:p>
@@ -363,79 +378,68 @@
           <w:color w:val="1E293B"/>
           <w:sz w:val="20"/>
         </w:rPr>
-        <w:t xml:space="preserve">– Khảo sát Lịch sử &amp; Triết học: </w:t>
+        <w:t xml:space="preserve">– 4. Ba đóng góp học thuật của Halpin: </w:t>
       </w:r>
       <w:r>
         <w:rPr>
           <w:color w:val="334155"/>
           <w:sz w:val="20"/>
         </w:rPr>
-        <w:t>Hệ thống hóa toàn diện quá trình tiến hóa mô hình đối thủ: từ Shannon (1949), PPT Adversary (1984), Dolev-Yao (1983) đến Random Oracle Model (1993) — làm rõ sự chuyển dịch từ an toàn thông tin sang độ phức tạp tính toán.</w:t>
+        <w:t>Hệ thống hóa lịch sử các mô hình đối thủ; Phê phán giới hạn của việc toán học hóa; Đề xuất 4 câu hỏi nghiên cứu mở kết hợp liên ngành.</w:t>
       </w:r>
     </w:p>
+    <w:tbl>
+      <w:tblPr>
+        <w:tblW w:type="auto" w:w="0"/>
+        <w:jc w:val="center"/>
+        <w:tblLook w:firstColumn="1" w:firstRow="1" w:lastColumn="0" w:lastRow="0" w:noHBand="0" w:noVBand="1" w:val="04A0"/>
+      </w:tblPr>
+      <w:tblGrid>
+        <w:gridCol w:w="9360"/>
+      </w:tblGrid>
+      <w:tr>
+        <w:tc>
+          <w:tcPr>
+            <w:tcW w:type="dxa" w:w="9360"/>
+            <w:shd w:val="clear" w:color="auto" w:fill="F1F5F9"/>
+          </w:tcPr>
+          <w:p>
+            <w:pPr>
+              <w:spacing w:before="80" w:after="80"/>
+              <w:ind w:left="144" w:right="144"/>
+            </w:pPr>
+            <w:r>
+              <w:rPr>
+                <w:b/>
+                <w:color w:val="1E40AF"/>
+                <w:sz w:val="20"/>
+              </w:rPr>
+              <w:t>💡 Hướng dẫn thuyết minh &amp; Giải thích dễ hiểu:</w:t>
+              <w:br/>
+            </w:r>
+            <w:r>
+              <w:rPr>
+                <w:color w:val="334155"/>
+                <w:sz w:val="19"/>
+              </w:rPr>
+              <w:t>Giải thích các thuật ngữ khó hiểu trên Slide:</w:t>
+              <w:br/>
+              <w:t>• 'Nghịch lý nhận thức luận' là gì? Nghĩa là từ trước đến nay, các nhà nghiên cứu rất hay bàn về triết học của thông tin (thông tin là gì, truyền tin thế nào). Nhưng họ lại quên mất một thực tế hiển nhiên: Khi truyền tin qua mạng thì luôn có kẻ xấu rình rập để nghe lén hoặc phá hoại. Mật mã học sinh ra chính là để đối phó với kẻ xấu đó, nhưng giới triết học lại bỏ quên góc nhìn này. Bài báo của Halpin ra đời để giải quyết đúng khoảng trống đó.</w:t>
+              <w:br/>
+              <w:t>• 'Cái giá của sự trừu tượng hóa' là gì? Nghĩa là nếu ta chỉ ngồi trên giấy chứng minh công thức toán học này an toàn tuyệt đối, ta sẽ bị mù trước thực tế. Kẻ trộm ngoài đời không cần đi bẻ công thức toán, mà chúng đo xem máy tính chạy mất bao nhiêu giây, ăn bao nhiêu điện để đoán ra mật khẩu. Coi an toàn chỉ là toán học sẽ khiến hệ thống sụp đổ trước các đòn đánh vật lý.</w:t>
+            </w:r>
+          </w:p>
+        </w:tc>
+      </w:tr>
+    </w:tbl>
     <w:p>
       <w:pPr>
-        <w:spacing w:before="20" w:after="40"/>
-        <w:ind w:left="504"/>
-      </w:pPr>
-      <w:r>
-        <w:rPr>
-          <w:b/>
-          <w:color w:val="1E293B"/>
-          <w:sz w:val="20"/>
-        </w:rPr>
-        <w:t xml:space="preserve">– Phê phán Giới hạn Hình thức hóa: </w:t>
-      </w:r>
-      <w:r>
-        <w:rPr>
-          <w:color w:val="334155"/>
-          <w:sz w:val="20"/>
-        </w:rPr>
-        <w:t>Chỉ rõ sự sụp đổ của các mô hình toán học trước thực tiễn: rò rỉ kênh kề (Kocher 1996), độ dài bản mã, rò rỉ siêu dữ liệu và giám sát hàng loạt của NSA (Snowden 2013) — khẳng định an ninh lý thuyết không đồng nghĩa với an ninh vật lý.</w:t>
-      </w:r>
-    </w:p>
-    <w:p>
-      <w:pPr>
-        <w:spacing w:before="20" w:after="40"/>
-        <w:ind w:left="504"/>
-      </w:pPr>
-      <w:r>
-        <w:rPr>
-          <w:b/>
-          <w:color w:val="1E293B"/>
-          <w:sz w:val="20"/>
-        </w:rPr>
-        <w:t xml:space="preserve">– Đề xuất Chương trình Mới: </w:t>
-      </w:r>
-      <w:r>
-        <w:rPr>
-          <w:color w:val="334155"/>
-          <w:sz w:val="20"/>
-        </w:rPr>
-        <w:t>Thiết lập 4 câu hỏi nghiên cứu mở (Section 7) nhằm mở rộng mật mã học từ một nhánh toán học biệt lập thành một khoa học an ninh hoàn chỉnh kết hợp thực nghiệm — định hướng liên ngành giữa triết học, an ninh mạng và khoa học xã hội.</w:t>
-      </w:r>
-    </w:p>
-    <w:p>
-      <w:pPr>
-        <w:spacing w:before="60" w:after="40"/>
+        <w:spacing w:before="80" w:after="200"/>
         <w:ind w:left="288"/>
       </w:pPr>
       <w:r>
         <w:rPr>
           <w:i/>
-          <w:color w:val="1E40AF"/>
-          <w:sz w:val="20"/>
-        </w:rPr>
-        <w:t>Lời thuyết minh tiếp nối: Ba đóng góp này tạo nên sợi chỉ đỏ xuyên suốt: Phê phán sự cô lập của mô hình toán học thuần túy và kêu gọi đưa mật mã học trở về với thế giới vật lý thực tế.</w:t>
-      </w:r>
-    </w:p>
-    <w:p>
-      <w:pPr>
-        <w:spacing w:before="20" w:after="160"/>
-        <w:ind w:left="288"/>
-      </w:pPr>
-      <w:r>
-        <w:rPr>
           <w:color w:val="94A3B8"/>
           <w:sz w:val="18"/>
         </w:rPr>
@@ -474,23 +478,23 @@
           <w:color w:val="475569"/>
           <w:sz w:val="19"/>
         </w:rPr>
-        <w:t>• Tiêu đề phụ / Section trên Slide: SECTION 2 &amp; 3 — CƠ SỞ TRIẾT HỌC VỀ THÔNG TIN (TRANG 2–5)</w:t>
+        <w:t>• Vị trí Slide: SECTION 2 &amp; 3 — CƠ SỞ TRIẾT HỌC VỀ THÔNG TIN (TRANG 2–5)</w:t>
         <w:br/>
-        <w:t xml:space="preserve">  Khung nhận thức luận của Fred Dretske và Brian Cantwell Smith ứng dụng trong Mật mã học</w:t>
+        <w:t xml:space="preserve">  Tiêu đề phụ: Khung nhận thức luận của Fred Dretske và Brian Cantwell Smith ứng dụng trong Mật mã học</w:t>
       </w:r>
     </w:p>
     <w:p>
       <w:pPr>
-        <w:spacing w:before="60" w:after="20"/>
+        <w:spacing w:before="40" w:after="40"/>
         <w:ind w:left="288"/>
       </w:pPr>
       <w:r>
         <w:rPr>
           <w:b/>
           <w:color w:val="0F172A"/>
-          <w:sz w:val="21"/>
+          <w:sz w:val="20"/>
         </w:rPr>
-        <w:t>1. Bản Thể Học Thông Tin — Brian Cantwell Smith (1996):</w:t>
+        <w:t>Nội dung hiển thị trên Slide:</w:t>
       </w:r>
     </w:p>
     <w:p>
@@ -504,14 +508,14 @@
           <w:color w:val="1E293B"/>
           <w:sz w:val="20"/>
         </w:rPr>
-        <w:t xml:space="preserve">– Dòng chảy nguyên thủy: </w:t>
+        <w:t xml:space="preserve">– 1. Bản thể học thông tin (Brian Cantwell Smith): </w:t>
       </w:r>
       <w:r>
         <w:rPr>
           <w:color w:val="334155"/>
           <w:sz w:val="20"/>
         </w:rPr>
-        <w:t>Thế giới khởi đầu từ dòng chảy siêu hình không biên giới (primordial metaphysical flux) — mọi ranh giới đều do con người và hệ thống kiến tạo.</w:t>
+        <w:t>Thế giới khởi đầu từ dòng chảy siêu hình nguyên thủy; con người định hình thực tại bằng cách 'đăng ký đối tượng' (registration of objects) giữa các tác nhân ở xa nhau.</w:t>
       </w:r>
     </w:p>
     <w:p>
@@ -525,14 +529,14 @@
           <w:color w:val="1E293B"/>
           <w:sz w:val="20"/>
         </w:rPr>
-        <w:t xml:space="preserve">– Phân ranh giới: </w:t>
+        <w:t xml:space="preserve">– 2. Thuyết thông tin khách quan (Fred Dretske): </w:t>
       </w:r>
       <w:r>
         <w:rPr>
           <w:color w:val="334155"/>
           <w:sz w:val="20"/>
         </w:rPr>
-        <w:t>Con người và hệ thống định hình thực tại bằng cách đăng ký đối tượng (registration of objects) — trong mật mã, thông điệp M, bản mã C và khóa K được đăng ký để kiểm soát luồng dữ liệu.</w:t>
+        <w:t>Thông tin tồn tại khách quan theo quy luật tự nhiên; bản rõ mang thông tin về nguồn phát, hệ mật hoàn hảo đảm bảo bản mã không để rò rỉ bất kỳ thông tin nào về nguồn.</w:t>
       </w:r>
     </w:p>
     <w:p>
@@ -546,28 +550,14 @@
           <w:color w:val="1E293B"/>
           <w:sz w:val="20"/>
         </w:rPr>
-        <w:t xml:space="preserve">– Tác nhân xa (Distal): </w:t>
+        <w:t xml:space="preserve">– 3. Bản chất của Kẻ đối đầu: </w:t>
       </w:r>
       <w:r>
         <w:rPr>
           <w:color w:val="334155"/>
           <w:sz w:val="20"/>
         </w:rPr>
-        <w:t>Thông tin mật mã ra đời để truyền đạt trạng thái giữa các thực thể ở xa nhau mà không thể tương tác trực tiếp — tạo cơ sở bản thể luận cho bài toán liên lạc từ xa qua mạng.</w:t>
-      </w:r>
-    </w:p>
-    <w:p>
-      <w:pPr>
-        <w:spacing w:before="60" w:after="20"/>
-        <w:ind w:left="288"/>
-      </w:pPr>
-      <w:r>
-        <w:rPr>
-          <w:b/>
-          <w:color w:val="0F172A"/>
-          <w:sz w:val="21"/>
-        </w:rPr>
-        <w:t>2. Thuyết Thông Tin Khách Quan — Fred Dretske (1981):</w:t>
+        <w:t>Đối thủ là tác nhân có chủ đích (intentional agent), có ý chí và mục tiêu, khác hoàn toàn với nhiễu ngẫu nhiên vật lý.</w:t>
       </w:r>
     </w:p>
     <w:p>
@@ -581,156 +571,76 @@
           <w:color w:val="1E293B"/>
           <w:sz w:val="20"/>
         </w:rPr>
-        <w:t xml:space="preserve">– Thông tin khách quan: </w:t>
+        <w:t xml:space="preserve">– 4. Bản chất của Bí mật &amp; Tri thức: </w:t>
       </w:r>
       <w:r>
         <w:rPr>
           <w:color w:val="334155"/>
           <w:sz w:val="20"/>
         </w:rPr>
-        <w:t>Thông tin là tính quy luật của trạng thái sự vật (state of affairs), hoàn toàn độc lập với việc có ai đọc hay không — mang tính quy luật tự nhiên.</w:t>
+        <w:t>Common Knowledge (David Lewis): Mọi người đều biết và tin trạng thái sự việc. Public Knowledge: Thông tin ai cũng có tiềm năng tiếp cận. Bí mật là 'tri thức không phổ biến', không đồng nhất với bản rõ hay bản mã.</w:t>
       </w:r>
     </w:p>
+    <w:tbl>
+      <w:tblPr>
+        <w:tblW w:type="auto" w:w="0"/>
+        <w:jc w:val="center"/>
+        <w:tblLook w:firstColumn="1" w:firstRow="1" w:lastColumn="0" w:lastRow="0" w:noHBand="0" w:noVBand="1" w:val="04A0"/>
+      </w:tblPr>
+      <w:tblGrid>
+        <w:gridCol w:w="9360"/>
+      </w:tblGrid>
+      <w:tr>
+        <w:tc>
+          <w:tcPr>
+            <w:tcW w:type="dxa" w:w="9360"/>
+            <w:shd w:val="clear" w:color="auto" w:fill="F1F5F9"/>
+          </w:tcPr>
+          <w:p>
+            <w:pPr>
+              <w:spacing w:before="80" w:after="80"/>
+              <w:ind w:left="144" w:right="144"/>
+            </w:pPr>
+            <w:r>
+              <w:rPr>
+                <w:b/>
+                <w:color w:val="1E40AF"/>
+                <w:sz w:val="20"/>
+              </w:rPr>
+              <w:t>💡 Hướng dẫn thuyết minh &amp; Giải thích dễ hiểu:</w:t>
+              <w:br/>
+            </w:r>
+            <w:r>
+              <w:rPr>
+                <w:color w:val="334155"/>
+                <w:sz w:val="19"/>
+              </w:rPr>
+              <w:t>Giải thích các thuật ngữ triết học khó hiểu trên Slide:</w:t>
+              <w:br/>
+              <w:t>• 'Đăng ký đối tượng' (Smith) là gì? Thế giới thực vốn là một mớ dữ liệu liên tục không có đường biên. Để hai máy tính ở xa nhau nói chuyện an toàn được, con người phải 'đóng khung' dữ liệu lại thành các đối tượng rõ ràng: đâu là Thông điệp M, đâu là Bản mã C, đâu là Chìa khóa K. Nhờ đóng khung rạch ròi, hệ thống mới biết phần nào cần bảo vệ và truyền đi.</w:t>
+              <w:br/>
+              <w:t>• 'Thông tin khách quan' (Dretske) là gì? Dretske cho rằng thông tin tồn tại khách quan tự nhiên, giống như tiếng sấm nổ tự nó báo hiệu trời sắp mưa, dù có ai nghe hay không. Áp dụng vào mật mã: Bản rõ chứa thông tin thật; nếu mã hóa tốt thì bản mã nhìn như một mớ dữ liệu rác vô nghĩa, hoàn toàn không dính dáng gì đến thông tin gốc, khiến kẻ trộm nhìn vào không suy đoán được gì.</w:t>
+              <w:br/>
+              <w:t>• Phân biệt Common Knowledge và Public Knowledge (David Lewis 1969):</w:t>
+              <w:br/>
+              <w:t xml:space="preserve">  - Common Knowledge (Tri thức chung): Là thông tin mà mọi người đều biết, và ai cũng biết là người khác cũng biết (ví dụ: luật đèn đỏ phải dừng, ai đi đường cũng biết và tin chắc người đối diện cũng biết luật đó).</w:t>
+              <w:br/>
+              <w:t xml:space="preserve">  - Public Knowledge (Tri thức công khai): Là thông tin ai cũng có thể tìm thấy nếu muốn (ví dụ: tài liệu mật bị rò rỉ lên mạng, ai tò mò lên mạng tải về là đọc được).</w:t>
+              <w:br/>
+              <w:t xml:space="preserve">  - Bí mật (Secret): Tác giả định nghĩa bí mật là 'thứ không công khai' (uncommon knowledge). Bí mật không phải tự thân chuỗi bit có phép thuật, mà là mối quan hệ xã hội: Chừng nào nhóm của ta vẫn giữ kín được thông tin và không để lọt ra ngoài, thì chừng đó nó vẫn là bí mật.</w:t>
+            </w:r>
+          </w:p>
+        </w:tc>
+      </w:tr>
+    </w:tbl>
     <w:p>
       <w:pPr>
-        <w:spacing w:before="20" w:after="40"/>
-        <w:ind w:left="504"/>
-      </w:pPr>
-      <w:r>
-        <w:rPr>
-          <w:b/>
-          <w:color w:val="1E293B"/>
-          <w:sz w:val="20"/>
-        </w:rPr>
-        <w:t xml:space="preserve">– Thông tin và Bí mật: </w:t>
-      </w:r>
-      <w:r>
-        <w:rPr>
-          <w:color w:val="334155"/>
-          <w:sz w:val="20"/>
-        </w:rPr>
-        <w:t>Bản rõ chứa đựng thông tin về nguồn; bản mã khi được mã hóa hoàn hảo sẽ không làm rò rỉ bất kỳ thông tin nào về nguồn — ngăn chặn đối thủ suy diễn bản rõ.</w:t>
-      </w:r>
-    </w:p>
-    <w:p>
-      <w:pPr>
-        <w:spacing w:before="20" w:after="40"/>
-        <w:ind w:left="504"/>
-      </w:pPr>
-      <w:r>
-        <w:rPr>
-          <w:b/>
-          <w:color w:val="1E293B"/>
-          <w:sz w:val="20"/>
-        </w:rPr>
-        <w:t xml:space="preserve">– Dòng chảy thông tin: </w:t>
-      </w:r>
-      <w:r>
-        <w:rPr>
-          <w:color w:val="334155"/>
-          <w:sz w:val="20"/>
-        </w:rPr>
-        <w:t>Nhiệm vụ của mật mã là kiểm soát dòng chảy thông tin chỉ đi đến người nhận được ủy quyền — ngăn chặn phát tán đến các tác nhân trái phép.</w:t>
-      </w:r>
-    </w:p>
-    <w:p>
-      <w:pPr>
-        <w:spacing w:before="60" w:after="20"/>
-        <w:ind w:left="288"/>
-      </w:pPr>
-      <w:r>
-        <w:rPr>
-          <w:b/>
-          <w:color w:val="0F172A"/>
-          <w:sz w:val="21"/>
-        </w:rPr>
-        <w:t>3. Tác Nhân Có Chủ Đích — Bản chất của đối thủ:</w:t>
-      </w:r>
-    </w:p>
-    <w:p>
-      <w:pPr>
-        <w:spacing w:before="20" w:after="40"/>
-        <w:ind w:left="504"/>
-      </w:pPr>
-      <w:r>
-        <w:rPr>
-          <w:b/>
-          <w:color w:val="1E293B"/>
-          <w:sz w:val="20"/>
-        </w:rPr>
-        <w:t xml:space="preserve">– Tính chủ đích (Intentionality): </w:t>
-      </w:r>
-      <w:r>
-        <w:rPr>
-          <w:color w:val="334155"/>
-          <w:sz w:val="20"/>
-        </w:rPr>
-        <w:t>Đối thủ không phải là 'nhiễu ngẫu nhiên' mà là thực thể có niềm tin, mục tiêu và ý chí khai thác lỗ hổng — phân biệt triệt để mật mã với truyền thông vật lý thông thường.</w:t>
-      </w:r>
-    </w:p>
-    <w:p>
-      <w:pPr>
-        <w:spacing w:before="20" w:after="40"/>
-        <w:ind w:left="504"/>
-      </w:pPr>
-      <w:r>
-        <w:rPr>
-          <w:b/>
-          <w:color w:val="1E293B"/>
-          <w:sz w:val="20"/>
-        </w:rPr>
-        <w:t xml:space="preserve">– Tính tương đối của bí mật: </w:t>
-      </w:r>
-      <w:r>
-        <w:rPr>
-          <w:color w:val="334155"/>
-          <w:sz w:val="20"/>
-        </w:rPr>
-        <w:t>Bí mật không tồn tại tự thân; nó là mối quan hệ giữa nhóm người giữ bí mật và thế giới bên ngoài trong một khoảng thời gian — sẽ mất đi khi mối quan hệ này bị phá vỡ.</w:t>
-      </w:r>
-    </w:p>
-    <w:p>
-      <w:pPr>
-        <w:spacing w:before="20" w:after="40"/>
-        <w:ind w:left="504"/>
-      </w:pPr>
-      <w:r>
-        <w:rPr>
-          <w:b/>
-          <w:color w:val="1E293B"/>
-          <w:sz w:val="20"/>
-        </w:rPr>
-        <w:t xml:space="preserve">– Public vs Common Knowledge: </w:t>
-      </w:r>
-      <w:r>
-        <w:rPr>
-          <w:color w:val="334155"/>
-          <w:sz w:val="20"/>
-        </w:rPr>
-        <w:t>Common Knowledge (David Lewis 1969): Mọi tác nhân đều biết và tin trạng thái sự việc. Public Knowledge: Thông tin mà bất kỳ ai cũng có tiềm năng tiếp cận (như khi bị rò rỉ). Bí mật là 'tri thức không phổ biến', không đồng nhất với bản rõ hay bản mã.</w:t>
-      </w:r>
-    </w:p>
-    <w:p>
-      <w:pPr>
-        <w:spacing w:before="60" w:after="40"/>
+        <w:spacing w:before="80" w:after="200"/>
         <w:ind w:left="288"/>
       </w:pPr>
       <w:r>
         <w:rPr>
           <w:i/>
-          <w:color w:val="1E40AF"/>
-          <w:sz w:val="20"/>
-        </w:rPr>
-        <w:t>Lời thuyết minh tiếp nối: Hai trụ cột triết học này xác lập rằng Kẻ đối đầu mật mã học là tác nhân có chủ đích, và bí mật là mối quan hệ mang tính vị thế xã hội chứ không phải thuộc tính tự thân của chuỗi bit.</w:t>
-      </w:r>
-    </w:p>
-    <w:p>
-      <w:pPr>
-        <w:spacing w:before="20" w:after="160"/>
-        <w:ind w:left="288"/>
-      </w:pPr>
-      <w:r>
-        <w:rPr>
           <w:color w:val="94A3B8"/>
           <w:sz w:val="18"/>
         </w:rPr>
@@ -769,23 +679,23 @@
           <w:color w:val="475569"/>
           <w:sz w:val="19"/>
         </w:rPr>
-        <w:t>• Tiêu đề phụ / Section trên Slide: SƠ ĐỒ 1: DÒNG THỜI GIAN TIẾN HÓA MÔ HÌNH ĐỐI THỦ</w:t>
+        <w:t>• Vị trí Slide: SƠ ĐỒ 1: DÒNG THỜI GIAN TIẾN HÓA MÔ HÌNH ĐỐI THỦ</w:t>
         <w:br/>
-        <w:t xml:space="preserve">  Sự dịch chuyển từ Lý thuyết thông tin sang Giả định độ phức tạp tính toán và Phê phán hậu Snowden</w:t>
+        <w:t xml:space="preserve">  Tiêu đề phụ: Sự dịch chuyển từ Lý thuyết thông tin sang Giả định độ phức tạp tính toán và Phê phán hậu Snowden</w:t>
       </w:r>
     </w:p>
     <w:p>
       <w:pPr>
-        <w:spacing w:before="60" w:after="20"/>
+        <w:spacing w:before="40" w:after="40"/>
         <w:ind w:left="288"/>
       </w:pPr>
       <w:r>
         <w:rPr>
           <w:b/>
           <w:color w:val="0F172A"/>
-          <w:sz w:val="21"/>
+          <w:sz w:val="20"/>
         </w:rPr>
-        <w:t>Nội dung dòng thời gian 5 giai đoạn:</w:t>
+        <w:t>Nội dung hiển thị trên Slide:</w:t>
       </w:r>
     </w:p>
     <w:p>
@@ -799,14 +709,14 @@
           <w:color w:val="1E293B"/>
           <w:sz w:val="20"/>
         </w:rPr>
-        <w:t xml:space="preserve">– Giai đoạn 1 (1948–1949) — [MÔ HÌNH SHANNON]: </w:t>
+        <w:t xml:space="preserve">– Giai đoạn 1 (1948–1949) — Mô hình Shannon: </w:t>
       </w:r>
       <w:r>
         <w:rPr>
           <w:color w:val="334155"/>
           <w:sz w:val="20"/>
         </w:rPr>
-        <w:t>Mô hình truyền thông bảo mật điểm - điểm; định nghĩa Bí mật hoàn hảo H(K) &gt;= H(M). Giới hạn: Giản lược đối thủ thành kẻ nghe lén trên kênh trừu tượng, bỏ qua chi phí phân phối khóa và thực tế xã hội - kỹ thuật — đặt nền móng lý thuyết nhưng cô lập với thực tế triển khai.</w:t>
+        <w:t>Mô hình bảo mật điểm-điểm; định nghĩa Bí mật hoàn hảo H(K) &gt;= H(M). Giới hạn: Giản lược đối thủ thành kẻ nghe lén trên kênh trừu tượng, bỏ qua chi phí phân phối khóa.</w:t>
       </w:r>
     </w:p>
     <w:p>
@@ -820,14 +730,14 @@
           <w:color w:val="1E293B"/>
           <w:sz w:val="20"/>
         </w:rPr>
-        <w:t xml:space="preserve">– Giai đoạn 2 (1976) — [CÁCH MẠNG KHÓA CÔNG KHAI]: </w:t>
+        <w:t xml:space="preserve">– Giai đoạn 2 (1976) — Cách mạng Khóa công khai: </w:t>
       </w:r>
       <w:r>
         <w:rPr>
           <w:color w:val="334155"/>
           <w:sz w:val="20"/>
         </w:rPr>
-        <w:t>Diffie-Hellman và Merkle giải quyết bài toán phân phối khóa; chuyển gánh nặng bảo mật sang độ phức tạp tính toán một chiều — khởi xướng thời kỳ bảo mật dựa trên độ khó toán học.</w:t>
+        <w:t>Diffie-Hellman và Merkle giải quyết bài toán phân phối khóa, chuyển gánh nặng sang độ phức tạp tính toán một chiều.</w:t>
       </w:r>
     </w:p>
     <w:p>
@@ -841,14 +751,14 @@
           <w:color w:val="1E293B"/>
           <w:sz w:val="20"/>
         </w:rPr>
-        <w:t xml:space="preserve">– Giai đoạn 3 (1982–1984) — [PPT ADVERSARY &amp; SECURITY GAMES]: </w:t>
+        <w:t xml:space="preserve">– Giai đoạn 3 (1982–1984) — PPT Adversary &amp; Security Games: </w:t>
       </w:r>
       <w:r>
         <w:rPr>
           <w:color w:val="334155"/>
           <w:sz w:val="20"/>
         </w:rPr>
-        <w:t>Goldwasser-Micali định nghĩa an toàn ngữ nghĩa và đối thủ thời gian đa thức xác suất (PPT). Chứng minh an toàn bằng quy dẫn toán học — chuẩn hóa phương pháp luận chứng minh hình thức.</w:t>
+        <w:t>Goldwasser-Micali định nghĩa đối thủ thời gian đa thức xác suất (PPT) và an toàn ngữ nghĩa thông qua các trò chơi an ninh.</w:t>
       </w:r>
     </w:p>
     <w:p>
@@ -862,14 +772,14 @@
           <w:color w:val="1E293B"/>
           <w:sz w:val="20"/>
         </w:rPr>
-        <w:t xml:space="preserve">– Giai đoạn 4 (1981–1993) — [DOLEV-YAO &amp; RANDOM ORACLE]: </w:t>
+        <w:t xml:space="preserve">– Giai đoạn 4 (1981–1993) — Dolev-Yao &amp; Random Oracle: </w:t>
       </w:r>
       <w:r>
         <w:rPr>
           <w:color w:val="334155"/>
           <w:sz w:val="20"/>
         </w:rPr>
-        <w:t>Dolev-Yao mô hình hóa đối thủ mạng kiểm soát hoàn toàn kênh truyền. Bellare-Rogaway đề xuất Random Oracle Model (ROM) ứng dụng thực hành — áp dụng kiểm chứng logic cho giao thức và hàm băm.</w:t>
+        <w:t>Dolev-Yao mô hình hóa đối thủ kiểm soát toàn bộ kênh truyền mạng; Bellare-Rogaway đề xuất Random Oracle Model (ROM) cho hàm băm.</w:t>
       </w:r>
     </w:p>
     <w:p>
@@ -883,37 +793,68 @@
           <w:color w:val="1E293B"/>
           <w:sz w:val="20"/>
         </w:rPr>
-        <w:t xml:space="preserve">– Giai đoạn 5 (2013–2025) — [PHÊ PHÁN HẬU SNOWDEN]: </w:t>
+        <w:t xml:space="preserve">– Giai đoạn 5 (2013–2025) — Phê phán hậu Snowden: </w:t>
       </w:r>
       <w:r>
         <w:rPr>
           <w:color w:val="334155"/>
           <w:sz w:val="20"/>
         </w:rPr>
-        <w:t>Tiết lộ của Snowden phơi bày năng lực thực tế của NSA: Kênh kề, cửa sau chuẩn mật mã, tấn công chuỗi cung ứng và giám sát siêu dữ liệu — bộc lộ khoảng cách giữa mô hình toán học và đối thủ thực tế.</w:t>
+        <w:t>Snowden phơi bày năng lực thực tế của NSA: Kênh kề, cửa sau chuẩn mật mã, tấn công chuỗi cung ứng và giám sát siêu dữ liệu.</w:t>
       </w:r>
     </w:p>
+    <w:tbl>
+      <w:tblPr>
+        <w:tblW w:type="auto" w:w="0"/>
+        <w:jc w:val="center"/>
+        <w:tblLook w:firstColumn="1" w:firstRow="1" w:lastColumn="0" w:lastRow="0" w:noHBand="0" w:noVBand="1" w:val="04A0"/>
+      </w:tblPr>
+      <w:tblGrid>
+        <w:gridCol w:w="9360"/>
+      </w:tblGrid>
+      <w:tr>
+        <w:tc>
+          <w:tcPr>
+            <w:tcW w:type="dxa" w:w="9360"/>
+            <w:shd w:val="clear" w:color="auto" w:fill="F1F5F9"/>
+          </w:tcPr>
+          <w:p>
+            <w:pPr>
+              <w:spacing w:before="80" w:after="80"/>
+              <w:ind w:left="144" w:right="144"/>
+            </w:pPr>
+            <w:r>
+              <w:rPr>
+                <w:b/>
+                <w:color w:val="1E40AF"/>
+                <w:sz w:val="20"/>
+              </w:rPr>
+              <w:t>💡 Hướng dẫn thuyết minh &amp; Giải thích dễ hiểu:</w:t>
+              <w:br/>
+            </w:r>
+            <w:r>
+              <w:rPr>
+                <w:color w:val="334155"/>
+                <w:sz w:val="19"/>
+              </w:rPr>
+              <w:t>Giải thích các khái niệm khó hiểu trên Slide:</w:t>
+              <w:br/>
+              <w:t>• Bí mật hoàn hảo của Shannon H(K) &gt;= H(M) có hạn chế gì? Shannon chứng minh muốn bảo mật tuyệt đối thì chìa khóa phải dài tối thiểu bằng bức thư (như mã dùng một lần One-Time Pad). Nhưng hạn chế ngoài đời là: Nếu ta muốn gửi bức thư 10 GB qua mạng mà lại phải đem theo cái ổ cứng chứa chìa khóa 10 GB đi giao tận tay người nhận thì cực kỳ tốn kém và không thể áp dụng cho mạng Internet toàn cầu.</w:t>
+              <w:br/>
+              <w:t>• 'PPT Adversary &amp; Security Games' (1984) là gì? Vì không thể dùng chìa khóa dài vô tận của Shannon, các nhà khoa học hiện đại chấp nhận thực tế: Kẻ trộm chỉ có máy tính chạy thời gian đa thức (PPT - tức máy tính có sức mạnh hữu hạn, không thể thử hàng tỷ tỷ năm). Họ đặt ra một 'Trò chơi an ninh': Đưa cho kẻ trộm hai gói tin mã hóa, nếu kẻ trộm không đoán được gói nào chứa tin nhắn nào (tỷ lệ đoán chỉ bằng 50% tung đồng xu) thì thuật toán đó được coi là an toàn.</w:t>
+            </w:r>
+          </w:p>
+        </w:tc>
+      </w:tr>
+    </w:tbl>
     <w:p>
       <w:pPr>
-        <w:spacing w:before="60" w:after="40"/>
+        <w:spacing w:before="80" w:after="200"/>
         <w:ind w:left="288"/>
       </w:pPr>
       <w:r>
         <w:rPr>
           <w:i/>
-          <w:color w:val="1E40AF"/>
-          <w:sz w:val="20"/>
-        </w:rPr>
-        <w:t>Lời thuyết minh tiếp nối: Dòng thời gian thể hiện quy luật biện chứng: Khi mật mã học nâng độ trừu tượng toán học lên đỉnh cao thì thực tiễn an ninh thế giới thực lại kéo ngành này trở về với các bài toán vật lý và thể chế.</w:t>
-      </w:r>
-    </w:p>
-    <w:p>
-      <w:pPr>
-        <w:spacing w:before="20" w:after="160"/>
-        <w:ind w:left="288"/>
-      </w:pPr>
-      <w:r>
-        <w:rPr>
           <w:color w:val="94A3B8"/>
           <w:sz w:val="18"/>
         </w:rPr>
@@ -952,23 +893,23 @@
           <w:color w:val="475569"/>
           <w:sz w:val="19"/>
         </w:rPr>
-        <w:t>• Tiêu đề phụ / Section trên Slide: SƠ ĐỒ 2: ĐỐI SÁNH MÔ HÌNH TRUYỀN THÔNG ĐIỂM-ĐIỂM VÀ MẠNG XÃ HỘI-KỸ THUẬT</w:t>
+        <w:t>• Vị trí Slide: SƠ ĐỒ 2: ĐỐI SÁNH MÔ HÌNH TRUYỀN THÔNG ĐIỂM-ĐIỂM VÀ MẠNG XÃ HỘI-KỸ THUẬT</w:t>
         <w:br/>
-        <w:t xml:space="preserve">  Khoảng cách giữa mô hình điểm-điểm đóng kín của Shannon và mạng phức hợp không đồng nhất</w:t>
+        <w:t xml:space="preserve">  Tiêu đề phụ: Khoảng cách giữa mô hình điểm-điểm đóng kín của Shannon và mạng phức hợp không đồng nhất</w:t>
       </w:r>
     </w:p>
     <w:p>
       <w:pPr>
-        <w:spacing w:before="60" w:after="20"/>
+        <w:spacing w:before="40" w:after="40"/>
         <w:ind w:left="288"/>
       </w:pPr>
       <w:r>
         <w:rPr>
           <w:b/>
           <w:color w:val="0F172A"/>
-          <w:sz w:val="21"/>
+          <w:sz w:val="20"/>
         </w:rPr>
-        <w:t>Nội dung đối sánh 2 Panel trên Sơ đồ:</w:t>
+        <w:t>Nội dung hiển thị trên Slide:</w:t>
       </w:r>
     </w:p>
     <w:p>
@@ -982,14 +923,14 @@
           <w:color w:val="1E293B"/>
           <w:sz w:val="20"/>
         </w:rPr>
-        <w:t xml:space="preserve">– Panel Trái — Mô hình điểm-điểm cổ điển của Shannon (1949): </w:t>
+        <w:t xml:space="preserve">– Panel Trái — Mô hình điểm-điểm Shannon (1949): </w:t>
       </w:r>
       <w:r>
         <w:rPr>
           <w:color w:val="334155"/>
           <w:sz w:val="20"/>
         </w:rPr>
-        <w:t>Alice gửi bản rõ M mã hóa bằng khóa K qua kênh truyền đến Bob. Đối thủ Eve chỉ là kẻ nghe lén thụ động (passive eavesdropper) trên đường truyền. Giới hạn: Trừu tượng hóa đối thủ trên kênh toán học độc lập, bỏ qua chi phí lưu trữ/phân phối khóa và không bao quát các bề mặt tấn công vật lý — chỉ phù hợp với liên lạc dây dẫn cô lập ban đầu.</w:t>
+        <w:t>Alice gửi bản rõ M mã hóa bằng khóa K qua kênh truyền đến Bob. Đối thủ Eve chỉ là kẻ nghe lén thụ động trên đường truyền. Bỏ qua chi phí quản lý khóa và bề mặt tấn công vật lý.</w:t>
       </w:r>
     </w:p>
     <w:p>
@@ -1003,37 +944,66 @@
           <w:color w:val="1E293B"/>
           <w:sz w:val="20"/>
         </w:rPr>
-        <w:t xml:space="preserve">– Panel Phải — Mạng xã hội - kỹ thuật phức hợp theo Halpin (2025): </w:t>
+        <w:t xml:space="preserve">– Panel Phải — Mạng xã hội - kỹ thuật phức hợp (Halpin 2025): </w:t>
       </w:r>
       <w:r>
         <w:rPr>
           <w:color w:val="334155"/>
           <w:sz w:val="20"/>
         </w:rPr>
-        <w:t>Thông tin luân chuyển giữa Nhóm giữ bí mật (Secret Keepers) và Hạ tầng mở / ISP / Đám mây. Đối thủ thể chế (NSA, Five Eyes) là tác nhân toàn cục cả thụ động lẫn chủ động, tấn công qua 4 con đường: (1) Kênh kề thời gian/điện năng; (2) Giám sát siêu dữ liệu luồng gói tin; (3) Cài cắm cửa sau chuỗi cung ứng; (4) Lỗi phản bội nội bộ Byzantine — đòi hỏi phòng thủ hiện đại phải bảo vệ cả siêu dữ liệu và kháng kênh kề.</w:t>
+        <w:t>Thông tin luân chuyển giữa Nhóm giữ bí mật và Hạ tầng mở / ISP / Đám mây. Đối thủ thể chế (NSA, Five Eyes) tấn công qua 4 con đường: (1) Kênh kề; (2) Giám sát siêu dữ liệu; (3) Cửa sau phần cứng; (4) Lỗi phản bội nội bộ Byzantine.</w:t>
       </w:r>
     </w:p>
+    <w:tbl>
+      <w:tblPr>
+        <w:tblW w:type="auto" w:w="0"/>
+        <w:jc w:val="center"/>
+        <w:tblLook w:firstColumn="1" w:firstRow="1" w:lastColumn="0" w:lastRow="0" w:noHBand="0" w:noVBand="1" w:val="04A0"/>
+      </w:tblPr>
+      <w:tblGrid>
+        <w:gridCol w:w="9360"/>
+      </w:tblGrid>
+      <w:tr>
+        <w:tc>
+          <w:tcPr>
+            <w:tcW w:type="dxa" w:w="9360"/>
+            <w:shd w:val="clear" w:color="auto" w:fill="F1F5F9"/>
+          </w:tcPr>
+          <w:p>
+            <w:pPr>
+              <w:spacing w:before="80" w:after="80"/>
+              <w:ind w:left="144" w:right="144"/>
+            </w:pPr>
+            <w:r>
+              <w:rPr>
+                <w:b/>
+                <w:color w:val="1E40AF"/>
+                <w:sz w:val="20"/>
+              </w:rPr>
+              <w:t>💡 Hướng dẫn thuyết minh &amp; Giải thích dễ hiểu:</w:t>
+              <w:br/>
+            </w:r>
+            <w:r>
+              <w:rPr>
+                <w:color w:val="334155"/>
+                <w:sz w:val="19"/>
+              </w:rPr>
+              <w:t>Giải thích bản chất trực quan của Sơ đồ đối sánh:</w:t>
+              <w:br/>
+              <w:t>• Tại sao mô hình Shannon không còn đủ cho thế giới ngày nay? Thời của Shannon (1949), người ta chỉ nghĩ đơn giản là kéo một sợi dây điện từ nhà Alice sang nhà Bob, và có một kẻ xấu Eve đứng kẹp dây nghe trộm. Nhưng Internet ngày nay phức tạp hơn thế: Gói tin phải đi qua nhà mạng Viettel/VNPT, qua máy chủ đám mây của Google, Amazon. Kẻ nghe lén hiện nay là các cơ quan tình báo khổng lồ. Họ không chỉ nghe lén nội dung tin nhắn, mà họ soi 'Siêu dữ liệu' (Metadata): Tức là ai nhắn tin cho ai, gửi lúc mấy giờ, tệp nặng bao nhiêu MB. Chỉ cần nắm siêu dữ liệu là họ biết hết quan hệ và hành vi của người dùng mà không cần tốn công bẻ khóa mật mã.</w:t>
+            </w:r>
+          </w:p>
+        </w:tc>
+      </w:tr>
+    </w:tbl>
     <w:p>
       <w:pPr>
-        <w:spacing w:before="60" w:after="40"/>
+        <w:spacing w:before="80" w:after="200"/>
         <w:ind w:left="288"/>
       </w:pPr>
       <w:r>
         <w:rPr>
           <w:i/>
-          <w:color w:val="1E40AF"/>
-          <w:sz w:val="20"/>
-        </w:rPr>
-        <w:t>Lời thuyết minh tiếp nối: Sự đối sánh này làm rõ luận điểm của Halpin: An ninh không chỉ là mã hóa nội dung giữa hai điểm, mà là bảo vệ toàn bộ mạng xã hội và hạ tầng trước sự giám sát toàn cục.</w:t>
-      </w:r>
-    </w:p>
-    <w:p>
-      <w:pPr>
-        <w:spacing w:before="20" w:after="160"/>
-        <w:ind w:left="288"/>
-      </w:pPr>
-      <w:r>
-        <w:rPr>
           <w:color w:val="94A3B8"/>
           <w:sz w:val="18"/>
         </w:rPr>
@@ -1072,23 +1042,23 @@
           <w:color w:val="475569"/>
           <w:sz w:val="19"/>
         </w:rPr>
-        <w:t>• Tiêu đề phụ / Section trên Slide: SECTION 4 — HÌNH THỨC HÓA ĐỐI THỦ (TRANG 5–8)</w:t>
+        <w:t>• Vị trí Slide: SECTION 4 — HÌNH THỨC HÓA ĐỐI THỦ (TRANG 5–8)</w:t>
         <w:br/>
-        <w:t xml:space="preserve">  Tiến trình toán học hóa kẻ thù: Độ phức tạp tính toán đa thức, Logic kênh truyền và Tiên tri ngẫu nhiên</w:t>
+        <w:t xml:space="preserve">  Tiêu đề phụ: Tiến trình toán học hóa kẻ thù: Độ phức tạp tính toán đa thức, Logic kênh truyền và Tiên tri ngẫu nhiên</w:t>
       </w:r>
     </w:p>
     <w:p>
       <w:pPr>
-        <w:spacing w:before="60" w:after="20"/>
+        <w:spacing w:before="40" w:after="40"/>
         <w:ind w:left="288"/>
       </w:pPr>
       <w:r>
         <w:rPr>
           <w:b/>
           <w:color w:val="0F172A"/>
-          <w:sz w:val="21"/>
+          <w:sz w:val="20"/>
         </w:rPr>
-        <w:t>1. Mô Hình PPT Adversary — Goldwasser-Micali (1984):</w:t>
+        <w:t>Nội dung hiển thị trên Slide:</w:t>
       </w:r>
     </w:p>
     <w:p>
@@ -1102,14 +1072,14 @@
           <w:color w:val="1E293B"/>
           <w:sz w:val="20"/>
         </w:rPr>
-        <w:t xml:space="preserve">– Khái niệm: </w:t>
+        <w:t xml:space="preserve">– 1. Mô hình PPT Adversary (Goldwasser-Micali 1984): </w:t>
       </w:r>
       <w:r>
         <w:rPr>
           <w:color w:val="334155"/>
           <w:sz w:val="20"/>
         </w:rPr>
-        <w:t>Đối thủ là thuật toán Turing xác suất chạy trong thời gian đa thức (Probabilistic Polynomial-Time) — giới hạn năng lực đối thủ ở mức khả thi tính toán.</w:t>
+        <w:t>Đối thủ là thuật toán Turing xác suất chạy thời gian đa thức; an toàn được định nghĩa qua Trò chơi An ninh với lợi thế đoán đúng là hàm không đáng kể; chứng minh bằng quy dẫn toán học.</w:t>
       </w:r>
     </w:p>
     <w:p>
@@ -1123,14 +1093,14 @@
           <w:color w:val="1E293B"/>
           <w:sz w:val="20"/>
         </w:rPr>
-        <w:t xml:space="preserve">– Security Games: </w:t>
+        <w:t xml:space="preserve">– 2. Mô hình Đối thủ mạng Logic (Dolev-Yao 1983): </w:t>
       </w:r>
       <w:r>
         <w:rPr>
           <w:color w:val="334155"/>
           <w:sz w:val="20"/>
         </w:rPr>
-        <w:t>Định nghĩa an toàn thông qua các trò chơi thách đấu. Lợi thế Adv(A) phải là hàm không đáng kể (negligible) — đối thủ không đoán tốt hơn ngẫu nhiên.</w:t>
+        <w:t>Kẻ thù kiểm soát toàn bộ kênh truyền (đọc, chặn, sửa, xóa, phát lại gói tin), nhưng xem mật mã là 'hộp đen đại số hoàn hảo', không thể giải mã nếu không có khóa.</w:t>
       </w:r>
     </w:p>
     <w:p>
@@ -1144,191 +1114,70 @@
           <w:color w:val="1E293B"/>
           <w:sz w:val="20"/>
         </w:rPr>
-        <w:t xml:space="preserve">– Quy dẫn toán học: </w:t>
+        <w:t xml:space="preserve">– 3. Mô hình Tiên tri Ngẫu nhiên (Bellare-Rogaway 1993): </w:t>
       </w:r>
       <w:r>
         <w:rPr>
           <w:color w:val="334155"/>
           <w:sz w:val="20"/>
         </w:rPr>
-        <w:t>Chứng minh an toàn bằng cách quy dẫn: bẻ gãy hệ mật tương đương giải bài toán khó (phân tích thừa số nguyên, logarit rời rạc) — gắn an toàn với giả thuyết toán học.</w:t>
+        <w:t>Giả định hàm băm thực tế hoạt động như một cỗ máy ngẫu nhiên lý tưởng (Random Oracle); thực tế không có hàm băm nào tương đương toán học với một Random Oracle thực sự.</w:t>
       </w:r>
     </w:p>
+    <w:tbl>
+      <w:tblPr>
+        <w:tblW w:type="auto" w:w="0"/>
+        <w:jc w:val="center"/>
+        <w:tblLook w:firstColumn="1" w:firstRow="1" w:lastColumn="0" w:lastRow="0" w:noHBand="0" w:noVBand="1" w:val="04A0"/>
+      </w:tblPr>
+      <w:tblGrid>
+        <w:gridCol w:w="9360"/>
+      </w:tblGrid>
+      <w:tr>
+        <w:tc>
+          <w:tcPr>
+            <w:tcW w:type="dxa" w:w="9360"/>
+            <w:shd w:val="clear" w:color="auto" w:fill="F1F5F9"/>
+          </w:tcPr>
+          <w:p>
+            <w:pPr>
+              <w:spacing w:before="80" w:after="80"/>
+              <w:ind w:left="144" w:right="144"/>
+            </w:pPr>
+            <w:r>
+              <w:rPr>
+                <w:b/>
+                <w:color w:val="1E40AF"/>
+                <w:sz w:val="20"/>
+              </w:rPr>
+              <w:t>💡 Hướng dẫn thuyết minh &amp; Giải thích dễ hiểu:</w:t>
+              <w:br/>
+            </w:r>
+            <w:r>
+              <w:rPr>
+                <w:color w:val="334155"/>
+                <w:sz w:val="19"/>
+              </w:rPr>
+              <w:t>Giải thích cốt lõi của 3 mô hình toán học:</w:t>
+              <w:br/>
+              <w:t>• Mô hình Dolev-Yao (1983) coi kẻ tấn công như 'ông trùm đường truyền Internet': Muốn chặn gói tin, sửa tin hay phát lại gói tin cũ lúc nào cũng được. Nhưng mô hình này lại ngây thơ coi mật mã như một 'hộp đen thần kỳ', tức là kẻ địch không bao giờ phá được nếu không có khóa.</w:t>
+              <w:br/>
+              <w:t>• Mô hình Random Oracle (ROM 1993) coi hàm băm (như SHA-256) hoàn hảo như một cỗ máy bốc thăm ngẫu nhiên tuyệt đối của trời cho. Nhưng thực tế ngoài đời, SHA-256 chỉ là một đoạn code toán học cố định do con người viết ra, nên không thể ngẫu nhiên tuyệt đối 100% được.</w:t>
+              <w:br/>
+              <w:t>• Tác giả phê phán điều gì? Cả 3 mô hình này đều quá lý tưởng trên giấy tờ. Kẻ thù ngoài đời không ngoan ngoãn giải toán như các nhà khoa học giả định, mà chúng tấn công vào điểm mù phần cứng và con người.</w:t>
+            </w:r>
+          </w:p>
+        </w:tc>
+      </w:tr>
+    </w:tbl>
     <w:p>
       <w:pPr>
-        <w:spacing w:before="60" w:after="20"/>
-        <w:ind w:left="288"/>
-      </w:pPr>
-      <w:r>
-        <w:rPr>
-          <w:b/>
-          <w:color w:val="0F172A"/>
-          <w:sz w:val="21"/>
-        </w:rPr>
-        <w:t>2. Mô Hình Đối Thủ Mạng Logic — Dolev-Yao (1983):</w:t>
-      </w:r>
-    </w:p>
-    <w:p>
-      <w:pPr>
-        <w:spacing w:before="20" w:after="40"/>
-        <w:ind w:left="504"/>
-      </w:pPr>
-      <w:r>
-        <w:rPr>
-          <w:b/>
-          <w:color w:val="1E293B"/>
-          <w:sz w:val="20"/>
-        </w:rPr>
-        <w:t xml:space="preserve">– Khái niệm: </w:t>
-      </w:r>
-      <w:r>
-        <w:rPr>
-          <w:color w:val="334155"/>
-          <w:sz w:val="20"/>
-        </w:rPr>
-        <w:t>Đối thủ kiểm soát toàn bộ kênh truyền mạng: có quyền đọc, chặn, sửa đổi, xóa, tráo đổi và phát lại gói tin — chuẩn an toàn cho mạng thù địch.</w:t>
-      </w:r>
-    </w:p>
-    <w:p>
-      <w:pPr>
-        <w:spacing w:before="20" w:after="40"/>
-        <w:ind w:left="504"/>
-      </w:pPr>
-      <w:r>
-        <w:rPr>
-          <w:b/>
-          <w:color w:val="1E293B"/>
-          <w:sz w:val="20"/>
-        </w:rPr>
-        <w:t xml:space="preserve">– Hộp đen mật mã: </w:t>
-      </w:r>
-      <w:r>
-        <w:rPr>
-          <w:color w:val="334155"/>
-          <w:sz w:val="20"/>
-        </w:rPr>
-        <w:t>Mô hình Dolev-Yao xem mật mã như các hàm đại số hoàn hảo (Perfect Black-box). Kẻ thù không thể giải mã nếu không có khóa — tách biệt logic mạng với thuật toán.</w:t>
-      </w:r>
-    </w:p>
-    <w:p>
-      <w:pPr>
-        <w:spacing w:before="20" w:after="40"/>
-        <w:ind w:left="504"/>
-      </w:pPr>
-      <w:r>
-        <w:rPr>
-          <w:b/>
-          <w:color w:val="1E293B"/>
-          <w:sz w:val="20"/>
-        </w:rPr>
-        <w:t xml:space="preserve">– Ứng dụng: </w:t>
-      </w:r>
-      <w:r>
-        <w:rPr>
-          <w:color w:val="334155"/>
-          <w:sz w:val="20"/>
-        </w:rPr>
-        <w:t>Kiểm chứng hình thức các giao thức mạng phức tạp thông qua các công cụ logic tự động — chứng minh tính đúng đắn khi trao đổi khóa.</w:t>
-      </w:r>
-    </w:p>
-    <w:p>
-      <w:pPr>
-        <w:spacing w:before="60" w:after="20"/>
-        <w:ind w:left="288"/>
-      </w:pPr>
-      <w:r>
-        <w:rPr>
-          <w:b/>
-          <w:color w:val="0F172A"/>
-          <w:sz w:val="21"/>
-        </w:rPr>
-        <w:t>3. Mô Hình Tiên Tri Ngẫu Nhiên — Bellare-Rogaway (1993):</w:t>
-      </w:r>
-    </w:p>
-    <w:p>
-      <w:pPr>
-        <w:spacing w:before="20" w:after="40"/>
-        <w:ind w:left="504"/>
-      </w:pPr>
-      <w:r>
-        <w:rPr>
-          <w:b/>
-          <w:color w:val="1E293B"/>
-          <w:sz w:val="20"/>
-        </w:rPr>
-        <w:t xml:space="preserve">– Khái niệm: </w:t>
-      </w:r>
-      <w:r>
-        <w:rPr>
-          <w:color w:val="334155"/>
-          <w:sz w:val="20"/>
-        </w:rPr>
-        <w:t>Giả định hàm băm thực tế hoạt động như một hàm ngẫu nhiên lý tưởng (Random Oracle Model - ROM) trả về chuỗi ngẫu nhiên đồng đều — mốc tham chiếu toán học lý tưởng.</w:t>
-      </w:r>
-    </w:p>
-    <w:p>
-      <w:pPr>
-        <w:spacing w:before="20" w:after="40"/>
-        <w:ind w:left="504"/>
-      </w:pPr>
-      <w:r>
-        <w:rPr>
-          <w:b/>
-          <w:color w:val="1E293B"/>
-          <w:sz w:val="20"/>
-        </w:rPr>
-        <w:t xml:space="preserve">– Vai trò thực tế: </w:t>
-      </w:r>
-      <w:r>
-        <w:rPr>
-          <w:color w:val="334155"/>
-          <w:sz w:val="20"/>
-        </w:rPr>
-        <w:t>Cho phép xây dựng các hệ mật khóa công khai và chữ ký số hiệu năng cao có chứng minh an toàn — thiết kế giao thức thực tế vận hành nhanh.</w:t>
-      </w:r>
-    </w:p>
-    <w:p>
-      <w:pPr>
-        <w:spacing w:before="20" w:after="40"/>
-        <w:ind w:left="504"/>
-      </w:pPr>
-      <w:r>
-        <w:rPr>
-          <w:b/>
-          <w:color w:val="1E293B"/>
-          <w:sz w:val="20"/>
-        </w:rPr>
-        <w:t xml:space="preserve">– Giới hạn triết học: </w:t>
-      </w:r>
-      <w:r>
-        <w:rPr>
-          <w:color w:val="334155"/>
-          <w:sz w:val="20"/>
-        </w:rPr>
-        <w:t>Trong thế giới thực, không có hàm băm cụ thể nào (kể cả SHA-256) có thể tương đương toán học với một Random Oracle thực sự — do mọi hàm băm thực tế đều có cấu trúc toán học xác định.</w:t>
-      </w:r>
-    </w:p>
-    <w:p>
-      <w:pPr>
-        <w:spacing w:before="60" w:after="40"/>
+        <w:spacing w:before="80" w:after="200"/>
         <w:ind w:left="288"/>
       </w:pPr>
       <w:r>
         <w:rPr>
           <w:i/>
-          <w:color w:val="1E40AF"/>
-          <w:sz w:val="20"/>
-        </w:rPr>
-        <w:t>Lời thuyết minh tiếp nối: Cả ba mô hình đều đem lại công cụ toán học mạnh mẽ, nhưng sự hoàn hảo của chúng dựa trên các giả định trừu tượng mà thế giới thực thường xuyên vi phạm.</w:t>
-      </w:r>
-    </w:p>
-    <w:p>
-      <w:pPr>
-        <w:spacing w:before="20" w:after="160"/>
-        <w:ind w:left="288"/>
-      </w:pPr>
-      <w:r>
-        <w:rPr>
           <w:color w:val="94A3B8"/>
           <w:sz w:val="18"/>
         </w:rPr>
@@ -1367,23 +1216,23 @@
           <w:color w:val="475569"/>
           <w:sz w:val="19"/>
         </w:rPr>
-        <w:t>• Tiêu đề phụ / Section trên Slide: SECTION 5 — GIỚI HẠN TRỪU TƯỢNG HÓA (TRANG 8–10)</w:t>
+        <w:t>• Vị trí Slide: SECTION 5 — GIỚI HẠN TRỪU TƯỢNG HÓA (TRANG 8–10)</w:t>
         <w:br/>
-        <w:t xml:space="preserve">  Khoảng cách giữa các giả định toán học lý tưởng và thế giới vật lý thực tế</w:t>
+        <w:t xml:space="preserve">  Tiêu đề phụ: Khoảng cách giữa các giả định toán học lý tưởng và thế giới vật lý thực tế</w:t>
       </w:r>
     </w:p>
     <w:p>
       <w:pPr>
-        <w:spacing w:before="60" w:after="20"/>
+        <w:spacing w:before="40" w:after="40"/>
         <w:ind w:left="288"/>
       </w:pPr>
       <w:r>
         <w:rPr>
           <w:b/>
           <w:color w:val="0F172A"/>
-          <w:sz w:val="21"/>
+          <w:sz w:val="20"/>
         </w:rPr>
-        <w:t>Tiến trình 4 bước từ Giả định đến Thực tế:</w:t>
+        <w:t>Nội dung hiển thị trên Slide:</w:t>
       </w:r>
     </w:p>
     <w:p>
@@ -1397,14 +1246,14 @@
           <w:color w:val="1E293B"/>
           <w:sz w:val="20"/>
         </w:rPr>
-        <w:t xml:space="preserve">– BƯỚC 1: GIẢ ĐỊNH TOÁN HỌC HÌNH THỨC: </w:t>
+        <w:t xml:space="preserve">– Bước 1 — Giả định toán học hình thức: </w:t>
       </w:r>
       <w:r>
         <w:rPr>
           <w:color w:val="334155"/>
           <w:sz w:val="20"/>
         </w:rPr>
-        <w:t>Hộp đen mật mã lý tưởng, thời gian thực thi là vô hình, độ dài bản mã công khai không rò rỉ nội dung, kênh truyền điểm-điểm độc lập — thế giới phẳng hoàn hảo trên chứng minh giấy tờ.</w:t>
+        <w:t>Hộp đen mật mã lý tưởng, thời gian thực thi vô hình, độ dài bản mã không lộ nội dung, kênh truyền độc lập.</w:t>
       </w:r>
     </w:p>
     <w:p>
@@ -1418,14 +1267,14 @@
           <w:color w:val="1E293B"/>
           <w:sz w:val="20"/>
         </w:rPr>
-        <w:t xml:space="preserve">– BƯỚC 2: CÁC YẾU TỐ VẬT LÝ BỊ TRỪU TƯỢNG HÓA LƯỢC BỎ: </w:t>
+        <w:t xml:space="preserve">– Bước 2 — Yếu tố vật lý bị trừu tượng hóa bỏ qua: </w:t>
       </w:r>
       <w:r>
         <w:rPr>
           <w:color w:val="334155"/>
           <w:sz w:val="20"/>
         </w:rPr>
-        <w:t>Thời gian vi xử lý CPU, dao động điện năng tiêu thụ, phát xạ điện từ, kiến trúc bộ nhớ đệm (Cache), lỗi lập trình phần mềm — các hiện tượng vật lý tất yếu khi chạy trên phần cứng.</w:t>
+        <w:t>Thời gian vi xử lý CPU, điện năng tiêu thụ, bức xạ điện từ, bộ nhớ đệm Cache, lỗi lập trình phần mềm.</w:t>
       </w:r>
     </w:p>
     <w:p>
@@ -1439,14 +1288,14 @@
           <w:color w:val="1E293B"/>
           <w:sz w:val="20"/>
         </w:rPr>
-        <w:t xml:space="preserve">– BƯỚC 3: CON ĐƯỜNG KHAI THÁC CỦA ĐỐI THỦ THẾ GIỚI THỰC: </w:t>
+        <w:t xml:space="preserve">– Bước 3 — Con đường khai thác của đối thủ thế giới thực: </w:t>
       </w:r>
       <w:r>
         <w:rPr>
           <w:color w:val="334155"/>
           <w:sz w:val="20"/>
         </w:rPr>
-        <w:t>Tấn công kênh kề (Timing Attack - Kocher 1996), phân tích độ dài và lưu lượng siêu dữ liệu (Traffic Analysis), khai thác lỗi cài đặt phần mềm và quản lý (Anderson 2001) — kẻ thù chiếm ưu thế mà không cần bẻ gãy toán học.</w:t>
+        <w:t>Tấn công kênh kề thời gian (Paul Kocher 1996), phân tích lưu lượng và độ dài siêu dữ liệu, khai thác lỗi cài đặt phần mềm và quản trị (Ross Anderson 2001).</w:t>
       </w:r>
     </w:p>
     <w:p>
@@ -1460,37 +1309,68 @@
           <w:color w:val="1E293B"/>
           <w:sz w:val="20"/>
         </w:rPr>
-        <w:t xml:space="preserve">– BƯỚC 4: KẾT LUẬN NHẬN THỨC LUẬN CỦA HARRY HALPIN: </w:t>
+        <w:t xml:space="preserve">– Bước 4 — Kết luận nhận thức luận của Halpin: </w:t>
       </w:r>
       <w:r>
         <w:rPr>
           <w:color w:val="334155"/>
           <w:sz w:val="20"/>
         </w:rPr>
-        <w:t>Cái giá của sự trừu tượng hóa là làm cho mật mã học mù quáng trước chính những năng lực thực tế của đối thủ nằm ngoài mô hình lý thuyết — buộc an ninh mạng phải mở rộng ra kiểm định thực nghiệm.</w:t>
+        <w:t>Sự trừu tượng hóa quá mức làm cho mật mã học mù quáng trước chính những năng lực thực tế của đối thủ nằm ngoài mô hình lý thuyết.</w:t>
       </w:r>
     </w:p>
+    <w:tbl>
+      <w:tblPr>
+        <w:tblW w:type="auto" w:w="0"/>
+        <w:jc w:val="center"/>
+        <w:tblLook w:firstColumn="1" w:firstRow="1" w:lastColumn="0" w:lastRow="0" w:noHBand="0" w:noVBand="1" w:val="04A0"/>
+      </w:tblPr>
+      <w:tblGrid>
+        <w:gridCol w:w="9360"/>
+      </w:tblGrid>
+      <w:tr>
+        <w:tc>
+          <w:tcPr>
+            <w:tcW w:type="dxa" w:w="9360"/>
+            <w:shd w:val="clear" w:color="auto" w:fill="F1F5F9"/>
+          </w:tcPr>
+          <w:p>
+            <w:pPr>
+              <w:spacing w:before="80" w:after="80"/>
+              <w:ind w:left="144" w:right="144"/>
+            </w:pPr>
+            <w:r>
+              <w:rPr>
+                <w:b/>
+                <w:color w:val="1E40AF"/>
+                <w:sz w:val="20"/>
+              </w:rPr>
+              <w:t>💡 Hướng dẫn thuyết minh &amp; Giải thích dễ hiểu:</w:t>
+              <w:br/>
+            </w:r>
+            <w:r>
+              <w:rPr>
+                <w:color w:val="334155"/>
+                <w:sz w:val="19"/>
+              </w:rPr>
+              <w:t>Giải thích trực quan về Tấn công Kênh kề (Side-channel Attack):</w:t>
+              <w:br/>
+              <w:t>• Tấn công kênh kề thời gian (Kocher 1996) hoạt động thế nào? Trong lập trình, khi so sánh hai chuỗi mật khẩu, máy tính thường dùng lệnh so sánh tuần tự từ trái qua phải: hễ thấy ký tự đầu tiên bị sai là nó dừng lại ngay lập tức (ngắt sớm - early return). Kẻ tấn công lợi dụng điều này bằng cách gửi thử các ký tự và dùng đồng hồ siêu chính xác đo thời gian máy tính trả lời: Nếu thấy máy xử lý lâu hơn một chút xíu (vài phần triệu giây), nghĩa là chữ cái đầu tiên đã đoán đúng! Bằng cách đó, kẻ trộm dò ra từng chữ cái của chìa khóa mà không cần phải bẻ khóa thuật toán.</w:t>
+              <w:br/>
+              <w:t>• Rò rỉ qua độ dài siêu dữ liệu là gì? Dù tin nhắn được mã hóa kín 100%, nhưng nếu ta gửi một tệp nặng đúng 4.5 MB vào lúc 2 giờ sáng, kẻ theo dõi mạng đối chiếu dung lượng là biết ngay ta vừa gửi bài hát hay đoạn video cụ thể nào.</w:t>
+            </w:r>
+          </w:p>
+        </w:tc>
+      </w:tr>
+    </w:tbl>
     <w:p>
       <w:pPr>
-        <w:spacing w:before="60" w:after="40"/>
+        <w:spacing w:before="80" w:after="200"/>
         <w:ind w:left="288"/>
       </w:pPr>
       <w:r>
         <w:rPr>
           <w:i/>
-          <w:color w:val="1E40AF"/>
-          <w:sz w:val="20"/>
-        </w:rPr>
-        <w:t>Lời thuyết minh tiếp nối: Sơ đồ 4 bước này khẳng định luận điểm cốt tử của Section 5: Hệ thống an toàn trên giấy tờ toán học hoàn toàn có thể bị đánh bại bởi các kênh vật lý bên ngoài mô hình.</w:t>
-      </w:r>
-    </w:p>
-    <w:p>
-      <w:pPr>
-        <w:spacing w:before="20" w:after="160"/>
-        <w:ind w:left="288"/>
-      </w:pPr>
-      <w:r>
-        <w:rPr>
           <w:color w:val="94A3B8"/>
           <w:sz w:val="18"/>
         </w:rPr>
@@ -1529,23 +1409,23 @@
           <w:color w:val="475569"/>
           <w:sz w:val="19"/>
         </w:rPr>
-        <w:t>• Tiêu đề phụ / Section trên Slide: SECTION 6 — TIẾT LỘ CỦA SNOWDEN (TRANG 10–12)</w:t>
+        <w:t>• Vị trí Slide: SECTION 6 — TIẾT LỘ CỦA SNOWDEN (TRANG 10–12)</w:t>
         <w:br/>
-        <w:t xml:space="preserve">  Khủng hoảng mô hình an ninh trước đối thủ giám sát hàng loạt quy mô quốc gia</w:t>
+        <w:t xml:space="preserve">  Tiêu đề phụ: Khủng hoảng mô hình an ninh trước đối thủ giám sát hàng loạt quy mô quốc gia</w:t>
       </w:r>
     </w:p>
     <w:p>
       <w:pPr>
-        <w:spacing w:before="60" w:after="20"/>
+        <w:spacing w:before="40" w:after="40"/>
         <w:ind w:left="288"/>
       </w:pPr>
       <w:r>
         <w:rPr>
           <w:b/>
           <w:color w:val="0F172A"/>
-          <w:sz w:val="21"/>
+          <w:sz w:val="20"/>
         </w:rPr>
-        <w:t>1. Khủng Hoảng Thực Tiễn — Tiết lộ Snowden (2013):</w:t>
+        <w:t>Nội dung hiển thị trên Slide:</w:t>
       </w:r>
     </w:p>
     <w:p>
@@ -1559,14 +1439,14 @@
           <w:color w:val="1E293B"/>
           <w:sz w:val="20"/>
         </w:rPr>
-        <w:t xml:space="preserve">– Sự kiện bước ngoặt: </w:t>
+        <w:t xml:space="preserve">– 1. Khủng hoảng thực tiễn (Snowden 2013): </w:t>
       </w:r>
       <w:r>
         <w:rPr>
           <w:color w:val="334155"/>
           <w:sz w:val="20"/>
         </w:rPr>
-        <w:t>Các tài liệu Edward Snowden tiết lộ về NSA đã kéo mật mã học vào một cuộc khủng hoảng thực tiễn sâu sắc — làm lung lay niềm tin vào sự an toàn tuyệt đối của chuẩn mật mã.</w:t>
+        <w:t>NSA không cần giải các bài toán toán học khó của RSA/AES mà tấn công vào toàn bộ hệ sinh thái xung quanh (đánh cắp khóa, thâm nhập cáp quang biển).</w:t>
       </w:r>
     </w:p>
     <w:p>
@@ -1580,14 +1460,14 @@
           <w:color w:val="1E293B"/>
           <w:sz w:val="20"/>
         </w:rPr>
-        <w:t xml:space="preserve">– Không phá toán học: </w:t>
+        <w:t xml:space="preserve">– 2. Năng lực đối thủ thể chế: </w:t>
       </w:r>
       <w:r>
         <w:rPr>
           <w:color w:val="334155"/>
           <w:sz w:val="20"/>
         </w:rPr>
-        <w:t>NSA không cần giải các bài toán toán học khó của RSA hay AES mà tấn công trực tiếp vào toàn bộ hệ sinh thái xung quanh — bằng cách đánh cắp khóa và trích xuất siêu dữ liệu.</w:t>
+        <w:t>Khai thác Siêu dữ liệu để dựng mạng xã hội; Tấn công chuỗi cung ứng bằng cách cài cửa sau vào chuẩn NIST (Dual_EC_DRBG); Ép buộc pháp lý các tập đoàn công nghệ lớn.</w:t>
       </w:r>
     </w:p>
     <w:p>
@@ -1601,191 +1481,68 @@
           <w:color w:val="1E293B"/>
           <w:sz w:val="20"/>
         </w:rPr>
-        <w:t xml:space="preserve">– Mô hình thực tế: </w:t>
+        <w:t xml:space="preserve">– 3. Tính tương đối của Kẻ thù: </w:t>
       </w:r>
       <w:r>
         <w:rPr>
           <w:color w:val="334155"/>
           <w:sz w:val="20"/>
         </w:rPr>
-        <w:t>Đối thủ bị động toàn cầu (Global Passive Adversary) và tấn công can thiệp vào đường truyền là mối đe dọa hoàn toàn có thật — vượt ngoài khuôn khổ bảo mật điểm-điểm.</w:t>
+        <w:t>'Kẻ thù' mang tính vị thế quyền lực; Mật mã học buộc phải nghiên cứu phòng chống cửa sau (Cliptography) thay vì giả định kênh sạch.</w:t>
       </w:r>
     </w:p>
+    <w:tbl>
+      <w:tblPr>
+        <w:tblW w:type="auto" w:w="0"/>
+        <w:jc w:val="center"/>
+        <w:tblLook w:firstColumn="1" w:firstRow="1" w:lastColumn="0" w:lastRow="0" w:noHBand="0" w:noVBand="1" w:val="04A0"/>
+      </w:tblPr>
+      <w:tblGrid>
+        <w:gridCol w:w="9360"/>
+      </w:tblGrid>
+      <w:tr>
+        <w:tc>
+          <w:tcPr>
+            <w:tcW w:type="dxa" w:w="9360"/>
+            <w:shd w:val="clear" w:color="auto" w:fill="F1F5F9"/>
+          </w:tcPr>
+          <w:p>
+            <w:pPr>
+              <w:spacing w:before="80" w:after="80"/>
+              <w:ind w:left="144" w:right="144"/>
+            </w:pPr>
+            <w:r>
+              <w:rPr>
+                <w:b/>
+                <w:color w:val="1E40AF"/>
+                <w:sz w:val="20"/>
+              </w:rPr>
+              <w:t>💡 Hướng dẫn thuyết minh &amp; Giải thích dễ hiểu:</w:t>
+              <w:br/>
+            </w:r>
+            <w:r>
+              <w:rPr>
+                <w:color w:val="334155"/>
+                <w:sz w:val="19"/>
+              </w:rPr>
+              <w:t>Giải thích vụ việc cài cửa sau Dual_EC_DRBG nổi tiếng của NSA:</w:t>
+              <w:br/>
+              <w:t>• Chuyện gì đã xảy ra trong vụ Dual_EC_DRBG? Bộ sinh số ngẫu nhiên là trái tim của mật mã: Chìa khóa bí mật bắt buộc phải được tạo ra ngẫu nhiên thì người khác mới không đoán được. Thay vì đi phá từng chiếc chìa khóa, cơ quan an ninh NSA đã bí mật tác động vào Viện Tiêu chuẩn Mỹ (NIST) để biến một thuật toán tạo số ngẫu nhiên bị lỗi (Dual_EC_DRBG) thành tiêu chuẩn quốc tế. NSA nắm giữ một công thức toán học bí mật đằng sau thuật toán này, do đó bất kỳ công ty hay tổ chức nào dùng chuẩn này để tạo khóa thì NSA đều tính toán ra được chìa khóa đó trong chớp mắt.</w:t>
+              <w:br/>
+              <w:t>• 'Cliptography' là gì? Là ngành nghiên cứu cách tạo ra hệ thống bảo mật an toàn ngay cả khi chính con chip hoặc phần mềm mã hóa đã bị kẻ xấu cài cắm cửa sau từ trước.</w:t>
+            </w:r>
+          </w:p>
+        </w:tc>
+      </w:tr>
+    </w:tbl>
     <w:p>
       <w:pPr>
-        <w:spacing w:before="60" w:after="20"/>
-        <w:ind w:left="288"/>
-      </w:pPr>
-      <w:r>
-        <w:rPr>
-          <w:b/>
-          <w:color w:val="0F172A"/>
-          <w:sz w:val="21"/>
-        </w:rPr>
-        <w:t>2. Năng Lực Đối Thủ Thể Chế — Vượt ngoài hình thức:</w:t>
-      </w:r>
-    </w:p>
-    <w:p>
-      <w:pPr>
-        <w:spacing w:before="20" w:after="40"/>
-        <w:ind w:left="504"/>
-      </w:pPr>
-      <w:r>
-        <w:rPr>
-          <w:b/>
-          <w:color w:val="1E293B"/>
-          <w:sz w:val="20"/>
-        </w:rPr>
-        <w:t xml:space="preserve">– Giám sát Siêu dữ liệu: </w:t>
-      </w:r>
-      <w:r>
-        <w:rPr>
-          <w:color w:val="334155"/>
-          <w:sz w:val="20"/>
-        </w:rPr>
-        <w:t>NSA tập trung khai thác Metadata (ai liên lạc với ai, thời gian, kích thước) để dựng lại mạng xã hội mà không cần bẻ khóa bản mã — khẳng định siêu dữ liệu nguy hiểm ngang nội dung.</w:t>
-      </w:r>
-    </w:p>
-    <w:p>
-      <w:pPr>
-        <w:spacing w:before="20" w:after="40"/>
-        <w:ind w:left="504"/>
-      </w:pPr>
-      <w:r>
-        <w:rPr>
-          <w:b/>
-          <w:color w:val="1E293B"/>
-          <w:sz w:val="20"/>
-        </w:rPr>
-        <w:t xml:space="preserve">– Tấn công Chuỗi cung ứng: </w:t>
-      </w:r>
-      <w:r>
-        <w:rPr>
-          <w:color w:val="334155"/>
-          <w:sz w:val="20"/>
-        </w:rPr>
-        <w:t>Chèn cửa sau vào phần cứng, làm suy yếu chuẩn mật mã quốc tế (tiêu chuẩn NIST Dual_EC_DRBG bị cài cửa sau ngầm) — làm xói mòn lòng tin vào cơ quan tiêu chuẩn hóa.</w:t>
-      </w:r>
-    </w:p>
-    <w:p>
-      <w:pPr>
-        <w:spacing w:before="20" w:after="40"/>
-        <w:ind w:left="504"/>
-      </w:pPr>
-      <w:r>
-        <w:rPr>
-          <w:b/>
-          <w:color w:val="1E293B"/>
-          <w:sz w:val="20"/>
-        </w:rPr>
-        <w:t xml:space="preserve">– Áp lực Thể chế: </w:t>
-      </w:r>
-      <w:r>
-        <w:rPr>
-          <w:color w:val="334155"/>
-          <w:sz w:val="20"/>
-        </w:rPr>
-        <w:t>Cưỡng chế pháp lý các tập đoàn công nghệ lớn bàn giao khóa bí mật và quyền truy cập dữ liệu máy chủ — biến rào cản kỹ thuật thành thỏa hiệp pháp lý kín.</w:t>
-      </w:r>
-    </w:p>
-    <w:p>
-      <w:pPr>
-        <w:spacing w:before="60" w:after="20"/>
-        <w:ind w:left="288"/>
-      </w:pPr>
-      <w:r>
-        <w:rPr>
-          <w:b/>
-          <w:color w:val="0F172A"/>
-          <w:sz w:val="21"/>
-        </w:rPr>
-        <w:t>3. Tính Tương Đối Của Kẻ Thù — Bản chất nhận thức luận:</w:t>
-      </w:r>
-    </w:p>
-    <w:p>
-      <w:pPr>
-        <w:spacing w:before="20" w:after="40"/>
-        <w:ind w:left="504"/>
-      </w:pPr>
-      <w:r>
-        <w:rPr>
-          <w:b/>
-          <w:color w:val="1E293B"/>
-          <w:sz w:val="20"/>
-        </w:rPr>
-        <w:t xml:space="preserve">– Khái niệm tương đối: </w:t>
-      </w:r>
-      <w:r>
-        <w:rPr>
-          <w:color w:val="334155"/>
-          <w:sz w:val="20"/>
-        </w:rPr>
-        <w:t>Khái niệm 'Kẻ thù' mang tính vị thế: Đối với người dân, NSA là đối thủ giám sát; nhưng đối với NSA, Snowden lại là đối thủ làm rò rỉ bí mật — an ninh luôn gắn với góc nhìn quyền lực.</w:t>
-      </w:r>
-    </w:p>
-    <w:p>
-      <w:pPr>
-        <w:spacing w:before="20" w:after="40"/>
-        <w:ind w:left="504"/>
-      </w:pPr>
-      <w:r>
-        <w:rPr>
-          <w:b/>
-          <w:color w:val="1E293B"/>
-          <w:sz w:val="20"/>
-        </w:rPr>
-        <w:t xml:space="preserve">– Dân chủ hóa mật mã: </w:t>
-      </w:r>
-      <w:r>
-        <w:rPr>
-          <w:color w:val="334155"/>
-          <w:sz w:val="20"/>
-        </w:rPr>
-        <w:t>Mật mã khóa công khai từng giúp cá nhân tự vệ, nhưng công cụ gián điệp của NSA nay đã lan rộng sang tội phạm mạng và các nhóm phi nhà nước — tạo thế trận đối kháng đa cực.</w:t>
-      </w:r>
-    </w:p>
-    <w:p>
-      <w:pPr>
-        <w:spacing w:before="20" w:after="40"/>
-        <w:ind w:left="504"/>
-      </w:pPr>
-      <w:r>
-        <w:rPr>
-          <w:b/>
-          <w:color w:val="1E293B"/>
-          <w:sz w:val="20"/>
-        </w:rPr>
-        <w:t xml:space="preserve">– Hệ quả khoa học: </w:t>
-      </w:r>
-      <w:r>
-        <w:rPr>
-          <w:color w:val="334155"/>
-          <w:sz w:val="20"/>
-        </w:rPr>
-        <w:t>Mật mã học buộc phải từ bỏ giả định kênh truyền sạch để nghiên cứu phòng chống cửa sau (Cliptography) — xây dựng hệ thống an toàn ngay cả khi thuật toán bị cài cắm ngầm.</w:t>
-      </w:r>
-    </w:p>
-    <w:p>
-      <w:pPr>
-        <w:spacing w:before="60" w:after="40"/>
+        <w:spacing w:before="80" w:after="200"/>
         <w:ind w:left="288"/>
       </w:pPr>
       <w:r>
         <w:rPr>
           <w:i/>
-          <w:color w:val="1E40AF"/>
-          <w:sz w:val="20"/>
-        </w:rPr>
-        <w:t>Lời thuyết minh tiếp nối: Sự kiện Snowden chứng minh rằng đối thủ thế giới thực không phải là các thuật toán trừu tượng mà là các thể chế quyền lực có nguồn lực tài chính, chính trị và kỹ thuật gần như không giới hạn.</w:t>
-      </w:r>
-    </w:p>
-    <w:p>
-      <w:pPr>
-        <w:spacing w:before="20" w:after="160"/>
-        <w:ind w:left="288"/>
-      </w:pPr>
-      <w:r>
-        <w:rPr>
           <w:color w:val="94A3B8"/>
           <w:sz w:val="18"/>
         </w:rPr>
@@ -1824,23 +1581,23 @@
           <w:color w:val="475569"/>
           <w:sz w:val="19"/>
         </w:rPr>
-        <w:t>• Tiêu đề phụ / Section trên Slide: SECTION 7 — KẾT LUẬN &amp; CHƯƠNG TRÌNH NGHIÊN CỨU (TRANG 12–14)</w:t>
+        <w:t>• Vị trí Slide: SECTION 7 — KẾT LUẬN &amp; CHƯƠNG TRÌNH NGHIÊN CỨU (TRANG 12–14)</w:t>
         <w:br/>
-        <w:t xml:space="preserve">  Đề xuất hòa giải giữa trừu tượng hóa toán học và dữ liệu thực nghiệm thế giới thực</w:t>
+        <w:t xml:space="preserve">  Tiêu đề phụ: Đề xuất hòa giải giữa trừu tượng hóa toán học và dữ liệu thực nghiệm thế giới thực</w:t>
       </w:r>
     </w:p>
     <w:p>
       <w:pPr>
-        <w:spacing w:before="60" w:after="20"/>
+        <w:spacing w:before="40" w:after="40"/>
         <w:ind w:left="288"/>
       </w:pPr>
       <w:r>
         <w:rPr>
           <w:b/>
           <w:color w:val="0F172A"/>
-          <w:sz w:val="21"/>
+          <w:sz w:val="20"/>
         </w:rPr>
-        <w:t>Bốn câu hỏi nghiên cứu mở nguyên văn từ Halpin:</w:t>
+        <w:t>Nội dung hiển thị trên Slide:</w:t>
       </w:r>
     </w:p>
     <w:p>
@@ -1854,14 +1611,14 @@
           <w:color w:val="1E293B"/>
           <w:sz w:val="20"/>
         </w:rPr>
-        <w:t xml:space="preserve">– Câu hỏi 1: Mạng Xã Hội Động của Truyền Thông Bí Mật: </w:t>
+        <w:t xml:space="preserve">– Câu hỏi 1 (RQ1) — Mạng xã hội động: </w:t>
       </w:r>
       <w:r>
         <w:rPr>
           <w:color w:val="334155"/>
           <w:sz w:val="20"/>
         </w:rPr>
-        <w:t>"Can we study dynamic social networks of secret communication modeled on the empirical behavior of secret keepers?" — Nghiên cứu tổ chức thông tin dưới dạng mạng xã hội động giữa những người giữ bí mật. Kiểm tra xem các bất biến chính sách bảo vệ bí mật có được duy trì qua các biến động cấu trúc mạng và các sự cố Byzantine hay không — giúp an ninh thích ứng linh hoạt trước thay đổi tác nhân.</w:t>
+        <w:t>Nghiên cứu hành vi thực tế của con người khi giữ bí mật; kiểm tra xem chính sách an ninh có bền vững trước sự cố Byzantine nội bộ.</w:t>
       </w:r>
     </w:p>
     <w:p>
@@ -1875,14 +1632,14 @@
           <w:color w:val="1E293B"/>
           <w:sz w:val="20"/>
         </w:rPr>
-        <w:t xml:space="preserve">– Câu hỏi 2: Mô Hình Hóa Năng Lực và Liên Minh Đối Thủ Bằng Thống Kê: </w:t>
+        <w:t xml:space="preserve">– Câu hỏi 2 (RQ2) — Mô hình hóa bằng thống kê: </w:t>
       </w:r>
       <w:r>
         <w:rPr>
           <w:color w:val="334155"/>
           <w:sz w:val="20"/>
         </w:rPr>
-        <w:t>"By incorporating statistics, can new models of the adversary take into account more accurate data about their capabilities?" — Sử dụng thống kê thực nghiệm và mô phỏng Monte Carlo để mô hình hóa chính xác hơn năng lực đối thủ; phân tích kinh tế chính trị của các liên minh giám sát (Five Eyes, Anonymous) — lượng hóa nguy cơ bằng dữ liệu định lượng thực tế.</w:t>
+        <w:t>Dùng thống kê thực nghiệm và mô phỏng Monte Carlo để lượng hóa năng lực thực tế của đối thủ và liên minh giám sát.</w:t>
       </w:r>
     </w:p>
     <w:p>
@@ -1896,14 +1653,14 @@
           <w:color w:val="1E293B"/>
           <w:sz w:val="20"/>
         </w:rPr>
-        <w:t xml:space="preserve">– Câu hỏi 3: Ứng Dụng Phương Pháp Liên Ngành &amp; Hệ Thống Phức Hợp: </w:t>
+        <w:t xml:space="preserve">– Câu hỏi 3 (RQ3) — Phương pháp liên ngành: </w:t>
       </w:r>
       <w:r>
         <w:rPr>
           <w:color w:val="334155"/>
           <w:sz w:val="20"/>
         </w:rPr>
-        <w:t>"Can cryptography incorporate interdisciplinary methods and insights that can capture the complexity of secure communication?" — Áp dụng các công cụ từ lý thuyết hệ thống phức hợp, động lực học mạng và dịch tễ học để mô hình hóa sự lan truyền thông tin, nhận diện các điểm chuyển pha khi bị tấn công — mở rộng mật mã sang khoa học tự nhiên.</w:t>
+        <w:t>Ứng dụng lý thuyết hệ thống phức hợp và động lực học mạng (như mô hình lây lan dịch bệnh) vào nghiên cứu sự phát tán thông tin.</w:t>
       </w:r>
     </w:p>
     <w:p>
@@ -1917,37 +1674,66 @@
           <w:color w:val="1E293B"/>
           <w:sz w:val="20"/>
         </w:rPr>
-        <w:t xml:space="preserve">– Câu hỏi 4: Triết Học Giúp Tái Cấu Trúc Các Giả Định Ngầm Định: </w:t>
+        <w:t xml:space="preserve">– Câu hỏi 4 (RQ4) — Triết học chất vấn ngầm định: </w:t>
       </w:r>
       <w:r>
         <w:rPr>
           <w:color w:val="334155"/>
           <w:sz w:val="20"/>
         </w:rPr>
-        <w:t>"Will philosophy let us make explicit and then reformulate the hidden assumptions of cryptographic communication, and vice versa?" — Vận dụng triết học để chất vấn các giả định nền tảng của Shannon; xem xét ranh giới động giữa con người và môi trường kỹ thuật số theo Giả thuyết Tâm trí Mở rộng (Extended Mind Hypothesis) — tái cấu trúc nhận thức luận về an toàn thông tin.</w:t>
+        <w:t>Vận dụng triết học để xem xét lại các giả định nền tảng 70 năm qua từ thời Shannon, thích ứng với kỷ nguyên số và AI.</w:t>
       </w:r>
     </w:p>
+    <w:tbl>
+      <w:tblPr>
+        <w:tblW w:type="auto" w:w="0"/>
+        <w:jc w:val="center"/>
+        <w:tblLook w:firstColumn="1" w:firstRow="1" w:lastColumn="0" w:lastRow="0" w:noHBand="0" w:noVBand="1" w:val="04A0"/>
+      </w:tblPr>
+      <w:tblGrid>
+        <w:gridCol w:w="9360"/>
+      </w:tblGrid>
+      <w:tr>
+        <w:tc>
+          <w:tcPr>
+            <w:tcW w:type="dxa" w:w="9360"/>
+            <w:shd w:val="clear" w:color="auto" w:fill="F1F5F9"/>
+          </w:tcPr>
+          <w:p>
+            <w:pPr>
+              <w:spacing w:before="80" w:after="80"/>
+              <w:ind w:left="144" w:right="144"/>
+            </w:pPr>
+            <w:r>
+              <w:rPr>
+                <w:b/>
+                <w:color w:val="1E40AF"/>
+                <w:sz w:val="20"/>
+              </w:rPr>
+              <w:t>💡 Hướng dẫn thuyết minh &amp; Giải thích dễ hiểu:</w:t>
+              <w:br/>
+            </w:r>
+            <w:r>
+              <w:rPr>
+                <w:color w:val="334155"/>
+                <w:sz w:val="19"/>
+              </w:rPr>
+              <w:t>Ý nghĩa tóm gọn của 4 câu hỏi nghiên cứu:</w:t>
+              <w:br/>
+              <w:t>Halpin muốn nhắn nhủ thông điệp: Các nhà khoa học không thể mãi ngồi trong phòng thí nghiệm giải toán một mình được nữa. Mật mã học tương lai phải: (1) Quan sát xem con người thực tế giữ bí mật như thế nào; (2) Thu thập số liệu thống kê để đo lường sức mạnh thực sự của các cơ quan tình báo và tin tặc; (3) Mượn mô hình lây lan dịch bệnh để nghiên cứu xem thông tin mật bị rò rỉ ra sao; và (4) Dùng triết học để xem lại xem các giả định từ 70 năm trước có còn phù hợp với thế giới Internet và AI ngày nay hay không.</w:t>
+            </w:r>
+          </w:p>
+        </w:tc>
+      </w:tr>
+    </w:tbl>
     <w:p>
       <w:pPr>
-        <w:spacing w:before="60" w:after="40"/>
+        <w:spacing w:before="80" w:after="200"/>
         <w:ind w:left="288"/>
       </w:pPr>
       <w:r>
         <w:rPr>
           <w:i/>
-          <w:color w:val="1E40AF"/>
-          <w:sz w:val="20"/>
-        </w:rPr>
-        <w:t>Lời thuyết minh tiếp nối: 4 câu hỏi này là bản thiết kế mở cho tương lai, định hướng mật mã học chuyển mình thành một khoa học an ninh toàn diện và thực nghiệm.</w:t>
-      </w:r>
-    </w:p>
-    <w:p>
-      <w:pPr>
-        <w:spacing w:before="20" w:after="160"/>
-        <w:ind w:left="288"/>
-      </w:pPr>
-      <w:r>
-        <w:rPr>
           <w:color w:val="94A3B8"/>
           <w:sz w:val="18"/>
         </w:rPr>
@@ -1986,23 +1772,23 @@
           <w:color w:val="475569"/>
           <w:sz w:val="19"/>
         </w:rPr>
-        <w:t>• Tiêu đề phụ / Section trên Slide: ĐÁNH GIÁ PHƯƠNG PHÁP LUẬN &amp; HƯỚNG TIẾP CẬN THỰC NGHIỆM</w:t>
+        <w:t>• Vị trí Slide: ĐÁNH GIÁ PHƯƠNG PHÁP LUẬN &amp; HƯỚNG TIẾP CẬN THỰC NGHIỆM</w:t>
         <w:br/>
-        <w:t xml:space="preserve">  Làm rõ tính khả thi tái lập đối với một công trình triết học và định hướng thí nghiệm độc lập</w:t>
+        <w:t xml:space="preserve">  Tiêu đề phụ: Làm rõ tính khả thi tái lập đối với một công trình triết học và định hướng thí nghiệm độc lập</w:t>
       </w:r>
     </w:p>
     <w:p>
       <w:pPr>
-        <w:spacing w:before="60" w:after="20"/>
+        <w:spacing w:before="40" w:after="40"/>
         <w:ind w:left="288"/>
       </w:pPr>
       <w:r>
         <w:rPr>
           <w:b/>
           <w:color w:val="0F172A"/>
-          <w:sz w:val="21"/>
+          <w:sz w:val="20"/>
         </w:rPr>
-        <w:t>1. Đánh Giá Khả Năng Tái Lập (Replication Feasibility):</w:t>
+        <w:t>Nội dung hiển thị trên Slide:</w:t>
       </w:r>
     </w:p>
     <w:p>
@@ -2016,14 +1802,14 @@
           <w:color w:val="1E293B"/>
           <w:sz w:val="20"/>
         </w:rPr>
-        <w:t xml:space="preserve">– Bản chất công trình: </w:t>
+        <w:t xml:space="preserve">– 1. Đánh giá tính khả thi tái lập: </w:t>
       </w:r>
       <w:r>
         <w:rPr>
           <w:color w:val="334155"/>
           <w:sz w:val="20"/>
         </w:rPr>
-        <w:t>Bài báo của TS. Harry Halpin là một luận văn tổng quan triết học và phân tích nhận thức luận, không phải là một công trình kỹ thuật phần mềm — khơi mở tư duy chứ không cung cấp mã nguồn.</w:t>
+        <w:t>Bài báo của Halpin là công trình khảo luận triết học thuần túy, hoàn toàn KHÔNG có mã nguồn, không có tập dữ liệu và không có số liệu đo đạc benchmark ban đầu. Nhóm thực hiện thẩm định học thuật (Scholarly Audit) đối chiếu toàn bộ 17 trang bản in PDF và 134 tài liệu tham khảo.</w:t>
       </w:r>
     </w:p>
     <w:p>
@@ -2037,177 +1823,66 @@
           <w:color w:val="1E293B"/>
           <w:sz w:val="20"/>
         </w:rPr>
-        <w:t xml:space="preserve">– Không có tài nguyên phần mềm: </w:t>
+        <w:t xml:space="preserve">– 2. Định hướng thực nghiệm độc lập của sinh viên: </w:t>
       </w:r>
       <w:r>
         <w:rPr>
           <w:color w:val="334155"/>
           <w:sz w:val="20"/>
         </w:rPr>
-        <w:t>Bài báo HOÀN TOÀN KHÔNG có mã nguồn triển khai, không có tập dữ liệu thực nghiệm, không có các bảng đo thời gian (ms) hay dung lượng benchmark — không tồn tại hệ chuẩn kỹ thuật gốc từ tác giả.</w:t>
+        <w:t>Sinh viên tự xây dựng hệ thống kiểm tra toàn vẹn tệp để minh họa trực quan các khái niệm lý thuyết; thiết kế các kịch bản đối kháng kiểm chứng CRC32, Dolev-Yao, kênh kề thời gian. Quy trình kiểm toán lưu vết tại MIDTERM_CODE_AUDIT.md.</w:t>
       </w:r>
     </w:p>
+    <w:tbl>
+      <w:tblPr>
+        <w:tblW w:type="auto" w:w="0"/>
+        <w:jc w:val="center"/>
+        <w:tblLook w:firstColumn="1" w:firstRow="1" w:lastColumn="0" w:lastRow="0" w:noHBand="0" w:noVBand="1" w:val="04A0"/>
+      </w:tblPr>
+      <w:tblGrid>
+        <w:gridCol w:w="9360"/>
+      </w:tblGrid>
+      <w:tr>
+        <w:tc>
+          <w:tcPr>
+            <w:tcW w:type="dxa" w:w="9360"/>
+            <w:shd w:val="clear" w:color="auto" w:fill="F1F5F9"/>
+          </w:tcPr>
+          <w:p>
+            <w:pPr>
+              <w:spacing w:before="80" w:after="80"/>
+              <w:ind w:left="144" w:right="144"/>
+            </w:pPr>
+            <w:r>
+              <w:rPr>
+                <w:b/>
+                <w:color w:val="1E40AF"/>
+                <w:sz w:val="20"/>
+              </w:rPr>
+              <w:t>💡 Hướng dẫn thuyết minh &amp; Giải thích dễ hiểu:</w:t>
+              <w:br/>
+            </w:r>
+            <w:r>
+              <w:rPr>
+                <w:color w:val="334155"/>
+                <w:sz w:val="19"/>
+              </w:rPr>
+              <w:t>Giải thích trả lời câu hỏi phản biện then chốt:</w:t>
+              <w:br/>
+              <w:t>• Tại sao bài báo không có code mà đề tài lại viết ra phần mềm demo? Vì bài báo của TS. Harry Halpin là một bài nghiên cứu triết học lý thuyết (toàn chữ và lập luận, không có một dòng code hay bảng số liệu thực nghiệm nào). Nhóm sinh viên không thể 'chạy lại code của tác giả' vì tác giả không công bố code. Do đó, nhóm đã tự tay thiết kế và lập trình một hệ thống kiểm tra toàn vẹn tệp độc lập, sử dụng tập dữ liệu thực tế 2.485 tệp tin để làm bằng chứng thực nghiệm trực quan minh họa cho các luận điểm của bài báo.</w:t>
+            </w:r>
+          </w:p>
+        </w:tc>
+      </w:tr>
+    </w:tbl>
     <w:p>
       <w:pPr>
-        <w:spacing w:before="20" w:after="40"/>
-        <w:ind w:left="504"/>
-      </w:pPr>
-      <w:r>
-        <w:rPr>
-          <w:b/>
-          <w:color w:val="1E293B"/>
-          <w:sz w:val="20"/>
-        </w:rPr>
-        <w:t xml:space="preserve">– Phương pháp thẩm định: </w:t>
-      </w:r>
-      <w:r>
-        <w:rPr>
-          <w:color w:val="334155"/>
-          <w:sz w:val="20"/>
-        </w:rPr>
-        <w:t>Nhóm sinh viên thực hiện thẩm định học thuật (Scholarly Audit) đối chiếu toàn bộ 17 trang bản in PDF, 7 mục nội dung và 134 tài liệu tham khảo — đảm bảo nắm bắt chuẩn xác và có phê phán.</w:t>
-      </w:r>
-    </w:p>
-    <w:p>
-      <w:pPr>
-        <w:spacing w:before="20" w:after="40"/>
-        <w:ind w:left="504"/>
-      </w:pPr>
-      <w:r>
-        <w:rPr>
-          <w:b/>
-          <w:color w:val="1E293B"/>
-          <w:sz w:val="20"/>
-        </w:rPr>
-        <w:t xml:space="preserve">– Tính trung thực học thuật: </w:t>
-      </w:r>
-      <w:r>
-        <w:rPr>
-          <w:color w:val="334155"/>
-          <w:sz w:val="20"/>
-        </w:rPr>
-        <w:t>Không bịa đặt số liệu gốc của tác giả; không tuyên bố 'tái lập 100% benchmark bài báo' khi tác giả không công bố benchmark — giữ vững đạo đức khoa học chuẩn mực.</w:t>
-      </w:r>
-    </w:p>
-    <w:p>
-      <w:pPr>
-        <w:spacing w:before="60" w:after="20"/>
-        <w:ind w:left="288"/>
-      </w:pPr>
-      <w:r>
-        <w:rPr>
-          <w:b/>
-          <w:color w:val="0F172A"/>
-          <w:sz w:val="21"/>
-        </w:rPr>
-        <w:t>2. Định Hướng Thí Nghiệm Minh Họa Độc Lập:</w:t>
-      </w:r>
-    </w:p>
-    <w:p>
-      <w:pPr>
-        <w:spacing w:before="20" w:after="40"/>
-        <w:ind w:left="504"/>
-      </w:pPr>
-      <w:r>
-        <w:rPr>
-          <w:b/>
-          <w:color w:val="1E293B"/>
-          <w:sz w:val="20"/>
-        </w:rPr>
-        <w:t xml:space="preserve">– Mục tiêu thực nghiệm: </w:t>
-      </w:r>
-      <w:r>
-        <w:rPr>
-          <w:color w:val="334155"/>
-          <w:sz w:val="20"/>
-        </w:rPr>
-        <w:t>Sinh viên tự xây dựng hệ thống kiểm tra toàn vẹn tệp nhằm chuyển hóa các luận điểm lý thuyết trừu tượng của Halpin thành các kịch bản quan sát được — cung cấp bằng chứng thực nghiệm trực quan.</w:t>
-      </w:r>
-    </w:p>
-    <w:p>
-      <w:pPr>
-        <w:spacing w:before="20" w:after="40"/>
-        <w:ind w:left="504"/>
-      </w:pPr>
-      <w:r>
-        <w:rPr>
-          <w:b/>
-          <w:color w:val="1E293B"/>
-          <w:sz w:val="20"/>
-        </w:rPr>
-        <w:t xml:space="preserve">– Minh họa trực quan: </w:t>
-      </w:r>
-      <w:r>
-        <w:rPr>
-          <w:color w:val="334155"/>
-          <w:sz w:val="20"/>
-        </w:rPr>
-        <w:t>Thiết kế các kịch bản kiểm thử: đối đầu toán học trên mã tuyến tính CRC32; can thiệp đường truyền Dolev-Yao; rò rỉ kênh kề thời gian so sánh chuỗi — đưa người nghe vào trải nghiệm an ninh thực tế.</w:t>
-      </w:r>
-    </w:p>
-    <w:p>
-      <w:pPr>
-        <w:spacing w:before="20" w:after="40"/>
-        <w:ind w:left="504"/>
-      </w:pPr>
-      <w:r>
-        <w:rPr>
-          <w:b/>
-          <w:color w:val="1E293B"/>
-          <w:sz w:val="20"/>
-        </w:rPr>
-        <w:t xml:space="preserve">– Phân định ranh giới rõ ràng: </w:t>
-      </w:r>
-      <w:r>
-        <w:rPr>
-          <w:color w:val="334155"/>
-          <w:sz w:val="20"/>
-        </w:rPr>
-        <w:t>Mã nguồn và hệ thống kiểm tra toàn vẹn là đóng góp kỹ thuật độc lập của sinh viên; không được nhầm lẫn là thuật toán do Halpin đề xuất — minh bạch tuyệt đối về bản quyền ý tưởng.</w:t>
-      </w:r>
-    </w:p>
-    <w:p>
-      <w:pPr>
-        <w:spacing w:before="20" w:after="40"/>
-        <w:ind w:left="504"/>
-      </w:pPr>
-      <w:r>
-        <w:rPr>
-          <w:b/>
-          <w:color w:val="1E293B"/>
-          <w:sz w:val="20"/>
-        </w:rPr>
-        <w:t xml:space="preserve">– Kiểm toán khoa học: </w:t>
-      </w:r>
-      <w:r>
-        <w:rPr>
-          <w:color w:val="334155"/>
-          <w:sz w:val="20"/>
-        </w:rPr>
-        <w:t>Tất cả quy trình kiểm toán mã nguồn và đối chiếu thực nghiệm được lưu vết kỹ thuật tại MIDTERM_CODE_AUDIT.md — sẵn sàng cho hội đồng thẩm định chi tiết.</w:t>
-      </w:r>
-    </w:p>
-    <w:p>
-      <w:pPr>
-        <w:spacing w:before="60" w:after="40"/>
+        <w:spacing w:before="80" w:after="200"/>
         <w:ind w:left="288"/>
       </w:pPr>
       <w:r>
         <w:rPr>
           <w:i/>
-          <w:color w:val="1E40AF"/>
-          <w:sz w:val="20"/>
-        </w:rPr>
-        <w:t>Lời thuyết minh tiếp nối: Slide 10 khẳng định nguyên tắc nghiên cứu trung thực: Bài báo là nền tảng triết học lý thuyết; hệ thống phần mềm là công cụ minh họa độc lập do sinh viên tự phát triển.</w:t>
-      </w:r>
-    </w:p>
-    <w:p>
-      <w:pPr>
-        <w:spacing w:before="20" w:after="160"/>
-        <w:ind w:left="288"/>
-      </w:pPr>
-      <w:r>
-        <w:rPr>
           <w:color w:val="94A3B8"/>
           <w:sz w:val="18"/>
         </w:rPr>
@@ -2246,23 +1921,23 @@
           <w:color w:val="475569"/>
           <w:sz w:val="19"/>
         </w:rPr>
-        <w:t>• Tiêu đề phụ / Section trên Slide: SƠ ĐỒ 4: PHÂN ĐỊNH LÝ THUYẾT &amp; THÍ NGHIỆM ĐỘC LẬP</w:t>
+        <w:t>• Vị trí Slide: SƠ ĐỒ 4: PHÂN ĐỊNH LÝ THUYẾT &amp; THÍ NGHIỆM ĐỘC LẬP</w:t>
         <w:br/>
-        <w:t xml:space="preserve">  Đối sánh minh bạch giữa các luận điểm bài báo và thí nghiệm minh họa do sinh viên xây dựng</w:t>
+        <w:t xml:space="preserve">  Tiêu đề phụ: Đối sánh minh bạch giữa các luận điểm bài báo và thí nghiệm minh họa do sinh viên xây dựng</w:t>
       </w:r>
     </w:p>
     <w:p>
       <w:pPr>
-        <w:spacing w:before="60" w:after="20"/>
+        <w:spacing w:before="40" w:after="40"/>
         <w:ind w:left="288"/>
       </w:pPr>
       <w:r>
         <w:rPr>
           <w:b/>
           <w:color w:val="0F172A"/>
-          <w:sz w:val="21"/>
+          <w:sz w:val="20"/>
         </w:rPr>
-        <w:t>1. NHIỄU vs ĐỐI THỦ CHỦ ĐÍCH:</w:t>
+        <w:t>Nội dung hiển thị trên Slide:</w:t>
       </w:r>
     </w:p>
     <w:p>
@@ -2276,14 +1951,14 @@
           <w:color w:val="1E293B"/>
           <w:sz w:val="20"/>
         </w:rPr>
-        <w:t xml:space="preserve">– Luận điểm Halpin (Sec. 1–2): </w:t>
+        <w:t xml:space="preserve">– Ví dụ 1 — Nhiễu ngẫu nhiên vs Đối thủ có chủ đích: </w:t>
       </w:r>
       <w:r>
         <w:rPr>
           <w:color w:val="334155"/>
           <w:sz w:val="20"/>
         </w:rPr>
-        <w:t>Đối thủ là tác nhân có chủ đích, không phải nhiễu ngẫu nhiên. Mã kiểm tra lỗi tuyến tính được thiết kế cho nhiễu ngẫu nhiên, không phòng vệ được trước đối thủ chủ đích.</w:t>
+        <w:t>Halpin chỉ rõ mã kiểm tra lỗi chỉ chống được nhiễu ngẫu nhiên. DT005 thử nghiệm kịch bản giải hệ phương trình tuyến tính trên GF(2) bù 4 byte qua mặt CRC32; SHA-256 phát hiện tức thì nhờ tính phi tuyến. Giới hạn: Không khẳng định CRC32 bất lực trong kiểm tra lỗi ngẫu nhiên vật lý.</w:t>
       </w:r>
     </w:p>
     <w:p>
@@ -2297,14 +1972,14 @@
           <w:color w:val="1E293B"/>
           <w:sz w:val="20"/>
         </w:rPr>
-        <w:t xml:space="preserve">– Minh họa độc lập (DT005): </w:t>
+        <w:t xml:space="preserve">– Ví dụ 2 — Phân tách miền nút lá (RFC 6962): </w:t>
       </w:r>
       <w:r>
         <w:rPr>
           <w:color w:val="334155"/>
           <w:sz w:val="20"/>
         </w:rPr>
-        <w:t>Thử nghiệm kịch bản bù 4 byte GF(2): Kẻ tấn công giải hệ phương trình tuyến tính để qua mặt CRC32 trong tệp bị can thiệp; hàm băm phi tuyến SHA-256 phát hiện tức thì.</w:t>
+        <w:t>Halpin nhấn mạnh điểm mù cấu trúc dữ liệu nhưng không đề cập cây Merkle. DT005 chủ động cài đặt phân tách miền theo chuẩn IETF RFC 6962 (tiền tố byte 0x00 cho lá, 0x01 cho nhánh) để phòng ngừa va chạm cấu trúc. Giới hạn: Đây là đóng góp độc lập của sinh viên, không phải đề xuất của Halpin.</w:t>
       </w:r>
     </w:p>
     <w:p>
@@ -2318,191 +1993,68 @@
           <w:color w:val="1E293B"/>
           <w:sz w:val="20"/>
         </w:rPr>
-        <w:t xml:space="preserve">– Giới hạn diễn giải: </w:t>
+        <w:t xml:space="preserve">– Ví dụ 3 — Rò rỉ kênh kề thời gian: </w:t>
       </w:r>
       <w:r>
         <w:rPr>
           <w:color w:val="334155"/>
           <w:sz w:val="20"/>
         </w:rPr>
-        <w:t>Chỉ minh họa tính phi tuyến của hàm băm trong kịch bản giả mạo đã kiểm thử; không kết luận CRC32 bất lực trong vai trò phát hiện lỗi ngẫu nhiên vật lý — bởi CRC32 vẫn giữ nguyên giá trị kiểm tra lỗi mạng và phần cứng truyền thống.</w:t>
+        <w:t>Halpin dẫn chứng thời gian thực thi làm rò rỉ bí mật (Kocher 1996). DT005 đo đạc so sánh chuỗi ngắt sớm so với hàm thời gian hằng số hmac.compare_digest. Giới hạn: Đo trên Python có jitter hệ điều hành, chỉ minh họa mức phần mềm.</w:t>
       </w:r>
     </w:p>
+    <w:tbl>
+      <w:tblPr>
+        <w:tblW w:type="auto" w:w="0"/>
+        <w:jc w:val="center"/>
+        <w:tblLook w:firstColumn="1" w:firstRow="1" w:lastColumn="0" w:lastRow="0" w:noHBand="0" w:noVBand="1" w:val="04A0"/>
+      </w:tblPr>
+      <w:tblGrid>
+        <w:gridCol w:w="9360"/>
+      </w:tblGrid>
+      <w:tr>
+        <w:tc>
+          <w:tcPr>
+            <w:tcW w:type="dxa" w:w="9360"/>
+            <w:shd w:val="clear" w:color="auto" w:fill="F1F5F9"/>
+          </w:tcPr>
+          <w:p>
+            <w:pPr>
+              <w:spacing w:before="80" w:after="80"/>
+              <w:ind w:left="144" w:right="144"/>
+            </w:pPr>
+            <w:r>
+              <w:rPr>
+                <w:b/>
+                <w:color w:val="1E40AF"/>
+                <w:sz w:val="20"/>
+              </w:rPr>
+              <w:t>💡 Hướng dẫn thuyết minh &amp; Giải thích dễ hiểu:</w:t>
+              <w:br/>
+            </w:r>
+            <w:r>
+              <w:rPr>
+                <w:color w:val="334155"/>
+                <w:sz w:val="19"/>
+              </w:rPr>
+              <w:t>Giải thích sâu 2 kỹ thuật then chốt trên Slide 11:</w:t>
+              <w:br/>
+              <w:t>• Tại sao mã CRC32 bị bẻ gãy dễ dàng bằng phép toán GF(2), còn SHA-256 thì không? CRC32 (mã kiểm tra lỗi dạng vòng) vốn chỉ được tạo ra để phát hiện lỗi ngẫu nhiên trên dây cáp hay đĩa xước. Công thức của CRC32 là phép chia đa thức tuyến tính rất đơn giản. Kẻ tấn công chỉ cần dùng toán đại số lớp 10 (giải hệ phương trình bậc nhất trên trường nhị phân GF(2)) là tính ra được đúng 4 byte vá víu dán vào đuôi tệp tin, khiến nội dung tệp bị sửa đổi hoàn toàn nhưng mã CRC32 tính ra vẫn trùng khít 100% với tệp gốc! Trong khi đó, SHA-256 là hàm băm mật mã học phi tuyến, có hiệu ứng tuyết lở (~50%): Chỉ cần sửa 1 bit dữ liệu là hơn nửa số bit của mã băm bị đảo lộn ngẫu nhiên, kẻ xấu không thể nào giải phương trình để làm giả được.</w:t>
+              <w:br/>
+              <w:t>• Lỗ hổng nhập nhằng nút lá (Node-leaf ambiguity) và chuẩn RFC 6962 là gì? Trong cây Merkle thông thường, các nút lá và nút nhánh đều được băm bằng công thức giống nhau. Kẻ xấu có thể lấy mã băm của một nút nhánh bên trên rồi giả mạo nó thành nội dung của một tệp tin lá ở dưới, làm hệ thống kiểm tra bị nhầm lẫn cấu trúc. Để khắc phục, nhóm sinh viên áp dụng chuẩn quốc tế IETF RFC 6962: Tệp tin lá thì bắt buộc thêm byte 0x00 vào đầu trước khi băm, còn nút nhánh thì thêm byte 0x01. Giống như dán nhãn phân loại hàng hóa, hệ thống sẽ không bao giờ bị lẫn lộn giữa lá và cành nữa.</w:t>
+            </w:r>
+          </w:p>
+        </w:tc>
+      </w:tr>
+    </w:tbl>
     <w:p>
       <w:pPr>
-        <w:spacing w:before="60" w:after="20"/>
-        <w:ind w:left="288"/>
-      </w:pPr>
-      <w:r>
-        <w:rPr>
-          <w:b/>
-          <w:color w:val="0F172A"/>
-          <w:sz w:val="21"/>
-        </w:rPr>
-        <w:t>2. PHÂN TÁCH MIỀN NÚT LÁ (RFC 6962):</w:t>
-      </w:r>
-    </w:p>
-    <w:p>
-      <w:pPr>
-        <w:spacing w:before="20" w:after="40"/>
-        <w:ind w:left="504"/>
-      </w:pPr>
-      <w:r>
-        <w:rPr>
-          <w:b/>
-          <w:color w:val="1E293B"/>
-          <w:sz w:val="20"/>
-        </w:rPr>
-        <w:t xml:space="preserve">– Gốc lý thuyết bài báo: </w:t>
-      </w:r>
-      <w:r>
-        <w:rPr>
-          <w:color w:val="334155"/>
-          <w:sz w:val="20"/>
-        </w:rPr>
-        <w:t>Halpin nhấn mạnh điểm mù khi triển khai cấu trúc dữ liệu trong thực tế, nhưng KHÔNG trực tiếp đề cập cấu trúc cây Merkle hay kỹ thuật phân tách miền.</w:t>
-      </w:r>
-    </w:p>
-    <w:p>
-      <w:pPr>
-        <w:spacing w:before="20" w:after="40"/>
-        <w:ind w:left="504"/>
-      </w:pPr>
-      <w:r>
-        <w:rPr>
-          <w:b/>
-          <w:color w:val="1E293B"/>
-          <w:sz w:val="20"/>
-        </w:rPr>
-        <w:t xml:space="preserve">– Minh họa độc lập (DT005): </w:t>
-      </w:r>
-      <w:r>
-        <w:rPr>
-          <w:color w:val="334155"/>
-          <w:sz w:val="20"/>
-        </w:rPr>
-        <w:t>Sinh viên chủ động mở rộng bài toán toàn vẹn: Cài đặt phân tách miền theo chuẩn IETF RFC 6962 (tiền tố byte 0x00 cho lá, 0x01 cho nhánh) để phòng ngừa va chạm cấu trúc tầng cây.</w:t>
-      </w:r>
-    </w:p>
-    <w:p>
-      <w:pPr>
-        <w:spacing w:before="20" w:after="40"/>
-        <w:ind w:left="504"/>
-      </w:pPr>
-      <w:r>
-        <w:rPr>
-          <w:b/>
-          <w:color w:val="1E293B"/>
-          <w:sz w:val="20"/>
-        </w:rPr>
-        <w:t xml:space="preserve">– Giới hạn diễn giải: </w:t>
-      </w:r>
-      <w:r>
-        <w:rPr>
-          <w:color w:val="334155"/>
-          <w:sz w:val="20"/>
-        </w:rPr>
-        <w:t>Kỹ thuật RFC 6962 do sinh viên tự nghiên cứu tích hợp, không phải đề xuất của Halpin; chỉ phòng ngừa va chạm cấu trúc, không thay đổi độ phức tạp 2^256 của SHA-256 — đây là đóng góp công nghệ bổ trợ của nhóm.</w:t>
-      </w:r>
-    </w:p>
-    <w:p>
-      <w:pPr>
-        <w:spacing w:before="60" w:after="20"/>
-        <w:ind w:left="288"/>
-      </w:pPr>
-      <w:r>
-        <w:rPr>
-          <w:b/>
-          <w:color w:val="0F172A"/>
-          <w:sz w:val="21"/>
-        </w:rPr>
-        <w:t>3. RÒ RỈ KÊNH KỀ THỜI GIAN:</w:t>
-      </w:r>
-    </w:p>
-    <w:p>
-      <w:pPr>
-        <w:spacing w:before="20" w:after="40"/>
-        <w:ind w:left="504"/>
-      </w:pPr>
-      <w:r>
-        <w:rPr>
-          <w:b/>
-          <w:color w:val="1E293B"/>
-          <w:sz w:val="20"/>
-        </w:rPr>
-        <w:t xml:space="preserve">– Luận điểm Halpin (Sec. 5): </w:t>
-      </w:r>
-      <w:r>
-        <w:rPr>
-          <w:color w:val="334155"/>
-          <w:sz w:val="20"/>
-        </w:rPr>
-        <w:t>Mô hình toán học trừu tượng xem mật mã là hàm lý tưởng, nhưng thời gian thực thi thực tế làm rò rỉ dữ liệu bí mật (dẫn theo Paul Kocher 1996).</w:t>
-      </w:r>
-    </w:p>
-    <w:p>
-      <w:pPr>
-        <w:spacing w:before="20" w:after="40"/>
-        <w:ind w:left="504"/>
-      </w:pPr>
-      <w:r>
-        <w:rPr>
-          <w:b/>
-          <w:color w:val="1E293B"/>
-          <w:sz w:val="20"/>
-        </w:rPr>
-        <w:t xml:space="preserve">– Minh họa độc lập (DT005): </w:t>
-      </w:r>
-      <w:r>
-        <w:rPr>
-          <w:color w:val="334155"/>
-          <w:sz w:val="20"/>
-        </w:rPr>
-        <w:t>Sinh viên xây dựng kịch bản kiểm thử đo đạc thời gian so sánh chuỗi tuần tự (dừng sớm khi gặp byte lệch) so với việc sử dụng hàm thời gian hằng số hmac.compare_digest.</w:t>
-      </w:r>
-    </w:p>
-    <w:p>
-      <w:pPr>
-        <w:spacing w:before="20" w:after="40"/>
-        <w:ind w:left="504"/>
-      </w:pPr>
-      <w:r>
-        <w:rPr>
-          <w:b/>
-          <w:color w:val="1E293B"/>
-          <w:sz w:val="20"/>
-        </w:rPr>
-        <w:t xml:space="preserve">– Giới hạn diễn giải: </w:t>
-      </w:r>
-      <w:r>
-        <w:rPr>
-          <w:color w:val="334155"/>
-          <w:sz w:val="20"/>
-        </w:rPr>
-        <w:t>Đo đạc trên môi trường máy tính đơn có jitter hệ điều hành; chỉ minh họa rò rỉ logic ở mức phần mềm ứng dụng, không đại diện cho kênh kề phần cứng chuyên sâu — phục vụ mục đích trực quan hóa lỗ hổng kênh kề mức mã nguồn.</w:t>
-      </w:r>
-    </w:p>
-    <w:p>
-      <w:pPr>
-        <w:spacing w:before="60" w:after="40"/>
+        <w:spacing w:before="80" w:after="200"/>
         <w:ind w:left="288"/>
       </w:pPr>
       <w:r>
         <w:rPr>
           <w:i/>
-          <w:color w:val="1E40AF"/>
-          <w:sz w:val="20"/>
-        </w:rPr>
-        <w:t>Lời thuyết minh tiếp nối: Slide 11 đối chiếu 3 cột rạch ròi: Luận điểm lý thuyết của bài báo, Mã nguồn minh họa độc lập của sinh viên, và Giới hạn diễn giải khoa học chính xác.</w:t>
-      </w:r>
-    </w:p>
-    <w:p>
-      <w:pPr>
-        <w:spacing w:before="20" w:after="160"/>
-        <w:ind w:left="288"/>
-      </w:pPr>
-      <w:r>
-        <w:rPr>
           <w:color w:val="94A3B8"/>
           <w:sz w:val="18"/>
         </w:rPr>
@@ -2541,23 +2093,23 @@
           <w:color w:val="475569"/>
           <w:sz w:val="19"/>
         </w:rPr>
-        <w:t>• Tiêu đề phụ / Section trên Slide: GIAO DIỆN TỐI GIẢN NỀN SÁNG CHUẨN BỊ DIỄN TẬP TRỰC TIẾP</w:t>
+        <w:t>• Vị trí Slide: GIAO DIỆN TỐI GIẢN NỀN SÁNG CHUẨN BỊ DIỄN TẬP TRỰC TIẾP</w:t>
         <w:br/>
-        <w:t xml:space="preserve">  Chữ hiển thị trên Slide: DEMO</w:t>
+        <w:t xml:space="preserve">  Tiêu đề phụ: Chữ hiển thị trên Slide: DEMO</w:t>
       </w:r>
     </w:p>
     <w:p>
       <w:pPr>
-        <w:spacing w:before="60" w:after="20"/>
+        <w:spacing w:before="40" w:after="40"/>
         <w:ind w:left="288"/>
       </w:pPr>
       <w:r>
         <w:rPr>
           <w:b/>
           <w:color w:val="0F172A"/>
-          <w:sz w:val="21"/>
+          <w:sz w:val="20"/>
         </w:rPr>
-        <w:t>Nội dung thể hiện trên Slide:</w:t>
+        <w:t>Nội dung hiển thị trên Slide:</w:t>
       </w:r>
     </w:p>
     <w:p>
@@ -2581,27 +2133,56 @@
         <w:t>DEMO (Được thiết kế tối giản, chữ to rõ ràng trên nền sáng thanh lịch để tạo nhịp nghỉ trang trọng chuyển tiếp phần thuyết trình sang phần thực nghiệm).</w:t>
       </w:r>
     </w:p>
+    <w:tbl>
+      <w:tblPr>
+        <w:tblW w:type="auto" w:w="0"/>
+        <w:jc w:val="center"/>
+        <w:tblLook w:firstColumn="1" w:firstRow="1" w:lastColumn="0" w:lastRow="0" w:noHBand="0" w:noVBand="1" w:val="04A0"/>
+      </w:tblPr>
+      <w:tblGrid>
+        <w:gridCol w:w="9360"/>
+      </w:tblGrid>
+      <w:tr>
+        <w:tc>
+          <w:tcPr>
+            <w:tcW w:type="dxa" w:w="9360"/>
+            <w:shd w:val="clear" w:color="auto" w:fill="F1F5F9"/>
+          </w:tcPr>
+          <w:p>
+            <w:pPr>
+              <w:spacing w:before="80" w:after="80"/>
+              <w:ind w:left="144" w:right="144"/>
+            </w:pPr>
+            <w:r>
+              <w:rPr>
+                <w:b/>
+                <w:color w:val="1E40AF"/>
+                <w:sz w:val="20"/>
+              </w:rPr>
+              <w:t>💡 Hướng dẫn thuyết minh &amp; Giải thích dễ hiểu:</w:t>
+              <w:br/>
+            </w:r>
+            <w:r>
+              <w:rPr>
+                <w:color w:val="334155"/>
+                <w:sz w:val="19"/>
+              </w:rPr>
+              <w:t>Lời thoại chuyển tiếp vào phần Demo:</w:t>
+              <w:br/>
+              <w:t>Sau khi đã làm rõ các cơ sở triết học và phân định phương pháp luận trên lý thuyết, nhóm xin phép chuyển sang phần Diễn tập An ninh Thực nghiệm trực tiếp (Live Demo) thông qua mô hình đối kháng hai màn hình Red Team và Blue Team, tập trung kiểm chứng thực tế các luận điểm mấu chốt của bài báo.</w:t>
+            </w:r>
+          </w:p>
+        </w:tc>
+      </w:tr>
+    </w:tbl>
     <w:p>
       <w:pPr>
-        <w:spacing w:before="60" w:after="40"/>
+        <w:spacing w:before="80" w:after="200"/>
         <w:ind w:left="288"/>
       </w:pPr>
       <w:r>
         <w:rPr>
           <w:i/>
-          <w:color w:val="1E40AF"/>
-          <w:sz w:val="20"/>
-        </w:rPr>
-        <w:t>Lời thuyết minh tiếp nối: Sau khi hoàn thành phần đối chiếu lý thuyết, nhóm xin chuyển sang phần Diễn tập An ninh Thực nghiệm trực tiếp (Live Demo) thông qua mô hình đối kháng 2 màn hình Red Team và Blue Team, tập trung kiểm chứng các luận điểm mấu chốt của Halpin.</w:t>
-      </w:r>
-    </w:p>
-    <w:p>
-      <w:pPr>
-        <w:spacing w:before="20" w:after="160"/>
-        <w:ind w:left="288"/>
-      </w:pPr>
-      <w:r>
-        <w:rPr>
           <w:color w:val="94A3B8"/>
           <w:sz w:val="18"/>
         </w:rPr>
@@ -2640,23 +2221,23 @@
           <w:color w:val="475569"/>
           <w:sz w:val="19"/>
         </w:rPr>
-        <w:t>• Tiêu đề phụ / Section trên Slide: SƠ ĐỒ 5: KIẾN TRÚC DIỄN TẬP ĐỐI KHÁNG (DEMO ARCHITECTURE)</w:t>
+        <w:t>• Vị trí Slide: SƠ ĐỒ 5: KIẾN TRÚC DIỄN TẬP ĐỐI KHÁNG (DEMO ARCHITECTURE)</w:t>
         <w:br/>
-        <w:t xml:space="preserve">  Mô hình đối kháng thực tế 2 màn hình trên tập dữ liệu kaggle_dataset (2.485 tệp tin / ~112,81 MiB theo benchmark)</w:t>
+        <w:t xml:space="preserve">  Tiêu đề phụ: Mô hình đối kháng thực tế 2 màn hình trên tập dữ liệu kaggle_dataset (2.485 tệp tin / ~112,81 MiB theo benchmark)</w:t>
       </w:r>
     </w:p>
     <w:p>
       <w:pPr>
-        <w:spacing w:before="60" w:after="20"/>
+        <w:spacing w:before="40" w:after="40"/>
         <w:ind w:left="288"/>
       </w:pPr>
       <w:r>
         <w:rPr>
           <w:b/>
           <w:color w:val="0F172A"/>
-          <w:sz w:val="21"/>
+          <w:sz w:val="20"/>
         </w:rPr>
-        <w:t>Nội dung thành phần kiến trúc diễn tập trên Sơ đồ:</w:t>
+        <w:t>Nội dung hiển thị trên Slide:</w:t>
       </w:r>
     </w:p>
     <w:p>
@@ -2670,7 +2251,7 @@
           <w:color w:val="1E293B"/>
           <w:sz w:val="20"/>
         </w:rPr>
-        <w:t xml:space="preserve">– Hạ tầng diễn tập 2 Màn hình: </w:t>
+        <w:t xml:space="preserve">– 1. Hạ tầng diễn tập 2 Màn hình: </w:t>
       </w:r>
       <w:r>
         <w:rPr>
@@ -2691,14 +2272,14 @@
           <w:color w:val="1E293B"/>
           <w:sz w:val="20"/>
         </w:rPr>
-        <w:t xml:space="preserve">– Tập dữ liệu thực nghiệm: </w:t>
+        <w:t xml:space="preserve">– 2. Tập dữ liệu thực nghiệm: </w:t>
       </w:r>
       <w:r>
         <w:rPr>
           <w:color w:val="334155"/>
           <w:sz w:val="20"/>
         </w:rPr>
-        <w:t>kaggle_dataset gồm 2.485 tệp tin, dung lượng ~112,81 MiB (phiên bản nạp kiểm thử cục bộ hiện tại gồm 2.483 tệp) đóng vai trò môi trường kiểm thử thực tế — phản ánh cấu trúc cây thư mục doanh nghiệp nhiều tầng.</w:t>
+        <w:t>kaggle_dataset gồm 2.485 tệp tin, dung lượng ~112,81 MiB (phiên bản nạp kiểm thử cục bộ hiện tại gồm 2.483 tệp) đóng vai trò môi trường kiểm thử thực tế nhiều tầng thư mục.</w:t>
       </w:r>
     </w:p>
     <w:p>
@@ -2712,14 +2293,14 @@
           <w:color w:val="1E293B"/>
           <w:sz w:val="20"/>
         </w:rPr>
-        <w:t xml:space="preserve">– Blue Team (Port 8080): </w:t>
+        <w:t xml:space="preserve">– 3. Blue Team (Port 8080): </w:t>
       </w:r>
       <w:r>
         <w:rPr>
           <w:color w:val="334155"/>
           <w:sz w:val="20"/>
         </w:rPr>
-        <w:t>Nạp dữ liệu, thiết lập mốc tin cậy sạch ban đầu H_0; khi hệ thống kiểm tra toàn vẹn, cơ chế duyệt cây phân cấp định vị chính xác vị trí tệp tin bị biến đổi với tốc độ quét thực tế vượt 2.000 tệp/giây — bắt quả tang vi phạm toàn vẹn tức thì.</w:t>
+        <w:t>Nạp dữ liệu, thiết lập mốc tin cậy sạch ban đầu H_0; quét kiểm tra toàn vẹn định vị chính xác vị trí tệp tin bị biến đổi với tốc độ quét thực tế vượt 2.000 tệp/giây.</w:t>
       </w:r>
     </w:p>
     <w:p>
@@ -2733,14 +2314,14 @@
           <w:color w:val="1E293B"/>
           <w:sz w:val="20"/>
         </w:rPr>
-        <w:t xml:space="preserve">– Red Team (Port 8081): </w:t>
+        <w:t xml:space="preserve">– 4. Red Team (Port 8081): </w:t>
       </w:r>
       <w:r>
         <w:rPr>
           <w:color w:val="334155"/>
           <w:sz w:val="20"/>
         </w:rPr>
-        <w:t>Mô phỏng các vector can thiệp thực tế: Sửa byte tệp ngẫu nhiên (In-place Tamper) và giải hệ phương trình tuyến tính trên GF(2) bù 4 byte qua mặt mã kiểm tra CRC32 — hiện thực hóa năng lực kẻ đối đầu có chủ đích.</w:t>
+        <w:t>Mô phỏng các vector tấn công có chủ đích: Sửa byte tệp ngẫu nhiên (In-place Tamper) và giải hệ phương trình tuyến tính trên GF(2) bù 4 byte qua mặt mã kiểm tra CRC32.</w:t>
       </w:r>
     </w:p>
     <w:p>
@@ -2754,37 +2335,72 @@
           <w:color w:val="1E293B"/>
           <w:sz w:val="20"/>
         </w:rPr>
-        <w:t xml:space="preserve">– Cơ chế hoàn nguyên an toàn: </w:t>
+        <w:t xml:space="preserve">– 5. Cơ chế hoàn nguyên an toàn: </w:t>
       </w:r>
       <w:r>
         <w:rPr>
           <w:color w:val="334155"/>
           <w:sz w:val="20"/>
         </w:rPr>
-        <w:t>Thư mục sao lưu an toàn .adversary_backups/ cho phép phục hồi nguyên vẹn 100% dữ liệu chỉ với 1 click chuột Rollback — đảm bảo ổ đĩa luôn được bảo toàn sau diễn tập.</w:t>
+        <w:t>Thư mục sao lưu an toàn .adversary_backups/ cho phép phục hồi nguyên vẹn 100% dữ liệu chỉ với 1 click chuột Rollback.</w:t>
       </w:r>
     </w:p>
+    <w:tbl>
+      <w:tblPr>
+        <w:tblW w:type="auto" w:w="0"/>
+        <w:jc w:val="center"/>
+        <w:tblLook w:firstColumn="1" w:firstRow="1" w:lastColumn="0" w:lastRow="0" w:noHBand="0" w:noVBand="1" w:val="04A0"/>
+      </w:tblPr>
+      <w:tblGrid>
+        <w:gridCol w:w="9360"/>
+      </w:tblGrid>
+      <w:tr>
+        <w:tc>
+          <w:tcPr>
+            <w:tcW w:type="dxa" w:w="9360"/>
+            <w:shd w:val="clear" w:color="auto" w:fill="F1F5F9"/>
+          </w:tcPr>
+          <w:p>
+            <w:pPr>
+              <w:spacing w:before="80" w:after="80"/>
+              <w:ind w:left="144" w:right="144"/>
+            </w:pPr>
+            <w:r>
+              <w:rPr>
+                <w:b/>
+                <w:color w:val="1E40AF"/>
+                <w:sz w:val="20"/>
+              </w:rPr>
+              <w:t>💡 Hướng dẫn thuyết minh &amp; Giải thích dễ hiểu:</w:t>
+              <w:br/>
+            </w:r>
+            <w:r>
+              <w:rPr>
+                <w:color w:val="334155"/>
+                <w:sz w:val="19"/>
+              </w:rPr>
+              <w:t>Giải thích cơ chế vận hành của buổi Demo trực tiếp:</w:t>
+              <w:br/>
+              <w:t>Mô hình được thiết kế như một cuộc đấu an ninh trực tiếp giữa hai màn hình:</w:t>
+              <w:br/>
+              <w:t>• Màn hình bên phải là Red Team (Kẻ tấn công có chủ đích): Đóng vai tin tặc, bấm nút sửa tệp Resume/Resume.csv hoặc tính toán 4 byte bù để qua mặt CRC32.</w:t>
+              <w:br/>
+              <w:t>• Màn hình bên trái là Blue Team (Hệ thống giám sát phòng thủ): Nạp tập dữ liệu thực tế 2.485 tệp tin. Khi bấm kiểm tra, thuật toán duyệt cây phân cấp sẽ rà soát và định vị chính xác vị trí tệp tin bị sửa đổi chỉ trong tích tắc (tốc độ quét trên 2.000 tệp/giây), phát còi báo động đỏ.</w:t>
+              <w:br/>
+              <w:t>• Sau khi diễn tập xong, nút Rollback All sẽ tự động phục hồi toàn bộ dữ liệu gốc từ thư mục sao lưu an toàn .adversary_backups/.</w:t>
+            </w:r>
+          </w:p>
+        </w:tc>
+      </w:tr>
+    </w:tbl>
     <w:p>
       <w:pPr>
-        <w:spacing w:before="60" w:after="40"/>
+        <w:spacing w:before="80" w:after="200"/>
         <w:ind w:left="288"/>
       </w:pPr>
       <w:r>
         <w:rPr>
           <w:i/>
-          <w:color w:val="1E40AF"/>
-          <w:sz w:val="20"/>
-        </w:rPr>
-        <w:t>Lời thuyết minh tiếp nối: Sơ đồ kiến trúc thể hiện sự kết nối hoàn chỉnh giữa phòng thủ và tấn công, cho phép kiểm chứng các luận điểm của Halpin một cách trực quan và an toàn tuyệt đối.</w:t>
-      </w:r>
-    </w:p>
-    <w:p>
-      <w:pPr>
-        <w:spacing w:before="20" w:after="160"/>
-        <w:ind w:left="288"/>
-      </w:pPr>
-      <w:r>
-        <w:rPr>
           <w:color w:val="94A3B8"/>
           <w:sz w:val="18"/>
         </w:rPr>
@@ -2823,23 +2439,23 @@
           <w:color w:val="475569"/>
           <w:sz w:val="19"/>
         </w:rPr>
-        <w:t>• Tiêu đề phụ / Section trên Slide: SECTION 7 — KẾT LUẬN &amp; THÔNG ĐIỆP HỌC THUẬT</w:t>
+        <w:t>• Vị trí Slide: SECTION 7 — KẾT LUẬN &amp; THÔNG ĐIỆP HỌC THUẬT</w:t>
         <w:br/>
-        <w:t xml:space="preserve">  Tổng kết các đóng góp lý thuyết của Halpin và định hướng nghiên cứu tiếp theo</w:t>
+        <w:t xml:space="preserve">  Tiêu đề phụ: Tổng kết các đóng góp lý thuyết của Halpin và định hướng nghiên cứu tiếp theo</w:t>
       </w:r>
     </w:p>
     <w:p>
       <w:pPr>
-        <w:spacing w:before="60" w:after="20"/>
+        <w:spacing w:before="40" w:after="40"/>
         <w:ind w:left="288"/>
       </w:pPr>
       <w:r>
         <w:rPr>
           <w:b/>
           <w:color w:val="0F172A"/>
-          <w:sz w:val="21"/>
+          <w:sz w:val="20"/>
         </w:rPr>
-        <w:t>1. Thông Điệp Học Thuật Cốt Lõi (Harry Halpin 2025):</w:t>
+        <w:t>Nội dung hiển thị trên Slide:</w:t>
       </w:r>
     </w:p>
     <w:p>
@@ -2853,14 +2469,14 @@
           <w:color w:val="1E293B"/>
           <w:sz w:val="20"/>
         </w:rPr>
-        <w:t xml:space="preserve">– Vượt qua sự trừu tượng hóa: </w:t>
+        <w:t xml:space="preserve">– 1. Thông điệp học thuật cốt lõi (Harry Halpin 2025): </w:t>
       </w:r>
       <w:r>
         <w:rPr>
           <w:color w:val="334155"/>
           <w:sz w:val="20"/>
         </w:rPr>
-        <w:t>Mật mã học không chỉ là toán học thuần túy trên giấy tờ. Các hệ thống an toàn trong thế giới thực phải nhận thức rõ khoảng cách giữa mô hình lý tưởng và thực tế vật lý (kênh kề, siêu dữ liệu, chuỗi cung ứng, áp lực thể chế) — đây là chìa khóa để xây dựng an ninh thực chiến.</w:t>
+        <w:t>Vượt qua sự trừu tượng hóa: Các hệ thống an toàn thế giới thực phải nhận thức khoảng cách giữa mô hình lý tưởng và thực tế vật lý (kênh kề, siêu dữ liệu, chuỗi cung ứng). Bản chất đối thủ là tác nhân có chủ đích. Halpin đặt nền móng cho khoa học an ninh liên ngành.</w:t>
       </w:r>
     </w:p>
     <w:p>
@@ -2874,135 +2490,66 @@
           <w:color w:val="1E293B"/>
           <w:sz w:val="20"/>
         </w:rPr>
-        <w:t xml:space="preserve">– Bản chất của đối thủ: </w:t>
+        <w:t xml:space="preserve">– 2. Hoàn thành giữa kỳ &amp; Lộ trình cuối kỳ (DT005): </w:t>
       </w:r>
       <w:r>
         <w:rPr>
           <w:color w:val="334155"/>
           <w:sz w:val="20"/>
         </w:rPr>
-        <w:t>Đối thủ không phải là 'nhiễu ngẫu nhiên' mà là tác nhân có chủ đích, liên tục tìm kiếm các kênh rò rỉ bị mô hình toán học bỏ qua — an ninh phải dựa trên tư duy đối kháng toàn diện.</w:t>
+        <w:t>Nghiệm thu giữa kỳ: Hoàn thành thẩm định học thuật sâu sắc toàn văn bài báo gốc (17 trang PDF), phân tích đầy đủ 7 mục nội dung. Minh bạch phương pháp luận giữa lý thuyết và phần mềm thực nghiệm. Định hướng cuối kỳ: Tiếp tục nghiên cứu hoàn thiện cấu trúc cây phân cấp tối ưu cho kiểm tra toàn vẹn dữ liệu lớn.</w:t>
       </w:r>
     </w:p>
+    <w:tbl>
+      <w:tblPr>
+        <w:tblW w:type="auto" w:w="0"/>
+        <w:jc w:val="center"/>
+        <w:tblLook w:firstColumn="1" w:firstRow="1" w:lastColumn="0" w:lastRow="0" w:noHBand="0" w:noVBand="1" w:val="04A0"/>
+      </w:tblPr>
+      <w:tblGrid>
+        <w:gridCol w:w="9360"/>
+      </w:tblGrid>
+      <w:tr>
+        <w:tc>
+          <w:tcPr>
+            <w:tcW w:type="dxa" w:w="9360"/>
+            <w:shd w:val="clear" w:color="auto" w:fill="F1F5F9"/>
+          </w:tcPr>
+          <w:p>
+            <w:pPr>
+              <w:spacing w:before="80" w:after="80"/>
+              <w:ind w:left="144" w:right="144"/>
+            </w:pPr>
+            <w:r>
+              <w:rPr>
+                <w:b/>
+                <w:color w:val="1E40AF"/>
+                <w:sz w:val="20"/>
+              </w:rPr>
+              <w:t>💡 Hướng dẫn thuyết minh &amp; Giải thích dễ hiểu:</w:t>
+              <w:br/>
+            </w:r>
+            <w:r>
+              <w:rPr>
+                <w:color w:val="334155"/>
+                <w:sz w:val="19"/>
+              </w:rPr>
+              <w:t>Tóm tắt kết luận ngắn gọn:</w:t>
+              <w:br/>
+              <w:t>Giữa kỳ nhóm đã hoàn thành tốt 2 nhiệm vụ: (1) Thẩm định bài báo một cách có hệ thống, hiểu rõ bản chất triết học của đối thủ; và (2) Dựng xong bộ công cụ demo trực quan minh chứng cho lý thuyết. Định hướng cuối kỳ sẽ tiếp tục nghiên cứu sâu hơn về thuật toán tối ưu hóa cấu trúc cây Merkle để xử lý các tập dữ liệu khổng lồ.</w:t>
+            </w:r>
+          </w:p>
+        </w:tc>
+      </w:tr>
+    </w:tbl>
     <w:p>
       <w:pPr>
-        <w:spacing w:before="20" w:after="40"/>
-        <w:ind w:left="504"/>
-      </w:pPr>
-      <w:r>
-        <w:rPr>
-          <w:b/>
-          <w:color w:val="1E293B"/>
-          <w:sz w:val="20"/>
-        </w:rPr>
-        <w:t xml:space="preserve">– Chương trình nghiên cứu mở: </w:t>
-      </w:r>
-      <w:r>
-        <w:rPr>
-          <w:color w:val="334155"/>
-          <w:sz w:val="20"/>
-        </w:rPr>
-        <w:t>Halpin đặt nền móng triết học và vạch ra 4 câu hỏi nghiên cứu liên ngành nhằm mở rộng mật mã học thành một khoa học an ninh hoàn chỉnh — tạo cầu nối giữa toán học, máy tính và triết học.</w:t>
-      </w:r>
-    </w:p>
-    <w:p>
-      <w:pPr>
-        <w:spacing w:before="60" w:after="20"/>
-        <w:ind w:left="288"/>
-      </w:pPr>
-      <w:r>
-        <w:rPr>
-          <w:b/>
-          <w:color w:val="0F172A"/>
-          <w:sz w:val="21"/>
-        </w:rPr>
-        <w:t>2. Hoàn Thành Giữa Kỳ &amp; Lộ Trình Cuối Kỳ (Nhóm DT005):</w:t>
-      </w:r>
-    </w:p>
-    <w:p>
-      <w:pPr>
-        <w:spacing w:before="20" w:after="40"/>
-        <w:ind w:left="504"/>
-      </w:pPr>
-      <w:r>
-        <w:rPr>
-          <w:b/>
-          <w:color w:val="1E293B"/>
-          <w:sz w:val="20"/>
-        </w:rPr>
-        <w:t xml:space="preserve">– Nghiệm thu tiến độ giữa kỳ: </w:t>
-      </w:r>
-      <w:r>
-        <w:rPr>
-          <w:color w:val="334155"/>
-          <w:sz w:val="20"/>
-        </w:rPr>
-        <w:t>Hoàn thành thẩm định học thuật sâu sắc toàn văn bài báo gốc (17 trang PDF), phân tích đầy đủ 7 mục nội dung và làm rõ khoảng cách giữa lý thuyết trừu tượng với an ninh thực tế — đáp ứng chuẩn mực đồ án giữa kỳ.</w:t>
-      </w:r>
-    </w:p>
-    <w:p>
-      <w:pPr>
-        <w:spacing w:before="20" w:after="40"/>
-        <w:ind w:left="504"/>
-      </w:pPr>
-      <w:r>
-        <w:rPr>
-          <w:b/>
-          <w:color w:val="1E293B"/>
-          <w:sz w:val="20"/>
-        </w:rPr>
-        <w:t xml:space="preserve">– Minh bạch phương pháp luận: </w:t>
-      </w:r>
-      <w:r>
-        <w:rPr>
-          <w:color w:val="334155"/>
-          <w:sz w:val="20"/>
-        </w:rPr>
-        <w:t>Không ngụy tạo số liệu tác giả; phân định rõ ràng giữa công trình khảo cứu triết học của Halpin và các kịch bản thực nghiệm minh họa độc lập do sinh viên tự xây dựng — khẳng định trách nhiệm khoa học.</w:t>
-      </w:r>
-    </w:p>
-    <w:p>
-      <w:pPr>
-        <w:spacing w:before="20" w:after="40"/>
-        <w:ind w:left="504"/>
-      </w:pPr>
-      <w:r>
-        <w:rPr>
-          <w:b/>
-          <w:color w:val="1E293B"/>
-          <w:sz w:val="20"/>
-        </w:rPr>
-        <w:t xml:space="preserve">– Định hướng nghiên cứu cuối kỳ: </w:t>
-      </w:r>
-      <w:r>
-        <w:rPr>
-          <w:color w:val="334155"/>
-          <w:sz w:val="20"/>
-        </w:rPr>
-        <w:t>Tiếp tục nghiên cứu và hoàn thiện mô hình cấu trúc cây phân cấp tối ưu cho bài toán kiểm tra toàn vẹn dữ liệu, tiến hành đo đạc và đánh giá thực nghiệm toàn diện — hướng đến bảo vệ đồ án tốt nghiệp cuối kỳ.</w:t>
-      </w:r>
-    </w:p>
-    <w:p>
-      <w:pPr>
-        <w:spacing w:before="60" w:after="40"/>
+        <w:spacing w:before="80" w:after="200"/>
         <w:ind w:left="288"/>
       </w:pPr>
       <w:r>
         <w:rPr>
           <w:i/>
-          <w:color w:val="1E40AF"/>
-          <w:sz w:val="20"/>
-        </w:rPr>
-        <w:t>Lời thuyết minh tiếp nối: Đề tài giữa kỳ đã khép lại trọn vẹn phần khảo cứu học thuật và chuẩn bị nền móng kỹ thuật vững chắc cho việc phát triển các cấu trúc dữ liệu xác thực tối ưu ở giai đoạn cuối kỳ.</w:t>
-      </w:r>
-    </w:p>
-    <w:p>
-      <w:pPr>
-        <w:spacing w:before="20" w:after="160"/>
-        <w:ind w:left="288"/>
-      </w:pPr>
-      <w:r>
-        <w:rPr>
           <w:color w:val="94A3B8"/>
           <w:sz w:val="18"/>
         </w:rPr>
@@ -3041,23 +2588,23 @@
           <w:color w:val="475569"/>
           <w:sz w:val="19"/>
         </w:rPr>
-        <w:t>• Tiêu đề phụ / Section trên Slide: Trường ĐH Tài nguyên và Môi trường TP.HCM — Khoa Công nghệ thông tin</w:t>
+        <w:t>• Vị trí Slide: Trường ĐH Tài nguyên và Môi trường TP.HCM — Khoa Công nghệ thông tin</w:t>
         <w:br/>
-        <w:t xml:space="preserve">  CẢM ƠN THẦY VÀ CÁC BẠN ĐÃ LẮNG NGHE!</w:t>
+        <w:t xml:space="preserve">  Tiêu đề phụ: CẢM ƠN THẦY VÀ CÁC BẠN ĐÃ LẮNG NGHE!</w:t>
       </w:r>
     </w:p>
     <w:p>
       <w:pPr>
-        <w:spacing w:before="60" w:after="20"/>
+        <w:spacing w:before="40" w:after="40"/>
         <w:ind w:left="288"/>
       </w:pPr>
       <w:r>
         <w:rPr>
           <w:b/>
           <w:color w:val="0F172A"/>
-          <w:sz w:val="21"/>
+          <w:sz w:val="20"/>
         </w:rPr>
-        <w:t>Thông tin kết thúc trên Slide:</w:t>
+        <w:t>Nội dung hiển thị trên Slide:</w:t>
       </w:r>
     </w:p>
     <w:p>
@@ -3071,7 +2618,7 @@
           <w:color w:val="1E293B"/>
           <w:sz w:val="20"/>
         </w:rPr>
-        <w:t xml:space="preserve">– Thông điệp: </w:t>
+        <w:t xml:space="preserve">– Thông điệp kết thúc: </w:t>
       </w:r>
       <w:r>
         <w:rPr>
@@ -3092,58 +2639,66 @@
           <w:color w:val="1E293B"/>
           <w:sz w:val="20"/>
         </w:rPr>
-        <w:t xml:space="preserve">– Đề tài: </w:t>
+        <w:t xml:space="preserve">– Thông tin đề tài: </w:t>
       </w:r>
       <w:r>
         <w:rPr>
           <w:color w:val="334155"/>
           <w:sz w:val="20"/>
         </w:rPr>
-        <w:t>Đề tài DT005: Hệ thống kiểm tra toàn vẹn tệp bằng SHA-256, HMAC và cây Merkle phân cấp động.</w:t>
+        <w:t>Đề tài DT005: Hệ thống kiểm tra toàn vẹn tệp bằng SHA-256, HMAC và cây Merkle phân cấp động | GVHD: ThS. Phạm Trọng Huynh | SVTH: Võ Anh Kiệt — MSSV: 1150080143.</w:t>
       </w:r>
     </w:p>
+    <w:tbl>
+      <w:tblPr>
+        <w:tblW w:type="auto" w:w="0"/>
+        <w:jc w:val="center"/>
+        <w:tblLook w:firstColumn="1" w:firstRow="1" w:lastColumn="0" w:lastRow="0" w:noHBand="0" w:noVBand="1" w:val="04A0"/>
+      </w:tblPr>
+      <w:tblGrid>
+        <w:gridCol w:w="9360"/>
+      </w:tblGrid>
+      <w:tr>
+        <w:tc>
+          <w:tcPr>
+            <w:tcW w:type="dxa" w:w="9360"/>
+            <w:shd w:val="clear" w:color="auto" w:fill="F1F5F9"/>
+          </w:tcPr>
+          <w:p>
+            <w:pPr>
+              <w:spacing w:before="80" w:after="80"/>
+              <w:ind w:left="144" w:right="144"/>
+            </w:pPr>
+            <w:r>
+              <w:rPr>
+                <w:b/>
+                <w:color w:val="1E40AF"/>
+                <w:sz w:val="20"/>
+              </w:rPr>
+              <w:t>💡 Hướng dẫn thuyết minh &amp; Giải thích dễ hiểu:</w:t>
+              <w:br/>
+            </w:r>
+            <w:r>
+              <w:rPr>
+                <w:color w:val="334155"/>
+                <w:sz w:val="19"/>
+              </w:rPr>
+              <w:t>Lời kết thúc báo cáo:</w:t>
+              <w:br/>
+              <w:t>Phần trình bày báo cáo giữa kỳ của đề tài DT005 đến đây là kết thúc. Xin chân thành cảm ơn sự chú ý lắng nghe của Thầy cùng các bạn. Nhóm xin sẵn sàng lắng nghe các ý kiến nhận xét và giải đáp các câu hỏi trong phiên thảo luận.</w:t>
+            </w:r>
+          </w:p>
+        </w:tc>
+      </w:tr>
+    </w:tbl>
     <w:p>
       <w:pPr>
-        <w:spacing w:before="20" w:after="40"/>
-        <w:ind w:left="504"/>
-      </w:pPr>
-      <w:r>
-        <w:rPr>
-          <w:b/>
-          <w:color w:val="1E293B"/>
-          <w:sz w:val="20"/>
-        </w:rPr>
-        <w:t xml:space="preserve">– Thông tin quản lý: </w:t>
-      </w:r>
-      <w:r>
-        <w:rPr>
-          <w:color w:val="334155"/>
-          <w:sz w:val="20"/>
-        </w:rPr>
-        <w:t>Học phần: An toàn và bảo mật hệ thống thông tin | GVHD: ThS. Phạm Trọng Huynh | SVTH: Võ Anh Kiệt — MSSV: 1150080143 — Lớp: 11_CNPM2.</w:t>
-      </w:r>
-    </w:p>
-    <w:p>
-      <w:pPr>
-        <w:spacing w:before="60" w:after="40"/>
+        <w:spacing w:before="80" w:after="200"/>
         <w:ind w:left="288"/>
       </w:pPr>
       <w:r>
         <w:rPr>
           <w:i/>
-          <w:color w:val="1E40AF"/>
-          <w:sz w:val="20"/>
-        </w:rPr>
-        <w:t>Lời thuyết minh tiếp nối: Phần trình bày báo cáo giữa kỳ của đề tài DT005 đến đây là kết thúc. Xin chân thành cảm ơn sự chú ý lắng nghe của Thầy cùng các bạn. Nhóm xin sẵn sàng lắng nghe các ý kiến nhận xét và giải đáp các câu hỏi trong phiên thảo luận.</w:t>
-      </w:r>
-    </w:p>
-    <w:p>
-      <w:pPr>
-        <w:spacing w:before="20" w:after="160"/>
-        <w:ind w:left="288"/>
-      </w:pPr>
-      <w:r>
-        <w:rPr>
           <w:color w:val="94A3B8"/>
           <w:sz w:val="18"/>
         </w:rPr>
@@ -3248,7 +2803,7 @@
         <w:br/>
         <w:t>Bấm nút 'Nạp &amp; Tính toán Toàn vẹn'. Hệ thống tính toán và hiển thị Root Hash ban đầu H_0 với trạng thái màu xanh an toàn: '100% NGUYÊN VẸN'.</w:t>
         <w:br/>
-        <w:t>Ý nghĩa học thuật tiếp nối: Minh họa khái niệm 'đăng ký đối tượng' (registration of objects) theo Cantwell Smith và thiết lập trạng thái tin cậy khách quan theo Dretske.</w:t>
+        <w:t>Ý nghĩa học thuật: Minh họa khái niệm 'đăng ký đối tượng' (registration of objects) theo Cantwell Smith và thiết lập trạng thái tin cậy khách quan theo Dretske.</w:t>
       </w:r>
     </w:p>
     <w:p>
@@ -3283,7 +2838,7 @@
         <w:br/>
         <w:t>• Bảng truy vết chỉ ra chính xác tệp tin Resume/Resume.csv bị tác động.</w:t>
         <w:br/>
-        <w:t>Ý nghĩa học thuật tiếp nối: Minh chứng luận điểm Halpin — Kẻ đối đầu mật mã học là tác nhân có chủ đích (intentional agent), hàm băm mật mã học lập tức bắt quả tang mọi sai lệch dù chỉ 1 bit.</w:t>
+        <w:t>Ý nghĩa học thuật: Minh chứng luận điểm Halpin — Kẻ đối đầu mật mã học là tác nhân có chủ đích (intentional agent), hàm băm mật mã học lập tức bắt quả tang mọi sai lệch dù chỉ 1 bit.</w:t>
       </w:r>
     </w:p>
     <w:p>
@@ -3318,7 +2873,7 @@
         <w:br/>
         <w:t>• Ngược lại, hàm băm SHA-256 phát hiện vi phạm ngay lập tức nhờ tính phi tuyến và hiệu ứng tuyết lở (~50%).</w:t>
         <w:br/>
-        <w:t>Ý nghĩa học thuật tiếp nối: Trực quan hóa luận điểm mấu chốt của bài báo Halpin — phân biệt rạch ròi giữa mã phát hiện lỗi ngẫu nhiên của Shannon và mật mã học trước kẻ thù có chủ đích.</w:t>
+        <w:t>Ý nghĩa học thuật: Trực quan hóa luận điểm mấu chốt của bài báo Halpin — phân biệt rạch ròi giữa mã phát hiện lỗi ngẫu nhiên của Shannon và mật mã học trước kẻ thù có chủ đích.</w:t>
       </w:r>
     </w:p>
     <w:p>

</xml_diff>

<commit_message>
Streamline Word script: remove redundant filler words and replace overly emotional/complex terms
</commit_message>
<xml_diff>
--- a/Kich_Ban_Thuyet_Trinh_Va_Demo_DT005.docx
+++ b/Kich_Ban_Thuyet_Trinh_Va_Demo_DT005.docx
@@ -231,9 +231,9 @@
                 <w:color w:val="334155"/>
                 <w:sz w:val="19"/>
               </w:rPr>
-              <w:t>Cách mở đầu báo cáo ngắn gọn, tự nhiên:</w:t>
+              <w:t>Mở đầu báo cáo:</w:t>
               <w:br/>
-              <w:t>Báo cáo giữa kỳ của đề tài kết hợp hai phần: Một là thẩm định học thuật bài báo triết học về Kẻ thù trong mật mã học của TS. Harry Halpin; Hai là tự xây dựng một hệ thống demo thực tế trên máy tính để kiểm tra toàn vẹn tệp tin, làm bằng chứng thực nghiệm minh họa cho các luận điểm của bài báo.</w:t>
+              <w:t>Báo cáo gồm 2 phần: (1) Thẩm định bài báo của TS. Harry Halpin về mô hình đối thủ trong mật mã học; (2) Trình diễn hệ thống demo kiểm tra toàn vẹn tệp tin để minh họa thực tế cho các luận điểm của tác giả.</w:t>
             </w:r>
           </w:p>
         </w:tc>
@@ -322,7 +322,7 @@
           <w:color w:val="334155"/>
           <w:sz w:val="20"/>
         </w:rPr>
-        <w:t>Khoa học về truyền thông bí mật khi có sự hiện diện của đối thủ có chủ đích trên môi trường mạng mở.</w:t>
+        <w:t>Khoa học về truyền thông bí mật khi có đối thủ có chủ đích trên môi trường mạng mở.</w:t>
       </w:r>
     </w:p>
     <w:p>
@@ -343,7 +343,7 @@
           <w:color w:val="334155"/>
           <w:sz w:val="20"/>
         </w:rPr>
-        <w:t>Lý thuyết thông tin của Shannon (1948) được triết học nghiên cứu sâu rộng, nhưng chính mật mã học lại bị triết học bỏ quên suốt nhiều thập kỷ.</w:t>
+        <w:t>Lý thuyết thông tin của Shannon (1948) được triết học nghiên cứu nhiều, nhưng mật mã học lại bị bỏ quên suốt nhiều thập kỷ.</w:t>
       </w:r>
     </w:p>
     <w:p>
@@ -364,7 +364,7 @@
           <w:color w:val="334155"/>
           <w:sz w:val="20"/>
         </w:rPr>
-        <w:t>Xem mật mã học chỉ là các bài toán toán học thuần túy trên giấy sẽ tạo ra điểm mù nguy hiểm trước các đòn tấn công vật lý trong thế giới thực.</w:t>
+        <w:t>Xem mật mã học chỉ là toán học trên giấy sẽ tạo ra điểm mù trước các đòn tấn công vật lý trong thế giới thực.</w:t>
       </w:r>
     </w:p>
     <w:p>
@@ -422,11 +422,11 @@
                 <w:color w:val="334155"/>
                 <w:sz w:val="19"/>
               </w:rPr>
-              <w:t>Giải thích các thuật ngữ khó hiểu trên Slide:</w:t>
+              <w:t>Giải thích ngắn gọn:</w:t>
               <w:br/>
-              <w:t>• 'Nghịch lý nhận thức luận' là gì? Nghĩa là từ trước đến nay, các nhà nghiên cứu rất hay bàn về triết học của thông tin (thông tin là gì, truyền tin thế nào). Nhưng họ lại quên mất một thực tế hiển nhiên: Khi truyền tin qua mạng thì luôn có kẻ xấu rình rập để nghe lén hoặc phá hoại. Mật mã học sinh ra chính là để đối phó với kẻ xấu đó, nhưng giới triết học lại bỏ quên góc nhìn này. Bài báo của Halpin ra đời để giải quyết đúng khoảng trống đó.</w:t>
+              <w:t>• Nghịch lý nhận thức luận: Triết học nghiên cứu nhiều về lý thuyết thông tin, nhưng lại bỏ quên mật mã học — nơi thực sự giải quyết bài toán truyền tin khi có đối thủ theo dõi. Halpin đặt vấn đề để lấp khoảng trống này.</w:t>
               <w:br/>
-              <w:t>• 'Cái giá của sự trừu tượng hóa' là gì? Nghĩa là nếu ta chỉ ngồi trên giấy chứng minh công thức toán học này an toàn tuyệt đối, ta sẽ bị mù trước thực tế. Kẻ trộm ngoài đời không cần đi bẻ công thức toán, mà chúng đo xem máy tính chạy mất bao nhiêu giây, ăn bao nhiêu điện để đoán ra mật khẩu. Coi an toàn chỉ là toán học sẽ khiến hệ thống sụp đổ trước các đòn đánh vật lý.</w:t>
+              <w:t>• Cái giá của sự trừu tượng hóa: Xem an toàn chỉ là công thức toán trên giấy sẽ bỏ sót thực tế. Kẻ tấn công ngoài đời không cần bẻ toán, mà đo thời gian xử lý hoặc mức tiêu thụ điện của thiết bị để tìm khóa.</w:t>
             </w:r>
           </w:p>
         </w:tc>
@@ -515,7 +515,7 @@
           <w:color w:val="334155"/>
           <w:sz w:val="20"/>
         </w:rPr>
-        <w:t>Thế giới khởi đầu từ dòng chảy siêu hình nguyên thủy; con người định hình thực tại bằng cách 'đăng ký đối tượng' (registration of objects) giữa các tác nhân ở xa nhau.</w:t>
+        <w:t>Thế giới khởi đầu từ dòng dữ liệu chưa có ranh giới; con người định hình thực tại bằng cách 'đăng ký đối tượng' (registration of objects) giữa các tác nhân ở xa nhau.</w:t>
       </w:r>
     </w:p>
     <w:p>
@@ -536,7 +536,7 @@
           <w:color w:val="334155"/>
           <w:sz w:val="20"/>
         </w:rPr>
-        <w:t>Thông tin tồn tại khách quan theo quy luật tự nhiên; bản rõ mang thông tin về nguồn phát, hệ mật hoàn hảo đảm bảo bản mã không để rò rỉ bất kỳ thông tin nào về nguồn.</w:t>
+        <w:t>Thông tin tồn tại khách quan theo quy luật tự nhiên; bản rõ mang thông tin về nguồn, hệ mật đảm bảo bản mã không để lộ thông tin về nguồn.</w:t>
       </w:r>
     </w:p>
     <w:p>
@@ -550,14 +550,14 @@
           <w:color w:val="1E293B"/>
           <w:sz w:val="20"/>
         </w:rPr>
-        <w:t xml:space="preserve">– 3. Bản chất của Kẻ đối đầu: </w:t>
+        <w:t xml:space="preserve">– 3. Bản chất của đối thủ: </w:t>
       </w:r>
       <w:r>
         <w:rPr>
           <w:color w:val="334155"/>
           <w:sz w:val="20"/>
         </w:rPr>
-        <w:t>Đối thủ là tác nhân có chủ đích (intentional agent), có ý chí và mục tiêu, khác hoàn toàn với nhiễu ngẫu nhiên vật lý.</w:t>
+        <w:t>Đối thủ là tác nhân có chủ đích (intentional agent), có mục tiêu rõ ràng, khác với nhiễu ngẫu nhiên vật lý.</w:t>
       </w:r>
     </w:p>
     <w:p>
@@ -578,7 +578,7 @@
           <w:color w:val="334155"/>
           <w:sz w:val="20"/>
         </w:rPr>
-        <w:t>Common Knowledge (David Lewis): Mọi người đều biết và tin trạng thái sự việc. Public Knowledge: Thông tin ai cũng có tiềm năng tiếp cận. Bí mật là 'tri thức không phổ biến', không đồng nhất với bản rõ hay bản mã.</w:t>
+        <w:t>Common Knowledge (David Lewis): Mọi người cùng biết và biết người khác cũng biết. Public Knowledge: Thông tin ai cũng có thể tiếp cận. Bí mật là 'tri thức không phổ biến', không đồng nhất với bản rõ hay bản mã.</w:t>
       </w:r>
     </w:p>
     <w:tbl>
@@ -615,19 +615,19 @@
                 <w:color w:val="334155"/>
                 <w:sz w:val="19"/>
               </w:rPr>
-              <w:t>Giải thích các thuật ngữ triết học khó hiểu trên Slide:</w:t>
+              <w:t>Giải thích ngắn gọn:</w:t>
               <w:br/>
-              <w:t>• 'Đăng ký đối tượng' (Smith) là gì? Thế giới thực vốn là một mớ dữ liệu liên tục không có đường biên. Để hai máy tính ở xa nhau nói chuyện an toàn được, con người phải 'đóng khung' dữ liệu lại thành các đối tượng rõ ràng: đâu là Thông điệp M, đâu là Bản mã C, đâu là Chìa khóa K. Nhờ đóng khung rạch ròi, hệ thống mới biết phần nào cần bảo vệ và truyền đi.</w:t>
+              <w:t>• Đăng ký đối tượng (Smith): Dữ liệu truyền đi vốn là dòng liên tục. Để bảo vệ, hệ thống phải phân định rõ từng phần: Bản rõ (M), Bản mã (C), Khóa (K). Có phân định rõ thì hệ thống mới kiểm soát được luồng bảo mật.</w:t>
               <w:br/>
-              <w:t>• 'Thông tin khách quan' (Dretske) là gì? Dretske cho rằng thông tin tồn tại khách quan tự nhiên, giống như tiếng sấm nổ tự nó báo hiệu trời sắp mưa, dù có ai nghe hay không. Áp dụng vào mật mã: Bản rõ chứa thông tin thật; nếu mã hóa tốt thì bản mã nhìn như một mớ dữ liệu rác vô nghĩa, hoàn toàn không dính dáng gì đến thông tin gốc, khiến kẻ trộm nhìn vào không suy đoán được gì.</w:t>
+              <w:t>• Thông tin khách quan (Dretske): Thông tin tồn tại độc lập với người nhận (như tiếng sấm báo trời mưa). Bản rõ mang thông tin gốc; khi mã hóa tốt, bản mã trở thành chuỗi ngẫu nhiên không để lộ thông tin về nguồn.</w:t>
               <w:br/>
-              <w:t>• Phân biệt Common Knowledge và Public Knowledge (David Lewis 1969):</w:t>
+              <w:t>• Common Knowledge vs Public Knowledge (Lewis 1969):</w:t>
               <w:br/>
-              <w:t xml:space="preserve">  - Common Knowledge (Tri thức chung): Là thông tin mà mọi người đều biết, và ai cũng biết là người khác cũng biết (ví dụ: luật đèn đỏ phải dừng, ai đi đường cũng biết và tin chắc người đối diện cũng biết luật đó).</w:t>
+              <w:t xml:space="preserve">  - Tri thức chung (Common Knowledge): Mọi người cùng biết một thông tin và biết người khác cũng biết (như luật đèn đỏ, ai cũng biết và tin người khác cũng tuân thủ).</w:t>
               <w:br/>
-              <w:t xml:space="preserve">  - Public Knowledge (Tri thức công khai): Là thông tin ai cũng có thể tìm thấy nếu muốn (ví dụ: tài liệu mật bị rò rỉ lên mạng, ai tò mò lên mạng tải về là đọc được).</w:t>
+              <w:t xml:space="preserve">  - Tri thức công khai (Public Knowledge): Thông tin bất kỳ ai cũng có thể tiếp cận (như tài liệu bị rò rỉ lên mạng).</w:t>
               <w:br/>
-              <w:t xml:space="preserve">  - Bí mật (Secret): Tác giả định nghĩa bí mật là 'thứ không công khai' (uncommon knowledge). Bí mật không phải tự thân chuỗi bit có phép thuật, mà là mối quan hệ xã hội: Chừng nào nhóm của ta vẫn giữ kín được thông tin và không để lọt ra ngoài, thì chừng đó nó vẫn là bí mật.</w:t>
+              <w:t xml:space="preserve">  - Bí mật: Là 'tri thức không phổ biến', chỉ lưu hành trong nhóm nhất định, không để lộ ra ngoài.</w:t>
             </w:r>
           </w:p>
         </w:tc>
@@ -716,7 +716,7 @@
           <w:color w:val="334155"/>
           <w:sz w:val="20"/>
         </w:rPr>
-        <w:t>Mô hình bảo mật điểm-điểm; định nghĩa Bí mật hoàn hảo H(K) &gt;= H(M). Giới hạn: Giản lược đối thủ thành kẻ nghe lén trên kênh trừu tượng, bỏ qua chi phí phân phối khóa.</w:t>
+        <w:t>Mô hình bảo mật điểm-điểm; định nghĩa Bí mật hoàn hảo H(K) &gt;= H(M). Giới hạn: Trừu tượng hóa đối thủ trên kênh toán học, bỏ qua chi phí phân phối khóa.</w:t>
       </w:r>
     </w:p>
     <w:p>
@@ -737,7 +737,7 @@
           <w:color w:val="334155"/>
           <w:sz w:val="20"/>
         </w:rPr>
-        <w:t>Diffie-Hellman và Merkle giải quyết bài toán phân phối khóa, chuyển gánh nặng sang độ phức tạp tính toán một chiều.</w:t>
+        <w:t>Diffie-Hellman và Merkle giải bài toán phân phối khóa bằng các bài toán độ phức tạp tính toán một chiều.</w:t>
       </w:r>
     </w:p>
     <w:p>
@@ -758,7 +758,7 @@
           <w:color w:val="334155"/>
           <w:sz w:val="20"/>
         </w:rPr>
-        <w:t>Goldwasser-Micali định nghĩa đối thủ thời gian đa thức xác suất (PPT) và an toàn ngữ nghĩa thông qua các trò chơi an ninh.</w:t>
+        <w:t>Goldwasser-Micali mô hình hóa đối thủ thời gian đa thức xác suất (PPT) và kiểm chứng an toàn qua trò chơi an ninh.</w:t>
       </w:r>
     </w:p>
     <w:p>
@@ -779,7 +779,7 @@
           <w:color w:val="334155"/>
           <w:sz w:val="20"/>
         </w:rPr>
-        <w:t>Dolev-Yao mô hình hóa đối thủ kiểm soát toàn bộ kênh truyền mạng; Bellare-Rogaway đề xuất Random Oracle Model (ROM) cho hàm băm.</w:t>
+        <w:t>Dolev-Yao mô hình hóa đối thủ kiểm soát kênh mạng; Bellare-Rogaway đề xuất Random Oracle Model (ROM) cho hàm băm.</w:t>
       </w:r>
     </w:p>
     <w:p>
@@ -800,7 +800,7 @@
           <w:color w:val="334155"/>
           <w:sz w:val="20"/>
         </w:rPr>
-        <w:t>Snowden phơi bày năng lực thực tế của NSA: Kênh kề, cửa sau chuẩn mật mã, tấn công chuỗi cung ứng và giám sát siêu dữ liệu.</w:t>
+        <w:t>Snowden phơi bày năng lực thực tế của đối thủ thể chế: Kênh kề, cửa sau tiêu chuẩn, can thiệp chuỗi cung ứng và giám sát siêu dữ liệu.</w:t>
       </w:r>
     </w:p>
     <w:tbl>
@@ -837,11 +837,11 @@
                 <w:color w:val="334155"/>
                 <w:sz w:val="19"/>
               </w:rPr>
-              <w:t>Giải thích các khái niệm khó hiểu trên Slide:</w:t>
+              <w:t>Giải thích ngắn gọn:</w:t>
               <w:br/>
-              <w:t>• Bí mật hoàn hảo của Shannon H(K) &gt;= H(M) có hạn chế gì? Shannon chứng minh muốn bảo mật tuyệt đối thì chìa khóa phải dài tối thiểu bằng bức thư (như mã dùng một lần One-Time Pad). Nhưng hạn chế ngoài đời là: Nếu ta muốn gửi bức thư 10 GB qua mạng mà lại phải đem theo cái ổ cứng chứa chìa khóa 10 GB đi giao tận tay người nhận thì cực kỳ tốn kém và không thể áp dụng cho mạng Internet toàn cầu.</w:t>
+              <w:t>• Giới hạn của Shannon: Bí mật hoàn hảo đòi hỏi khóa phải dài bằng thông điệp (One-Time Pad). Gửi dữ liệu 10 GB mà phải chuyển trước khóa 10 GB tận tay thì tốn kém và không thực tế trên Internet.</w:t>
               <w:br/>
-              <w:t>• 'PPT Adversary &amp; Security Games' (1984) là gì? Vì không thể dùng chìa khóa dài vô tận của Shannon, các nhà khoa học hiện đại chấp nhận thực tế: Kẻ trộm chỉ có máy tính chạy thời gian đa thức (PPT - tức máy tính có sức mạnh hữu hạn, không thể thử hàng tỷ tỷ năm). Họ đặt ra một 'Trò chơi an ninh': Đưa cho kẻ trộm hai gói tin mã hóa, nếu kẻ trộm không đoán được gói nào chứa tin nhắn nào (tỷ lệ đoán chỉ bằng 50% tung đồng xu) thì thuật toán đó được coi là an toàn.</w:t>
+              <w:t>• PPT Adversary &amp; Trò chơi an ninh (1984): Đưa ra giả định thực tế: Đối thủ dùng máy tính thời gian đa thức (năng lực tính toán hữu hạn). An toàn được chứng minh nếu đối thủ không phân biệt được hai bản mã với xác suất tốt hơn đoán ngẫu nhiên (50%).</w:t>
             </w:r>
           </w:p>
         </w:tc>
@@ -930,7 +930,7 @@
           <w:color w:val="334155"/>
           <w:sz w:val="20"/>
         </w:rPr>
-        <w:t>Alice gửi bản rõ M mã hóa bằng khóa K qua kênh truyền đến Bob. Đối thủ Eve chỉ là kẻ nghe lén thụ động trên đường truyền. Bỏ qua chi phí quản lý khóa và bề mặt tấn công vật lý.</w:t>
+        <w:t>Alice gửi bản rõ M mã hóa bằng khóa K qua kênh truyền đến Bob; đối thủ Eve nghe lén thụ động. Bỏ qua chi phí quản lý khóa và bề mặt tấn công vật lý.</w:t>
       </w:r>
     </w:p>
     <w:p>
@@ -944,14 +944,14 @@
           <w:color w:val="1E293B"/>
           <w:sz w:val="20"/>
         </w:rPr>
-        <w:t xml:space="preserve">– Panel Phải — Mạng xã hội - kỹ thuật phức hợp (Halpin 2025): </w:t>
+        <w:t xml:space="preserve">– Panel Phải — Mạng xã hội - kỹ thuật (Halpin 2025): </w:t>
       </w:r>
       <w:r>
         <w:rPr>
           <w:color w:val="334155"/>
           <w:sz w:val="20"/>
         </w:rPr>
-        <w:t>Thông tin luân chuyển giữa Nhóm giữ bí mật và Hạ tầng mở / ISP / Đám mây. Đối thủ thể chế (NSA, Five Eyes) tấn công qua 4 con đường: (1) Kênh kề; (2) Giám sát siêu dữ liệu; (3) Cửa sau phần cứng; (4) Lỗi phản bội nội bộ Byzantine.</w:t>
+        <w:t>Thông tin luân chuyển qua hạ tầng mở, ISP, đám mây. Đối thủ thể chế (NSA) tấn công qua 4 hướng: Kênh kề, giám sát siêu dữ liệu, cửa sau phần cứng và phản bội nội bộ.</w:t>
       </w:r>
     </w:p>
     <w:tbl>
@@ -988,9 +988,9 @@
                 <w:color w:val="334155"/>
                 <w:sz w:val="19"/>
               </w:rPr>
-              <w:t>Giải thích bản chất trực quan của Sơ đồ đối sánh:</w:t>
+              <w:t>Giải thích ngắn gọn:</w:t>
               <w:br/>
-              <w:t>• Tại sao mô hình Shannon không còn đủ cho thế giới ngày nay? Thời của Shannon (1949), người ta chỉ nghĩ đơn giản là kéo một sợi dây điện từ nhà Alice sang nhà Bob, và có một kẻ xấu Eve đứng kẹp dây nghe trộm. Nhưng Internet ngày nay phức tạp hơn thế: Gói tin phải đi qua nhà mạng Viettel/VNPT, qua máy chủ đám mây của Google, Amazon. Kẻ nghe lén hiện nay là các cơ quan tình báo khổng lồ. Họ không chỉ nghe lén nội dung tin nhắn, mà họ soi 'Siêu dữ liệu' (Metadata): Tức là ai nhắn tin cho ai, gửi lúc mấy giờ, tệp nặng bao nhiêu MB. Chỉ cần nắm siêu dữ liệu là họ biết hết quan hệ và hành vi của người dùng mà không cần tốn công bẻ khóa mật mã.</w:t>
+              <w:t>• Shannon vs Thực tế: Shannon giả định đường truyền điểm-điểm đơn giản, chỉ có kẻ nghe lén trên dây dẫn. Thực tế Internet dữ liệu phải qua ISP và máy chủ đám mây. Đối thủ hiện đại không chỉ chặn nội dung mà còn thu thập Siêu dữ liệu (ai gửi cho ai, lúc nào, dung lượng bao nhiêu) để vẽ lại hành vi người dùng mà không cần giải mã.</w:t>
             </w:r>
           </w:p>
         </w:tc>
@@ -1072,14 +1072,14 @@
           <w:color w:val="1E293B"/>
           <w:sz w:val="20"/>
         </w:rPr>
-        <w:t xml:space="preserve">– 1. Mô hình PPT Adversary (Goldwasser-Micali 1984): </w:t>
+        <w:t xml:space="preserve">– 1. PPT Adversary (Goldwasser-Micali 1984): </w:t>
       </w:r>
       <w:r>
         <w:rPr>
           <w:color w:val="334155"/>
           <w:sz w:val="20"/>
         </w:rPr>
-        <w:t>Đối thủ là thuật toán Turing xác suất chạy thời gian đa thức; an toàn được định nghĩa qua Trò chơi An ninh với lợi thế đoán đúng là hàm không đáng kể; chứng minh bằng quy dẫn toán học.</w:t>
+        <w:t>Đối thủ là thuật toán Turing xác suất chạy thời gian đa thức; an toàn định nghĩa qua trò chơi thách đấu; chứng minh bằng quy dẫn về bài toán khó.</w:t>
       </w:r>
     </w:p>
     <w:p>
@@ -1093,14 +1093,14 @@
           <w:color w:val="1E293B"/>
           <w:sz w:val="20"/>
         </w:rPr>
-        <w:t xml:space="preserve">– 2. Mô hình Đối thủ mạng Logic (Dolev-Yao 1983): </w:t>
+        <w:t xml:space="preserve">– 2. Đối thủ mạng logic (Dolev-Yao 1983): </w:t>
       </w:r>
       <w:r>
         <w:rPr>
           <w:color w:val="334155"/>
           <w:sz w:val="20"/>
         </w:rPr>
-        <w:t>Kẻ thù kiểm soát toàn bộ kênh truyền (đọc, chặn, sửa, xóa, phát lại gói tin), nhưng xem mật mã là 'hộp đen đại số hoàn hảo', không thể giải mã nếu không có khóa.</w:t>
+        <w:t>Đối thủ kiểm soát toàn bộ kênh truyền (chặn, sửa, xóa, phát lại gói tin), nhưng xem mật mã là hộp đen an toàn tuyệt đối nếu không có khóa.</w:t>
       </w:r>
     </w:p>
     <w:p>
@@ -1114,14 +1114,14 @@
           <w:color w:val="1E293B"/>
           <w:sz w:val="20"/>
         </w:rPr>
-        <w:t xml:space="preserve">– 3. Mô hình Tiên tri Ngẫu nhiên (Bellare-Rogaway 1993): </w:t>
+        <w:t xml:space="preserve">– 3. Tiên tri ngẫu nhiên (Bellare-Rogaway 1993): </w:t>
       </w:r>
       <w:r>
         <w:rPr>
           <w:color w:val="334155"/>
           <w:sz w:val="20"/>
         </w:rPr>
-        <w:t>Giả định hàm băm thực tế hoạt động như một cỗ máy ngẫu nhiên lý tưởng (Random Oracle); thực tế không có hàm băm nào tương đương toán học với một Random Oracle thực sự.</w:t>
+        <w:t>Giả định hàm băm hoạt động như hàm ngẫu nhiên lý tưởng (Random Oracle); thực tế không hàm băm nào đạt được tính ngẫu nhiên toán học này.</w:t>
       </w:r>
     </w:p>
     <w:tbl>
@@ -1158,13 +1158,15 @@
                 <w:color w:val="334155"/>
                 <w:sz w:val="19"/>
               </w:rPr>
-              <w:t>Giải thích cốt lõi của 3 mô hình toán học:</w:t>
+              <w:t>Giải thích ngắn gọn:</w:t>
               <w:br/>
-              <w:t>• Mô hình Dolev-Yao (1983) coi kẻ tấn công như 'ông trùm đường truyền Internet': Muốn chặn gói tin, sửa tin hay phát lại gói tin cũ lúc nào cũng được. Nhưng mô hình này lại ngây thơ coi mật mã như một 'hộp đen thần kỳ', tức là kẻ địch không bao giờ phá được nếu không có khóa.</w:t>
+              <w:t>• Điểm cốt lõi bài báo phê phán: Cả 3 mô hình đều lý tưởng hóa đối thủ trên giấy:</w:t>
               <w:br/>
-              <w:t>• Mô hình Random Oracle (ROM 1993) coi hàm băm (như SHA-256) hoàn hảo như một cỗ máy bốc thăm ngẫu nhiên tuyệt đối của trời cho. Nhưng thực tế ngoài đời, SHA-256 chỉ là một đoạn code toán học cố định do con người viết ra, nên không thể ngẫu nhiên tuyệt đối 100% được.</w:t>
+              <w:t xml:space="preserve">  - Dolev-Yao cho đối thủ kiểm soát mạng nhưng lại giả định mật mã là hộp đen không thể lộ khóa.</w:t>
               <w:br/>
-              <w:t>• Tác giả phê phán điều gì? Cả 3 mô hình này đều quá lý tưởng trên giấy tờ. Kẻ thù ngoài đời không ngoan ngoãn giải toán như các nhà khoa học giả định, mà chúng tấn công vào điểm mù phần cứng và con người.</w:t>
+              <w:t xml:space="preserve">  - Random Oracle giả định hàm băm ngẫu nhiên hoàn hảo, trong khi hàm băm thực tế (như SHA-256) chỉ là thuật toán xác định.</w:t>
+              <w:br/>
+              <w:t xml:space="preserve">  - Thực tế, đối thủ không chỉ giải toán mà còn tấn công vào lỗi phần cứng, kênh kề và quy trình quản trị.</w:t>
             </w:r>
           </w:p>
         </w:tc>
@@ -1246,14 +1248,14 @@
           <w:color w:val="1E293B"/>
           <w:sz w:val="20"/>
         </w:rPr>
-        <w:t xml:space="preserve">– Bước 1 — Giả định toán học hình thức: </w:t>
+        <w:t xml:space="preserve">– Bước 1 — Giả định toán học: </w:t>
       </w:r>
       <w:r>
         <w:rPr>
           <w:color w:val="334155"/>
           <w:sz w:val="20"/>
         </w:rPr>
-        <w:t>Hộp đen mật mã lý tưởng, thời gian thực thi vô hình, độ dài bản mã không lộ nội dung, kênh truyền độc lập.</w:t>
+        <w:t>Hộp đen mật mã lý tưởng, thời gian thực thi vô hình, độ dài bản mã không làm lộ nội dung, kênh truyền độc lập.</w:t>
       </w:r>
     </w:p>
     <w:p>
@@ -1267,14 +1269,14 @@
           <w:color w:val="1E293B"/>
           <w:sz w:val="20"/>
         </w:rPr>
-        <w:t xml:space="preserve">– Bước 2 — Yếu tố vật lý bị trừu tượng hóa bỏ qua: </w:t>
+        <w:t xml:space="preserve">– Bước 2 — Yếu tố vật lý bị lược bỏ: </w:t>
       </w:r>
       <w:r>
         <w:rPr>
           <w:color w:val="334155"/>
           <w:sz w:val="20"/>
         </w:rPr>
-        <w:t>Thời gian vi xử lý CPU, điện năng tiêu thụ, bức xạ điện từ, bộ nhớ đệm Cache, lỗi lập trình phần mềm.</w:t>
+        <w:t>Thời gian xử lý CPU, điện năng tiêu thụ, bức xạ điện từ, bộ nhớ đệm Cache, lỗi lập trình.</w:t>
       </w:r>
     </w:p>
     <w:p>
@@ -1288,14 +1290,14 @@
           <w:color w:val="1E293B"/>
           <w:sz w:val="20"/>
         </w:rPr>
-        <w:t xml:space="preserve">– Bước 3 — Con đường khai thác của đối thủ thế giới thực: </w:t>
+        <w:t xml:space="preserve">– Bước 3 — Đối thủ thế giới thực khai thác: </w:t>
       </w:r>
       <w:r>
         <w:rPr>
           <w:color w:val="334155"/>
           <w:sz w:val="20"/>
         </w:rPr>
-        <w:t>Tấn công kênh kề thời gian (Paul Kocher 1996), phân tích lưu lượng và độ dài siêu dữ liệu, khai thác lỗi cài đặt phần mềm và quản trị (Ross Anderson 2001).</w:t>
+        <w:t>Tấn công kênh kề thời gian (Kocher 1996), phân tích lưu lượng và kích thước gói tin, lỗi quản lý khóa (Anderson 2001).</w:t>
       </w:r>
     </w:p>
     <w:p>
@@ -1309,14 +1311,14 @@
           <w:color w:val="1E293B"/>
           <w:sz w:val="20"/>
         </w:rPr>
-        <w:t xml:space="preserve">– Bước 4 — Kết luận nhận thức luận của Halpin: </w:t>
+        <w:t xml:space="preserve">– Bước 4 — Kết luận của Halpin: </w:t>
       </w:r>
       <w:r>
         <w:rPr>
           <w:color w:val="334155"/>
           <w:sz w:val="20"/>
         </w:rPr>
-        <w:t>Sự trừu tượng hóa quá mức làm cho mật mã học mù quáng trước chính những năng lực thực tế của đối thủ nằm ngoài mô hình lý thuyết.</w:t>
+        <w:t>Sự trừu tượng hóa quá mức làm mật mã học bỏ sót chính những năng lực thực tế của đối thủ ngoài đời thực.</w:t>
       </w:r>
     </w:p>
     <w:tbl>
@@ -1353,11 +1355,11 @@
                 <w:color w:val="334155"/>
                 <w:sz w:val="19"/>
               </w:rPr>
-              <w:t>Giải thích trực quan về Tấn công Kênh kề (Side-channel Attack):</w:t>
+              <w:t>Giải thích ngắn gọn:</w:t>
               <w:br/>
-              <w:t>• Tấn công kênh kề thời gian (Kocher 1996) hoạt động thế nào? Trong lập trình, khi so sánh hai chuỗi mật khẩu, máy tính thường dùng lệnh so sánh tuần tự từ trái qua phải: hễ thấy ký tự đầu tiên bị sai là nó dừng lại ngay lập tức (ngắt sớm - early return). Kẻ tấn công lợi dụng điều này bằng cách gửi thử các ký tự và dùng đồng hồ siêu chính xác đo thời gian máy tính trả lời: Nếu thấy máy xử lý lâu hơn một chút xíu (vài phần triệu giây), nghĩa là chữ cái đầu tiên đã đoán đúng! Bằng cách đó, kẻ trộm dò ra từng chữ cái của chìa khóa mà không cần phải bẻ khóa thuật toán.</w:t>
+              <w:t>• Kênh kề thời gian (Kocher 1996): Khi so sánh mật khẩu, máy tính thường ngắt sớm ngay khi gặp ký tự sai đầu tiên. Đối thủ gửi thử các chuỗi và đo thời gian phản hồi: Thời gian xử lý lâu hơn nghĩa là đã đoán đúng thêm một ký tự. Nhờ đó, đối thủ dò ra khóa mà không cần phá thuật toán.</w:t>
               <w:br/>
-              <w:t>• Rò rỉ qua độ dài siêu dữ liệu là gì? Dù tin nhắn được mã hóa kín 100%, nhưng nếu ta gửi một tệp nặng đúng 4.5 MB vào lúc 2 giờ sáng, kẻ theo dõi mạng đối chiếu dung lượng là biết ngay ta vừa gửi bài hát hay đoạn video cụ thể nào.</w:t>
+              <w:t>• Rò rỉ kích thước: Bản mã có mã hóa kín nhưng độ dài gói tin vẫn lộ trên mạng, giúp đối thủ đoán được loại dữ liệu đang truyền.</w:t>
             </w:r>
           </w:p>
         </w:tc>
@@ -1446,7 +1448,7 @@
           <w:color w:val="334155"/>
           <w:sz w:val="20"/>
         </w:rPr>
-        <w:t>NSA không cần giải các bài toán toán học khó của RSA/AES mà tấn công vào toàn bộ hệ sinh thái xung quanh (đánh cắp khóa, thâm nhập cáp quang biển).</w:t>
+        <w:t>NSA không cần phá toán học của RSA/AES mà tấn công vào hạ tầng xung quanh (đánh cắp khóa, thâm nhập cáp quang biển).</w:t>
       </w:r>
     </w:p>
     <w:p>
@@ -1467,7 +1469,7 @@
           <w:color w:val="334155"/>
           <w:sz w:val="20"/>
         </w:rPr>
-        <w:t>Khai thác Siêu dữ liệu để dựng mạng xã hội; Tấn công chuỗi cung ứng bằng cách cài cửa sau vào chuẩn NIST (Dual_EC_DRBG); Ép buộc pháp lý các tập đoàn công nghệ lớn.</w:t>
+        <w:t>Khai thác siêu dữ liệu để lập bản đồ liên lạc; cài cửa sau vào tiêu chuẩn NIST (Dual_EC_DRBG); gây áp lực pháp lý lên các tập đoàn công nghệ.</w:t>
       </w:r>
     </w:p>
     <w:p>
@@ -1481,14 +1483,14 @@
           <w:color w:val="1E293B"/>
           <w:sz w:val="20"/>
         </w:rPr>
-        <w:t xml:space="preserve">– 3. Tính tương đối của Kẻ thù: </w:t>
+        <w:t xml:space="preserve">– 3. Tính tương đối của đối thủ: </w:t>
       </w:r>
       <w:r>
         <w:rPr>
           <w:color w:val="334155"/>
           <w:sz w:val="20"/>
         </w:rPr>
-        <w:t>'Kẻ thù' mang tính vị thế quyền lực; Mật mã học buộc phải nghiên cứu phòng chống cửa sau (Cliptography) thay vì giả định kênh sạch.</w:t>
+        <w:t>'Đối thủ' mang tính vị thế; mật mã học buộc phải nghiên cứu cơ chế phòng chống cửa sau (Cliptography).</w:t>
       </w:r>
     </w:p>
     <w:tbl>
@@ -1525,11 +1527,11 @@
                 <w:color w:val="334155"/>
                 <w:sz w:val="19"/>
               </w:rPr>
-              <w:t>Giải thích vụ việc cài cửa sau Dual_EC_DRBG nổi tiếng của NSA:</w:t>
+              <w:t>Giải thích ngắn gọn:</w:t>
               <w:br/>
-              <w:t>• Chuyện gì đã xảy ra trong vụ Dual_EC_DRBG? Bộ sinh số ngẫu nhiên là trái tim của mật mã: Chìa khóa bí mật bắt buộc phải được tạo ra ngẫu nhiên thì người khác mới không đoán được. Thay vì đi phá từng chiếc chìa khóa, cơ quan an ninh NSA đã bí mật tác động vào Viện Tiêu chuẩn Mỹ (NIST) để biến một thuật toán tạo số ngẫu nhiên bị lỗi (Dual_EC_DRBG) thành tiêu chuẩn quốc tế. NSA nắm giữ một công thức toán học bí mật đằng sau thuật toán này, do đó bất kỳ công ty hay tổ chức nào dùng chuẩn này để tạo khóa thì NSA đều tính toán ra được chìa khóa đó trong chớp mắt.</w:t>
+              <w:t>• Cửa sau Dual_EC_DRBG: Bộ sinh số ngẫu nhiên là nền tảng tạo khóa. Thay vì phá khóa, NSA tác động đưa thuật toán có khiếm khuyết vào tiêu chuẩn NIST. Do nắm trước hằng số bí mật, NSA tính được khóa của mọi hệ thống dùng chuẩn này.</w:t>
               <w:br/>
-              <w:t>• 'Cliptography' là gì? Là ngành nghiên cứu cách tạo ra hệ thống bảo mật an toàn ngay cả khi chính con chip hoặc phần mềm mã hóa đã bị kẻ xấu cài cắm cửa sau từ trước.</w:t>
+              <w:t>• Cliptography: Ngành nghiên cứu thiết kế mật mã an toàn ngay cả khi thuật toán hoặc phần cứng bị cài sẵn cửa sau.</w:t>
             </w:r>
           </w:p>
         </w:tc>
@@ -1611,14 +1613,14 @@
           <w:color w:val="1E293B"/>
           <w:sz w:val="20"/>
         </w:rPr>
-        <w:t xml:space="preserve">– Câu hỏi 1 (RQ1) — Mạng xã hội động: </w:t>
+        <w:t xml:space="preserve">– RQ1 — Mạng xã hội động: </w:t>
       </w:r>
       <w:r>
         <w:rPr>
           <w:color w:val="334155"/>
           <w:sz w:val="20"/>
         </w:rPr>
-        <w:t>Nghiên cứu hành vi thực tế của con người khi giữ bí mật; kiểm tra xem chính sách an ninh có bền vững trước sự cố Byzantine nội bộ.</w:t>
+        <w:t>Nghiên cứu hành vi giữ bí mật thực tế của con người; đánh giá độ bền chính sách an ninh trước sự cố nội bộ Byzantine.</w:t>
       </w:r>
     </w:p>
     <w:p>
@@ -1632,14 +1634,14 @@
           <w:color w:val="1E293B"/>
           <w:sz w:val="20"/>
         </w:rPr>
-        <w:t xml:space="preserve">– Câu hỏi 2 (RQ2) — Mô hình hóa bằng thống kê: </w:t>
+        <w:t xml:space="preserve">– RQ2 — Mô hình hóa bằng thống kê: </w:t>
       </w:r>
       <w:r>
         <w:rPr>
           <w:color w:val="334155"/>
           <w:sz w:val="20"/>
         </w:rPr>
-        <w:t>Dùng thống kê thực nghiệm và mô phỏng Monte Carlo để lượng hóa năng lực thực tế của đối thủ và liên minh giám sát.</w:t>
+        <w:t>Dùng thống kê thực nghiệm và mô phỏng Monte Carlo để định lượng năng lực thực tế của đối thủ và liên minh giám sát.</w:t>
       </w:r>
     </w:p>
     <w:p>
@@ -1653,14 +1655,14 @@
           <w:color w:val="1E293B"/>
           <w:sz w:val="20"/>
         </w:rPr>
-        <w:t xml:space="preserve">– Câu hỏi 3 (RQ3) — Phương pháp liên ngành: </w:t>
+        <w:t xml:space="preserve">– RQ3 — Phương pháp liên ngành: </w:t>
       </w:r>
       <w:r>
         <w:rPr>
           <w:color w:val="334155"/>
           <w:sz w:val="20"/>
         </w:rPr>
-        <w:t>Ứng dụng lý thuyết hệ thống phức hợp và động lực học mạng (như mô hình lây lan dịch bệnh) vào nghiên cứu sự phát tán thông tin.</w:t>
+        <w:t>Ứng dụng lý thuyết hệ thống phức hợp và động lực học mạng (như mô hình lây lan) vào phân tích sự rò rỉ thông tin.</w:t>
       </w:r>
     </w:p>
     <w:p>
@@ -1674,14 +1676,14 @@
           <w:color w:val="1E293B"/>
           <w:sz w:val="20"/>
         </w:rPr>
-        <w:t xml:space="preserve">– Câu hỏi 4 (RQ4) — Triết học chất vấn ngầm định: </w:t>
+        <w:t xml:space="preserve">– RQ4 — Triết học chất vấn ngầm định: </w:t>
       </w:r>
       <w:r>
         <w:rPr>
           <w:color w:val="334155"/>
           <w:sz w:val="20"/>
         </w:rPr>
-        <w:t>Vận dụng triết học để xem xét lại các giả định nền tảng 70 năm qua từ thời Shannon, thích ứng với kỷ nguyên số và AI.</w:t>
+        <w:t>Xem xét lại các giả định nền tảng từ thời Shannon, điều chỉnh cho phù hợp với môi trường mạng hiện đại.</w:t>
       </w:r>
     </w:p>
     <w:tbl>
@@ -1718,9 +1720,9 @@
                 <w:color w:val="334155"/>
                 <w:sz w:val="19"/>
               </w:rPr>
-              <w:t>Ý nghĩa tóm gọn của 4 câu hỏi nghiên cứu:</w:t>
+              <w:t>Giải thích ngắn gọn:</w:t>
               <w:br/>
-              <w:t>Halpin muốn nhắn nhủ thông điệp: Các nhà khoa học không thể mãi ngồi trong phòng thí nghiệm giải toán một mình được nữa. Mật mã học tương lai phải: (1) Quan sát xem con người thực tế giữ bí mật như thế nào; (2) Thu thập số liệu thống kê để đo lường sức mạnh thực sự của các cơ quan tình báo và tin tặc; (3) Mượn mô hình lây lan dịch bệnh để nghiên cứu xem thông tin mật bị rò rỉ ra sao; và (4) Dùng triết học để xem lại xem các giả định từ 70 năm trước có còn phù hợp với thế giới Internet và AI ngày nay hay không.</w:t>
+              <w:t>Ý nghĩa 4 câu hỏi: Mật mã học tương lai cần liên ngành: (1) Quan sát hành vi thực tế của người dùng; (2) Dùng dữ liệu thống kê lượng hóa đối thủ; (3) Áp dụng mô hình lây lan mạng để theo dõi rò rỉ tin; (4) Dùng triết học xem xét lại các giả định cũ từ thời Shannon.</w:t>
             </w:r>
           </w:p>
         </w:tc>
@@ -1802,14 +1804,14 @@
           <w:color w:val="1E293B"/>
           <w:sz w:val="20"/>
         </w:rPr>
-        <w:t xml:space="preserve">– 1. Đánh giá tính khả thi tái lập: </w:t>
+        <w:t xml:space="preserve">– 1. Tính khả thi tái lập: </w:t>
       </w:r>
       <w:r>
         <w:rPr>
           <w:color w:val="334155"/>
           <w:sz w:val="20"/>
         </w:rPr>
-        <w:t>Bài báo của Halpin là công trình khảo luận triết học thuần túy, hoàn toàn KHÔNG có mã nguồn, không có tập dữ liệu và không có số liệu đo đạc benchmark ban đầu. Nhóm thực hiện thẩm định học thuật (Scholarly Audit) đối chiếu toàn bộ 17 trang bản in PDF và 134 tài liệu tham khảo.</w:t>
+        <w:t>Bài báo của Halpin là khảo luận triết học thuần túy, không có mã nguồn, không có tập dữ liệu hay benchmark. Nhóm thực hiện thẩm định học thuật (Scholarly Audit) đối chiếu 17 trang PDF và 134 tài liệu tham khảo.</w:t>
       </w:r>
     </w:p>
     <w:p>
@@ -1823,14 +1825,14 @@
           <w:color w:val="1E293B"/>
           <w:sz w:val="20"/>
         </w:rPr>
-        <w:t xml:space="preserve">– 2. Định hướng thực nghiệm độc lập của sinh viên: </w:t>
+        <w:t xml:space="preserve">– 2. Thực nghiệm độc lập của sinh viên: </w:t>
       </w:r>
       <w:r>
         <w:rPr>
           <w:color w:val="334155"/>
           <w:sz w:val="20"/>
         </w:rPr>
-        <w:t>Sinh viên tự xây dựng hệ thống kiểm tra toàn vẹn tệp để minh họa trực quan các khái niệm lý thuyết; thiết kế các kịch bản đối kháng kiểm chứng CRC32, Dolev-Yao, kênh kề thời gian. Quy trình kiểm toán lưu vết tại MIDTERM_CODE_AUDIT.md.</w:t>
+        <w:t>Sinh viên tự phát triển hệ thống kiểm tra toàn vẹn tệp để minh họa trực quan các khái niệm lý thuyết; kiểm thử CRC32, Dolev-Yao, kênh kề thời gian. Quy trình lưu vết tại MIDTERM_CODE_AUDIT.md.</w:t>
       </w:r>
     </w:p>
     <w:tbl>
@@ -1867,9 +1869,9 @@
                 <w:color w:val="334155"/>
                 <w:sz w:val="19"/>
               </w:rPr>
-              <w:t>Giải thích trả lời câu hỏi phản biện then chốt:</w:t>
+              <w:t>Giải thích ngắn gọn:</w:t>
               <w:br/>
-              <w:t>• Tại sao bài báo không có code mà đề tài lại viết ra phần mềm demo? Vì bài báo của TS. Harry Halpin là một bài nghiên cứu triết học lý thuyết (toàn chữ và lập luận, không có một dòng code hay bảng số liệu thực nghiệm nào). Nhóm sinh viên không thể 'chạy lại code của tác giả' vì tác giả không công bố code. Do đó, nhóm đã tự tay thiết kế và lập trình một hệ thống kiểm tra toàn vẹn tệp độc lập, sử dụng tập dữ liệu thực tế 2.485 tệp tin để làm bằng chứng thực nghiệm trực quan minh họa cho các luận điểm của bài báo.</w:t>
+              <w:t>Tại sao bài báo không có code mà đề tài có demo? Bài báo gốc là khảo cứu triết học, không công bố mã nguồn hay số liệu để chạy lại. Do đó, nhóm tự thiết kế hệ thống kiểm tra toàn vẹn tệp độc lập trên tập dữ liệu 2.485 tệp để minh họa thực tế cho các luận điểm của tác giả.</w:t>
             </w:r>
           </w:p>
         </w:tc>
@@ -1951,14 +1953,14 @@
           <w:color w:val="1E293B"/>
           <w:sz w:val="20"/>
         </w:rPr>
-        <w:t xml:space="preserve">– Ví dụ 1 — Nhiễu ngẫu nhiên vs Đối thủ có chủ đích: </w:t>
+        <w:t xml:space="preserve">– Ví dụ 1 — Nhiễu ngẫu nhiên vs Đối thủ chủ đích: </w:t>
       </w:r>
       <w:r>
         <w:rPr>
           <w:color w:val="334155"/>
           <w:sz w:val="20"/>
         </w:rPr>
-        <w:t>Halpin chỉ rõ mã kiểm tra lỗi chỉ chống được nhiễu ngẫu nhiên. DT005 thử nghiệm kịch bản giải hệ phương trình tuyến tính trên GF(2) bù 4 byte qua mặt CRC32; SHA-256 phát hiện tức thì nhờ tính phi tuyến. Giới hạn: Không khẳng định CRC32 bất lực trong kiểm tra lỗi ngẫu nhiên vật lý.</w:t>
+        <w:t>Halpin chỉ rõ mã kiểm tra lỗi chỉ chống được nhiễu ngẫu nhiên. DT005 thử nghiệm giải hệ phương trình trên GF(2) bù 4 byte qua mặt CRC32; SHA-256 phát hiện ngay nhờ tính phi tuyến. Giới hạn: Không khẳng định CRC32 bất lực trong kiểm tra lỗi phần cứng ngẫu nhiên.</w:t>
       </w:r>
     </w:p>
     <w:p>
@@ -1979,7 +1981,7 @@
           <w:color w:val="334155"/>
           <w:sz w:val="20"/>
         </w:rPr>
-        <w:t>Halpin nhấn mạnh điểm mù cấu trúc dữ liệu nhưng không đề cập cây Merkle. DT005 chủ động cài đặt phân tách miền theo chuẩn IETF RFC 6962 (tiền tố byte 0x00 cho lá, 0x01 cho nhánh) để phòng ngừa va chạm cấu trúc. Giới hạn: Đây là đóng góp độc lập của sinh viên, không phải đề xuất của Halpin.</w:t>
+        <w:t>Halpin nhấn mạnh điểm mù cấu trúc dữ liệu nhưng không đề cập cây Merkle. DT005 cài đặt phân tách miền IETF RFC 6962 (tiền tố 0x00 cho lá, 0x01 cho nhánh) phòng ngừa va chạm cấu trúc. Giới hạn: Đóng góp độc lập của sinh viên, không phải của Halpin.</w:t>
       </w:r>
     </w:p>
     <w:p>
@@ -1993,14 +1995,14 @@
           <w:color w:val="1E293B"/>
           <w:sz w:val="20"/>
         </w:rPr>
-        <w:t xml:space="preserve">– Ví dụ 3 — Rò rỉ kênh kề thời gian: </w:t>
+        <w:t xml:space="preserve">– Ví dụ 3 — Kênh kề thời gian: </w:t>
       </w:r>
       <w:r>
         <w:rPr>
           <w:color w:val="334155"/>
           <w:sz w:val="20"/>
         </w:rPr>
-        <w:t>Halpin dẫn chứng thời gian thực thi làm rò rỉ bí mật (Kocher 1996). DT005 đo đạc so sánh chuỗi ngắt sớm so với hàm thời gian hằng số hmac.compare_digest. Giới hạn: Đo trên Python có jitter hệ điều hành, chỉ minh họa mức phần mềm.</w:t>
+        <w:t>Halpin dẫn chứng thời gian thực thi làm lộ bí mật (Kocher 1996). DT005 đo đạc so sánh chuỗi ngắt sớm so với hàm thời gian hằng số hmac.compare_digest. Giới hạn: Đo trên Python có jitter hệ điều hành, chỉ minh họa mức ứng dụng.</w:t>
       </w:r>
     </w:p>
     <w:tbl>
@@ -2037,11 +2039,11 @@
                 <w:color w:val="334155"/>
                 <w:sz w:val="19"/>
               </w:rPr>
-              <w:t>Giải thích sâu 2 kỹ thuật then chốt trên Slide 11:</w:t>
+              <w:t>Giải thích ngắn gọn:</w:t>
               <w:br/>
-              <w:t>• Tại sao mã CRC32 bị bẻ gãy dễ dàng bằng phép toán GF(2), còn SHA-256 thì không? CRC32 (mã kiểm tra lỗi dạng vòng) vốn chỉ được tạo ra để phát hiện lỗi ngẫu nhiên trên dây cáp hay đĩa xước. Công thức của CRC32 là phép chia đa thức tuyến tính rất đơn giản. Kẻ tấn công chỉ cần dùng toán đại số lớp 10 (giải hệ phương trình bậc nhất trên trường nhị phân GF(2)) là tính ra được đúng 4 byte vá víu dán vào đuôi tệp tin, khiến nội dung tệp bị sửa đổi hoàn toàn nhưng mã CRC32 tính ra vẫn trùng khít 100% với tệp gốc! Trong khi đó, SHA-256 là hàm băm mật mã học phi tuyến, có hiệu ứng tuyết lở (~50%): Chỉ cần sửa 1 bit dữ liệu là hơn nửa số bit của mã băm bị đảo lộn ngẫu nhiên, kẻ xấu không thể nào giải phương trình để làm giả được.</w:t>
+              <w:t>• CRC32 vs SHA-256: CRC32 là mã tuyến tính, thiết kế để bắt lỗi ngẫu nhiên trong truyền dẫn. Đối thủ giải hệ phương trình tuyến tính trên GF(2) để tìm 4 byte bù, sửa nội dung tệp mà CRC32 vẫn khớp. SHA-256 là hàm băm phi tuyến có hiệu ứng tuyết lở (đổi 1 bit đầu vào thì ~50% bit đầu ra thay đổi), không thể làm giả bằng đại số tuyến tính.</w:t>
               <w:br/>
-              <w:t>• Lỗ hổng nhập nhằng nút lá (Node-leaf ambiguity) và chuẩn RFC 6962 là gì? Trong cây Merkle thông thường, các nút lá và nút nhánh đều được băm bằng công thức giống nhau. Kẻ xấu có thể lấy mã băm của một nút nhánh bên trên rồi giả mạo nó thành nội dung của một tệp tin lá ở dưới, làm hệ thống kiểm tra bị nhầm lẫn cấu trúc. Để khắc phục, nhóm sinh viên áp dụng chuẩn quốc tế IETF RFC 6962: Tệp tin lá thì bắt buộc thêm byte 0x00 vào đầu trước khi băm, còn nút nhánh thì thêm byte 0x01. Giống như dán nhãn phân loại hàng hóa, hệ thống sẽ không bao giờ bị lẫn lộn giữa lá và cành nữa.</w:t>
+              <w:t>• Phân tách miền RFC 6962: Tránh lỗi nhập nhằng nút lá (nhầm lẫn giữa nút lá và cặp băm của nút nhánh). Nhóm thêm tiền tố 0x00 cho lá và 0x01 cho nhánh để phân định rạch ròi cấu trúc cây.</w:t>
             </w:r>
           </w:p>
         </w:tc>
@@ -2130,7 +2132,7 @@
           <w:color w:val="334155"/>
           <w:sz w:val="20"/>
         </w:rPr>
-        <w:t>DEMO (Được thiết kế tối giản, chữ to rõ ràng trên nền sáng thanh lịch để tạo nhịp nghỉ trang trọng chuyển tiếp phần thuyết trình sang phần thực nghiệm).</w:t>
+        <w:t>DEMO (Slide chuyển tiếp tối giản nền sáng, tạo nhịp nghỉ trước phần thực hành).</w:t>
       </w:r>
     </w:p>
     <w:tbl>
@@ -2167,9 +2169,9 @@
                 <w:color w:val="334155"/>
                 <w:sz w:val="19"/>
               </w:rPr>
-              <w:t>Lời thoại chuyển tiếp vào phần Demo:</w:t>
+              <w:t>Lời thoại ngắn gọn:</w:t>
               <w:br/>
-              <w:t>Sau khi đã làm rõ các cơ sở triết học và phân định phương pháp luận trên lý thuyết, nhóm xin phép chuyển sang phần Diễn tập An ninh Thực nghiệm trực tiếp (Live Demo) thông qua mô hình đối kháng hai màn hình Red Team và Blue Team, tập trung kiểm chứng thực tế các luận điểm mấu chốt của bài báo.</w:t>
+              <w:t>Chuyển tiếp sang phần Demo thực tế 2 màn hình Red Team vs Blue Team để kiểm chứng các luận điểm đối kháng vừa trình bày.</w:t>
             </w:r>
           </w:p>
         </w:tc>
@@ -2258,7 +2260,7 @@
           <w:color w:val="334155"/>
           <w:sz w:val="20"/>
         </w:rPr>
-        <w:t>Tương tác thời gian thực giữa Hệ thống giám sát phòng thủ Blue Team (Port 8080) và Động cơ tấn công đối kháng Red Team (Port 8081).</w:t>
+        <w:t>Tương tác thời gian thực giữa Hệ thống giám sát Blue Team (Port 8080) và Động cơ tấn công Red Team (Port 8081).</w:t>
       </w:r>
     </w:p>
     <w:p>
@@ -2279,7 +2281,7 @@
           <w:color w:val="334155"/>
           <w:sz w:val="20"/>
         </w:rPr>
-        <w:t>kaggle_dataset gồm 2.485 tệp tin, dung lượng ~112,81 MiB (phiên bản nạp kiểm thử cục bộ hiện tại gồm 2.483 tệp) đóng vai trò môi trường kiểm thử thực tế nhiều tầng thư mục.</w:t>
+        <w:t>kaggle_dataset gồm 2.485 tệp tin (~112,81 MiB theo benchmark, nạp cục bộ 2.483 tệp) đóng vai trò môi trường kiểm thử.</w:t>
       </w:r>
     </w:p>
     <w:p>
@@ -2300,7 +2302,7 @@
           <w:color w:val="334155"/>
           <w:sz w:val="20"/>
         </w:rPr>
-        <w:t>Nạp dữ liệu, thiết lập mốc tin cậy sạch ban đầu H_0; quét kiểm tra toàn vẹn định vị chính xác vị trí tệp tin bị biến đổi với tốc độ quét thực tế vượt 2.000 tệp/giây.</w:t>
+        <w:t>Thiết lập mốc tin cậy sạch H_0; quét kiểm tra toàn vẹn định vị chính xác tệp tin bị biến đổi với tốc độ quét trên 2.000 tệp/giây.</w:t>
       </w:r>
     </w:p>
     <w:p>
@@ -2321,7 +2323,7 @@
           <w:color w:val="334155"/>
           <w:sz w:val="20"/>
         </w:rPr>
-        <w:t>Mô phỏng các vector tấn công có chủ đích: Sửa byte tệp ngẫu nhiên (In-place Tamper) và giải hệ phương trình tuyến tính trên GF(2) bù 4 byte qua mặt mã kiểm tra CRC32.</w:t>
+        <w:t>Mô phỏng tấn công có chủ đích: Sửa byte tệp (In-place Tamper) và giải hệ phương trình GF(2) bù 4 byte qua mặt CRC32.</w:t>
       </w:r>
     </w:p>
     <w:p>
@@ -2342,7 +2344,7 @@
           <w:color w:val="334155"/>
           <w:sz w:val="20"/>
         </w:rPr>
-        <w:t>Thư mục sao lưu an toàn .adversary_backups/ cho phép phục hồi nguyên vẹn 100% dữ liệu chỉ với 1 click chuột Rollback.</w:t>
+        <w:t>Thư mục sao lưu an toàn .adversary_backups/ phục hồi nguyên trạng 100% dữ liệu với nút Rollback All.</w:t>
       </w:r>
     </w:p>
     <w:tbl>
@@ -2379,15 +2381,13 @@
                 <w:color w:val="334155"/>
                 <w:sz w:val="19"/>
               </w:rPr>
-              <w:t>Giải thích cơ chế vận hành của buổi Demo trực tiếp:</w:t>
+              <w:t>Giải thích vận hành Demo:</w:t>
               <w:br/>
-              <w:t>Mô hình được thiết kế như một cuộc đấu an ninh trực tiếp giữa hai màn hình:</w:t>
+              <w:t>- Cửa sổ phải (Red Team): Sửa tệp Resume/Resume.csv hoặc tính 4 byte bù GF(2) qua mặt CRC32.</w:t>
               <w:br/>
-              <w:t>• Màn hình bên phải là Red Team (Kẻ tấn công có chủ đích): Đóng vai tin tặc, bấm nút sửa tệp Resume/Resume.csv hoặc tính toán 4 byte bù để qua mặt CRC32.</w:t>
+              <w:t>- Cửa sổ trái (Blue Team): Bấm kiểm tra toàn vẹn, hệ thống phát hiện tệp bị sửa tức thì và báo động.</w:t>
               <w:br/>
-              <w:t>• Màn hình bên trái là Blue Team (Hệ thống giám sát phòng thủ): Nạp tập dữ liệu thực tế 2.485 tệp tin. Khi bấm kiểm tra, thuật toán duyệt cây phân cấp sẽ rà soát và định vị chính xác vị trí tệp tin bị sửa đổi chỉ trong tích tắc (tốc độ quét trên 2.000 tệp/giây), phát còi báo động đỏ.</w:t>
-              <w:br/>
-              <w:t>• Sau khi diễn tập xong, nút Rollback All sẽ tự động phục hồi toàn bộ dữ liệu gốc từ thư mục sao lưu an toàn .adversary_backups/.</w:t>
+              <w:t>- Nút Rollback All: Phục hồi lại dữ liệu gốc từ thư mục sao lưu.</w:t>
             </w:r>
           </w:p>
         </w:tc>
@@ -2469,14 +2469,14 @@
           <w:color w:val="1E293B"/>
           <w:sz w:val="20"/>
         </w:rPr>
-        <w:t xml:space="preserve">– 1. Thông điệp học thuật cốt lõi (Harry Halpin 2025): </w:t>
+        <w:t xml:space="preserve">– 1. Đóng góp bài báo (Halpin 2025): </w:t>
       </w:r>
       <w:r>
         <w:rPr>
           <w:color w:val="334155"/>
           <w:sz w:val="20"/>
         </w:rPr>
-        <w:t>Vượt qua sự trừu tượng hóa: Các hệ thống an toàn thế giới thực phải nhận thức khoảng cách giữa mô hình lý tưởng và thực tế vật lý (kênh kề, siêu dữ liệu, chuỗi cung ứng). Bản chất đối thủ là tác nhân có chủ đích. Halpin đặt nền móng cho khoa học an ninh liên ngành.</w:t>
+        <w:t>Vượt qua sự trừu tượng hóa toán học để nhìn nhận đúng đối thủ thực tế; xác định đối thủ là tác nhân có chủ đích; mở ra chương trình nghiên cứu an ninh liên ngành.</w:t>
       </w:r>
     </w:p>
     <w:p>
@@ -2490,14 +2490,14 @@
           <w:color w:val="1E293B"/>
           <w:sz w:val="20"/>
         </w:rPr>
-        <w:t xml:space="preserve">– 2. Hoàn thành giữa kỳ &amp; Lộ trình cuối kỳ (DT005): </w:t>
+        <w:t xml:space="preserve">– 2. Kết quả giữa kỳ &amp; Lộ trình (DT005): </w:t>
       </w:r>
       <w:r>
         <w:rPr>
           <w:color w:val="334155"/>
           <w:sz w:val="20"/>
         </w:rPr>
-        <w:t>Nghiệm thu giữa kỳ: Hoàn thành thẩm định học thuật sâu sắc toàn văn bài báo gốc (17 trang PDF), phân tích đầy đủ 7 mục nội dung. Minh bạch phương pháp luận giữa lý thuyết và phần mềm thực nghiệm. Định hướng cuối kỳ: Tiếp tục nghiên cứu hoàn thiện cấu trúc cây phân cấp tối ưu cho kiểm tra toàn vẹn dữ liệu lớn.</w:t>
+        <w:t>Hoàn thành thẩm định bài báo gốc 17 trang; minh bạch ranh giới giữa lý thuyết và phần mềm minh họa độc lập; định hướng cuối kỳ tiếp tục nghiên cứu cấu trúc cây xác thực phân cấp.</w:t>
       </w:r>
     </w:p>
     <w:tbl>
@@ -2534,9 +2534,9 @@
                 <w:color w:val="334155"/>
                 <w:sz w:val="19"/>
               </w:rPr>
-              <w:t>Tóm tắt kết luận ngắn gọn:</w:t>
+              <w:t>Tổng kết ngắn gọn:</w:t>
               <w:br/>
-              <w:t>Giữa kỳ nhóm đã hoàn thành tốt 2 nhiệm vụ: (1) Thẩm định bài báo một cách có hệ thống, hiểu rõ bản chất triết học của đối thủ; và (2) Dựng xong bộ công cụ demo trực quan minh chứng cho lý thuyết. Định hướng cuối kỳ sẽ tiếp tục nghiên cứu sâu hơn về thuật toán tối ưu hóa cấu trúc cây Merkle để xử lý các tập dữ liệu khổng lồ.</w:t>
+              <w:t>Đề tài hoàn thành thẩm định lý thuyết bài báo và xây dựng xong bộ demo đối kháng minh họa. Cuối kỳ sẽ tập trung tối ưu hóa cấu trúc cây cho dữ liệu lớn.</w:t>
             </w:r>
           </w:p>
         </w:tc>
@@ -2625,7 +2625,7 @@
           <w:color w:val="334155"/>
           <w:sz w:val="20"/>
         </w:rPr>
-        <w:t>Q &amp; A — Xin đón nhận các câu hỏi và ý kiến đóng góp của Thầy và Hội đồng.</w:t>
+        <w:t>Q &amp; A — Xin đón nhận câu hỏi và góp ý từ Thầy và Hội đồng.</w:t>
       </w:r>
     </w:p>
     <w:p>
@@ -2683,9 +2683,9 @@
                 <w:color w:val="334155"/>
                 <w:sz w:val="19"/>
               </w:rPr>
-              <w:t>Lời kết thúc báo cáo:</w:t>
+              <w:t>Lời kết thúc:</w:t>
               <w:br/>
-              <w:t>Phần trình bày báo cáo giữa kỳ của đề tài DT005 đến đây là kết thúc. Xin chân thành cảm ơn sự chú ý lắng nghe của Thầy cùng các bạn. Nhóm xin sẵn sàng lắng nghe các ý kiến nhận xét và giải đáp các câu hỏi trong phiên thảo luận.</w:t>
+              <w:t>Cảm ơn Thầy và các bạn đã theo dõi. Nhóm xin lắng nghe ý kiến đóng góp và trả lời các câu hỏi phản biện.</w:t>
             </w:r>
           </w:p>
         </w:tc>
@@ -2726,7 +2726,7 @@
     </w:p>
     <w:p>
       <w:r>
-        <w:t>Mục tiêu diễn tập giữa kỳ: Chỉ tập trung trình diễn các kịch bản đối kháng cốt lõi phản ánh trực tiếp luận điểm bài báo Harry Halpin (2025). Các chức năng nghiên cứu mở rộng phục vụ đồ án cuối kỳ (như đánh tráo Merkle Proof phân tán, đo đạc độ sâu động, nén CompactProof) được lược bỏ để đảm bảo thời lượng và làm nổi bật trọng tâm khoa học.</w:t>
+        <w:t>Mục tiêu diễn tập giữa kỳ: Tập trung vào 2 kịch bản đối kháng cốt lõi phản ánh bài báo của Harry Halpin (2025). Các tính năng nghiên cứu mở rộng phục vụ đồ án cuối kỳ được lược bỏ để đảm bảo thời lượng và làm nổi bật trọng tâm khoa học.</w:t>
       </w:r>
     </w:p>
     <w:p>
@@ -2766,13 +2766,13 @@
           <w:color w:val="334155"/>
           <w:sz w:val="20"/>
         </w:rPr>
-        <w:t>Mở terminal và kích hoạt song song 2 dịch vụ:</w:t>
+        <w:t>Mở terminal và chạy 2 dịch vụ:</w:t>
         <w:br/>
         <w:t>• Blue Team Service:  python -m src.demo.web_demo --port 8080</w:t>
         <w:br/>
         <w:t>• Red Team Service:   python -m src.demo.red_team_web --port 8081</w:t>
         <w:br/>
-        <w:t>Mở 2 cửa sổ trình duyệt chia đôi màn hình (Split Screen): Cửa sổ bên trái truy cập http://localhost:8080 (Blue Team); cửa sổ bên phải truy cập http://localhost:8081 (Red Team).</w:t>
+        <w:t>Mở 2 cửa sổ trình duyệt chia đôi màn hình: Cửa sổ trái vào http://localhost:8080 (Blue Team); cửa sổ phải vào http://localhost:8081 (Red Team).</w:t>
       </w:r>
     </w:p>
     <w:p>
@@ -2786,7 +2786,7 @@
           <w:color w:val="1E40AF"/>
           <w:sz w:val="21"/>
         </w:rPr>
-        <w:t xml:space="preserve">Bước 2: Thiết lập mốc tin cậy sạch ban đầu tại Blue Team (Port 8080): </w:t>
+        <w:t xml:space="preserve">Bước 2: Thiết lập mốc tin cậy sạch tại Blue Team (Port 8080): </w:t>
       </w:r>
     </w:p>
     <w:p>
@@ -2799,11 +2799,11 @@
           <w:color w:val="334155"/>
           <w:sz w:val="20"/>
         </w:rPr>
-        <w:t>Tại cổng 8080, chọn thư mục dữ liệu thực tế 'kaggle_dataset' (~112.8 MB).</w:t>
+        <w:t>Tại cổng 8080, chọn thư mục 'kaggle_dataset' (~112.8 MB).</w:t>
         <w:br/>
-        <w:t>Bấm nút 'Nạp &amp; Tính toán Toàn vẹn'. Hệ thống tính toán và hiển thị Root Hash ban đầu H_0 với trạng thái màu xanh an toàn: '100% NGUYÊN VẸN'.</w:t>
+        <w:t>Bấm 'Nạp &amp; Tính toán Toàn vẹn'. Hệ thống sinh Root Hash ban đầu H_0 sạch với trạng thái xanh: '100% NGUYÊN VẸN'.</w:t>
         <w:br/>
-        <w:t>Ý nghĩa học thuật: Minh họa khái niệm 'đăng ký đối tượng' (registration of objects) theo Cantwell Smith và thiết lập trạng thái tin cậy khách quan theo Dretske.</w:t>
+        <w:t>Ý nghĩa: Minh họa việc thiết lập trạng thái tin cậy khách quan theo Dretske.</w:t>
       </w:r>
     </w:p>
     <w:p>
@@ -2817,7 +2817,7 @@
           <w:color w:val="1E40AF"/>
           <w:sz w:val="21"/>
         </w:rPr>
-        <w:t xml:space="preserve">Bước 3: Phát động Kịch bản 1 — Can thiệp tệp tin có chủ đích tại Red Team (Port 8081): </w:t>
+        <w:t xml:space="preserve">Bước 3: Phát động Kịch bản 1 — Can thiệp tệp tin tại Red Team (Port 8081): </w:t>
       </w:r>
     </w:p>
     <w:p>
@@ -2830,15 +2830,15 @@
           <w:color w:val="334155"/>
           <w:sz w:val="20"/>
         </w:rPr>
-        <w:t>Tại cổng 8081, bấm nút 'Can thiệp tệp tin ngẫu nhiên' (In-place Tampering). Red Team sửa đổi trực tiếp dữ liệu tệp tin trên ổ đĩa (ví dụ: Resume/Resume.csv).</w:t>
+        <w:t>Tại cổng 8081, bấm 'Can thiệp tệp tin ngẫu nhiên' (In-place Tampering) để sửa đổi tệp Resume/Resume.csv trên đĩa.</w:t>
         <w:br/>
-        <w:t>Quay lại Blue Team (Port 8080), bấm nút 'Kiểm tra toàn vẹn':</w:t>
+        <w:t>Quay lại Blue Team (Port 8080), bấm 'Kiểm tra toàn vẹn':</w:t>
         <w:br/>
-        <w:t>• Hệ thống ngay lập tức đổi sang trạng thái cảnh báo đỏ: 'CẢNH BÁO: PHÁT HIỆN CAN THIỆP DỮ LIỆU!'.</w:t>
+        <w:t>• Hệ thống đổi sang cảnh báo đỏ: 'CẢNH BÁO: PHÁT HIỆN CAN THIỆP DỮ LIỆU!'.</w:t>
         <w:br/>
-        <w:t>• Bảng truy vết chỉ ra chính xác tệp tin Resume/Resume.csv bị tác động.</w:t>
+        <w:t>• Bảng truy vết chỉ rõ tệp Resume/Resume.csv bị thay đổi.</w:t>
         <w:br/>
-        <w:t>Ý nghĩa học thuật: Minh chứng luận điểm Halpin — Kẻ đối đầu mật mã học là tác nhân có chủ đích (intentional agent), hàm băm mật mã học lập tức bắt quả tang mọi sai lệch dù chỉ 1 bit.</w:t>
+        <w:t>Ý nghĩa: Chứng minh hàm băm phát hiện ngay lập tức hành vi sửa đổi của đối thủ.</w:t>
       </w:r>
     </w:p>
     <w:p>
@@ -2852,7 +2852,7 @@
           <w:color w:val="1E40AF"/>
           <w:sz w:val="21"/>
         </w:rPr>
-        <w:t xml:space="preserve">Bước 4: Phát động Kịch bản 2 — Tấn công bù 4 byte GF(2) qua mặt CRC32 tại Red Team (Port 8081): </w:t>
+        <w:t xml:space="preserve">Bước 4: Phát động Kịch bản 2 — Bù 4 byte GF(2) qua mặt CRC32 tại Red Team (Port 8081): </w:t>
       </w:r>
     </w:p>
     <w:p>
@@ -2865,15 +2865,15 @@
           <w:color w:val="334155"/>
           <w:sz w:val="20"/>
         </w:rPr>
-        <w:t>Tại cổng 8081, bấm nút 'Tấn công bù 4 byte GF(2)' (CRC32 Forge Attack). Động cơ Red Team giải hệ phương trình tuyến tính, làm sai lệch nội dung tệp nhưng bù 4 byte patch khiến cho mã CRC32 không đổi.</w:t>
+        <w:t>Tại cổng 8081, bấm 'Tấn công bù 4 byte GF(2)' (CRC32 Forge Attack). Động cơ Red Team giải hệ phương trình tuyến tính, làm sai lệch nội dung tệp nhưng bù 4 byte patch khiến mã CRC32 không đổi.</w:t>
         <w:br/>
-        <w:t>Quay lại Blue Team (Port 8080), bấm nút 'Kiểm tra toàn vẹn':</w:t>
+        <w:t>Quay lại Blue Team (Port 8080), bấm 'Kiểm tra toàn vẹn':</w:t>
         <w:br/>
-        <w:t>• Bảng đối chứng hiển thị rõ: Thuật toán kiểm tra lỗi CRC32 bị qua mặt hoàn toàn (báo khớp sai sự thật do tính chất tuyến tính của đa thức chia).</w:t>
+        <w:t>• Bảng đối chứng hiển thị: Thuật toán CRC32 bị qua mặt (báo khớp sai do tính chất tuyến tính).</w:t>
         <w:br/>
-        <w:t>• Ngược lại, hàm băm SHA-256 phát hiện vi phạm ngay lập tức nhờ tính phi tuyến và hiệu ứng tuyết lở (~50%).</w:t>
+        <w:t>• Ngược lại, hàm băm SHA-256 phát hiện gian lận ngay lập tức nhờ tính phi tuyến.</w:t>
         <w:br/>
-        <w:t>Ý nghĩa học thuật: Trực quan hóa luận điểm mấu chốt của bài báo Halpin — phân biệt rạch ròi giữa mã phát hiện lỗi ngẫu nhiên của Shannon và mật mã học trước kẻ thù có chủ đích.</w:t>
+        <w:t>Ý nghĩa: Phân biệt rõ mã phát hiện lỗi ngẫu nhiên và mật mã học trước đối thủ có chủ đích.</w:t>
       </w:r>
     </w:p>
     <w:p>
@@ -2887,7 +2887,7 @@
           <w:color w:val="1E40AF"/>
           <w:sz w:val="21"/>
         </w:rPr>
-        <w:t xml:space="preserve">Bước 5: Hoàn nguyên dữ liệu sạch 100% (Rollback All): </w:t>
+        <w:t xml:space="preserve">Bước 5: Hoàn nguyên dữ liệu sạch (Rollback All): </w:t>
       </w:r>
     </w:p>
     <w:p>
@@ -2900,7 +2900,7 @@
           <w:color w:val="334155"/>
           <w:sz w:val="20"/>
         </w:rPr>
-        <w:t>Tại giao diện Red Team (Port 8081), bấm nút 'ROLLBACK ALL'. Toàn bộ các tệp tin bị sửa đổi được khôi phục nguyên vẹn từ thư mục sao lưu an toàn .adversary_backups/.</w:t>
+        <w:t>Tại giao diện Red Team (Port 8081), bấm 'ROLLBACK ALL' để khôi phục toàn bộ tệp từ thư mục sao lưu .adversary_backups/.</w:t>
         <w:br/>
         <w:t>Tại Blue Team bấm kiểm tra lại: Hệ thống trở về trạng thái an toàn màu xanh.</w:t>
       </w:r>
@@ -2931,16 +2931,16 @@
         <w:br/>
         <w:t xml:space="preserve">   Lệnh: python -m src.proposed_model.security_games</w:t>
         <w:br/>
-        <w:t xml:space="preserve">   Kết quả: Đo đạc thực tế tính phi tuyến của SHA-256, hiệu ứng tuyết lở SAC ~50%, kịch bản bẻ gãy mã tuyến tính CRC32 trên GF(2), và kênh kề thời gian so sánh chuỗi.</w:t>
+        <w:t xml:space="preserve">   Kết quả: Đo đạc tính phi tuyến của SHA-256, hiệu ứng tuyết lở SAC ~50%, kịch bản bẻ gãy mã tuyến tính CRC32 trên GF(2), và kênh kề thời gian so sánh chuỗi.</w:t>
         <w:br/>
         <w:br/>
         <w:t>2. Diễn tập 2 Terminal Red Team vs Blue Team:</w:t>
         <w:br/>
-        <w:t xml:space="preserve">   • Terminal 1 (Red Team): Chạy 'python src/adversary/red_team_cli.py'. Bấm phím '1' để can thiệp tệp, hoặc phím '4' để bù mã CRC32.</w:t>
+        <w:t xml:space="preserve">   • Terminal 1 (Red Team): Chạy 'python src/adversary/red_team_cli.py'. Chọn phím '1' can thiệp tệp, hoặc phím '4' bù mã CRC32.</w:t>
         <w:br/>
-        <w:t xml:space="preserve">   • Terminal 2 (Blue Team): Chạy 'python -m src.baselines.sha256_manifest --dir kaggle_dataset --verify'. Blue Team phát hiện vi phạm ngay lập tức: MODIFIED_FILE: Resume/Resume.csv.</w:t>
+        <w:t xml:space="preserve">   • Terminal 2 (Blue Team): Chạy 'python -m src.baselines.sha256_manifest --dir kaggle_dataset --verify'. Blue Team phát hiện vi phạm: MODIFIED_FILE: Resume/Resume.csv.</w:t>
         <w:br/>
-        <w:t xml:space="preserve">   • Terminal 1: Bấm phím '9' để Rollback All khôi phục đĩa cứng an toàn.</w:t>
+        <w:t xml:space="preserve">   • Terminal 1: Chọn phím '9' để Rollback All khôi phục đĩa cứng an toàn.</w:t>
       </w:r>
     </w:p>
     <w:p>
@@ -2972,7 +2972,7 @@
           <w:color w:val="0F172A"/>
           <w:sz w:val="22"/>
         </w:rPr>
-        <w:t>Câu hỏi 1: Bài báo của Halpin là một bài khảo luận triết học, tại sao đề tài lại chọn bài toán Kiểm tra toàn vẹn tệp tin?</w:t>
+        <w:t>Câu hỏi 1: Bài báo của Halpin là khảo luận triết học, tại sao đề tài lại chọn bài toán Kiểm tra toàn vẹn tệp tin?</w:t>
       </w:r>
     </w:p>
     <w:p>
@@ -2985,13 +2985,13 @@
           <w:color w:val="334155"/>
           <w:sz w:val="20"/>
         </w:rPr>
-        <w:t>Luận điểm phản biện &amp; Căn cứ khoa học:</w:t>
+        <w:t>Luận điểm phản biện:</w:t>
         <w:br/>
-        <w:t>1. Thuộc tính an ninh cốt lõi: Trong cấu trúc tam giác an ninh thông tin (Confidentiality, Integrity, Availability), Halpin phân tích sâu sắc rằng Tính toàn vẹn (Integrity) là điều kiện tiên quyết mang tính bản thể luận. Một thông điệp có thể không bí mật nhưng bắt buộc phải toàn vẹn thì tác nhân mới có thể hành động dựa trên thông tin đó.</w:t>
+        <w:t>1. Thuộc tính an ninh cốt lõi: Trong tam giác an ninh CIA (Bảo mật, Toàn vẹn, Khả dụng), Halpin phân tích rằng Tính toàn vẹn (Integrity) là điều kiện tiên quyết. Một thông điệp có thể không bí mật nhưng bắt buộc phải toàn vẹn thì người nhận mới có thể tin cậy sử dụng.</w:t>
         <w:br/>
-        <w:t>2. Lời kêu gọi về một 'Khoa học an ninh thực nghiệm': Halpin phê phán việc toán học hóa trừu tượng đã làm mật mã học xa rời thực tế vật lý. Tác giả kêu gọi xây dựng một nền an ninh thực nghiệm. Bài toán kiểm tra toàn vẹn tệp tin trên hệ thống đĩa cứng thực là bài toán kinh điển, cho phép đưa các khái niệm trừu tượng vào kiểm định vật lý.</w:t>
+        <w:t>2. Kiểm định thực nghiệm: Halpin phê phán việc toán học hóa trừu tượng đã làm mật mã học xa rời thực tế vật lý. Bài toán kiểm tra toàn vẹn tệp tin trên đĩa cứng là bài toán thực tế, cho phép đưa các khái niệm trừu tượng vào kiểm định vật lý rõ ràng.</w:t>
         <w:br/>
-        <w:t>3. Minh họa các đối thủ trong bài báo: Hệ thống toàn vẹn tệp tin cho phép mô hình hóa và kiểm chứng trực quan các dạng đối thủ được Halpin mổ xẻ: Từ kẻ nghe lén của Shannon, kẻ can thiệp mạng Dolev-Yao, kẻ khai thác kênh kề Kocher, đến các đòn tấn công can thiệp dữ liệu và chèn backdoor chuỗi cung ứng.</w:t>
+        <w:t>3. Mô hình hóa đối thủ: Hệ thống toàn vẹn tệp tin cho phép minh họa trực quan các dạng đối thủ được Halpin đề cập: Kẻ can thiệp Dolev-Yao, kẻ khai thác kênh kề Kocher và kẻ sửa đổi dữ liệu có chủ đích.</w:t>
       </w:r>
     </w:p>
     <w:p>
@@ -3004,7 +3004,7 @@
           <w:color w:val="0F172A"/>
           <w:sz w:val="22"/>
         </w:rPr>
-        <w:t>Câu hỏi 2: Bài báo có 134 tài liệu tham khảo, khi thẩm định và tái lập thì có bắt buộc phải làm theo toàn bộ 134 tài liệu đó không?</w:t>
+        <w:t>Câu hỏi 2: Bài báo có 134 tài liệu tham khảo, khi thẩm định và tái lập thì có bắt buộc phải làm theo toàn bộ không?</w:t>
       </w:r>
     </w:p>
     <w:p>
@@ -3017,11 +3017,11 @@
           <w:color w:val="334155"/>
           <w:sz w:val="20"/>
         </w:rPr>
-        <w:t>Luận điểm phản biện &amp; Căn cứ khoa học:</w:t>
+        <w:t>Luận điểm phản biện:</w:t>
         <w:br/>
-        <w:t>1. Bản chất bài khảo cứu: Bài báo của Halpin là một bài tổng quan triết học (philosophical survey) dài 17 trang, 134 trích dẫn là kho tàng tài liệu lịch sử trải dài từ năm 1883 đến 2024, bao gồm cả sách triết học siêu hình (Dretske, Cantwell Smith), tài liệu lưu trữ chính phủ về NSA, và các hệ thống chứng minh định lý tự động. Về mặt phương pháp luận nghiên cứu, không một công trình kỹ thuật nào có thể hay bắt buộc phải tái lập toàn bộ 134 tài liệu nền đó.</w:t>
+        <w:t>1. Bản chất bài khảo cứu: Bài báo của Halpin là bài tổng quan triết học (philosophical survey) dài 17 trang, 134 trích dẫn là kho tàng tài liệu lịch sử từ năm 1883 đến 2024 (bao gồm sách triết học, tài liệu lưu trữ chính phủ về NSA, v.v.). Không một công trình kỹ thuật nào có thể hay bắt buộc phải tái lập toàn bộ 134 tài liệu nền đó.</w:t>
         <w:br/>
-        <w:t>2. Phương pháp tinh lọc trọng tâm: Thẩm định một bài báo lý thuyết là tinh lọc các trụ cột kỹ thuật trực tiếp liên quan đến bài toán an ninh. Đề tài DT005 đã tinh lọc và kết nối với các tài liệu kỹ thuật cốt lõi: Ref [2, 3] của Shannon (Mã tuyến tính vs Hàm băm), Ref [21] của Biba (Toàn vẹn phân cấp), Ref [33, 34] của Goldwasser-Micali (Trò chơi an ninh PPT), Ref [36] của Kocher (Kênh kề thời gian), Ref [40] của Bellare-Rogaway (Random Oracle), Ref [52] của Dolev-Yao (Mạng thù địch), Ref [100, 101] về Snowden/NSA (Đối thủ thể chế), và bổ sung tài liệu kỹ thuật chuẩn IETF RFC 6962 về phân tách miền cho Cây Merkle.</w:t>
+        <w:t>2. Tinh lọc trọng tâm: Thẩm định bài báo lý thuyết là tinh lọc các trụ cột kỹ thuật trực tiếp liên quan đến bài toán an ninh. Nhóm đã tinh lọc và kết nối với các tài liệu kỹ thuật cốt lõi: Shannon (Mã tuyến tính vs Hàm băm), Goldwasser-Micali (Trò chơi an ninh PPT), Kocher (Kênh kề thời gian), Bellare-Rogaway (Random Oracle), Dolev-Yao (Mạng thù địch), Snowden (Đối thủ thể chế), và bổ sung chuẩn IETF RFC 6962 về phân tách miền.</w:t>
       </w:r>
     </w:p>
     <w:p>
@@ -3047,11 +3047,11 @@
           <w:color w:val="334155"/>
           <w:sz w:val="20"/>
         </w:rPr>
-        <w:t>Luận điểm phản biện &amp; Căn cứ khoa học:</w:t>
+        <w:t>Luận điểm phản biện:</w:t>
         <w:br/>
-        <w:t>1. Khẳng định minh bạch khoa học: Bài báo gốc của Harry Halpin hoàn toàn KHÔNG CÓ bất kỳ tập dữ liệu, bảng số liệu thực nghiệm hay mã nguồn nào. Bài báo là công trình khảo luận nhận thức luận trên tạp chí lý thuyết.</w:t>
+        <w:t>1. Khẳng định minh bạch: Bài báo gốc của Harry Halpin hoàn toàn KHÔNG CÓ tập dữ liệu, bảng số liệu thực nghiệm hay mã nguồn nào. Bài báo là công trình khảo luận nhận thức luận trên tạp chí lý thuyết.</w:t>
         <w:br/>
-        <w:t>2. Mục đích đưa tập dữ liệu vào nghiên cứu: Tập dữ liệu Kaggle Resume Dataset (báo cáo benchmark ghi nhận 2.485 tệp tin, ~112.81 MiB) do nhóm sinh viên tự chọn và tiền xử lý. Lý do chọn tập dữ liệu này là để cung cấp một môi trường cây thư mục doanh nghiệp nhiều tầng thực tế, kích thước tệp biến thiên, phản ánh trung thực tải làm việc thực tế nhằm đo đạc năng lực định vị sai lệch và khả năng chịu tải đối kháng, hoàn toàn không phải ngụy tạo số liệu của tác giả.</w:t>
+        <w:t>2. Mục đích đưa tập dữ liệu vào: Tập dữ liệu Kaggle Resume Dataset (2.485 tệp tin, ~112.81 MiB theo benchmark) do nhóm sinh viên tự chọn và tiền xử lý. Mục đích là cung cấp môi trường cây thư mục doanh nghiệp nhiều tầng thực tế, kích thước tệp biến thiên, phản ánh tải làm việc thực tế để đo tốc độ quét và kiểm tra khả năng bắt lỗi đối kháng, hoàn toàn không phải ngụy tạo số liệu tác giả.</w:t>
       </w:r>
     </w:p>
     <w:p>
@@ -3064,7 +3064,7 @@
           <w:color w:val="0F172A"/>
           <w:sz w:val="22"/>
         </w:rPr>
-        <w:t>Câu hỏi 4: Tại sao mã kiểm tra lỗi CRC32 bị qua mặt trong kịch bản giải hệ trên GF(2), trong khi SHA-256 lại phát hiện được gian lận?</w:t>
+        <w:t>Câu hỏi 4: Tại sao mã kiểm tra lỗi CRC32 bị qua mặt bằng GF(2), trong khi SHA-256 lại phát hiện được gian lận?</w:t>
       </w:r>
     </w:p>
     <w:p>
@@ -3077,11 +3077,11 @@
           <w:color w:val="334155"/>
           <w:sz w:val="20"/>
         </w:rPr>
-        <w:t>Luận điểm phản biện &amp; Căn cứ khoa học:</w:t>
+        <w:t>Luận điểm phản biện:</w:t>
         <w:br/>
-        <w:t>1. Tính chất tuyến tính của CRC32: CRC32 hoạt động dựa trên phép chia đa thức trên trường nhị phân hữu hạn GF(2). Do tính chất tuyến tính, giá trị CRC của một thông điệp sửa đổi CRC(M XOR Delta) có thể tính toán từ CRC(M) và CRC(Delta). Kẻ đối đầu có chủ đích có thể giải hệ phương trình đại số tuyến tính bằng thuật toán khử Gauss để tìm ra 4 byte bù (patch) nối vào cuối tệp tin, khiến cho CRC32 của tệp giả mạo trùng khớp với tệp gốc ban đầu trong kịch bản kiểm thử này.</w:t>
+        <w:t>1. Tính tuyến tính của CRC32: CRC32 hoạt động dựa trên phép chia đa thức trên trường nhị phân GF(2). Do tính chất tuyến tính, giá trị CRC của thông điệp sửa đổi có thể tính trước được. Đối thủ giải hệ phương trình đại số tuyến tính để tìm ra 4 byte bù (patch) nối vào đuôi tệp, khiến CRC32 của tệp giả mạo trùng khớp với tệp gốc trong kịch bản kiểm thử này.</w:t>
         <w:br/>
-        <w:t>2. Tính phi tuyến của SHA-256: SHA-256 là hàm băm mật mã học xây dựng trên cấu trúc lặp Merkle-Damgard và phép nén Davies-Meyer với các hàm phi tuyến (Ch, Maj, Sigma). Hàm băm đạt hiệu ứng tuyết lở (Strict Avalanche Criterion - SAC ~50%): Chỉ cần thay đổi 1 bit đầu vào thì trung bình 50% số bit đầu ra bị đảo ngẫu nhiên. Bài toán tìm tiền ảnh thứ hai trên SHA-256 có độ phức tạp 2^256, vượt quá năng lực tính toán của đối thủ đa thức xác suất (PPT Adversary).</w:t>
+        <w:t>2. Tính phi tuyến của SHA-256: SHA-256 xây dựng trên cấu trúc lặp Merkle-Damgard với các hàm phi tuyến. Hàm băm đạt hiệu ứng tuyết lở (SAC ~50%): Chỉ đổi 1 bit đầu vào thì trung bình 50% số bit đầu ra bị đảo ngẫu nhiên. Bài toán tìm tiền ảnh thứ hai trên SHA-256 có độ phức tạp 2^256, vượt quá năng lực tính toán của đối thủ thời gian đa thức (PPT).</w:t>
       </w:r>
     </w:p>
     <w:p>
@@ -3094,7 +3094,7 @@
           <w:color w:val="0F172A"/>
           <w:sz w:val="22"/>
         </w:rPr>
-        <w:t>Câu hỏi 5: Tấn công Kênh kề thời gian (Timing Side-Channel) trong so sánh chuỗi hoạt động như thế nào và cách giải quyết?</w:t>
+        <w:t>Câu hỏi 5: Tấn công Kênh kề thời gian (Timing Side-Channel) trong so sánh chuỗi hoạt động thế nào và cách giải quyết?</w:t>
       </w:r>
     </w:p>
     <w:p>
@@ -3107,11 +3107,11 @@
           <w:color w:val="334155"/>
           <w:sz w:val="20"/>
         </w:rPr>
-        <w:t>Luận điểm phản biện &amp; Căn cứ khoa học:</w:t>
+        <w:t>Luận điểm phản biện:</w:t>
         <w:br/>
-        <w:t>1. Cơ chế rò rỉ: Hàm so sánh chuỗi thông thường (như toán tử == trong nhiều ngôn ngữ) thực hiện so sánh tuần tự từng ký tự từ trái sang phải và ngắt sớm (early return) khi phát hiện ký tự sai khác đầu tiên. Kẻ tấn công gửi các chuỗi thử nghiệm và đo thời gian phản hồi: Thời gian thực thi càng dài đồng nghĩa số lượng ký tự tiền tố đoán đúng càng nhiều. Từ đó, đối thủ khôi phục được mã băm hoặc khóa bí mật mà không cần giải mã.</w:t>
+        <w:t>1. Cơ chế rò rỉ: Hàm so sánh chuỗi thông thường (toán tử ==) so sánh tuần tự từng ký tự từ trái sang phải và ngắt sớm (early return) khi thấy ký tự sai đầu tiên. Đối thủ gửi các chuỗi thử và đo thời gian phản hồi: Thời gian xử lý lâu hơn nghĩa là đã đoán đúng thêm ký tự. Nhờ đó, đối thủ dò ra khóa bí mật mà không cần giải mã.</w:t>
         <w:br/>
-        <w:t>2. Giải pháp kỹ thuật: Chuyển sang sử dụng hàm so sánh thời gian hằng số (Constant-time comparison) `hmac.compare_digest`. Hàm này luôn duyệt qua toàn bộ độ dài của chuỗi bằng phép toán bitwise XOR tích lũy, đảm bảo thời gian thực thi độc lập với vị trí xuất hiện ký tự sai khác, triệt tiêu kênh rò rỉ thời gian ở mức phần mềm.</w:t>
+        <w:t>2. Giải pháp kỹ thuật: Sử dụng hàm so sánh thời gian hằng số (Constant-time comparison) `hmac.compare_digest`. Hàm này luôn duyệt hết độ dài chuỗi bằng phép XOR tích lũy, đảm bảo thời gian xử lý độc lập với vị trí sai khác, triệt tiêu kênh rò rỉ thời gian ở mức phần mềm.</w:t>
       </w:r>
     </w:p>
     <w:p>
@@ -3124,7 +3124,7 @@
           <w:color w:val="0F172A"/>
           <w:sz w:val="22"/>
         </w:rPr>
-        <w:t>Câu hỏi 6: Giải pháp Cây Merkle phân cấp và phân tách miền RFC 6962 đóng vai trò gì trong đề tài?</w:t>
+        <w:t>Câu hỏi 6: Cây Merkle phân cấp và phân tách miền RFC 6962 đóng vai trò gì trong đề tài?</w:t>
       </w:r>
     </w:p>
     <w:p>
@@ -3137,13 +3137,13 @@
           <w:color w:val="334155"/>
           <w:sz w:val="20"/>
         </w:rPr>
-        <w:t>Luận điểm phản biện &amp; Căn cứ khoa học:</w:t>
+        <w:t>Luận điểm phản biện:</w:t>
         <w:br/>
-        <w:t>1. Minh họa độc lập của nhóm: Bài báo của Halpin không đề xuất Cây Merkle hay chuẩn RFC 6962. Đây là phần nghiên cứu và triển khai độc lập của nhóm DT005 nhằm giải quyết bài toán toàn vẹn dữ liệu tệp tin.</w:t>
+        <w:t>1. Đóng góp độc lập: Halpin không đề xuất Cây Merkle hay chuẩn RFC 6962. Đây là phần mở rộng độc lập của nhóm nhằm giải quyết bài toán toàn vẹn dữ liệu tệp tin.</w:t>
         <w:br/>
-        <w:t>2. Phân tách miền RFC 6962: Phép ghép băm thông thường H(L || R) có nguy cơ dẫn đến lỗ hổng nhập nhằng nút lá (Node-leaf ambiguity) khi một nút lá có cấu trúc 64 byte bị kẻ tấn công đánh tráo thành cặp băm của nút nhánh nội bộ. Nhóm áp dụng chuẩn RFC 6962: Tiền tố 0x00 cho nút lá và 0x01 cho nút nhánh nội bộ, triệt tiêu hoàn toàn nhập nhằng cấu trúc ở cấp độ cây.</w:t>
+        <w:t>2. Phân tách miền RFC 6962: Phép ghép băm thông thường H(L || R) có nguy cơ dẫn đến lỗi nhập nhằng nút lá (Node-leaf ambiguity) khi một nút lá bị giả mạo thành cặp băm của nút nhánh nội bộ. Nhóm áp dụng chuẩn RFC 6962: Thêm tiền tố 0x00 cho lá và 0x01 cho nhánh, triệt tiêu hoàn toàn sự nhập nhằng cấu trúc ở cấp độ cây.</w:t>
         <w:br/>
-        <w:t>3. Định hướng hoàn thiện cuối kỳ: Nhóm tiếp tục tối ưu hóa cơ chế bộ đệm cập nhật cục bộ và đo đạc thực nghiệm độ bền (Ablation Study) trên các quy mô dữ liệu lớn hơn.</w:t>
+        <w:t>3. Định hướng cuối kỳ: Nhóm tiếp tục tối ưu hóa cơ chế bộ đệm cập nhật cục bộ và đo đạc thực nghiệm trên các quy mô dữ liệu lớn hơn.</w:t>
       </w:r>
     </w:p>
     <w:sectPr>

</xml_diff>

<commit_message>
Streamline slides 10, 11, 13 content in presentation and speaking script
</commit_message>
<xml_diff>
--- a/Kich_Ban_Thuyet_Trinh_Va_Demo_DT005.docx
+++ b/Kich_Ban_Thuyet_Trinh_Va_Demo_DT005.docx
@@ -1776,7 +1776,7 @@
         </w:rPr>
         <w:t>• Vị trí Slide: ĐÁNH GIÁ PHƯƠNG PHÁP LUẬN &amp; HƯỚNG TIẾP CẬN THỰC NGHIỆM</w:t>
         <w:br/>
-        <w:t xml:space="preserve">  Tiêu đề phụ: Làm rõ tính khả thi tái lập đối với một công trình triết học và định hướng thí nghiệm độc lập</w:t>
+        <w:t xml:space="preserve">  Tiêu đề phụ: Làm rõ tính khả thi tái lập đối với công trình triết học và định hướng thí nghiệm độc lập</w:t>
       </w:r>
     </w:p>
     <w:p>
@@ -1804,14 +1804,14 @@
           <w:color w:val="1E293B"/>
           <w:sz w:val="20"/>
         </w:rPr>
-        <w:t xml:space="preserve">– 1. Tính khả thi tái lập: </w:t>
+        <w:t xml:space="preserve">– Khảo luận triết học thuần túy: </w:t>
       </w:r>
       <w:r>
         <w:rPr>
           <w:color w:val="334155"/>
           <w:sz w:val="20"/>
         </w:rPr>
-        <w:t>Bài báo của Halpin là khảo luận triết học thuần túy, không có mã nguồn, không có tập dữ liệu hay benchmark. Nhóm thực hiện thẩm định học thuật (Scholarly Audit) đối chiếu 17 trang PDF và 134 tài liệu tham khảo.</w:t>
+        <w:t>Bài báo của TS. Harry Halpin là nghiên cứu nhận thức luận, hoàn toàn không có mã nguồn, không có tập dữ liệu hay bảng đo benchmark.</w:t>
       </w:r>
     </w:p>
     <w:p>
@@ -1825,14 +1825,56 @@
           <w:color w:val="1E293B"/>
           <w:sz w:val="20"/>
         </w:rPr>
-        <w:t xml:space="preserve">– 2. Thực nghiệm độc lập của sinh viên: </w:t>
+        <w:t xml:space="preserve">– Không tuyên bố sai lệch: </w:t>
       </w:r>
       <w:r>
         <w:rPr>
           <w:color w:val="334155"/>
           <w:sz w:val="20"/>
         </w:rPr>
-        <w:t>Sinh viên tự phát triển hệ thống kiểm tra toàn vẹn tệp để minh họa trực quan các khái niệm lý thuyết; kiểm thử CRC32, Dolev-Yao, kênh kề thời gian. Quy trình lưu vết tại MIDTERM_CODE_AUDIT.md.</w:t>
+        <w:t>Nhóm thẩm định toàn văn 17 trang PDF và 134 tài liệu tham khảo; tuyệt đối không bịa đặt số liệu hay tuyên bố 'tái lập 100% benchmark' của tác giả.</w:t>
+      </w:r>
+    </w:p>
+    <w:p>
+      <w:pPr>
+        <w:spacing w:before="20" w:after="40"/>
+        <w:ind w:left="504"/>
+      </w:pPr>
+      <w:r>
+        <w:rPr>
+          <w:b/>
+          <w:color w:val="1E293B"/>
+          <w:sz w:val="20"/>
+        </w:rPr>
+        <w:t xml:space="preserve">– Minh họa trực quan luận điểm: </w:t>
+      </w:r>
+      <w:r>
+        <w:rPr>
+          <w:color w:val="334155"/>
+          <w:sz w:val="20"/>
+        </w:rPr>
+        <w:t>Sinh viên tự phát triển hệ thống kiểm tra toàn vẹn tệp để đưa các luận điểm đối kháng trừu tượng của Halpin vào kiểm chứng thực nghiệm.</w:t>
+      </w:r>
+    </w:p>
+    <w:p>
+      <w:pPr>
+        <w:spacing w:before="20" w:after="40"/>
+        <w:ind w:left="504"/>
+      </w:pPr>
+      <w:r>
+        <w:rPr>
+          <w:b/>
+          <w:color w:val="1E293B"/>
+          <w:sz w:val="20"/>
+        </w:rPr>
+        <w:t xml:space="preserve">– Phân định ranh giới rạch ròi: </w:t>
+      </w:r>
+      <w:r>
+        <w:rPr>
+          <w:color w:val="334155"/>
+          <w:sz w:val="20"/>
+        </w:rPr>
+        <w:t>Mã nguồn và kịch bản đối kháng là sản phẩm độc lập của sinh viên, không phải thuật toán của Halpin (lưu vết tại MIDTERM_CODE_AUDIT.md).</w:t>
       </w:r>
     </w:p>
     <w:tbl>
@@ -1869,9 +1911,9 @@
                 <w:color w:val="334155"/>
                 <w:sz w:val="19"/>
               </w:rPr>
-              <w:t>Giải thích ngắn gọn:</w:t>
+              <w:t>Giải thích dễ hiểu:</w:t>
               <w:br/>
-              <w:t>Tại sao bài báo không có code mà đề tài có demo? Bài báo gốc là khảo cứu triết học, không công bố mã nguồn hay số liệu để chạy lại. Do đó, nhóm tự thiết kế hệ thống kiểm tra toàn vẹn tệp độc lập trên tập dữ liệu 2.485 tệp để minh họa thực tế cho các luận điểm của tác giả.</w:t>
+              <w:t>Tại sao bài báo không có code mà đề tài lại có demo? Bài báo là nghiên cứu triết học, không có mã nguồn hay số liệu sẵn. Nhóm tự xây dựng phần mềm để minh họa các luận điểm của tác giả, chứ không bịa đặt số liệu của bài báo.</w:t>
             </w:r>
           </w:p>
         </w:tc>
@@ -1953,14 +1995,14 @@
           <w:color w:val="1E293B"/>
           <w:sz w:val="20"/>
         </w:rPr>
-        <w:t xml:space="preserve">– Ví dụ 1 — Nhiễu ngẫu nhiên vs Đối thủ chủ đích: </w:t>
+        <w:t xml:space="preserve">– 1. Nhiễu vs Đối thủ chủ đích: </w:t>
       </w:r>
       <w:r>
         <w:rPr>
           <w:color w:val="334155"/>
           <w:sz w:val="20"/>
         </w:rPr>
-        <w:t>Halpin chỉ rõ mã kiểm tra lỗi chỉ chống được nhiễu ngẫu nhiên. DT005 thử nghiệm giải hệ phương trình trên GF(2) bù 4 byte qua mặt CRC32; SHA-256 phát hiện ngay nhờ tính phi tuyến. Giới hạn: Không khẳng định CRC32 bất lực trong kiểm tra lỗi phần cứng ngẫu nhiên.</w:t>
+        <w:t>Halpin (Sec. 1–2): Mã tuyến tính chỉ bắt lỗi ngẫu nhiên, không cản được đối thủ có chủ đích. Minh họa DT005: Giải hệ GF(2) bù 4 byte qua mặt CRC32; SHA-256 phát hiện ngay nhờ tính phi tuyến. Giới hạn: Chỉ minh họa kịch bản giả mạo cụ thể; không phủ nhận vai trò bắt lỗi phần cứng của CRC32.</w:t>
       </w:r>
     </w:p>
     <w:p>
@@ -1974,14 +2016,14 @@
           <w:color w:val="1E293B"/>
           <w:sz w:val="20"/>
         </w:rPr>
-        <w:t xml:space="preserve">– Ví dụ 2 — Phân tách miền nút lá (RFC 6962): </w:t>
+        <w:t xml:space="preserve">– 2. Phân tách miền nút lá: </w:t>
       </w:r>
       <w:r>
         <w:rPr>
           <w:color w:val="334155"/>
           <w:sz w:val="20"/>
         </w:rPr>
-        <w:t>Halpin nhấn mạnh điểm mù cấu trúc dữ liệu nhưng không đề cập cây Merkle. DT005 cài đặt phân tách miền IETF RFC 6962 (tiền tố 0x00 cho lá, 0x01 cho nhánh) phòng ngừa va chạm cấu trúc. Giới hạn: Đóng góp độc lập của sinh viên, không phải của Halpin.</w:t>
+        <w:t>Lý thuyết bài báo: Halpin nhấn mạnh điểm mù cấu trúc dữ liệu, nhưng không đề cập cây Merkle. Minh họa DT005: Cài đặt chuẩn RFC 6962 (tiền tố 0x00 cho lá, 0x01 cho nhánh) để tránh nhầm lẫn cấu trúc cây. Giới hạn: Đây là giải pháp kỹ thuật độc lập do sinh viên tích hợp, không phải đề xuất của Halpin.</w:t>
       </w:r>
     </w:p>
     <w:p>
@@ -1995,14 +2037,14 @@
           <w:color w:val="1E293B"/>
           <w:sz w:val="20"/>
         </w:rPr>
-        <w:t xml:space="preserve">– Ví dụ 3 — Kênh kề thời gian: </w:t>
+        <w:t xml:space="preserve">– 3. Rò rỉ kênh kề thời gian: </w:t>
       </w:r>
       <w:r>
         <w:rPr>
           <w:color w:val="334155"/>
           <w:sz w:val="20"/>
         </w:rPr>
-        <w:t>Halpin dẫn chứng thời gian thực thi làm lộ bí mật (Kocher 1996). DT005 đo đạc so sánh chuỗi ngắt sớm so với hàm thời gian hằng số hmac.compare_digest. Giới hạn: Đo trên Python có jitter hệ điều hành, chỉ minh họa mức ứng dụng.</w:t>
+        <w:t>Halpin (Sec. 5): Thời gian xử lý thực tế làm rò rỉ dữ liệu ngoài mô hình toán (dẫn Kocher 1996). Minh họa DT005: Đo đạc so sánh chuỗi ngắt sớm làm rò rỉ ký tự; áp dụng hàm thời gian hằng số hmac.compare_digest. Giới hạn: Chỉ minh họa rò rỉ logic ở mức phần mềm ứng dụng; đo trên Python có độ trễ hệ điều hành.</w:t>
       </w:r>
     </w:p>
     <w:tbl>
@@ -2039,11 +2081,11 @@
                 <w:color w:val="334155"/>
                 <w:sz w:val="19"/>
               </w:rPr>
-              <w:t>Giải thích ngắn gọn:</w:t>
+              <w:t>Giải thích dễ hiểu:</w:t>
               <w:br/>
-              <w:t>• CRC32 vs SHA-256: CRC32 là mã tuyến tính, thiết kế để bắt lỗi ngẫu nhiên trong truyền dẫn. Đối thủ giải hệ phương trình tuyến tính trên GF(2) để tìm 4 byte bù, sửa nội dung tệp mà CRC32 vẫn khớp. SHA-256 là hàm băm phi tuyến có hiệu ứng tuyết lở (đổi 1 bit đầu vào thì ~50% bit đầu ra thay đổi), không thể làm giả bằng đại số tuyến tính.</w:t>
+              <w:t>• CRC32 vs SHA-256: CRC32 chỉ bắt lỗi đường truyền ngẫu nhiên. Kẻ tấn công tính được 4 byte bù để sửa tệp mà mã CRC32 không đổi. Còn SHA-256 đổi 1 bit là mã băm đổi hoàn toàn nên không làm giả được.</w:t>
               <w:br/>
-              <w:t>• Phân tách miền RFC 6962: Tránh lỗi nhập nhằng nút lá (nhầm lẫn giữa nút lá và cặp băm của nút nhánh). Nhóm thêm tiền tố 0x00 cho lá và 0x01 cho nhánh để phân định rạch ròi cấu trúc cây.</w:t>
+              <w:t>• Phân tách miền RFC 6962: Gắn nhãn 0x00 cho lá và 0x01 cho nhánh để cây không bị nhầm lẫn dữ liệu.</w:t>
             </w:r>
           </w:p>
         </w:tc>
@@ -2209,7 +2251,7 @@
           <w:color w:val="64748B"/>
           <w:sz w:val="20"/>
         </w:rPr>
-        <w:t>[1:00]</w:t>
+        <w:t>[0:45]</w:t>
       </w:r>
     </w:p>
     <w:p>
@@ -2253,14 +2295,14 @@
           <w:color w:val="1E293B"/>
           <w:sz w:val="20"/>
         </w:rPr>
-        <w:t xml:space="preserve">– 1. Hạ tầng diễn tập 2 Màn hình: </w:t>
+        <w:t xml:space="preserve">– 1. Mô hình diễn tập 2 màn hình: </w:t>
       </w:r>
       <w:r>
         <w:rPr>
           <w:color w:val="334155"/>
           <w:sz w:val="20"/>
         </w:rPr>
-        <w:t>Tương tác thời gian thực giữa Hệ thống giám sát Blue Team (Port 8080) và Động cơ tấn công Red Team (Port 8081).</w:t>
+        <w:t>Màn hình trái là Blue Team (Port 8080) giám sát toàn vẹn tệp; màn hình phải là Red Team (Port 8081) thực hiện can thiệp.</w:t>
       </w:r>
     </w:p>
     <w:p>
@@ -2274,14 +2316,14 @@
           <w:color w:val="1E293B"/>
           <w:sz w:val="20"/>
         </w:rPr>
-        <w:t xml:space="preserve">– 2. Tập dữ liệu thực nghiệm: </w:t>
+        <w:t xml:space="preserve">– 2. Dữ liệu thực nghiệm: </w:t>
       </w:r>
       <w:r>
         <w:rPr>
           <w:color w:val="334155"/>
           <w:sz w:val="20"/>
         </w:rPr>
-        <w:t>kaggle_dataset gồm 2.485 tệp tin (~112,81 MiB theo benchmark, nạp cục bộ 2.483 tệp) đóng vai trò môi trường kiểm thử.</w:t>
+        <w:t>Thư mục kaggle_dataset (2.485 tệp tin) mô phỏng cấu trúc tệp thực tế để đo kiểm tra toàn vẹn.</w:t>
       </w:r>
     </w:p>
     <w:p>
@@ -2295,56 +2337,14 @@
           <w:color w:val="1E293B"/>
           <w:sz w:val="20"/>
         </w:rPr>
-        <w:t xml:space="preserve">– 3. Blue Team (Port 8080): </w:t>
+        <w:t xml:space="preserve">– 3. Kịch bản minh họa &amp; Hoàn nguyên: </w:t>
       </w:r>
       <w:r>
         <w:rPr>
           <w:color w:val="334155"/>
           <w:sz w:val="20"/>
         </w:rPr>
-        <w:t>Thiết lập mốc tin cậy sạch H_0; quét kiểm tra toàn vẹn định vị chính xác tệp tin bị biến đổi với tốc độ quét trên 2.000 tệp/giây.</w:t>
-      </w:r>
-    </w:p>
-    <w:p>
-      <w:pPr>
-        <w:spacing w:before="20" w:after="40"/>
-        <w:ind w:left="504"/>
-      </w:pPr>
-      <w:r>
-        <w:rPr>
-          <w:b/>
-          <w:color w:val="1E293B"/>
-          <w:sz w:val="20"/>
-        </w:rPr>
-        <w:t xml:space="preserve">– 4. Red Team (Port 8081): </w:t>
-      </w:r>
-      <w:r>
-        <w:rPr>
-          <w:color w:val="334155"/>
-          <w:sz w:val="20"/>
-        </w:rPr>
-        <w:t>Mô phỏng tấn công có chủ đích: Sửa byte tệp (In-place Tamper) và giải hệ phương trình GF(2) bù 4 byte qua mặt CRC32.</w:t>
-      </w:r>
-    </w:p>
-    <w:p>
-      <w:pPr>
-        <w:spacing w:before="20" w:after="40"/>
-        <w:ind w:left="504"/>
-      </w:pPr>
-      <w:r>
-        <w:rPr>
-          <w:b/>
-          <w:color w:val="1E293B"/>
-          <w:sz w:val="20"/>
-        </w:rPr>
-        <w:t xml:space="preserve">– 5. Cơ chế hoàn nguyên an toàn: </w:t>
-      </w:r>
-      <w:r>
-        <w:rPr>
-          <w:color w:val="334155"/>
-          <w:sz w:val="20"/>
-        </w:rPr>
-        <w:t>Thư mục sao lưu an toàn .adversary_backups/ phục hồi nguyên trạng 100% dữ liệu với nút Rollback All.</w:t>
+        <w:t>Red Team sửa tệp hoặc bù byte qua mặt CRC32; Blue Team phát hiện gian lận và có nút Rollback All để hoàn nguyên dữ liệu gốc an toàn.</w:t>
       </w:r>
     </w:p>
     <w:tbl>
@@ -2381,13 +2381,9 @@
                 <w:color w:val="334155"/>
                 <w:sz w:val="19"/>
               </w:rPr>
-              <w:t>Giải thích vận hành Demo:</w:t>
+              <w:t>Hướng dẫn thuyết minh:</w:t>
               <w:br/>
-              <w:t>- Cửa sổ phải (Red Team): Sửa tệp Resume/Resume.csv hoặc tính 4 byte bù GF(2) qua mặt CRC32.</w:t>
-              <w:br/>
-              <w:t>- Cửa sổ trái (Blue Team): Bấm kiểm tra toàn vẹn, hệ thống phát hiện tệp bị sửa tức thì và báo động.</w:t>
-              <w:br/>
-              <w:t>- Nút Rollback All: Phục hồi lại dữ liệu gốc từ thư mục sao lưu.</w:t>
+              <w:t>Đây là sơ đồ bố trí màn hình cho buổi Demo: màn hình phải tấn công, màn hình trái phát hiện. Nói ngắn gọn trong 20-30 giây để chuyển ngay vào màn hình Demo trực tiếp.</w:t>
             </w:r>
           </w:p>
         </w:tc>

</xml_diff>

<commit_message>
Streamline presentation to 13 slides: remove slides 10-11, move architecture before DEMO, add summary table, and enrich demo script
</commit_message>
<xml_diff>
--- a/Kich_Ban_Thuyet_Trinh_Va_Demo_DT005.docx
+++ b/Kich_Ban_Thuyet_Trinh_Va_Demo_DT005.docx
@@ -1752,7 +1752,7 @@
           <w:color w:val="1E40AF"/>
           <w:sz w:val="24"/>
         </w:rPr>
-        <w:t xml:space="preserve">► SLIDE 10: PHƯƠNG PHÁP LUẬN &amp; KHẢ NĂNG TÁI LẬP BÀI BÁO </w:t>
+        <w:t xml:space="preserve">► SLIDE 10: KIẾN TRÚC DIỄN TẬP ĐỐI KHÁNG: RED TEAM VS BLUE TEAM </w:t>
       </w:r>
       <w:r>
         <w:rPr>
@@ -1760,7 +1760,7 @@
           <w:color w:val="64748B"/>
           <w:sz w:val="20"/>
         </w:rPr>
-        <w:t>[1:00]</w:t>
+        <w:t>[0:45]</w:t>
       </w:r>
     </w:p>
     <w:p>
@@ -1774,9 +1774,9 @@
           <w:color w:val="475569"/>
           <w:sz w:val="19"/>
         </w:rPr>
-        <w:t>• Vị trí Slide: ĐÁNH GIÁ PHƯƠNG PHÁP LUẬN &amp; HƯỚNG TIẾP CẬN THỰC NGHIỆM</w:t>
+        <w:t>• Vị trí Slide: SƠ ĐỒ 4: KIẾN TRÚC DIỄN TẬP ĐỐI KHÁNG (PRE-DEMO ARCHITECTURE)</w:t>
         <w:br/>
-        <w:t xml:space="preserve">  Tiêu đề phụ: Làm rõ tính khả thi tái lập đối với công trình triết học và định hướng thí nghiệm độc lập</w:t>
+        <w:t xml:space="preserve">  Tiêu đề phụ: Mô hình đối kháng 2 màn hình trên tập dữ liệu kaggle_dataset (2.485 tệp tin) kiểm chứng trực quan luận điểm bài báo</w:t>
       </w:r>
     </w:p>
     <w:p>
@@ -1804,14 +1804,14 @@
           <w:color w:val="1E293B"/>
           <w:sz w:val="20"/>
         </w:rPr>
-        <w:t xml:space="preserve">– Khảo luận triết học thuần túy: </w:t>
+        <w:t xml:space="preserve">– 1. Sơ đồ diễn tập 2 màn hình: </w:t>
       </w:r>
       <w:r>
         <w:rPr>
           <w:color w:val="334155"/>
           <w:sz w:val="20"/>
         </w:rPr>
-        <w:t>Bài báo của TS. Harry Halpin là nghiên cứu nhận thức luận, hoàn toàn không có mã nguồn, không có tập dữ liệu hay bảng đo benchmark.</w:t>
+        <w:t>Màn hình trái là Blue Team (Port 8080) giám sát toàn vẹn tệp; màn hình phải là Red Team (Port 8081) thực hiện can thiệp.</w:t>
       </w:r>
     </w:p>
     <w:p>
@@ -1825,14 +1825,14 @@
           <w:color w:val="1E293B"/>
           <w:sz w:val="20"/>
         </w:rPr>
-        <w:t xml:space="preserve">– Không tuyên bố sai lệch: </w:t>
+        <w:t xml:space="preserve">– 2. Dữ liệu thực nghiệm: </w:t>
       </w:r>
       <w:r>
         <w:rPr>
           <w:color w:val="334155"/>
           <w:sz w:val="20"/>
         </w:rPr>
-        <w:t>Nhóm thẩm định toàn văn 17 trang PDF và 134 tài liệu tham khảo; tuyệt đối không bịa đặt số liệu hay tuyên bố 'tái lập 100% benchmark' của tác giả.</w:t>
+        <w:t>Thư mục kaggle_dataset (2.485 tệp tin) đóng vai trò môi trường kiểm thử thực tế để đo kiểm tra toàn vẹn.</w:t>
       </w:r>
     </w:p>
     <w:p>
@@ -1846,14 +1846,14 @@
           <w:color w:val="1E293B"/>
           <w:sz w:val="20"/>
         </w:rPr>
-        <w:t xml:space="preserve">– Minh họa trực quan luận điểm: </w:t>
+        <w:t xml:space="preserve">– 3. Cầu nối minh họa độc lập (Paper-to-Code): </w:t>
       </w:r>
       <w:r>
         <w:rPr>
           <w:color w:val="334155"/>
           <w:sz w:val="20"/>
         </w:rPr>
-        <w:t>Sinh viên tự phát triển hệ thống kiểm tra toàn vẹn tệp để đưa các luận điểm đối kháng trừu tượng của Halpin vào kiểm chứng thực nghiệm.</w:t>
+        <w:t>Bài báo Halpin là khảo luận triết học thuần túy (không có code). Hệ thống kiểm chứng trực quan 3 luận điểm: (1) Mã CRC32 bị qua mặt trên GF(2) vs SHA-256 phi tuyến; (2) Phân tách miền nút lá RFC 6962; (3) Kênh kề thời gian so sánh chuỗi.</w:t>
       </w:r>
     </w:p>
     <w:p>
@@ -1867,14 +1867,14 @@
           <w:color w:val="1E293B"/>
           <w:sz w:val="20"/>
         </w:rPr>
-        <w:t xml:space="preserve">– Phân định ranh giới rạch ròi: </w:t>
+        <w:t xml:space="preserve">– 4. Cơ chế hoàn nguyên an toàn: </w:t>
       </w:r>
       <w:r>
         <w:rPr>
           <w:color w:val="334155"/>
           <w:sz w:val="20"/>
         </w:rPr>
-        <w:t>Mã nguồn và kịch bản đối kháng là sản phẩm độc lập của sinh viên, không phải thuật toán của Halpin (lưu vết tại MIDTERM_CODE_AUDIT.md).</w:t>
+        <w:t>Thư mục .adversary_backups/ phục hồi nguyên trạng 100% dữ liệu với nút Rollback All.</w:t>
       </w:r>
     </w:p>
     <w:tbl>
@@ -1911,9 +1911,9 @@
                 <w:color w:val="334155"/>
                 <w:sz w:val="19"/>
               </w:rPr>
-              <w:t>Giải thích dễ hiểu:</w:t>
+              <w:t>Hướng dẫn thuyết minh ngắn gọn:</w:t>
               <w:br/>
-              <w:t>Tại sao bài báo không có code mà đề tài lại có demo? Bài báo là nghiên cứu triết học, không có mã nguồn hay số liệu sẵn. Nhóm tự xây dựng phần mềm để minh họa các luận điểm của tác giả, chứ không bịa đặt số liệu của bài báo.</w:t>
+              <w:t>Đây là sơ đồ bố trí màn hình trước khi Demo: màn hình phải tấn công, màn hình trái phát hiện. Nhóm tự phát triển phần mềm này để minh họa trực quan cho các luận điểm của tác giả. Nói ngắn gọn trong 30 giây để chuyển ngay vào màn hình Demo trực tiếp.</w:t>
             </w:r>
           </w:p>
         </w:tc>
@@ -1930,7 +1930,7 @@
           <w:color w:val="94A3B8"/>
           <w:sz w:val="18"/>
         </w:rPr>
-        <w:t>• Ghi chú chân Slide: Báo cáo phân định phương pháp luận độc lập của nhóm nghiên cứu đề tài DT005.</w:t>
+        <w:t>• Ghi chú chân Slide: Sơ đồ kiến trúc diễn tập đối kháng độc lập do sinh viên thiết kế minh họa các khái niệm an ninh.</w:t>
       </w:r>
     </w:p>
     <w:p>
@@ -1943,179 +1943,7 @@
           <w:color w:val="1E40AF"/>
           <w:sz w:val="24"/>
         </w:rPr>
-        <w:t xml:space="preserve">► SLIDE 11: MINH HỌA PAPER-TO-CODE ĐỘC LẬP &amp; GIỚI HẠN DIỄN GIẢI </w:t>
-      </w:r>
-      <w:r>
-        <w:rPr>
-          <w:b/>
-          <w:color w:val="64748B"/>
-          <w:sz w:val="20"/>
-        </w:rPr>
-        <w:t>[1:15]</w:t>
-      </w:r>
-    </w:p>
-    <w:p>
-      <w:pPr>
-        <w:spacing w:before="20" w:after="80"/>
-        <w:ind w:left="288"/>
-      </w:pPr>
-      <w:r>
-        <w:rPr>
-          <w:i/>
-          <w:color w:val="475569"/>
-          <w:sz w:val="19"/>
-        </w:rPr>
-        <w:t>• Vị trí Slide: SƠ ĐỒ 4: PHÂN ĐỊNH LÝ THUYẾT &amp; THÍ NGHIỆM ĐỘC LẬP</w:t>
-        <w:br/>
-        <w:t xml:space="preserve">  Tiêu đề phụ: Đối sánh minh bạch giữa các luận điểm bài báo và thí nghiệm minh họa do sinh viên xây dựng</w:t>
-      </w:r>
-    </w:p>
-    <w:p>
-      <w:pPr>
-        <w:spacing w:before="40" w:after="40"/>
-        <w:ind w:left="288"/>
-      </w:pPr>
-      <w:r>
-        <w:rPr>
-          <w:b/>
-          <w:color w:val="0F172A"/>
-          <w:sz w:val="20"/>
-        </w:rPr>
-        <w:t>Nội dung hiển thị trên Slide:</w:t>
-      </w:r>
-    </w:p>
-    <w:p>
-      <w:pPr>
-        <w:spacing w:before="20" w:after="40"/>
-        <w:ind w:left="504"/>
-      </w:pPr>
-      <w:r>
-        <w:rPr>
-          <w:b/>
-          <w:color w:val="1E293B"/>
-          <w:sz w:val="20"/>
-        </w:rPr>
-        <w:t xml:space="preserve">– 1. Nhiễu vs Đối thủ chủ đích: </w:t>
-      </w:r>
-      <w:r>
-        <w:rPr>
-          <w:color w:val="334155"/>
-          <w:sz w:val="20"/>
-        </w:rPr>
-        <w:t>Halpin (Sec. 1–2): Mã tuyến tính chỉ bắt lỗi ngẫu nhiên, không cản được đối thủ có chủ đích. Minh họa DT005: Giải hệ GF(2) bù 4 byte qua mặt CRC32; SHA-256 phát hiện ngay nhờ tính phi tuyến. Giới hạn: Chỉ minh họa kịch bản giả mạo cụ thể; không phủ nhận vai trò bắt lỗi phần cứng của CRC32.</w:t>
-      </w:r>
-    </w:p>
-    <w:p>
-      <w:pPr>
-        <w:spacing w:before="20" w:after="40"/>
-        <w:ind w:left="504"/>
-      </w:pPr>
-      <w:r>
-        <w:rPr>
-          <w:b/>
-          <w:color w:val="1E293B"/>
-          <w:sz w:val="20"/>
-        </w:rPr>
-        <w:t xml:space="preserve">– 2. Phân tách miền nút lá: </w:t>
-      </w:r>
-      <w:r>
-        <w:rPr>
-          <w:color w:val="334155"/>
-          <w:sz w:val="20"/>
-        </w:rPr>
-        <w:t>Lý thuyết bài báo: Halpin nhấn mạnh điểm mù cấu trúc dữ liệu, nhưng không đề cập cây Merkle. Minh họa DT005: Cài đặt chuẩn RFC 6962 (tiền tố 0x00 cho lá, 0x01 cho nhánh) để tránh nhầm lẫn cấu trúc cây. Giới hạn: Đây là giải pháp kỹ thuật độc lập do sinh viên tích hợp, không phải đề xuất của Halpin.</w:t>
-      </w:r>
-    </w:p>
-    <w:p>
-      <w:pPr>
-        <w:spacing w:before="20" w:after="40"/>
-        <w:ind w:left="504"/>
-      </w:pPr>
-      <w:r>
-        <w:rPr>
-          <w:b/>
-          <w:color w:val="1E293B"/>
-          <w:sz w:val="20"/>
-        </w:rPr>
-        <w:t xml:space="preserve">– 3. Rò rỉ kênh kề thời gian: </w:t>
-      </w:r>
-      <w:r>
-        <w:rPr>
-          <w:color w:val="334155"/>
-          <w:sz w:val="20"/>
-        </w:rPr>
-        <w:t>Halpin (Sec. 5): Thời gian xử lý thực tế làm rò rỉ dữ liệu ngoài mô hình toán (dẫn Kocher 1996). Minh họa DT005: Đo đạc so sánh chuỗi ngắt sớm làm rò rỉ ký tự; áp dụng hàm thời gian hằng số hmac.compare_digest. Giới hạn: Chỉ minh họa rò rỉ logic ở mức phần mềm ứng dụng; đo trên Python có độ trễ hệ điều hành.</w:t>
-      </w:r>
-    </w:p>
-    <w:tbl>
-      <w:tblPr>
-        <w:tblW w:type="auto" w:w="0"/>
-        <w:jc w:val="center"/>
-        <w:tblLook w:firstColumn="1" w:firstRow="1" w:lastColumn="0" w:lastRow="0" w:noHBand="0" w:noVBand="1" w:val="04A0"/>
-      </w:tblPr>
-      <w:tblGrid>
-        <w:gridCol w:w="9360"/>
-      </w:tblGrid>
-      <w:tr>
-        <w:tc>
-          <w:tcPr>
-            <w:tcW w:type="dxa" w:w="9360"/>
-            <w:shd w:val="clear" w:color="auto" w:fill="F1F5F9"/>
-          </w:tcPr>
-          <w:p>
-            <w:pPr>
-              <w:spacing w:before="80" w:after="80"/>
-              <w:ind w:left="144" w:right="144"/>
-            </w:pPr>
-            <w:r>
-              <w:rPr>
-                <w:b/>
-                <w:color w:val="1E40AF"/>
-                <w:sz w:val="20"/>
-              </w:rPr>
-              <w:t>💡 Hướng dẫn thuyết minh &amp; Giải thích dễ hiểu:</w:t>
-              <w:br/>
-            </w:r>
-            <w:r>
-              <w:rPr>
-                <w:color w:val="334155"/>
-                <w:sz w:val="19"/>
-              </w:rPr>
-              <w:t>Giải thích dễ hiểu:</w:t>
-              <w:br/>
-              <w:t>• CRC32 vs SHA-256: CRC32 chỉ bắt lỗi đường truyền ngẫu nhiên. Kẻ tấn công tính được 4 byte bù để sửa tệp mà mã CRC32 không đổi. Còn SHA-256 đổi 1 bit là mã băm đổi hoàn toàn nên không làm giả được.</w:t>
-              <w:br/>
-              <w:t>• Phân tách miền RFC 6962: Gắn nhãn 0x00 cho lá và 0x01 cho nhánh để cây không bị nhầm lẫn dữ liệu.</w:t>
-            </w:r>
-          </w:p>
-        </w:tc>
-      </w:tr>
-    </w:tbl>
-    <w:p>
-      <w:pPr>
-        <w:spacing w:before="80" w:after="200"/>
-        <w:ind w:left="288"/>
-      </w:pPr>
-      <w:r>
-        <w:rPr>
-          <w:i/>
-          <w:color w:val="94A3B8"/>
-          <w:sz w:val="18"/>
-        </w:rPr>
-        <w:t>• Ghi chú chân Slide: Bảng đối chiếu minh bạch do sinh viên tự xây dựng; chi tiết mã nguồn lưu tại MIDTERM_CODE_AUDIT.md.</w:t>
-      </w:r>
-    </w:p>
-    <w:p>
-      <w:pPr>
-        <w:spacing w:before="240" w:after="40"/>
-      </w:pPr>
-      <w:r>
-        <w:rPr>
-          <w:b/>
-          <w:color w:val="1E40AF"/>
-          <w:sz w:val="24"/>
-        </w:rPr>
-        <w:t xml:space="preserve">► SLIDE 12: SLIDE CHUYỂN TIẾP: DEMO </w:t>
+        <w:t xml:space="preserve">► SLIDE 11: SLIDE CHUYỂN TIẾP: DEMO </w:t>
       </w:r>
       <w:r>
         <w:rPr>
@@ -2243,7 +2071,7 @@
           <w:color w:val="1E40AF"/>
           <w:sz w:val="24"/>
         </w:rPr>
-        <w:t xml:space="preserve">► SLIDE 13: KIẾN TRÚC DIỄN TẬP ĐỐI KHÁNG: RED TEAM VS BLUE TEAM </w:t>
+        <w:t xml:space="preserve">► SLIDE 12: BẢNG TỔNG KẾT BÁO CÁO: ĐÓNG GÓP HỌC THUẬT &amp; BÀI HỌC AN NINH </w:t>
       </w:r>
       <w:r>
         <w:rPr>
@@ -2251,7 +2079,7 @@
           <w:color w:val="64748B"/>
           <w:sz w:val="20"/>
         </w:rPr>
-        <w:t>[0:45]</w:t>
+        <w:t>[1:00]</w:t>
       </w:r>
     </w:p>
     <w:p>
@@ -2265,9 +2093,9 @@
           <w:color w:val="475569"/>
           <w:sz w:val="19"/>
         </w:rPr>
-        <w:t>• Vị trí Slide: SƠ ĐỒ 5: KIẾN TRÚC DIỄN TẬP ĐỐI KHÁNG (DEMO ARCHITECTURE)</w:t>
+        <w:t>• Vị trí Slide: SECTION 7 — TỔNG KẾT TOÀN VĂN BÀI BÁO (HARRY HALPIN 2025)</w:t>
         <w:br/>
-        <w:t xml:space="preserve">  Tiêu đề phụ: Mô hình đối kháng thực tế 2 màn hình trên tập dữ liệu kaggle_dataset (2.485 tệp tin / ~112,81 MiB theo benchmark)</w:t>
+        <w:t xml:space="preserve">  Tiêu đề phụ: Bảng đối sánh giữa các giả định hình thức truyền thống và nhận thức luận của Harry Halpin</w:t>
       </w:r>
     </w:p>
     <w:p>
@@ -2295,14 +2123,14 @@
           <w:color w:val="1E293B"/>
           <w:sz w:val="20"/>
         </w:rPr>
-        <w:t xml:space="preserve">– 1. Mô hình diễn tập 2 màn hình: </w:t>
+        <w:t xml:space="preserve">– 1. Bản chất thông tin &amp; Bí mật (Sec 1–2): </w:t>
       </w:r>
       <w:r>
         <w:rPr>
           <w:color w:val="334155"/>
           <w:sz w:val="20"/>
         </w:rPr>
-        <w:t>Màn hình trái là Blue Team (Port 8080) giám sát toàn vẹn tệp; màn hình phải là Red Team (Port 8081) thực hiện can thiệp.</w:t>
+        <w:t>Từ bỏ giả định nhiễu ngẫu nhiên của Shannon; đối thủ là tác nhân có chủ đích; mã tuyến tính CRC32 không thể thay thế hàm băm phi tuyến SHA-256.</w:t>
       </w:r>
     </w:p>
     <w:p>
@@ -2316,14 +2144,14 @@
           <w:color w:val="1E293B"/>
           <w:sz w:val="20"/>
         </w:rPr>
-        <w:t xml:space="preserve">– 2. Dữ liệu thực nghiệm: </w:t>
+        <w:t xml:space="preserve">– 2. Giới hạn trừu tượng hóa (Sec 5): </w:t>
       </w:r>
       <w:r>
         <w:rPr>
           <w:color w:val="334155"/>
           <w:sz w:val="20"/>
         </w:rPr>
-        <w:t>Thư mục kaggle_dataset (2.485 tệp tin) mô phỏng cấu trúc tệp thực tế để đo kiểm tra toàn vẹn.</w:t>
+        <w:t>Vượt qua hộp đen toán học lý tưởng; xây dựng hệ thống an toàn đa tầng; triệt tiêu kênh kề thời gian bằng hàm hằng số (hmac.compare_digest).</w:t>
       </w:r>
     </w:p>
     <w:p>
@@ -2337,14 +2165,35 @@
           <w:color w:val="1E293B"/>
           <w:sz w:val="20"/>
         </w:rPr>
-        <w:t xml:space="preserve">– 3. Kịch bản minh họa &amp; Hoàn nguyên: </w:t>
+        <w:t xml:space="preserve">– 3. Đối thủ thế giới thực (Sec 6): </w:t>
       </w:r>
       <w:r>
         <w:rPr>
           <w:color w:val="334155"/>
           <w:sz w:val="20"/>
         </w:rPr>
-        <w:t>Red Team sửa tệp hoặc bù byte qua mặt CRC32; Blue Team phát hiện gian lận và có nút Rollback All để hoàn nguyên dữ liệu gốc an toàn.</w:t>
+        <w:t>Snowden chứng minh đối thủ thể chế (NSA) tấn công chuỗi cung ứng và cài cửa sau; cần nghiên cứu Cliptography và phân tách miền minh bạch (RFC 6962).</w:t>
+      </w:r>
+    </w:p>
+    <w:p>
+      <w:pPr>
+        <w:spacing w:before="20" w:after="40"/>
+        <w:ind w:left="504"/>
+      </w:pPr>
+      <w:r>
+        <w:rPr>
+          <w:b/>
+          <w:color w:val="1E293B"/>
+          <w:sz w:val="20"/>
+        </w:rPr>
+        <w:t xml:space="preserve">– 4. Chương trình nghiên cứu tương lai (Sec 7): </w:t>
+      </w:r>
+      <w:r>
+        <w:rPr>
+          <w:color w:val="334155"/>
+          <w:sz w:val="20"/>
+        </w:rPr>
+        <w:t>Liên ngành hóa mật mã học: kết hợp toán học, thống kê lượng hóa đối thủ, hệ thống phức hợp và triết học nhận thức.</w:t>
       </w:r>
     </w:p>
     <w:tbl>
@@ -2381,158 +2230,17 @@
                 <w:color w:val="334155"/>
                 <w:sz w:val="19"/>
               </w:rPr>
-              <w:t>Hướng dẫn thuyết minh:</w:t>
+              <w:t>Hướng dẫn thuyết minh Bảng tổng kết:</w:t>
               <w:br/>
-              <w:t>Đây là sơ đồ bố trí màn hình cho buổi Demo: màn hình phải tấn công, màn hình trái phát hiện. Nói ngắn gọn trong 20-30 giây để chuyển ngay vào màn hình Demo trực tiếp.</w:t>
-            </w:r>
-          </w:p>
-        </w:tc>
-      </w:tr>
-    </w:tbl>
-    <w:p>
-      <w:pPr>
-        <w:spacing w:before="80" w:after="200"/>
-        <w:ind w:left="288"/>
-      </w:pPr>
-      <w:r>
-        <w:rPr>
-          <w:i/>
-          <w:color w:val="94A3B8"/>
-          <w:sz w:val="18"/>
-        </w:rPr>
-        <w:t>• Ghi chú chân Slide: Sơ đồ kiến trúc diễn tập đối kháng độc lập do sinh viên thiết kế minh họa các khái niệm an ninh.</w:t>
-      </w:r>
-    </w:p>
-    <w:p>
-      <w:pPr>
-        <w:spacing w:before="240" w:after="40"/>
-      </w:pPr>
-      <w:r>
-        <w:rPr>
-          <w:b/>
-          <w:color w:val="1E40AF"/>
-          <w:sz w:val="24"/>
-        </w:rPr>
-        <w:t xml:space="preserve">► SLIDE 14: TỔNG KẾT BÁO CÁO GIỮA KỲ &amp; ĐỊNH HƯỚNG NGHIÊN CỨU </w:t>
-      </w:r>
-      <w:r>
-        <w:rPr>
-          <w:b/>
-          <w:color w:val="64748B"/>
-          <w:sz w:val="20"/>
-        </w:rPr>
-        <w:t>[0:45]</w:t>
-      </w:r>
-    </w:p>
-    <w:p>
-      <w:pPr>
-        <w:spacing w:before="20" w:after="80"/>
-        <w:ind w:left="288"/>
-      </w:pPr>
-      <w:r>
-        <w:rPr>
-          <w:i/>
-          <w:color w:val="475569"/>
-          <w:sz w:val="19"/>
-        </w:rPr>
-        <w:t>• Vị trí Slide: SECTION 7 — KẾT LUẬN &amp; THÔNG ĐIỆP HỌC THUẬT</w:t>
-        <w:br/>
-        <w:t xml:space="preserve">  Tiêu đề phụ: Tổng kết các đóng góp lý thuyết của Halpin và định hướng nghiên cứu tiếp theo</w:t>
-      </w:r>
-    </w:p>
-    <w:p>
-      <w:pPr>
-        <w:spacing w:before="40" w:after="40"/>
-        <w:ind w:left="288"/>
-      </w:pPr>
-      <w:r>
-        <w:rPr>
-          <w:b/>
-          <w:color w:val="0F172A"/>
-          <w:sz w:val="20"/>
-        </w:rPr>
-        <w:t>Nội dung hiển thị trên Slide:</w:t>
-      </w:r>
-    </w:p>
-    <w:p>
-      <w:pPr>
-        <w:spacing w:before="20" w:after="40"/>
-        <w:ind w:left="504"/>
-      </w:pPr>
-      <w:r>
-        <w:rPr>
-          <w:b/>
-          <w:color w:val="1E293B"/>
-          <w:sz w:val="20"/>
-        </w:rPr>
-        <w:t xml:space="preserve">– 1. Đóng góp bài báo (Halpin 2025): </w:t>
-      </w:r>
-      <w:r>
-        <w:rPr>
-          <w:color w:val="334155"/>
-          <w:sz w:val="20"/>
-        </w:rPr>
-        <w:t>Vượt qua sự trừu tượng hóa toán học để nhìn nhận đúng đối thủ thực tế; xác định đối thủ là tác nhân có chủ đích; mở ra chương trình nghiên cứu an ninh liên ngành.</w:t>
-      </w:r>
-    </w:p>
-    <w:p>
-      <w:pPr>
-        <w:spacing w:before="20" w:after="40"/>
-        <w:ind w:left="504"/>
-      </w:pPr>
-      <w:r>
-        <w:rPr>
-          <w:b/>
-          <w:color w:val="1E293B"/>
-          <w:sz w:val="20"/>
-        </w:rPr>
-        <w:t xml:space="preserve">– 2. Kết quả giữa kỳ &amp; Lộ trình (DT005): </w:t>
-      </w:r>
-      <w:r>
-        <w:rPr>
-          <w:color w:val="334155"/>
-          <w:sz w:val="20"/>
-        </w:rPr>
-        <w:t>Hoàn thành thẩm định bài báo gốc 17 trang; minh bạch ranh giới giữa lý thuyết và phần mềm minh họa độc lập; định hướng cuối kỳ tiếp tục nghiên cứu cấu trúc cây xác thực phân cấp.</w:t>
-      </w:r>
-    </w:p>
-    <w:tbl>
-      <w:tblPr>
-        <w:tblW w:type="auto" w:w="0"/>
-        <w:jc w:val="center"/>
-        <w:tblLook w:firstColumn="1" w:firstRow="1" w:lastColumn="0" w:lastRow="0" w:noHBand="0" w:noVBand="1" w:val="04A0"/>
-      </w:tblPr>
-      <w:tblGrid>
-        <w:gridCol w:w="9360"/>
-      </w:tblGrid>
-      <w:tr>
-        <w:tc>
-          <w:tcPr>
-            <w:tcW w:type="dxa" w:w="9360"/>
-            <w:shd w:val="clear" w:color="auto" w:fill="F1F5F9"/>
-          </w:tcPr>
-          <w:p>
-            <w:pPr>
-              <w:spacing w:before="80" w:after="80"/>
-              <w:ind w:left="144" w:right="144"/>
-            </w:pPr>
-            <w:r>
-              <w:rPr>
-                <w:b/>
-                <w:color w:val="1E40AF"/>
-                <w:sz w:val="20"/>
-              </w:rPr>
-              <w:t>💡 Hướng dẫn thuyết minh &amp; Giải thích dễ hiểu:</w:t>
+              <w:t>Bảng này đúc kết 4 trụ cột cốt lõi của toàn văn bài báo Halpin:</w:t>
               <w:br/>
-            </w:r>
-            <w:r>
-              <w:rPr>
-                <w:color w:val="334155"/>
-                <w:sz w:val="19"/>
-              </w:rPr>
-              <w:t>Tổng kết ngắn gọn:</w:t>
+              <w:t>• Trụ cột 1: Đối thủ là tác nhân có chủ đích, không phải nhiễu ngẫu nhiên.</w:t>
               <w:br/>
-              <w:t>Đề tài hoàn thành thẩm định lý thuyết bài báo và xây dựng xong bộ demo đối kháng minh họa. Cuối kỳ sẽ tập trung tối ưu hóa cấu trúc cây cho dữ liệu lớn.</w:t>
+              <w:t>• Trụ cột 2: Mật mã học trên giấy không bảo vệ được trước các đòn tấn công kênh kề vật lý.</w:t>
+              <w:br/>
+              <w:t>• Trụ cột 3: Đối thủ thể chế tấn công vào chuỗi cung ứng chứ không phá toán học.</w:t>
+              <w:br/>
+              <w:t>• Trụ cột 4: Mật mã học tương lai cần liên ngành với thống kê và triết học.</w:t>
             </w:r>
           </w:p>
         </w:tc>
@@ -2562,7 +2270,7 @@
           <w:color w:val="1E40AF"/>
           <w:sz w:val="24"/>
         </w:rPr>
-        <w:t xml:space="preserve">► SLIDE 15: CẢM ƠN &amp; PHIÊN PHẢN BIỆN (Q&amp;A) </w:t>
+        <w:t xml:space="preserve">► SLIDE 13: CẢM ƠN &amp; PHIÊN PHẢN BIỆN (Q&amp;A) </w:t>
       </w:r>
       <w:r>
         <w:rPr>
@@ -2799,7 +2507,7 @@
         <w:br/>
         <w:t>Bấm 'Nạp &amp; Tính toán Toàn vẹn'. Hệ thống sinh Root Hash ban đầu H_0 sạch với trạng thái xanh: '100% NGUYÊN VẸN'.</w:t>
         <w:br/>
-        <w:t>Ý nghĩa: Minh họa việc thiết lập trạng thái tin cậy khách quan theo Dretske.</w:t>
+        <w:t>Điểm nói lý thuyết (Paper-to-Code): Minh họa việc thiết lập trạng thái tin cậy khách quan theo Dretske. Hệ thống áp dụng chuẩn RFC 6962 (tiền tố 0x00 cho lá, 0x01 cho nhánh) khi băm cây dữ liệu, giải quyết triệt để điểm mù nhập nhằng cấu trúc dữ liệu mà Halpin cảnh báo tại Mục 5.</w:t>
       </w:r>
     </w:p>
     <w:p>
@@ -2869,7 +2577,7 @@
         <w:br/>
         <w:t>• Ngược lại, hàm băm SHA-256 phát hiện gian lận ngay lập tức nhờ tính phi tuyến.</w:t>
         <w:br/>
-        <w:t>Ý nghĩa: Phân biệt rõ mã phát hiện lỗi ngẫu nhiên và mật mã học trước đối thủ có chủ đích.</w:t>
+        <w:t>Điểm nói lý thuyết (Paper-to-Code): Minh họa trực tiếp luận điểm Halpin (Mục 1 &amp; 2): Mã kiểm tra tuyến tính (CRC32) chỉ bắt được nhiễu ngẫu nhiên trong truyền dẫn, hoàn toàn bất lực trước kẻ thù có chủ đích. Ngược lại, hàm băm mật mã SHA-256 có tính phi tuyến và hiệu ứng tuyết lở (~50% bit đảo khi sửa 1 bit), ngăn chặn kẻ thù bẻ gãy bằng đại số.</w:t>
       </w:r>
     </w:p>
     <w:p>
@@ -2927,7 +2635,7 @@
         <w:br/>
         <w:t xml:space="preserve">   Lệnh: python -m src.proposed_model.security_games</w:t>
         <w:br/>
-        <w:t xml:space="preserve">   Kết quả: Đo đạc tính phi tuyến của SHA-256, hiệu ứng tuyết lở SAC ~50%, kịch bản bẻ gãy mã tuyến tính CRC32 trên GF(2), và kênh kề thời gian so sánh chuỗi.</w:t>
+        <w:t xml:space="preserve">   Kết quả &amp; Điểm nói lý thuyết: Đo đạc tính phi tuyến của SHA-256, hiệu ứng tuyết lở SAC ~50%, kịch bản bẻ gãy mã tuyến tính CRC32 trên GF(2), và kiểm chứng rò rỉ kênh kề thời gian (Kocher 1996 - Mục 5 bài báo) khi so sánh chuỗi ngắt sớm so với hàm thời gian hằng số hmac.compare_digest.</w:t>
         <w:br/>
         <w:br/>
         <w:t>2. Diễn tập 2 Terminal Red Team vs Blue Team:</w:t>

</xml_diff>

<commit_message>
Streamline slide 12 table text, attach speaking expansions directly to slide bullets, and make slide 10 script read directly into the architecture diagram
</commit_message>
<xml_diff>
--- a/Kich_Ban_Thuyet_Trinh_Va_Demo_DT005.docx
+++ b/Kich_Ban_Thuyet_Trinh_Va_Demo_DT005.docx
@@ -80,7 +80,7 @@
           <w:color w:val="1E40AF"/>
           <w:sz w:val="27"/>
         </w:rPr>
-        <w:t>PHẦN 1: NỘI DUNG TRÊN SLIDE &amp; HƯỚNG DẪN GIẢI THÍCH DỄ HIỂU (15 SLIDE)</w:t>
+        <w:t>PHẦN 1: NỘI DUNG TRÊN SLIDE &amp; KỊCH BẢN THUYẾT MINH CHI TIẾT (13 SLIDE)</w:t>
       </w:r>
     </w:p>
     <w:p>
@@ -131,18 +131,18 @@
           <w:color w:val="0F172A"/>
           <w:sz w:val="20"/>
         </w:rPr>
-        <w:t>Nội dung hiển thị trên Slide:</w:t>
+        <w:t>Nội dung Slide &amp; Kịch bản thuyết minh liền mạch:</w:t>
       </w:r>
     </w:p>
     <w:p>
       <w:pPr>
-        <w:spacing w:before="20" w:after="40"/>
-        <w:ind w:left="504"/>
+        <w:spacing w:before="60" w:after="20"/>
+        <w:ind w:left="360"/>
       </w:pPr>
       <w:r>
         <w:rPr>
           <w:b/>
-          <w:color w:val="1E293B"/>
+          <w:color w:val="0F172A"/>
           <w:sz w:val="20"/>
         </w:rPr>
         <w:t xml:space="preserve">– Tên đề tài: </w:t>
@@ -157,13 +157,35 @@
     </w:p>
     <w:p>
       <w:pPr>
-        <w:spacing w:before="20" w:after="40"/>
-        <w:ind w:left="504"/>
+        <w:spacing w:before="0" w:after="80"/>
+        <w:ind w:left="648"/>
       </w:pPr>
       <w:r>
         <w:rPr>
           <w:b/>
-          <w:color w:val="1E293B"/>
+          <w:color w:val="1E40AF"/>
+          <w:sz w:val="19"/>
+        </w:rPr>
+        <w:t xml:space="preserve">↳ Thuyết minh / Mở rộng: </w:t>
+      </w:r>
+      <w:r>
+        <w:rPr>
+          <w:i/>
+          <w:color w:val="475569"/>
+          <w:sz w:val="19"/>
+        </w:rPr>
+        <w:t>Kính thưa Thầy và các bạn, hôm nay nhóm xin báo cáo đồ án giữa kỳ với 2 phần trọng tâm: (1) Thẩm định học thuật bài báo của TS. Harry Halpin và (2) Diễn tập hệ thống kiểm tra toàn vẹn dữ liệu thực tế.</w:t>
+      </w:r>
+    </w:p>
+    <w:p>
+      <w:pPr>
+        <w:spacing w:before="60" w:after="20"/>
+        <w:ind w:left="360"/>
+      </w:pPr>
+      <w:r>
+        <w:rPr>
+          <w:b/>
+          <w:color w:val="0F172A"/>
           <w:sz w:val="20"/>
         </w:rPr>
         <w:t xml:space="preserve">– Bài báo khảo sát: </w:t>
@@ -178,13 +200,35 @@
     </w:p>
     <w:p>
       <w:pPr>
-        <w:spacing w:before="20" w:after="40"/>
-        <w:ind w:left="504"/>
+        <w:spacing w:before="0" w:after="80"/>
+        <w:ind w:left="648"/>
       </w:pPr>
       <w:r>
         <w:rPr>
           <w:b/>
-          <w:color w:val="1E293B"/>
+          <w:color w:val="1E40AF"/>
+          <w:sz w:val="19"/>
+        </w:rPr>
+        <w:t xml:space="preserve">↳ Thuyết minh / Mở rộng: </w:t>
+      </w:r>
+      <w:r>
+        <w:rPr>
+          <w:i/>
+          <w:color w:val="475569"/>
+          <w:sz w:val="19"/>
+        </w:rPr>
+        <w:t>Đây là công trình khảo cứu nhận thức luận mới nhất về mô hình đối thủ trong mật mã học hiện đại.</w:t>
+      </w:r>
+    </w:p>
+    <w:p>
+      <w:pPr>
+        <w:spacing w:before="60" w:after="20"/>
+        <w:ind w:left="360"/>
+      </w:pPr>
+      <w:r>
+        <w:rPr>
+          <w:b/>
+          <w:color w:val="0F172A"/>
           <w:sz w:val="20"/>
         </w:rPr>
         <w:t xml:space="preserve">– Thông tin thực hiện: </w:t>
@@ -197,51 +241,31 @@
         <w:t>Học phần: An toàn và bảo mật hệ thống thông tin | GVHD: ThS. Phạm Trọng Huynh | SVTH: Võ Anh Kiệt — MSSV: 1150080143.</w:t>
       </w:r>
     </w:p>
-    <w:tbl>
-      <w:tblPr>
-        <w:tblW w:type="auto" w:w="0"/>
-        <w:jc w:val="center"/>
-        <w:tblLook w:firstColumn="1" w:firstRow="1" w:lastColumn="0" w:lastRow="0" w:noHBand="0" w:noVBand="1" w:val="04A0"/>
-      </w:tblPr>
-      <w:tblGrid>
-        <w:gridCol w:w="9360"/>
-      </w:tblGrid>
-      <w:tr>
-        <w:tc>
-          <w:tcPr>
-            <w:tcW w:type="dxa" w:w="9360"/>
-            <w:shd w:val="clear" w:color="auto" w:fill="F1F5F9"/>
-          </w:tcPr>
-          <w:p>
-            <w:pPr>
-              <w:spacing w:before="80" w:after="80"/>
-              <w:ind w:left="144" w:right="144"/>
-            </w:pPr>
-            <w:r>
-              <w:rPr>
-                <w:b/>
-                <w:color w:val="1E40AF"/>
-                <w:sz w:val="20"/>
-              </w:rPr>
-              <w:t>💡 Hướng dẫn thuyết minh &amp; Giải thích dễ hiểu:</w:t>
-              <w:br/>
-            </w:r>
-            <w:r>
-              <w:rPr>
-                <w:color w:val="334155"/>
-                <w:sz w:val="19"/>
-              </w:rPr>
-              <w:t>Mở đầu báo cáo:</w:t>
-              <w:br/>
-              <w:t>Báo cáo gồm 2 phần: (1) Thẩm định bài báo của TS. Harry Halpin về mô hình đối thủ trong mật mã học; (2) Trình diễn hệ thống demo kiểm tra toàn vẹn tệp tin để minh họa thực tế cho các luận điểm của tác giả.</w:t>
-            </w:r>
-          </w:p>
-        </w:tc>
-      </w:tr>
-    </w:tbl>
     <w:p>
       <w:pPr>
-        <w:spacing w:before="80" w:after="200"/>
+        <w:spacing w:before="0" w:after="80"/>
+        <w:ind w:left="648"/>
+      </w:pPr>
+      <w:r>
+        <w:rPr>
+          <w:b/>
+          <w:color w:val="1E40AF"/>
+          <w:sz w:val="19"/>
+        </w:rPr>
+        <w:t xml:space="preserve">↳ Thuyết minh / Mở rộng: </w:t>
+      </w:r>
+      <w:r>
+        <w:rPr>
+          <w:i/>
+          <w:color w:val="475569"/>
+          <w:sz w:val="19"/>
+        </w:rPr>
+        <w:t>Sau đây em xin phép được bắt đầu phần nội dung báo cáo.</w:t>
+      </w:r>
+    </w:p>
+    <w:p>
+      <w:pPr>
+        <w:spacing w:before="60" w:after="200"/>
         <w:ind w:left="288"/>
       </w:pPr>
       <w:r>
@@ -301,18 +325,18 @@
           <w:color w:val="0F172A"/>
           <w:sz w:val="20"/>
         </w:rPr>
-        <w:t>Nội dung hiển thị trên Slide:</w:t>
+        <w:t>Nội dung Slide &amp; Kịch bản thuyết minh liền mạch:</w:t>
       </w:r>
     </w:p>
     <w:p>
       <w:pPr>
-        <w:spacing w:before="20" w:after="40"/>
-        <w:ind w:left="504"/>
+        <w:spacing w:before="60" w:after="20"/>
+        <w:ind w:left="360"/>
       </w:pPr>
       <w:r>
         <w:rPr>
           <w:b/>
-          <w:color w:val="1E293B"/>
+          <w:color w:val="0F172A"/>
           <w:sz w:val="20"/>
         </w:rPr>
         <w:t xml:space="preserve">– 1. Bối cảnh mật mã học: </w:t>
@@ -322,18 +346,40 @@
           <w:color w:val="334155"/>
           <w:sz w:val="20"/>
         </w:rPr>
-        <w:t>Khoa học về truyền thông bí mật khi có đối thủ có chủ đích trên môi trường mạng mở.</w:t>
+        <w:t>Khoa học về truyền thông bí mật khi có sự hiện diện của đối thủ có chủ đích trên môi trường mạng mở.</w:t>
       </w:r>
     </w:p>
     <w:p>
       <w:pPr>
-        <w:spacing w:before="20" w:after="40"/>
-        <w:ind w:left="504"/>
+        <w:spacing w:before="0" w:after="80"/>
+        <w:ind w:left="648"/>
       </w:pPr>
       <w:r>
         <w:rPr>
           <w:b/>
-          <w:color w:val="1E293B"/>
+          <w:color w:val="1E40AF"/>
+          <w:sz w:val="19"/>
+        </w:rPr>
+        <w:t xml:space="preserve">↳ Thuyết minh / Mở rộng: </w:t>
+      </w:r>
+      <w:r>
+        <w:rPr>
+          <w:i/>
+          <w:color w:val="475569"/>
+          <w:sz w:val="19"/>
+        </w:rPr>
+        <w:t>Mật mã học không chỉ là mã hóa dữ liệu đơn thuần, mà cốt lõi là giải quyết bài toán giao tiếp an toàn trước các đối thủ luôn tìm cách nghe lén và can thiệp.</w:t>
+      </w:r>
+    </w:p>
+    <w:p>
+      <w:pPr>
+        <w:spacing w:before="60" w:after="20"/>
+        <w:ind w:left="360"/>
+      </w:pPr>
+      <w:r>
+        <w:rPr>
+          <w:b/>
+          <w:color w:val="0F172A"/>
           <w:sz w:val="20"/>
         </w:rPr>
         <w:t xml:space="preserve">– 2. Nghịch lý nhận thức luận: </w:t>
@@ -348,13 +394,35 @@
     </w:p>
     <w:p>
       <w:pPr>
-        <w:spacing w:before="20" w:after="40"/>
-        <w:ind w:left="504"/>
+        <w:spacing w:before="0" w:after="80"/>
+        <w:ind w:left="648"/>
       </w:pPr>
       <w:r>
         <w:rPr>
           <w:b/>
-          <w:color w:val="1E293B"/>
+          <w:color w:val="1E40AF"/>
+          <w:sz w:val="19"/>
+        </w:rPr>
+        <w:t xml:space="preserve">↳ Thuyết minh / Mở rộng: </w:t>
+      </w:r>
+      <w:r>
+        <w:rPr>
+          <w:i/>
+          <w:color w:val="475569"/>
+          <w:sz w:val="19"/>
+        </w:rPr>
+        <w:t>Triết học bàn luận rất sâu về thông tin, nhưng lại bỏ quên mật mã học — cái nôi thực sự của bảo mật thông tin. Halpin viết bài báo này để lấp đầy khoảng trống đó.</w:t>
+      </w:r>
+    </w:p>
+    <w:p>
+      <w:pPr>
+        <w:spacing w:before="60" w:after="20"/>
+        <w:ind w:left="360"/>
+      </w:pPr>
+      <w:r>
+        <w:rPr>
+          <w:b/>
+          <w:color w:val="0F172A"/>
           <w:sz w:val="20"/>
         </w:rPr>
         <w:t xml:space="preserve">– 3. Cái giá của sự trừu tượng hóa: </w:t>
@@ -369,13 +437,35 @@
     </w:p>
     <w:p>
       <w:pPr>
-        <w:spacing w:before="20" w:after="40"/>
-        <w:ind w:left="504"/>
+        <w:spacing w:before="0" w:after="80"/>
+        <w:ind w:left="648"/>
       </w:pPr>
       <w:r>
         <w:rPr>
           <w:b/>
-          <w:color w:val="1E293B"/>
+          <w:color w:val="1E40AF"/>
+          <w:sz w:val="19"/>
+        </w:rPr>
+        <w:t xml:space="preserve">↳ Thuyết minh / Mở rộng: </w:t>
+      </w:r>
+      <w:r>
+        <w:rPr>
+          <w:i/>
+          <w:color w:val="475569"/>
+          <w:sz w:val="19"/>
+        </w:rPr>
+        <w:t>Nếu chỉ coi an toàn là công thức toán học thì hệ thống sẽ gặp nguy hiểm, vì ngoài đời kẻ tấn công không cần giải toán mà tấn công vào thời gian xử lý, bộ nhớ đệm hay lỗi phần mềm.</w:t>
+      </w:r>
+    </w:p>
+    <w:p>
+      <w:pPr>
+        <w:spacing w:before="60" w:after="20"/>
+        <w:ind w:left="360"/>
+      </w:pPr>
+      <w:r>
+        <w:rPr>
+          <w:b/>
+          <w:color w:val="0F172A"/>
           <w:sz w:val="20"/>
         </w:rPr>
         <w:t xml:space="preserve">– 4. Ba đóng góp học thuật của Halpin: </w:t>
@@ -385,56 +475,34 @@
           <w:color w:val="334155"/>
           <w:sz w:val="20"/>
         </w:rPr>
-        <w:t>Hệ thống hóa lịch sử các mô hình đối thủ; Phê phán giới hạn của việc toán học hóa; Đề xuất 4 câu hỏi nghiên cứu mở kết hợp liên ngành.</w:t>
+        <w:t>Hệ thống hóa lịch sử các mô hình đối thủ; Phê phán giới hạn toán học hóa; Đề xuất 4 câu hỏi nghiên cứu mở kết hợp liên ngành.</w:t>
       </w:r>
     </w:p>
-    <w:tbl>
-      <w:tblPr>
-        <w:tblW w:type="auto" w:w="0"/>
-        <w:jc w:val="center"/>
-        <w:tblLook w:firstColumn="1" w:firstRow="1" w:lastColumn="0" w:lastRow="0" w:noHBand="0" w:noVBand="1" w:val="04A0"/>
-      </w:tblPr>
-      <w:tblGrid>
-        <w:gridCol w:w="9360"/>
-      </w:tblGrid>
-      <w:tr>
-        <w:tc>
-          <w:tcPr>
-            <w:tcW w:type="dxa" w:w="9360"/>
-            <w:shd w:val="clear" w:color="auto" w:fill="F1F5F9"/>
-          </w:tcPr>
-          <w:p>
-            <w:pPr>
-              <w:spacing w:before="80" w:after="80"/>
-              <w:ind w:left="144" w:right="144"/>
-            </w:pPr>
-            <w:r>
-              <w:rPr>
-                <w:b/>
-                <w:color w:val="1E40AF"/>
-                <w:sz w:val="20"/>
-              </w:rPr>
-              <w:t>💡 Hướng dẫn thuyết minh &amp; Giải thích dễ hiểu:</w:t>
-              <w:br/>
-            </w:r>
-            <w:r>
-              <w:rPr>
-                <w:color w:val="334155"/>
-                <w:sz w:val="19"/>
-              </w:rPr>
-              <w:t>Giải thích ngắn gọn:</w:t>
-              <w:br/>
-              <w:t>• Nghịch lý nhận thức luận: Triết học nghiên cứu nhiều về lý thuyết thông tin, nhưng lại bỏ quên mật mã học — nơi thực sự giải quyết bài toán truyền tin khi có đối thủ theo dõi. Halpin đặt vấn đề để lấp khoảng trống này.</w:t>
-              <w:br/>
-              <w:t>• Cái giá của sự trừu tượng hóa: Xem an toàn chỉ là công thức toán trên giấy sẽ bỏ sót thực tế. Kẻ tấn công ngoài đời không cần bẻ toán, mà đo thời gian xử lý hoặc mức tiêu thụ điện của thiết bị để tìm khóa.</w:t>
-            </w:r>
-          </w:p>
-        </w:tc>
-      </w:tr>
-    </w:tbl>
     <w:p>
       <w:pPr>
-        <w:spacing w:before="80" w:after="200"/>
+        <w:spacing w:before="0" w:after="80"/>
+        <w:ind w:left="648"/>
+      </w:pPr>
+      <w:r>
+        <w:rPr>
+          <w:b/>
+          <w:color w:val="1E40AF"/>
+          <w:sz w:val="19"/>
+        </w:rPr>
+        <w:t xml:space="preserve">↳ Thuyết minh / Mở rộng: </w:t>
+      </w:r>
+      <w:r>
+        <w:rPr>
+          <w:i/>
+          <w:color w:val="475569"/>
+          <w:sz w:val="19"/>
+        </w:rPr>
+        <w:t>Halpin giúp chúng ta nhìn nhận đúng bản chất của đối thủ thực tế thay vì các giả định toán học lý tưởng.</w:t>
+      </w:r>
+    </w:p>
+    <w:p>
+      <w:pPr>
+        <w:spacing w:before="60" w:after="200"/>
         <w:ind w:left="288"/>
       </w:pPr>
       <w:r>
@@ -494,18 +562,18 @@
           <w:color w:val="0F172A"/>
           <w:sz w:val="20"/>
         </w:rPr>
-        <w:t>Nội dung hiển thị trên Slide:</w:t>
+        <w:t>Nội dung Slide &amp; Kịch bản thuyết minh liền mạch:</w:t>
       </w:r>
     </w:p>
     <w:p>
       <w:pPr>
-        <w:spacing w:before="20" w:after="40"/>
-        <w:ind w:left="504"/>
+        <w:spacing w:before="60" w:after="20"/>
+        <w:ind w:left="360"/>
       </w:pPr>
       <w:r>
         <w:rPr>
           <w:b/>
-          <w:color w:val="1E293B"/>
+          <w:color w:val="0F172A"/>
           <w:sz w:val="20"/>
         </w:rPr>
         <w:t xml:space="preserve">– 1. Bản thể học thông tin (Brian Cantwell Smith): </w:t>
@@ -520,13 +588,35 @@
     </w:p>
     <w:p>
       <w:pPr>
-        <w:spacing w:before="20" w:after="40"/>
-        <w:ind w:left="504"/>
+        <w:spacing w:before="0" w:after="80"/>
+        <w:ind w:left="648"/>
       </w:pPr>
       <w:r>
         <w:rPr>
           <w:b/>
-          <w:color w:val="1E293B"/>
+          <w:color w:val="1E40AF"/>
+          <w:sz w:val="19"/>
+        </w:rPr>
+        <w:t xml:space="preserve">↳ Thuyết minh / Mở rộng: </w:t>
+      </w:r>
+      <w:r>
+        <w:rPr>
+          <w:i/>
+          <w:color w:val="475569"/>
+          <w:sz w:val="19"/>
+        </w:rPr>
+        <w:t>Dữ liệu truyền đi vốn là dòng liên tục; để bảo vệ, hệ thống phải phân định rạch ròi đâu là Bản rõ (M), Bản mã (C) và Khóa (K).</w:t>
+      </w:r>
+    </w:p>
+    <w:p>
+      <w:pPr>
+        <w:spacing w:before="60" w:after="20"/>
+        <w:ind w:left="360"/>
+      </w:pPr>
+      <w:r>
+        <w:rPr>
+          <w:b/>
+          <w:color w:val="0F172A"/>
           <w:sz w:val="20"/>
         </w:rPr>
         <w:t xml:space="preserve">– 2. Thuyết thông tin khách quan (Fred Dretske): </w:t>
@@ -541,13 +631,35 @@
     </w:p>
     <w:p>
       <w:pPr>
-        <w:spacing w:before="20" w:after="40"/>
-        <w:ind w:left="504"/>
+        <w:spacing w:before="0" w:after="80"/>
+        <w:ind w:left="648"/>
       </w:pPr>
       <w:r>
         <w:rPr>
           <w:b/>
-          <w:color w:val="1E293B"/>
+          <w:color w:val="1E40AF"/>
+          <w:sz w:val="19"/>
+        </w:rPr>
+        <w:t xml:space="preserve">↳ Thuyết minh / Mở rộng: </w:t>
+      </w:r>
+      <w:r>
+        <w:rPr>
+          <w:i/>
+          <w:color w:val="475569"/>
+          <w:sz w:val="19"/>
+        </w:rPr>
+        <w:t>Thông tin tồn tại độc lập với người nhận (như tiếng sấm báo trời mưa). Hệ mật tốt là hệ mật biến bản mã thành chuỗi ngẫu nhiên, không để lộ bất kỳ thông tin gì về bản rõ gốc.</w:t>
+      </w:r>
+    </w:p>
+    <w:p>
+      <w:pPr>
+        <w:spacing w:before="60" w:after="20"/>
+        <w:ind w:left="360"/>
+      </w:pPr>
+      <w:r>
+        <w:rPr>
+          <w:b/>
+          <w:color w:val="0F172A"/>
           <w:sz w:val="20"/>
         </w:rPr>
         <w:t xml:space="preserve">– 3. Bản chất của đối thủ: </w:t>
@@ -557,85 +669,77 @@
           <w:color w:val="334155"/>
           <w:sz w:val="20"/>
         </w:rPr>
-        <w:t>Đối thủ là tác nhân có chủ đích (intentional agent), có mục tiêu rõ ràng, khác với nhiễu ngẫu nhiên vật lý.</w:t>
+        <w:t>Đối thủ là tác nhân có chủ đích (intentional agent), có mục tiêu rõ ràng, khác biệt hoàn toàn với nhiễu ngẫu nhiên vật lý.</w:t>
       </w:r>
     </w:p>
     <w:p>
       <w:pPr>
-        <w:spacing w:before="20" w:after="40"/>
-        <w:ind w:left="504"/>
+        <w:spacing w:before="0" w:after="80"/>
+        <w:ind w:left="648"/>
       </w:pPr>
       <w:r>
         <w:rPr>
           <w:b/>
-          <w:color w:val="1E293B"/>
+          <w:color w:val="1E40AF"/>
+          <w:sz w:val="19"/>
+        </w:rPr>
+        <w:t xml:space="preserve">↳ Thuyết minh / Mở rộng: </w:t>
+      </w:r>
+      <w:r>
+        <w:rPr>
+          <w:i/>
+          <w:color w:val="475569"/>
+          <w:sz w:val="19"/>
+        </w:rPr>
+        <w:t>Đây là điểm then chốt: Nhiễu ngẫu nhiên chỉ làm sai lệch bit vô tình, còn kẻ thù có chủ đích sẽ chủ động tính toán để đánh lừa hệ thống.</w:t>
+      </w:r>
+    </w:p>
+    <w:p>
+      <w:pPr>
+        <w:spacing w:before="60" w:after="20"/>
+        <w:ind w:left="360"/>
+      </w:pPr>
+      <w:r>
+        <w:rPr>
+          <w:b/>
+          <w:color w:val="0F172A"/>
           <w:sz w:val="20"/>
         </w:rPr>
-        <w:t xml:space="preserve">– 4. Bản chất của Bí mật &amp; Tri thức: </w:t>
+        <w:t xml:space="preserve">– 4. Bản chất của Bí mật &amp; Tri thức (David Lewis): </w:t>
       </w:r>
       <w:r>
         <w:rPr>
           <w:color w:val="334155"/>
           <w:sz w:val="20"/>
         </w:rPr>
-        <w:t>Common Knowledge (David Lewis): Mọi người cùng biết và biết người khác cũng biết. Public Knowledge: Thông tin ai cũng có thể tiếp cận. Bí mật là 'tri thức không phổ biến', không đồng nhất với bản rõ hay bản mã.</w:t>
+        <w:t>Common Knowledge là tri thức chung mọi người cùng biết; Public Knowledge là công khai; Bí mật là 'tri thức không phổ biến'.</w:t>
       </w:r>
     </w:p>
-    <w:tbl>
-      <w:tblPr>
-        <w:tblW w:type="auto" w:w="0"/>
-        <w:jc w:val="center"/>
-        <w:tblLook w:firstColumn="1" w:firstRow="1" w:lastColumn="0" w:lastRow="0" w:noHBand="0" w:noVBand="1" w:val="04A0"/>
-      </w:tblPr>
-      <w:tblGrid>
-        <w:gridCol w:w="9360"/>
-      </w:tblGrid>
-      <w:tr>
-        <w:tc>
-          <w:tcPr>
-            <w:tcW w:type="dxa" w:w="9360"/>
-            <w:shd w:val="clear" w:color="auto" w:fill="F1F5F9"/>
-          </w:tcPr>
-          <w:p>
-            <w:pPr>
-              <w:spacing w:before="80" w:after="80"/>
-              <w:ind w:left="144" w:right="144"/>
-            </w:pPr>
-            <w:r>
-              <w:rPr>
-                <w:b/>
-                <w:color w:val="1E40AF"/>
-                <w:sz w:val="20"/>
-              </w:rPr>
-              <w:t>💡 Hướng dẫn thuyết minh &amp; Giải thích dễ hiểu:</w:t>
-              <w:br/>
-            </w:r>
-            <w:r>
-              <w:rPr>
-                <w:color w:val="334155"/>
-                <w:sz w:val="19"/>
-              </w:rPr>
-              <w:t>Giải thích ngắn gọn:</w:t>
-              <w:br/>
-              <w:t>• Đăng ký đối tượng (Smith): Dữ liệu truyền đi vốn là dòng liên tục. Để bảo vệ, hệ thống phải phân định rõ từng phần: Bản rõ (M), Bản mã (C), Khóa (K). Có phân định rõ thì hệ thống mới kiểm soát được luồng bảo mật.</w:t>
-              <w:br/>
-              <w:t>• Thông tin khách quan (Dretske): Thông tin tồn tại độc lập với người nhận (như tiếng sấm báo trời mưa). Bản rõ mang thông tin gốc; khi mã hóa tốt, bản mã trở thành chuỗi ngẫu nhiên không để lộ thông tin về nguồn.</w:t>
-              <w:br/>
-              <w:t>• Common Knowledge vs Public Knowledge (Lewis 1969):</w:t>
-              <w:br/>
-              <w:t xml:space="preserve">  - Tri thức chung (Common Knowledge): Mọi người cùng biết một thông tin và biết người khác cũng biết (như luật đèn đỏ, ai cũng biết và tin người khác cũng tuân thủ).</w:t>
-              <w:br/>
-              <w:t xml:space="preserve">  - Tri thức công khai (Public Knowledge): Thông tin bất kỳ ai cũng có thể tiếp cận (như tài liệu bị rò rỉ lên mạng).</w:t>
-              <w:br/>
-              <w:t xml:space="preserve">  - Bí mật: Là 'tri thức không phổ biến', chỉ lưu hành trong nhóm nhất định, không để lộ ra ngoài.</w:t>
-            </w:r>
-          </w:p>
-        </w:tc>
-      </w:tr>
-    </w:tbl>
     <w:p>
       <w:pPr>
-        <w:spacing w:before="80" w:after="200"/>
+        <w:spacing w:before="0" w:after="80"/>
+        <w:ind w:left="648"/>
+      </w:pPr>
+      <w:r>
+        <w:rPr>
+          <w:b/>
+          <w:color w:val="1E40AF"/>
+          <w:sz w:val="19"/>
+        </w:rPr>
+        <w:t xml:space="preserve">↳ Thuyết minh / Mở rộng: </w:t>
+      </w:r>
+      <w:r>
+        <w:rPr>
+          <w:i/>
+          <w:color w:val="475569"/>
+          <w:sz w:val="19"/>
+        </w:rPr>
+        <w:t>Tri thức chung là điều ai cũng biết và biết người khác cũng biết (như đèn đỏ dừng lại). Bí mật là tri thức chỉ lưu hành nội bộ, không thuộc về số đông.</w:t>
+      </w:r>
+    </w:p>
+    <w:p>
+      <w:pPr>
+        <w:spacing w:before="60" w:after="200"/>
         <w:ind w:left="288"/>
       </w:pPr>
       <w:r>
@@ -695,21 +799,21 @@
           <w:color w:val="0F172A"/>
           <w:sz w:val="20"/>
         </w:rPr>
-        <w:t>Nội dung hiển thị trên Slide:</w:t>
+        <w:t>Nội dung Slide &amp; Kịch bản thuyết minh liền mạch:</w:t>
       </w:r>
     </w:p>
     <w:p>
       <w:pPr>
-        <w:spacing w:before="20" w:after="40"/>
-        <w:ind w:left="504"/>
+        <w:spacing w:before="60" w:after="20"/>
+        <w:ind w:left="360"/>
       </w:pPr>
       <w:r>
         <w:rPr>
           <w:b/>
-          <w:color w:val="1E293B"/>
+          <w:color w:val="0F172A"/>
           <w:sz w:val="20"/>
         </w:rPr>
-        <w:t xml:space="preserve">– Giai đoạn 1 (1948–1949) — Mô hình Shannon: </w:t>
+        <w:t xml:space="preserve">– 1. Giai đoạn 1 (1948–1949) — Mô hình Shannon: </w:t>
       </w:r>
       <w:r>
         <w:rPr>
@@ -721,16 +825,38 @@
     </w:p>
     <w:p>
       <w:pPr>
-        <w:spacing w:before="20" w:after="40"/>
-        <w:ind w:left="504"/>
+        <w:spacing w:before="0" w:after="80"/>
+        <w:ind w:left="648"/>
       </w:pPr>
       <w:r>
         <w:rPr>
           <w:b/>
-          <w:color w:val="1E293B"/>
+          <w:color w:val="1E40AF"/>
+          <w:sz w:val="19"/>
+        </w:rPr>
+        <w:t xml:space="preserve">↳ Thuyết minh / Mở rộng: </w:t>
+      </w:r>
+      <w:r>
+        <w:rPr>
+          <w:i/>
+          <w:color w:val="475569"/>
+          <w:sz w:val="19"/>
+        </w:rPr>
+        <w:t>Shannon đặt nền móng toán học cho mật mã, chứng minh an toàn tuyệt đối là One-Time Pad, nhưng chỉ áp dụng trên giấy.</w:t>
+      </w:r>
+    </w:p>
+    <w:p>
+      <w:pPr>
+        <w:spacing w:before="60" w:after="20"/>
+        <w:ind w:left="360"/>
+      </w:pPr>
+      <w:r>
+        <w:rPr>
+          <w:b/>
+          <w:color w:val="0F172A"/>
           <w:sz w:val="20"/>
         </w:rPr>
-        <w:t xml:space="preserve">– Giai đoạn 2 (1976) — Cách mạng Khóa công khai: </w:t>
+        <w:t xml:space="preserve">– 2. Giai đoạn 2 (1976) — Cách mạng Khóa công khai: </w:t>
       </w:r>
       <w:r>
         <w:rPr>
@@ -742,16 +868,38 @@
     </w:p>
     <w:p>
       <w:pPr>
-        <w:spacing w:before="20" w:after="40"/>
-        <w:ind w:left="504"/>
+        <w:spacing w:before="0" w:after="80"/>
+        <w:ind w:left="648"/>
       </w:pPr>
       <w:r>
         <w:rPr>
           <w:b/>
-          <w:color w:val="1E293B"/>
+          <w:color w:val="1E40AF"/>
+          <w:sz w:val="19"/>
+        </w:rPr>
+        <w:t xml:space="preserve">↳ Thuyết minh / Mở rộng: </w:t>
+      </w:r>
+      <w:r>
+        <w:rPr>
+          <w:i/>
+          <w:color w:val="475569"/>
+          <w:sz w:val="19"/>
+        </w:rPr>
+        <w:t>Bước ngoặt lịch sử giúp hai bên trao đổi thông tin bí mật mà không cần gửi khóa tận tay trước.</w:t>
+      </w:r>
+    </w:p>
+    <w:p>
+      <w:pPr>
+        <w:spacing w:before="60" w:after="20"/>
+        <w:ind w:left="360"/>
+      </w:pPr>
+      <w:r>
+        <w:rPr>
+          <w:b/>
+          <w:color w:val="0F172A"/>
           <w:sz w:val="20"/>
         </w:rPr>
-        <w:t xml:space="preserve">– Giai đoạn 3 (1982–1984) — PPT Adversary &amp; Security Games: </w:t>
+        <w:t xml:space="preserve">– 3. Giai đoạn 3 (1982–1984) — PPT Adversary &amp; Security Games: </w:t>
       </w:r>
       <w:r>
         <w:rPr>
@@ -763,16 +911,38 @@
     </w:p>
     <w:p>
       <w:pPr>
-        <w:spacing w:before="20" w:after="40"/>
-        <w:ind w:left="504"/>
+        <w:spacing w:before="0" w:after="80"/>
+        <w:ind w:left="648"/>
       </w:pPr>
       <w:r>
         <w:rPr>
           <w:b/>
-          <w:color w:val="1E293B"/>
+          <w:color w:val="1E40AF"/>
+          <w:sz w:val="19"/>
+        </w:rPr>
+        <w:t xml:space="preserve">↳ Thuyết minh / Mở rộng: </w:t>
+      </w:r>
+      <w:r>
+        <w:rPr>
+          <w:i/>
+          <w:color w:val="475569"/>
+          <w:sz w:val="19"/>
+        </w:rPr>
+        <w:t>Thay vì an toàn tuyệt đối, khoa học chuyển sang an toàn tính toán: đối thủ có siêu máy tính cũng không thể giải được bài toán trong thời gian đa thức.</w:t>
+      </w:r>
+    </w:p>
+    <w:p>
+      <w:pPr>
+        <w:spacing w:before="60" w:after="20"/>
+        <w:ind w:left="360"/>
+      </w:pPr>
+      <w:r>
+        <w:rPr>
+          <w:b/>
+          <w:color w:val="0F172A"/>
           <w:sz w:val="20"/>
         </w:rPr>
-        <w:t xml:space="preserve">– Giai đoạn 4 (1981–1993) — Dolev-Yao &amp; Random Oracle: </w:t>
+        <w:t xml:space="preserve">– 4. Giai đoạn 4 (1981–1993) — Dolev-Yao &amp; Random Oracle: </w:t>
       </w:r>
       <w:r>
         <w:rPr>
@@ -784,16 +954,38 @@
     </w:p>
     <w:p>
       <w:pPr>
-        <w:spacing w:before="20" w:after="40"/>
-        <w:ind w:left="504"/>
+        <w:spacing w:before="0" w:after="80"/>
+        <w:ind w:left="648"/>
       </w:pPr>
       <w:r>
         <w:rPr>
           <w:b/>
-          <w:color w:val="1E293B"/>
+          <w:color w:val="1E40AF"/>
+          <w:sz w:val="19"/>
+        </w:rPr>
+        <w:t xml:space="preserve">↳ Thuyết minh / Mở rộng: </w:t>
+      </w:r>
+      <w:r>
+        <w:rPr>
+          <w:i/>
+          <w:color w:val="475569"/>
+          <w:sz w:val="19"/>
+        </w:rPr>
+        <w:t>Mô hình hóa mạng thù địch và giả định hàm băm ngẫu nhiên lý tưởng để phục vụ các bài toán chứng minh an ninh.</w:t>
+      </w:r>
+    </w:p>
+    <w:p>
+      <w:pPr>
+        <w:spacing w:before="60" w:after="20"/>
+        <w:ind w:left="360"/>
+      </w:pPr>
+      <w:r>
+        <w:rPr>
+          <w:b/>
+          <w:color w:val="0F172A"/>
           <w:sz w:val="20"/>
         </w:rPr>
-        <w:t xml:space="preserve">– Giai đoạn 5 (2013–2025) — Phê phán hậu Snowden: </w:t>
+        <w:t xml:space="preserve">– 5. Giai đoạn 5 (2013–2025) — Phê phán hậu Snowden: </w:t>
       </w:r>
       <w:r>
         <w:rPr>
@@ -803,53 +995,31 @@
         <w:t>Snowden phơi bày năng lực thực tế của đối thủ thể chế: Kênh kề, cửa sau tiêu chuẩn, can thiệp chuỗi cung ứng và giám sát siêu dữ liệu.</w:t>
       </w:r>
     </w:p>
-    <w:tbl>
-      <w:tblPr>
-        <w:tblW w:type="auto" w:w="0"/>
-        <w:jc w:val="center"/>
-        <w:tblLook w:firstColumn="1" w:firstRow="1" w:lastColumn="0" w:lastRow="0" w:noHBand="0" w:noVBand="1" w:val="04A0"/>
-      </w:tblPr>
-      <w:tblGrid>
-        <w:gridCol w:w="9360"/>
-      </w:tblGrid>
-      <w:tr>
-        <w:tc>
-          <w:tcPr>
-            <w:tcW w:type="dxa" w:w="9360"/>
-            <w:shd w:val="clear" w:color="auto" w:fill="F1F5F9"/>
-          </w:tcPr>
-          <w:p>
-            <w:pPr>
-              <w:spacing w:before="80" w:after="80"/>
-              <w:ind w:left="144" w:right="144"/>
-            </w:pPr>
-            <w:r>
-              <w:rPr>
-                <w:b/>
-                <w:color w:val="1E40AF"/>
-                <w:sz w:val="20"/>
-              </w:rPr>
-              <w:t>💡 Hướng dẫn thuyết minh &amp; Giải thích dễ hiểu:</w:t>
-              <w:br/>
-            </w:r>
-            <w:r>
-              <w:rPr>
-                <w:color w:val="334155"/>
-                <w:sz w:val="19"/>
-              </w:rPr>
-              <w:t>Giải thích ngắn gọn:</w:t>
-              <w:br/>
-              <w:t>• Giới hạn của Shannon: Bí mật hoàn hảo đòi hỏi khóa phải dài bằng thông điệp (One-Time Pad). Gửi dữ liệu 10 GB mà phải chuyển trước khóa 10 GB tận tay thì tốn kém và không thực tế trên Internet.</w:t>
-              <w:br/>
-              <w:t>• PPT Adversary &amp; Trò chơi an ninh (1984): Đưa ra giả định thực tế: Đối thủ dùng máy tính thời gian đa thức (năng lực tính toán hữu hạn). An toàn được chứng minh nếu đối thủ không phân biệt được hai bản mã với xác suất tốt hơn đoán ngẫu nhiên (50%).</w:t>
-            </w:r>
-          </w:p>
-        </w:tc>
-      </w:tr>
-    </w:tbl>
     <w:p>
       <w:pPr>
-        <w:spacing w:before="80" w:after="200"/>
+        <w:spacing w:before="0" w:after="80"/>
+        <w:ind w:left="648"/>
+      </w:pPr>
+      <w:r>
+        <w:rPr>
+          <w:b/>
+          <w:color w:val="1E40AF"/>
+          <w:sz w:val="19"/>
+        </w:rPr>
+        <w:t xml:space="preserve">↳ Thuyết minh / Mở rộng: </w:t>
+      </w:r>
+      <w:r>
+        <w:rPr>
+          <w:i/>
+          <w:color w:val="475569"/>
+          <w:sz w:val="19"/>
+        </w:rPr>
+        <w:t>Buộc mật mã học hiện đại phải từ bỏ giả định kênh truyền sạch để bước vào kỷ nguyên an ninh thực tế.</w:t>
+      </w:r>
+    </w:p>
+    <w:p>
+      <w:pPr>
+        <w:spacing w:before="60" w:after="200"/>
         <w:ind w:left="288"/>
       </w:pPr>
       <w:r>
@@ -909,18 +1079,18 @@
           <w:color w:val="0F172A"/>
           <w:sz w:val="20"/>
         </w:rPr>
-        <w:t>Nội dung hiển thị trên Slide:</w:t>
+        <w:t>Nội dung Slide &amp; Kịch bản thuyết minh liền mạch:</w:t>
       </w:r>
     </w:p>
     <w:p>
       <w:pPr>
-        <w:spacing w:before="20" w:after="40"/>
-        <w:ind w:left="504"/>
+        <w:spacing w:before="60" w:after="20"/>
+        <w:ind w:left="360"/>
       </w:pPr>
       <w:r>
         <w:rPr>
           <w:b/>
-          <w:color w:val="1E293B"/>
+          <w:color w:val="0F172A"/>
           <w:sz w:val="20"/>
         </w:rPr>
         <w:t xml:space="preserve">– Panel Trái — Mô hình điểm-điểm Shannon (1949): </w:t>
@@ -935,13 +1105,35 @@
     </w:p>
     <w:p>
       <w:pPr>
-        <w:spacing w:before="20" w:after="40"/>
-        <w:ind w:left="504"/>
+        <w:spacing w:before="0" w:after="80"/>
+        <w:ind w:left="648"/>
       </w:pPr>
       <w:r>
         <w:rPr>
           <w:b/>
-          <w:color w:val="1E293B"/>
+          <w:color w:val="1E40AF"/>
+          <w:sz w:val="19"/>
+        </w:rPr>
+        <w:t xml:space="preserve">↳ Thuyết minh / Mở rộng: </w:t>
+      </w:r>
+      <w:r>
+        <w:rPr>
+          <w:i/>
+          <w:color w:val="475569"/>
+          <w:sz w:val="19"/>
+        </w:rPr>
+        <w:t>Shannon giả định đường truyền điểm-điểm đơn giản, chỉ có kẻ nghe lén trên dây dẫn. Nhưng thực tế mạng không hề đóng kín như vậy.</w:t>
+      </w:r>
+    </w:p>
+    <w:p>
+      <w:pPr>
+        <w:spacing w:before="60" w:after="20"/>
+        <w:ind w:left="360"/>
+      </w:pPr>
+      <w:r>
+        <w:rPr>
+          <w:b/>
+          <w:color w:val="0F172A"/>
           <w:sz w:val="20"/>
         </w:rPr>
         <w:t xml:space="preserve">– Panel Phải — Mạng xã hội - kỹ thuật (Halpin 2025): </w:t>
@@ -954,51 +1146,31 @@
         <w:t>Thông tin luân chuyển qua hạ tầng mở, ISP, đám mây. Đối thủ thể chế (NSA) tấn công qua 4 hướng: Kênh kề, giám sát siêu dữ liệu, cửa sau phần cứng và phản bội nội bộ.</w:t>
       </w:r>
     </w:p>
-    <w:tbl>
-      <w:tblPr>
-        <w:tblW w:type="auto" w:w="0"/>
-        <w:jc w:val="center"/>
-        <w:tblLook w:firstColumn="1" w:firstRow="1" w:lastColumn="0" w:lastRow="0" w:noHBand="0" w:noVBand="1" w:val="04A0"/>
-      </w:tblPr>
-      <w:tblGrid>
-        <w:gridCol w:w="9360"/>
-      </w:tblGrid>
-      <w:tr>
-        <w:tc>
-          <w:tcPr>
-            <w:tcW w:type="dxa" w:w="9360"/>
-            <w:shd w:val="clear" w:color="auto" w:fill="F1F5F9"/>
-          </w:tcPr>
-          <w:p>
-            <w:pPr>
-              <w:spacing w:before="80" w:after="80"/>
-              <w:ind w:left="144" w:right="144"/>
-            </w:pPr>
-            <w:r>
-              <w:rPr>
-                <w:b/>
-                <w:color w:val="1E40AF"/>
-                <w:sz w:val="20"/>
-              </w:rPr>
-              <w:t>💡 Hướng dẫn thuyết minh &amp; Giải thích dễ hiểu:</w:t>
-              <w:br/>
-            </w:r>
-            <w:r>
-              <w:rPr>
-                <w:color w:val="334155"/>
-                <w:sz w:val="19"/>
-              </w:rPr>
-              <w:t>Giải thích ngắn gọn:</w:t>
-              <w:br/>
-              <w:t>• Shannon vs Thực tế: Shannon giả định đường truyền điểm-điểm đơn giản, chỉ có kẻ nghe lén trên dây dẫn. Thực tế Internet dữ liệu phải qua ISP và máy chủ đám mây. Đối thủ hiện đại không chỉ chặn nội dung mà còn thu thập Siêu dữ liệu (ai gửi cho ai, lúc nào, dung lượng bao nhiêu) để vẽ lại hành vi người dùng mà không cần giải mã.</w:t>
-            </w:r>
-          </w:p>
-        </w:tc>
-      </w:tr>
-    </w:tbl>
     <w:p>
       <w:pPr>
-        <w:spacing w:before="80" w:after="200"/>
+        <w:spacing w:before="0" w:after="80"/>
+        <w:ind w:left="648"/>
+      </w:pPr>
+      <w:r>
+        <w:rPr>
+          <w:b/>
+          <w:color w:val="1E40AF"/>
+          <w:sz w:val="19"/>
+        </w:rPr>
+        <w:t xml:space="preserve">↳ Thuyết minh / Mở rộng: </w:t>
+      </w:r>
+      <w:r>
+        <w:rPr>
+          <w:i/>
+          <w:color w:val="475569"/>
+          <w:sz w:val="19"/>
+        </w:rPr>
+        <w:t>Đối thủ hiện đại không chỉ chặn nội dung mà còn thu thập Siêu dữ liệu (ai gửi cho ai, lúc nào, dung lượng bao nhiêu) để vẽ lại hành vi người dùng mà không cần giải mã.</w:t>
+      </w:r>
+    </w:p>
+    <w:p>
+      <w:pPr>
+        <w:spacing w:before="60" w:after="200"/>
         <w:ind w:left="288"/>
       </w:pPr>
       <w:r>
@@ -1058,18 +1230,18 @@
           <w:color w:val="0F172A"/>
           <w:sz w:val="20"/>
         </w:rPr>
-        <w:t>Nội dung hiển thị trên Slide:</w:t>
+        <w:t>Nội dung Slide &amp; Kịch bản thuyết minh liền mạch:</w:t>
       </w:r>
     </w:p>
     <w:p>
       <w:pPr>
-        <w:spacing w:before="20" w:after="40"/>
-        <w:ind w:left="504"/>
+        <w:spacing w:before="60" w:after="20"/>
+        <w:ind w:left="360"/>
       </w:pPr>
       <w:r>
         <w:rPr>
           <w:b/>
-          <w:color w:val="1E293B"/>
+          <w:color w:val="0F172A"/>
           <w:sz w:val="20"/>
         </w:rPr>
         <w:t xml:space="preserve">– 1. PPT Adversary (Goldwasser-Micali 1984): </w:t>
@@ -1084,13 +1256,35 @@
     </w:p>
     <w:p>
       <w:pPr>
-        <w:spacing w:before="20" w:after="40"/>
-        <w:ind w:left="504"/>
+        <w:spacing w:before="0" w:after="80"/>
+        <w:ind w:left="648"/>
       </w:pPr>
       <w:r>
         <w:rPr>
           <w:b/>
-          <w:color w:val="1E293B"/>
+          <w:color w:val="1E40AF"/>
+          <w:sz w:val="19"/>
+        </w:rPr>
+        <w:t xml:space="preserve">↳ Thuyết minh / Mở rộng: </w:t>
+      </w:r>
+      <w:r>
+        <w:rPr>
+          <w:i/>
+          <w:color w:val="475569"/>
+          <w:sz w:val="19"/>
+        </w:rPr>
+        <w:t>Đây là nền móng cho mật mã lý thuyết, giới hạn đối thủ trong năng lực tính toán hữu hạn.</w:t>
+      </w:r>
+    </w:p>
+    <w:p>
+      <w:pPr>
+        <w:spacing w:before="60" w:after="20"/>
+        <w:ind w:left="360"/>
+      </w:pPr>
+      <w:r>
+        <w:rPr>
+          <w:b/>
+          <w:color w:val="0F172A"/>
           <w:sz w:val="20"/>
         </w:rPr>
         <w:t xml:space="preserve">– 2. Đối thủ mạng logic (Dolev-Yao 1983): </w:t>
@@ -1105,13 +1299,35 @@
     </w:p>
     <w:p>
       <w:pPr>
-        <w:spacing w:before="20" w:after="40"/>
-        <w:ind w:left="504"/>
+        <w:spacing w:before="0" w:after="80"/>
+        <w:ind w:left="648"/>
       </w:pPr>
       <w:r>
         <w:rPr>
           <w:b/>
-          <w:color w:val="1E293B"/>
+          <w:color w:val="1E40AF"/>
+          <w:sz w:val="19"/>
+        </w:rPr>
+        <w:t xml:space="preserve">↳ Thuyết minh / Mở rộng: </w:t>
+      </w:r>
+      <w:r>
+        <w:rPr>
+          <w:i/>
+          <w:color w:val="475569"/>
+          <w:sz w:val="19"/>
+        </w:rPr>
+        <w:t>Dolev-Yao cho đối thủ toàn quyền trên mạng, nhưng lại ngây thơ giả định mật mã là hộp đen hoàn hảo không bao giờ lộ khóa.</w:t>
+      </w:r>
+    </w:p>
+    <w:p>
+      <w:pPr>
+        <w:spacing w:before="60" w:after="20"/>
+        <w:ind w:left="360"/>
+      </w:pPr>
+      <w:r>
+        <w:rPr>
+          <w:b/>
+          <w:color w:val="0F172A"/>
           <w:sz w:val="20"/>
         </w:rPr>
         <w:t xml:space="preserve">– 3. Tiên tri ngẫu nhiên (Bellare-Rogaway 1993): </w:t>
@@ -1124,57 +1340,31 @@
         <w:t>Giả định hàm băm hoạt động như hàm ngẫu nhiên lý tưởng (Random Oracle); thực tế không hàm băm nào đạt được tính ngẫu nhiên toán học này.</w:t>
       </w:r>
     </w:p>
-    <w:tbl>
-      <w:tblPr>
-        <w:tblW w:type="auto" w:w="0"/>
-        <w:jc w:val="center"/>
-        <w:tblLook w:firstColumn="1" w:firstRow="1" w:lastColumn="0" w:lastRow="0" w:noHBand="0" w:noVBand="1" w:val="04A0"/>
-      </w:tblPr>
-      <w:tblGrid>
-        <w:gridCol w:w="9360"/>
-      </w:tblGrid>
-      <w:tr>
-        <w:tc>
-          <w:tcPr>
-            <w:tcW w:type="dxa" w:w="9360"/>
-            <w:shd w:val="clear" w:color="auto" w:fill="F1F5F9"/>
-          </w:tcPr>
-          <w:p>
-            <w:pPr>
-              <w:spacing w:before="80" w:after="80"/>
-              <w:ind w:left="144" w:right="144"/>
-            </w:pPr>
-            <w:r>
-              <w:rPr>
-                <w:b/>
-                <w:color w:val="1E40AF"/>
-                <w:sz w:val="20"/>
-              </w:rPr>
-              <w:t>💡 Hướng dẫn thuyết minh &amp; Giải thích dễ hiểu:</w:t>
-              <w:br/>
-            </w:r>
-            <w:r>
-              <w:rPr>
-                <w:color w:val="334155"/>
-                <w:sz w:val="19"/>
-              </w:rPr>
-              <w:t>Giải thích ngắn gọn:</w:t>
-              <w:br/>
-              <w:t>• Điểm cốt lõi bài báo phê phán: Cả 3 mô hình đều lý tưởng hóa đối thủ trên giấy:</w:t>
-              <w:br/>
-              <w:t xml:space="preserve">  - Dolev-Yao cho đối thủ kiểm soát mạng nhưng lại giả định mật mã là hộp đen không thể lộ khóa.</w:t>
-              <w:br/>
-              <w:t xml:space="preserve">  - Random Oracle giả định hàm băm ngẫu nhiên hoàn hảo, trong khi hàm băm thực tế (như SHA-256) chỉ là thuật toán xác định.</w:t>
-              <w:br/>
-              <w:t xml:space="preserve">  - Thực tế, đối thủ không chỉ giải toán mà còn tấn công vào lỗi phần cứng, kênh kề và quy trình quản trị.</w:t>
-            </w:r>
-          </w:p>
-        </w:tc>
-      </w:tr>
-    </w:tbl>
     <w:p>
       <w:pPr>
-        <w:spacing w:before="80" w:after="200"/>
+        <w:spacing w:before="0" w:after="80"/>
+        <w:ind w:left="648"/>
+      </w:pPr>
+      <w:r>
+        <w:rPr>
+          <w:b/>
+          <w:color w:val="1E40AF"/>
+          <w:sz w:val="19"/>
+        </w:rPr>
+        <w:t xml:space="preserve">↳ Thuyết minh / Mở rộng: </w:t>
+      </w:r>
+      <w:r>
+        <w:rPr>
+          <w:i/>
+          <w:color w:val="475569"/>
+          <w:sz w:val="19"/>
+        </w:rPr>
+        <w:t>SHA-256 ngoài đời chỉ là thuật toán xác định, không phải hộp đen ngẫu nhiên hoàn hảo, nên vẫn có thể bị khai thác qua các kênh rò rỉ vật lý.</w:t>
+      </w:r>
+    </w:p>
+    <w:p>
+      <w:pPr>
+        <w:spacing w:before="60" w:after="200"/>
         <w:ind w:left="288"/>
       </w:pPr>
       <w:r>
@@ -1234,18 +1424,18 @@
           <w:color w:val="0F172A"/>
           <w:sz w:val="20"/>
         </w:rPr>
-        <w:t>Nội dung hiển thị trên Slide:</w:t>
+        <w:t>Nội dung Slide &amp; Kịch bản thuyết minh liền mạch:</w:t>
       </w:r>
     </w:p>
     <w:p>
       <w:pPr>
-        <w:spacing w:before="20" w:after="40"/>
-        <w:ind w:left="504"/>
+        <w:spacing w:before="60" w:after="20"/>
+        <w:ind w:left="360"/>
       </w:pPr>
       <w:r>
         <w:rPr>
           <w:b/>
-          <w:color w:val="1E293B"/>
+          <w:color w:val="0F172A"/>
           <w:sz w:val="20"/>
         </w:rPr>
         <w:t xml:space="preserve">– Bước 1 — Giả định toán học: </w:t>
@@ -1260,13 +1450,35 @@
     </w:p>
     <w:p>
       <w:pPr>
-        <w:spacing w:before="20" w:after="40"/>
-        <w:ind w:left="504"/>
+        <w:spacing w:before="0" w:after="80"/>
+        <w:ind w:left="648"/>
       </w:pPr>
       <w:r>
         <w:rPr>
           <w:b/>
-          <w:color w:val="1E293B"/>
+          <w:color w:val="1E40AF"/>
+          <w:sz w:val="19"/>
+        </w:rPr>
+        <w:t xml:space="preserve">↳ Thuyết minh / Mở rộng: </w:t>
+      </w:r>
+      <w:r>
+        <w:rPr>
+          <w:i/>
+          <w:color w:val="475569"/>
+          <w:sz w:val="19"/>
+        </w:rPr>
+        <w:t>Các nhà toán học coi hàm mật mã như hộp đen: đưa đầu vào thì có đầu ra, không quan tâm thiết bị chạy mất bao nhiêu micro giây.</w:t>
+      </w:r>
+    </w:p>
+    <w:p>
+      <w:pPr>
+        <w:spacing w:before="60" w:after="20"/>
+        <w:ind w:left="360"/>
+      </w:pPr>
+      <w:r>
+        <w:rPr>
+          <w:b/>
+          <w:color w:val="0F172A"/>
           <w:sz w:val="20"/>
         </w:rPr>
         <w:t xml:space="preserve">– Bước 2 — Yếu tố vật lý bị lược bỏ: </w:t>
@@ -1281,13 +1493,35 @@
     </w:p>
     <w:p>
       <w:pPr>
-        <w:spacing w:before="20" w:after="40"/>
-        <w:ind w:left="504"/>
+        <w:spacing w:before="0" w:after="80"/>
+        <w:ind w:left="648"/>
       </w:pPr>
       <w:r>
         <w:rPr>
           <w:b/>
-          <w:color w:val="1E293B"/>
+          <w:color w:val="1E40AF"/>
+          <w:sz w:val="19"/>
+        </w:rPr>
+        <w:t xml:space="preserve">↳ Thuyết minh / Mở rộng: </w:t>
+      </w:r>
+      <w:r>
+        <w:rPr>
+          <w:i/>
+          <w:color w:val="475569"/>
+          <w:sz w:val="19"/>
+        </w:rPr>
+        <w:t>Nhưng trong thế giới vật lý, máy tính chạy cần thời gian và tiêu thụ điện; các vi xử lý hiện đại còn có bộ nhớ đệm cache.</w:t>
+      </w:r>
+    </w:p>
+    <w:p>
+      <w:pPr>
+        <w:spacing w:before="60" w:after="20"/>
+        <w:ind w:left="360"/>
+      </w:pPr>
+      <w:r>
+        <w:rPr>
+          <w:b/>
+          <w:color w:val="0F172A"/>
           <w:sz w:val="20"/>
         </w:rPr>
         <w:t xml:space="preserve">– Bước 3 — Đối thủ thế giới thực khai thác: </w:t>
@@ -1302,13 +1536,35 @@
     </w:p>
     <w:p>
       <w:pPr>
-        <w:spacing w:before="20" w:after="40"/>
-        <w:ind w:left="504"/>
+        <w:spacing w:before="0" w:after="80"/>
+        <w:ind w:left="648"/>
       </w:pPr>
       <w:r>
         <w:rPr>
           <w:b/>
-          <w:color w:val="1E293B"/>
+          <w:color w:val="1E40AF"/>
+          <w:sz w:val="19"/>
+        </w:rPr>
+        <w:t xml:space="preserve">↳ Thuyết minh / Mở rộng: </w:t>
+      </w:r>
+      <w:r>
+        <w:rPr>
+          <w:i/>
+          <w:color w:val="475569"/>
+          <w:sz w:val="19"/>
+        </w:rPr>
+        <w:t>Kẻ tấn công đo thời gian CPU so sánh chuỗi: nếu sai ký tự đầu thì máy dừng sớm, nếu đúng thì máy chạy lâu hơn; qua đó dò ra khóa mà không cần phá thuật toán.</w:t>
+      </w:r>
+    </w:p>
+    <w:p>
+      <w:pPr>
+        <w:spacing w:before="60" w:after="20"/>
+        <w:ind w:left="360"/>
+      </w:pPr>
+      <w:r>
+        <w:rPr>
+          <w:b/>
+          <w:color w:val="0F172A"/>
           <w:sz w:val="20"/>
         </w:rPr>
         <w:t xml:space="preserve">– Bước 4 — Kết luận của Halpin: </w:t>
@@ -1321,53 +1577,31 @@
         <w:t>Sự trừu tượng hóa quá mức làm mật mã học bỏ sót chính những năng lực thực tế của đối thủ ngoài đời thực.</w:t>
       </w:r>
     </w:p>
-    <w:tbl>
-      <w:tblPr>
-        <w:tblW w:type="auto" w:w="0"/>
-        <w:jc w:val="center"/>
-        <w:tblLook w:firstColumn="1" w:firstRow="1" w:lastColumn="0" w:lastRow="0" w:noHBand="0" w:noVBand="1" w:val="04A0"/>
-      </w:tblPr>
-      <w:tblGrid>
-        <w:gridCol w:w="9360"/>
-      </w:tblGrid>
-      <w:tr>
-        <w:tc>
-          <w:tcPr>
-            <w:tcW w:type="dxa" w:w="9360"/>
-            <w:shd w:val="clear" w:color="auto" w:fill="F1F5F9"/>
-          </w:tcPr>
-          <w:p>
-            <w:pPr>
-              <w:spacing w:before="80" w:after="80"/>
-              <w:ind w:left="144" w:right="144"/>
-            </w:pPr>
-            <w:r>
-              <w:rPr>
-                <w:b/>
-                <w:color w:val="1E40AF"/>
-                <w:sz w:val="20"/>
-              </w:rPr>
-              <w:t>💡 Hướng dẫn thuyết minh &amp; Giải thích dễ hiểu:</w:t>
-              <w:br/>
-            </w:r>
-            <w:r>
-              <w:rPr>
-                <w:color w:val="334155"/>
-                <w:sz w:val="19"/>
-              </w:rPr>
-              <w:t>Giải thích ngắn gọn:</w:t>
-              <w:br/>
-              <w:t>• Kênh kề thời gian (Kocher 1996): Khi so sánh mật khẩu, máy tính thường ngắt sớm ngay khi gặp ký tự sai đầu tiên. Đối thủ gửi thử các chuỗi và đo thời gian phản hồi: Thời gian xử lý lâu hơn nghĩa là đã đoán đúng thêm một ký tự. Nhờ đó, đối thủ dò ra khóa mà không cần phá thuật toán.</w:t>
-              <w:br/>
-              <w:t>• Rò rỉ kích thước: Bản mã có mã hóa kín nhưng độ dài gói tin vẫn lộ trên mạng, giúp đối thủ đoán được loại dữ liệu đang truyền.</w:t>
-            </w:r>
-          </w:p>
-        </w:tc>
-      </w:tr>
-    </w:tbl>
     <w:p>
       <w:pPr>
-        <w:spacing w:before="80" w:after="200"/>
+        <w:spacing w:before="0" w:after="80"/>
+        <w:ind w:left="648"/>
+      </w:pPr>
+      <w:r>
+        <w:rPr>
+          <w:b/>
+          <w:color w:val="1E40AF"/>
+          <w:sz w:val="19"/>
+        </w:rPr>
+        <w:t xml:space="preserve">↳ Thuyết minh / Mở rộng: </w:t>
+      </w:r>
+      <w:r>
+        <w:rPr>
+          <w:i/>
+          <w:color w:val="475569"/>
+          <w:sz w:val="19"/>
+        </w:rPr>
+        <w:t>Lỗ hổng lớn nhất thường không nằm ở công thức toán, mà nằm ở môi trường vật lý triển khai thuật toán.</w:t>
+      </w:r>
+    </w:p>
+    <w:p>
+      <w:pPr>
+        <w:spacing w:before="60" w:after="200"/>
         <w:ind w:left="288"/>
       </w:pPr>
       <w:r>
@@ -1427,18 +1661,18 @@
           <w:color w:val="0F172A"/>
           <w:sz w:val="20"/>
         </w:rPr>
-        <w:t>Nội dung hiển thị trên Slide:</w:t>
+        <w:t>Nội dung Slide &amp; Kịch bản thuyết minh liền mạch:</w:t>
       </w:r>
     </w:p>
     <w:p>
       <w:pPr>
-        <w:spacing w:before="20" w:after="40"/>
-        <w:ind w:left="504"/>
+        <w:spacing w:before="60" w:after="20"/>
+        <w:ind w:left="360"/>
       </w:pPr>
       <w:r>
         <w:rPr>
           <w:b/>
-          <w:color w:val="1E293B"/>
+          <w:color w:val="0F172A"/>
           <w:sz w:val="20"/>
         </w:rPr>
         <w:t xml:space="preserve">– 1. Khủng hoảng thực tiễn (Snowden 2013): </w:t>
@@ -1453,13 +1687,35 @@
     </w:p>
     <w:p>
       <w:pPr>
-        <w:spacing w:before="20" w:after="40"/>
-        <w:ind w:left="504"/>
+        <w:spacing w:before="0" w:after="80"/>
+        <w:ind w:left="648"/>
       </w:pPr>
       <w:r>
         <w:rPr>
           <w:b/>
-          <w:color w:val="1E293B"/>
+          <w:color w:val="1E40AF"/>
+          <w:sz w:val="19"/>
+        </w:rPr>
+        <w:t xml:space="preserve">↳ Thuyết minh / Mở rộng: </w:t>
+      </w:r>
+      <w:r>
+        <w:rPr>
+          <w:i/>
+          <w:color w:val="475569"/>
+          <w:sz w:val="19"/>
+        </w:rPr>
+        <w:t>Snowden phơi bày sự thật: Không cơ quan tình báo nào tốn công bẻ khóa 256-bit, họ trích xuất cáp quang biển, ép công ty giao khóa hoặc cài cửa sau.</w:t>
+      </w:r>
+    </w:p>
+    <w:p>
+      <w:pPr>
+        <w:spacing w:before="60" w:after="20"/>
+        <w:ind w:left="360"/>
+      </w:pPr>
+      <w:r>
+        <w:rPr>
+          <w:b/>
+          <w:color w:val="0F172A"/>
           <w:sz w:val="20"/>
         </w:rPr>
         <w:t xml:space="preserve">– 2. Năng lực đối thủ thể chế: </w:t>
@@ -1474,13 +1730,35 @@
     </w:p>
     <w:p>
       <w:pPr>
-        <w:spacing w:before="20" w:after="40"/>
-        <w:ind w:left="504"/>
+        <w:spacing w:before="0" w:after="80"/>
+        <w:ind w:left="648"/>
       </w:pPr>
       <w:r>
         <w:rPr>
           <w:b/>
-          <w:color w:val="1E293B"/>
+          <w:color w:val="1E40AF"/>
+          <w:sz w:val="19"/>
+        </w:rPr>
+        <w:t xml:space="preserve">↳ Thuyết minh / Mở rộng: </w:t>
+      </w:r>
+      <w:r>
+        <w:rPr>
+          <w:i/>
+          <w:color w:val="475569"/>
+          <w:sz w:val="19"/>
+        </w:rPr>
+        <w:t>NSA tác động đưa thuật toán có khiếm khuyết vào tiêu chuẩn quốc tế NIST. Do giữ trước hằng số bí mật, NSA đọc được dữ liệu của bất kỳ ai dùng chuẩn này.</w:t>
+      </w:r>
+    </w:p>
+    <w:p>
+      <w:pPr>
+        <w:spacing w:before="60" w:after="20"/>
+        <w:ind w:left="360"/>
+      </w:pPr>
+      <w:r>
+        <w:rPr>
+          <w:b/>
+          <w:color w:val="0F172A"/>
           <w:sz w:val="20"/>
         </w:rPr>
         <w:t xml:space="preserve">– 3. Tính tương đối của đối thủ: </w:t>
@@ -1493,53 +1771,31 @@
         <w:t>'Đối thủ' mang tính vị thế; mật mã học buộc phải nghiên cứu cơ chế phòng chống cửa sau (Cliptography).</w:t>
       </w:r>
     </w:p>
-    <w:tbl>
-      <w:tblPr>
-        <w:tblW w:type="auto" w:w="0"/>
-        <w:jc w:val="center"/>
-        <w:tblLook w:firstColumn="1" w:firstRow="1" w:lastColumn="0" w:lastRow="0" w:noHBand="0" w:noVBand="1" w:val="04A0"/>
-      </w:tblPr>
-      <w:tblGrid>
-        <w:gridCol w:w="9360"/>
-      </w:tblGrid>
-      <w:tr>
-        <w:tc>
-          <w:tcPr>
-            <w:tcW w:type="dxa" w:w="9360"/>
-            <w:shd w:val="clear" w:color="auto" w:fill="F1F5F9"/>
-          </w:tcPr>
-          <w:p>
-            <w:pPr>
-              <w:spacing w:before="80" w:after="80"/>
-              <w:ind w:left="144" w:right="144"/>
-            </w:pPr>
-            <w:r>
-              <w:rPr>
-                <w:b/>
-                <w:color w:val="1E40AF"/>
-                <w:sz w:val="20"/>
-              </w:rPr>
-              <w:t>💡 Hướng dẫn thuyết minh &amp; Giải thích dễ hiểu:</w:t>
-              <w:br/>
-            </w:r>
-            <w:r>
-              <w:rPr>
-                <w:color w:val="334155"/>
-                <w:sz w:val="19"/>
-              </w:rPr>
-              <w:t>Giải thích ngắn gọn:</w:t>
-              <w:br/>
-              <w:t>• Cửa sau Dual_EC_DRBG: Bộ sinh số ngẫu nhiên là nền tảng tạo khóa. Thay vì phá khóa, NSA tác động đưa thuật toán có khiếm khuyết vào tiêu chuẩn NIST. Do nắm trước hằng số bí mật, NSA tính được khóa của mọi hệ thống dùng chuẩn này.</w:t>
-              <w:br/>
-              <w:t>• Cliptography: Ngành nghiên cứu thiết kế mật mã an toàn ngay cả khi thuật toán hoặc phần cứng bị cài sẵn cửa sau.</w:t>
-            </w:r>
-          </w:p>
-        </w:tc>
-      </w:tr>
-    </w:tbl>
     <w:p>
       <w:pPr>
-        <w:spacing w:before="80" w:after="200"/>
+        <w:spacing w:before="0" w:after="80"/>
+        <w:ind w:left="648"/>
+      </w:pPr>
+      <w:r>
+        <w:rPr>
+          <w:b/>
+          <w:color w:val="1E40AF"/>
+          <w:sz w:val="19"/>
+        </w:rPr>
+        <w:t xml:space="preserve">↳ Thuyết minh / Mở rộng: </w:t>
+      </w:r>
+      <w:r>
+        <w:rPr>
+          <w:i/>
+          <w:color w:val="475569"/>
+          <w:sz w:val="19"/>
+        </w:rPr>
+        <w:t>Đối với người dân NSA là kẻ nghe lén, nhưng với NSA thì Snowden là kẻ làm lộ bí mật. Mật mã học ngày nay phải nghiên cứu tự bảo vệ ngay cả khi phần mềm bị cài sẵn cửa sau.</w:t>
+      </w:r>
+    </w:p>
+    <w:p>
+      <w:pPr>
+        <w:spacing w:before="60" w:after="200"/>
         <w:ind w:left="288"/>
       </w:pPr>
       <w:r>
@@ -1599,18 +1855,18 @@
           <w:color w:val="0F172A"/>
           <w:sz w:val="20"/>
         </w:rPr>
-        <w:t>Nội dung hiển thị trên Slide:</w:t>
+        <w:t>Nội dung Slide &amp; Kịch bản thuyết minh liền mạch:</w:t>
       </w:r>
     </w:p>
     <w:p>
       <w:pPr>
-        <w:spacing w:before="20" w:after="40"/>
-        <w:ind w:left="504"/>
+        <w:spacing w:before="60" w:after="20"/>
+        <w:ind w:left="360"/>
       </w:pPr>
       <w:r>
         <w:rPr>
           <w:b/>
-          <w:color w:val="1E293B"/>
+          <w:color w:val="0F172A"/>
           <w:sz w:val="20"/>
         </w:rPr>
         <w:t xml:space="preserve">– RQ1 — Mạng xã hội động: </w:t>
@@ -1625,13 +1881,35 @@
     </w:p>
     <w:p>
       <w:pPr>
-        <w:spacing w:before="20" w:after="40"/>
-        <w:ind w:left="504"/>
+        <w:spacing w:before="0" w:after="80"/>
+        <w:ind w:left="648"/>
       </w:pPr>
       <w:r>
         <w:rPr>
           <w:b/>
-          <w:color w:val="1E293B"/>
+          <w:color w:val="1E40AF"/>
+          <w:sz w:val="19"/>
+        </w:rPr>
+        <w:t xml:space="preserve">↳ Thuyết minh / Mở rộng: </w:t>
+      </w:r>
+      <w:r>
+        <w:rPr>
+          <w:i/>
+          <w:color w:val="475569"/>
+          <w:sz w:val="19"/>
+        </w:rPr>
+        <w:t>Quan sát cách người thật giữ bí mật ngoài đời, thay vì giả định người dùng luôn tuân thủ chính sách hoàn hảo.</w:t>
+      </w:r>
+    </w:p>
+    <w:p>
+      <w:pPr>
+        <w:spacing w:before="60" w:after="20"/>
+        <w:ind w:left="360"/>
+      </w:pPr>
+      <w:r>
+        <w:rPr>
+          <w:b/>
+          <w:color w:val="0F172A"/>
           <w:sz w:val="20"/>
         </w:rPr>
         <w:t xml:space="preserve">– RQ2 — Mô hình hóa bằng thống kê: </w:t>
@@ -1646,13 +1924,35 @@
     </w:p>
     <w:p>
       <w:pPr>
-        <w:spacing w:before="20" w:after="40"/>
-        <w:ind w:left="504"/>
+        <w:spacing w:before="0" w:after="80"/>
+        <w:ind w:left="648"/>
       </w:pPr>
       <w:r>
         <w:rPr>
           <w:b/>
-          <w:color w:val="1E293B"/>
+          <w:color w:val="1E40AF"/>
+          <w:sz w:val="19"/>
+        </w:rPr>
+        <w:t xml:space="preserve">↳ Thuyết minh / Mở rộng: </w:t>
+      </w:r>
+      <w:r>
+        <w:rPr>
+          <w:i/>
+          <w:color w:val="475569"/>
+          <w:sz w:val="19"/>
+        </w:rPr>
+        <w:t>Dùng số liệu thống kê để biết đối thủ thực tế mạnh đến đâu, thay vì giả định mơ hồ.</w:t>
+      </w:r>
+    </w:p>
+    <w:p>
+      <w:pPr>
+        <w:spacing w:before="60" w:after="20"/>
+        <w:ind w:left="360"/>
+      </w:pPr>
+      <w:r>
+        <w:rPr>
+          <w:b/>
+          <w:color w:val="0F172A"/>
           <w:sz w:val="20"/>
         </w:rPr>
         <w:t xml:space="preserve">– RQ3 — Phương pháp liên ngành: </w:t>
@@ -1667,13 +1967,35 @@
     </w:p>
     <w:p>
       <w:pPr>
-        <w:spacing w:before="20" w:after="40"/>
-        <w:ind w:left="504"/>
+        <w:spacing w:before="0" w:after="80"/>
+        <w:ind w:left="648"/>
       </w:pPr>
       <w:r>
         <w:rPr>
           <w:b/>
-          <w:color w:val="1E293B"/>
+          <w:color w:val="1E40AF"/>
+          <w:sz w:val="19"/>
+        </w:rPr>
+        <w:t xml:space="preserve">↳ Thuyết minh / Mở rộng: </w:t>
+      </w:r>
+      <w:r>
+        <w:rPr>
+          <w:i/>
+          <w:color w:val="475569"/>
+          <w:sz w:val="19"/>
+        </w:rPr>
+        <w:t>Mượn mô hình dịch tễ học: thông tin rò rỉ giống như virus lây lan trong mạng lưới để tìm cách ngăn chặn.</w:t>
+      </w:r>
+    </w:p>
+    <w:p>
+      <w:pPr>
+        <w:spacing w:before="60" w:after="20"/>
+        <w:ind w:left="360"/>
+      </w:pPr>
+      <w:r>
+        <w:rPr>
+          <w:b/>
+          <w:color w:val="0F172A"/>
           <w:sz w:val="20"/>
         </w:rPr>
         <w:t xml:space="preserve">– RQ4 — Triết học chất vấn ngầm định: </w:t>
@@ -1686,51 +2008,31 @@
         <w:t>Xem xét lại các giả định nền tảng từ thời Shannon, điều chỉnh cho phù hợp với môi trường mạng hiện đại.</w:t>
       </w:r>
     </w:p>
-    <w:tbl>
-      <w:tblPr>
-        <w:tblW w:type="auto" w:w="0"/>
-        <w:jc w:val="center"/>
-        <w:tblLook w:firstColumn="1" w:firstRow="1" w:lastColumn="0" w:lastRow="0" w:noHBand="0" w:noVBand="1" w:val="04A0"/>
-      </w:tblPr>
-      <w:tblGrid>
-        <w:gridCol w:w="9360"/>
-      </w:tblGrid>
-      <w:tr>
-        <w:tc>
-          <w:tcPr>
-            <w:tcW w:type="dxa" w:w="9360"/>
-            <w:shd w:val="clear" w:color="auto" w:fill="F1F5F9"/>
-          </w:tcPr>
-          <w:p>
-            <w:pPr>
-              <w:spacing w:before="80" w:after="80"/>
-              <w:ind w:left="144" w:right="144"/>
-            </w:pPr>
-            <w:r>
-              <w:rPr>
-                <w:b/>
-                <w:color w:val="1E40AF"/>
-                <w:sz w:val="20"/>
-              </w:rPr>
-              <w:t>💡 Hướng dẫn thuyết minh &amp; Giải thích dễ hiểu:</w:t>
-              <w:br/>
-            </w:r>
-            <w:r>
-              <w:rPr>
-                <w:color w:val="334155"/>
-                <w:sz w:val="19"/>
-              </w:rPr>
-              <w:t>Giải thích ngắn gọn:</w:t>
-              <w:br/>
-              <w:t>Ý nghĩa 4 câu hỏi: Mật mã học tương lai cần liên ngành: (1) Quan sát hành vi thực tế của người dùng; (2) Dùng dữ liệu thống kê lượng hóa đối thủ; (3) Áp dụng mô hình lây lan mạng để theo dõi rò rỉ tin; (4) Dùng triết học xem xét lại các giả định cũ từ thời Shannon.</w:t>
-            </w:r>
-          </w:p>
-        </w:tc>
-      </w:tr>
-    </w:tbl>
     <w:p>
       <w:pPr>
-        <w:spacing w:before="80" w:after="200"/>
+        <w:spacing w:before="0" w:after="80"/>
+        <w:ind w:left="648"/>
+      </w:pPr>
+      <w:r>
+        <w:rPr>
+          <w:b/>
+          <w:color w:val="1E40AF"/>
+          <w:sz w:val="19"/>
+        </w:rPr>
+        <w:t xml:space="preserve">↳ Thuyết minh / Mở rộng: </w:t>
+      </w:r>
+      <w:r>
+        <w:rPr>
+          <w:i/>
+          <w:color w:val="475569"/>
+          <w:sz w:val="19"/>
+        </w:rPr>
+        <w:t>Vận dụng triết học để xem xét lại các tiền đề cũ, thích ứng với kỷ nguyên giám sát kỹ thuật số.</w:t>
+      </w:r>
+    </w:p>
+    <w:p>
+      <w:pPr>
+        <w:spacing w:before="60" w:after="200"/>
         <w:ind w:left="288"/>
       </w:pPr>
       <w:r>
@@ -1790,138 +2092,227 @@
           <w:color w:val="0F172A"/>
           <w:sz w:val="20"/>
         </w:rPr>
-        <w:t>Nội dung hiển thị trên Slide:</w:t>
+        <w:t>Nội dung Slide &amp; Kịch bản thuyết minh liền mạch:</w:t>
       </w:r>
     </w:p>
     <w:p>
       <w:pPr>
-        <w:spacing w:before="20" w:after="40"/>
-        <w:ind w:left="504"/>
+        <w:spacing w:before="60" w:after="20"/>
+        <w:ind w:left="360"/>
       </w:pPr>
       <w:r>
         <w:rPr>
           <w:b/>
-          <w:color w:val="1E293B"/>
+          <w:color w:val="0F172A"/>
           <w:sz w:val="20"/>
         </w:rPr>
-        <w:t xml:space="preserve">– 1. Sơ đồ diễn tập 2 màn hình: </w:t>
+        <w:t xml:space="preserve">– 1. Tổng quan sơ đồ đối kháng 2 màn hình: </w:t>
       </w:r>
       <w:r>
         <w:rPr>
           <w:color w:val="334155"/>
           <w:sz w:val="20"/>
         </w:rPr>
-        <w:t>Màn hình trái là Blue Team (Port 8080) giám sát toàn vẹn tệp; màn hình phải là Red Team (Port 8081) thực hiện can thiệp.</w:t>
+        <w:t>Mô hình tương tác thời gian thực giữa Blue Team (Port 8080) và Red Team (Port 8081).</w:t>
       </w:r>
     </w:p>
     <w:p>
       <w:pPr>
-        <w:spacing w:before="20" w:after="40"/>
-        <w:ind w:left="504"/>
+        <w:spacing w:before="0" w:after="80"/>
+        <w:ind w:left="648"/>
       </w:pPr>
       <w:r>
         <w:rPr>
           <w:b/>
-          <w:color w:val="1E293B"/>
+          <w:color w:val="1E40AF"/>
+          <w:sz w:val="19"/>
+        </w:rPr>
+        <w:t xml:space="preserve">↳ Thuyết minh / Mở rộng: </w:t>
+      </w:r>
+      <w:r>
+        <w:rPr>
+          <w:i/>
+          <w:color w:val="475569"/>
+          <w:sz w:val="19"/>
+        </w:rPr>
+        <w:t>Nhìn trực tiếp vào sơ đồ trên slide, đây là mô hình đối kháng 2 màn hình do nhóm tự xây dựng để kiểm chứng thực nghiệm các luận điểm của Halpin: bên trái là Blue Team phòng thủ, bên phải là Red Team tấn công, ở giữa là dữ liệu thực tế.</w:t>
+      </w:r>
+    </w:p>
+    <w:p>
+      <w:pPr>
+        <w:spacing w:before="60" w:after="20"/>
+        <w:ind w:left="360"/>
+      </w:pPr>
+      <w:r>
+        <w:rPr>
+          <w:b/>
+          <w:color w:val="0F172A"/>
           <w:sz w:val="20"/>
         </w:rPr>
-        <w:t xml:space="preserve">– 2. Dữ liệu thực nghiệm: </w:t>
+        <w:t xml:space="preserve">– 2. Khối bên trái — Blue Team (Port 8080): </w:t>
       </w:r>
       <w:r>
         <w:rPr>
           <w:color w:val="334155"/>
           <w:sz w:val="20"/>
         </w:rPr>
-        <w:t>Thư mục kaggle_dataset (2.485 tệp tin) đóng vai trò môi trường kiểm thử thực tế để đo kiểm tra toàn vẹn.</w:t>
+        <w:t>Thiết lập mốc tin cậy sạch ban đầu H_0; tích hợp phân tách miền RFC 6962 (0x00 cho lá, 0x01 cho nhánh).</w:t>
       </w:r>
     </w:p>
     <w:p>
       <w:pPr>
-        <w:spacing w:before="20" w:after="40"/>
-        <w:ind w:left="504"/>
+        <w:spacing w:before="0" w:after="80"/>
+        <w:ind w:left="648"/>
       </w:pPr>
       <w:r>
         <w:rPr>
           <w:b/>
-          <w:color w:val="1E293B"/>
+          <w:color w:val="1E40AF"/>
+          <w:sz w:val="19"/>
+        </w:rPr>
+        <w:t xml:space="preserve">↳ Thuyết minh / Mở rộng: </w:t>
+      </w:r>
+      <w:r>
+        <w:rPr>
+          <w:i/>
+          <w:color w:val="475569"/>
+          <w:sz w:val="19"/>
+        </w:rPr>
+        <w:t>Ở góc bên trái là màn hình Blue Team đóng vai trò phòng thủ. Khi nạp thư mục, Blue Team tính toán mốc tin cậy sạch ban đầu. Để tránh nhầm lẫn cấu trúc cây Merkle mà Halpin cảnh báo tại Mục 5, hệ thống áp dụng chuẩn RFC 6962 gắn tiền tố 0x00 cho nút lá và 0x01 cho nút nhánh nội bộ.</w:t>
+      </w:r>
+    </w:p>
+    <w:p>
+      <w:pPr>
+        <w:spacing w:before="60" w:after="20"/>
+        <w:ind w:left="360"/>
+      </w:pPr>
+      <w:r>
+        <w:rPr>
+          <w:b/>
+          <w:color w:val="0F172A"/>
           <w:sz w:val="20"/>
         </w:rPr>
-        <w:t xml:space="preserve">– 3. Cầu nối minh họa độc lập (Paper-to-Code): </w:t>
+        <w:t xml:space="preserve">– 3. Khối ở giữa — Dữ liệu thực nghiệm (kaggle_dataset): </w:t>
       </w:r>
       <w:r>
         <w:rPr>
           <w:color w:val="334155"/>
           <w:sz w:val="20"/>
         </w:rPr>
-        <w:t>Bài báo Halpin là khảo luận triết học thuần túy (không có code). Hệ thống kiểm chứng trực quan 3 luận điểm: (1) Mã CRC32 bị qua mặt trên GF(2) vs SHA-256 phi tuyến; (2) Phân tách miền nút lá RFC 6962; (3) Kênh kề thời gian so sánh chuỗi.</w:t>
+        <w:t>2.485 tệp tin (~112,8 MB) mô phỏng cấu trúc cây thư mục doanh nghiệp thực tế trên đĩa cứng.</w:t>
       </w:r>
     </w:p>
     <w:p>
       <w:pPr>
-        <w:spacing w:before="20" w:after="40"/>
-        <w:ind w:left="504"/>
+        <w:spacing w:before="0" w:after="80"/>
+        <w:ind w:left="648"/>
       </w:pPr>
       <w:r>
         <w:rPr>
           <w:b/>
-          <w:color w:val="1E293B"/>
+          <w:color w:val="1E40AF"/>
+          <w:sz w:val="19"/>
+        </w:rPr>
+        <w:t xml:space="preserve">↳ Thuyết minh / Mở rộng: </w:t>
+      </w:r>
+      <w:r>
+        <w:rPr>
+          <w:i/>
+          <w:color w:val="475569"/>
+          <w:sz w:val="19"/>
+        </w:rPr>
+        <w:t>Ở vị trí trung tâm là kho dữ liệu kiểm thử gồm 2.485 tệp tin, đóng vai trò môi trường vật lý trên đĩa cứng để hai bên cùng tác động và đo tốc độ quét toàn vẹn.</w:t>
+      </w:r>
+    </w:p>
+    <w:p>
+      <w:pPr>
+        <w:spacing w:before="60" w:after="20"/>
+        <w:ind w:left="360"/>
+      </w:pPr>
+      <w:r>
+        <w:rPr>
+          <w:b/>
+          <w:color w:val="0F172A"/>
           <w:sz w:val="20"/>
         </w:rPr>
-        <w:t xml:space="preserve">– 4. Cơ chế hoàn nguyên an toàn: </w:t>
+        <w:t xml:space="preserve">– 4. Khối bên phải — Động cơ Red Team (Port 8081): </w:t>
       </w:r>
       <w:r>
         <w:rPr>
           <w:color w:val="334155"/>
           <w:sz w:val="20"/>
         </w:rPr>
-        <w:t>Thư mục .adversary_backups/ phục hồi nguyên trạng 100% dữ liệu với nút Rollback All.</w:t>
+        <w:t>Mô phỏng kẻ thù có chủ đích: Kịch bản 1 sửa tệp (Tamper) và Kịch bản 2 giải hệ GF(2) bù 4 byte qua mặt CRC32.</w:t>
       </w:r>
     </w:p>
-    <w:tbl>
-      <w:tblPr>
-        <w:tblW w:type="auto" w:w="0"/>
-        <w:jc w:val="center"/>
-        <w:tblLook w:firstColumn="1" w:firstRow="1" w:lastColumn="0" w:lastRow="0" w:noHBand="0" w:noVBand="1" w:val="04A0"/>
-      </w:tblPr>
-      <w:tblGrid>
-        <w:gridCol w:w="9360"/>
-      </w:tblGrid>
-      <w:tr>
-        <w:tc>
-          <w:tcPr>
-            <w:tcW w:type="dxa" w:w="9360"/>
-            <w:shd w:val="clear" w:color="auto" w:fill="F1F5F9"/>
-          </w:tcPr>
-          <w:p>
-            <w:pPr>
-              <w:spacing w:before="80" w:after="80"/>
-              <w:ind w:left="144" w:right="144"/>
-            </w:pPr>
-            <w:r>
-              <w:rPr>
-                <w:b/>
-                <w:color w:val="1E40AF"/>
-                <w:sz w:val="20"/>
-              </w:rPr>
-              <w:t>💡 Hướng dẫn thuyết minh &amp; Giải thích dễ hiểu:</w:t>
-              <w:br/>
-            </w:r>
-            <w:r>
-              <w:rPr>
-                <w:color w:val="334155"/>
-                <w:sz w:val="19"/>
-              </w:rPr>
-              <w:t>Hướng dẫn thuyết minh ngắn gọn:</w:t>
-              <w:br/>
-              <w:t>Đây là sơ đồ bố trí màn hình trước khi Demo: màn hình phải tấn công, màn hình trái phát hiện. Nhóm tự phát triển phần mềm này để minh họa trực quan cho các luận điểm của tác giả. Nói ngắn gọn trong 30 giây để chuyển ngay vào màn hình Demo trực tiếp.</w:t>
-            </w:r>
-          </w:p>
-        </w:tc>
-      </w:tr>
-    </w:tbl>
     <w:p>
       <w:pPr>
-        <w:spacing w:before="80" w:after="200"/>
+        <w:spacing w:before="0" w:after="80"/>
+        <w:ind w:left="648"/>
+      </w:pPr>
+      <w:r>
+        <w:rPr>
+          <w:b/>
+          <w:color w:val="1E40AF"/>
+          <w:sz w:val="19"/>
+        </w:rPr>
+        <w:t xml:space="preserve">↳ Thuyết minh / Mở rộng: </w:t>
+      </w:r>
+      <w:r>
+        <w:rPr>
+          <w:i/>
+          <w:color w:val="475569"/>
+          <w:sz w:val="19"/>
+        </w:rPr>
+        <w:t>Ở góc bên phải là màn hình Red Team với 2 kịch bản: sửa nội dung tệp trực tiếp khiến Blue Team đổi cảnh báo đỏ ngay lập tức; hoặc giải hệ phương trình tuyến tính GF(2) bù 4 byte để đánh lừa mã CRC32. Nhưng hàm băm SHA-256 phi tuyến ở Blue Team vẫn phát hiện ra ngay.</w:t>
+      </w:r>
+    </w:p>
+    <w:p>
+      <w:pPr>
+        <w:spacing w:before="60" w:after="20"/>
+        <w:ind w:left="360"/>
+      </w:pPr>
+      <w:r>
+        <w:rPr>
+          <w:b/>
+          <w:color w:val="0F172A"/>
+          <w:sz w:val="20"/>
+        </w:rPr>
+        <w:t xml:space="preserve">– 5. Khối dưới cùng — Cơ chế hoàn nguyên an toàn: </w:t>
+      </w:r>
+      <w:r>
+        <w:rPr>
+          <w:color w:val="334155"/>
+          <w:sz w:val="20"/>
+        </w:rPr>
+        <w:t>Thư mục sao lưu an toàn .adversary_backups/ và nút Rollback All.</w:t>
+      </w:r>
+    </w:p>
+    <w:p>
+      <w:pPr>
+        <w:spacing w:before="0" w:after="80"/>
+        <w:ind w:left="648"/>
+      </w:pPr>
+      <w:r>
+        <w:rPr>
+          <w:b/>
+          <w:color w:val="1E40AF"/>
+          <w:sz w:val="19"/>
+        </w:rPr>
+        <w:t xml:space="preserve">↳ Thuyết minh / Mở rộng: </w:t>
+      </w:r>
+      <w:r>
+        <w:rPr>
+          <w:i/>
+          <w:color w:val="475569"/>
+          <w:sz w:val="19"/>
+        </w:rPr>
+        <w:t>Cuối cùng, nút Rollback All giúp hoàn nguyên toàn bộ tệp về trạng thái sạch ban đầu sau khi diễn tập, đảm bảo an toàn tuyệt đối cho đĩa cứng.</w:t>
+      </w:r>
+    </w:p>
+    <w:p>
+      <w:pPr>
+        <w:spacing w:before="60" w:after="200"/>
         <w:ind w:left="288"/>
       </w:pPr>
       <w:r>
@@ -1981,18 +2372,18 @@
           <w:color w:val="0F172A"/>
           <w:sz w:val="20"/>
         </w:rPr>
-        <w:t>Nội dung hiển thị trên Slide:</w:t>
+        <w:t>Nội dung Slide &amp; Kịch bản thuyết minh liền mạch:</w:t>
       </w:r>
     </w:p>
     <w:p>
       <w:pPr>
-        <w:spacing w:before="20" w:after="40"/>
-        <w:ind w:left="504"/>
+        <w:spacing w:before="60" w:after="20"/>
+        <w:ind w:left="360"/>
       </w:pPr>
       <w:r>
         <w:rPr>
           <w:b/>
-          <w:color w:val="1E293B"/>
+          <w:color w:val="0F172A"/>
           <w:sz w:val="20"/>
         </w:rPr>
         <w:t xml:space="preserve">– Văn bản trung tâm: </w:t>
@@ -2005,51 +2396,31 @@
         <w:t>DEMO (Slide chuyển tiếp tối giản nền sáng, tạo nhịp nghỉ trước phần thực hành).</w:t>
       </w:r>
     </w:p>
-    <w:tbl>
-      <w:tblPr>
-        <w:tblW w:type="auto" w:w="0"/>
-        <w:jc w:val="center"/>
-        <w:tblLook w:firstColumn="1" w:firstRow="1" w:lastColumn="0" w:lastRow="0" w:noHBand="0" w:noVBand="1" w:val="04A0"/>
-      </w:tblPr>
-      <w:tblGrid>
-        <w:gridCol w:w="9360"/>
-      </w:tblGrid>
-      <w:tr>
-        <w:tc>
-          <w:tcPr>
-            <w:tcW w:type="dxa" w:w="9360"/>
-            <w:shd w:val="clear" w:color="auto" w:fill="F1F5F9"/>
-          </w:tcPr>
-          <w:p>
-            <w:pPr>
-              <w:spacing w:before="80" w:after="80"/>
-              <w:ind w:left="144" w:right="144"/>
-            </w:pPr>
-            <w:r>
-              <w:rPr>
-                <w:b/>
-                <w:color w:val="1E40AF"/>
-                <w:sz w:val="20"/>
-              </w:rPr>
-              <w:t>💡 Hướng dẫn thuyết minh &amp; Giải thích dễ hiểu:</w:t>
-              <w:br/>
-            </w:r>
-            <w:r>
-              <w:rPr>
-                <w:color w:val="334155"/>
-                <w:sz w:val="19"/>
-              </w:rPr>
-              <w:t>Lời thoại ngắn gọn:</w:t>
-              <w:br/>
-              <w:t>Chuyển tiếp sang phần Demo thực tế 2 màn hình Red Team vs Blue Team để kiểm chứng các luận điểm đối kháng vừa trình bày.</w:t>
-            </w:r>
-          </w:p>
-        </w:tc>
-      </w:tr>
-    </w:tbl>
     <w:p>
       <w:pPr>
-        <w:spacing w:before="80" w:after="200"/>
+        <w:spacing w:before="0" w:after="80"/>
+        <w:ind w:left="648"/>
+      </w:pPr>
+      <w:r>
+        <w:rPr>
+          <w:b/>
+          <w:color w:val="1E40AF"/>
+          <w:sz w:val="19"/>
+        </w:rPr>
+        <w:t xml:space="preserve">↳ Thuyết minh / Mở rộng: </w:t>
+      </w:r>
+      <w:r>
+        <w:rPr>
+          <w:i/>
+          <w:color w:val="475569"/>
+          <w:sz w:val="19"/>
+        </w:rPr>
+        <w:t>Ngay sau đây, nhóm xin chuyển sang màn hình Demo thực tế để thao tác trực tiếp 2 kịch bản đối kháng vừa nêu trên sơ đồ.</w:t>
+      </w:r>
+    </w:p>
+    <w:p>
+      <w:pPr>
+        <w:spacing w:before="60" w:after="200"/>
         <w:ind w:left="288"/>
       </w:pPr>
       <w:r>
@@ -2109,18 +2480,18 @@
           <w:color w:val="0F172A"/>
           <w:sz w:val="20"/>
         </w:rPr>
-        <w:t>Nội dung hiển thị trên Slide:</w:t>
+        <w:t>Nội dung Slide &amp; Kịch bản thuyết minh liền mạch:</w:t>
       </w:r>
     </w:p>
     <w:p>
       <w:pPr>
-        <w:spacing w:before="20" w:after="40"/>
-        <w:ind w:left="504"/>
+        <w:spacing w:before="60" w:after="20"/>
+        <w:ind w:left="360"/>
       </w:pPr>
       <w:r>
         <w:rPr>
           <w:b/>
-          <w:color w:val="1E293B"/>
+          <w:color w:val="0F172A"/>
           <w:sz w:val="20"/>
         </w:rPr>
         <w:t xml:space="preserve">– 1. Bản chất thông tin &amp; Bí mật (Sec 1–2): </w:t>
@@ -2130,39 +2501,83 @@
           <w:color w:val="334155"/>
           <w:sz w:val="20"/>
         </w:rPr>
-        <w:t>Từ bỏ giả định nhiễu ngẫu nhiên của Shannon; đối thủ là tác nhân có chủ đích; mã tuyến tính CRC32 không thể thay thế hàm băm phi tuyến SHA-256.</w:t>
+        <w:t>Mô hình cũ: Thông tin là xác suất, kênh chỉ có nhiễu ngẫu nhiên ↔ Halpin: Thông tin có ngữ nghĩa khách quan (Dretske), đối thủ có chủ đích.</w:t>
       </w:r>
     </w:p>
     <w:p>
       <w:pPr>
-        <w:spacing w:before="20" w:after="40"/>
-        <w:ind w:left="504"/>
+        <w:spacing w:before="0" w:after="80"/>
+        <w:ind w:left="648"/>
       </w:pPr>
       <w:r>
         <w:rPr>
           <w:b/>
-          <w:color w:val="1E293B"/>
+          <w:color w:val="1E40AF"/>
+          <w:sz w:val="19"/>
+        </w:rPr>
+        <w:t xml:space="preserve">↳ Thuyết minh / Mở rộng: </w:t>
+      </w:r>
+      <w:r>
+        <w:rPr>
+          <w:i/>
+          <w:color w:val="475569"/>
+          <w:sz w:val="19"/>
+        </w:rPr>
+        <w:t>Vì đối thủ có chủ đích nên mã tuyến tính CRC32 bất lực, an ninh đối kháng bắt buộc phải dùng hàm băm phi tuyến SHA-256.</w:t>
+      </w:r>
+    </w:p>
+    <w:p>
+      <w:pPr>
+        <w:spacing w:before="60" w:after="20"/>
+        <w:ind w:left="360"/>
+      </w:pPr>
+      <w:r>
+        <w:rPr>
+          <w:b/>
+          <w:color w:val="0F172A"/>
           <w:sz w:val="20"/>
         </w:rPr>
-        <w:t xml:space="preserve">– 2. Giới hạn trừu tượng hóa (Sec 5): </w:t>
+        <w:t xml:space="preserve">– 2. Giới hạn hình thức hóa (Sec 5): </w:t>
       </w:r>
       <w:r>
         <w:rPr>
           <w:color w:val="334155"/>
           <w:sz w:val="20"/>
         </w:rPr>
-        <w:t>Vượt qua hộp đen toán học lý tưởng; xây dựng hệ thống an toàn đa tầng; triệt tiêu kênh kề thời gian bằng hàm hằng số (hmac.compare_digest).</w:t>
+        <w:t>Mô hình cũ: Mật mã là hộp đen toán học, thời gian vô hình ↔ Halpin: Điểm mù vật lý (thời gian CPU, năng lượng, cache).</w:t>
       </w:r>
     </w:p>
     <w:p>
       <w:pPr>
-        <w:spacing w:before="20" w:after="40"/>
-        <w:ind w:left="504"/>
+        <w:spacing w:before="0" w:after="80"/>
+        <w:ind w:left="648"/>
       </w:pPr>
       <w:r>
         <w:rPr>
           <w:b/>
-          <w:color w:val="1E293B"/>
+          <w:color w:val="1E40AF"/>
+          <w:sz w:val="19"/>
+        </w:rPr>
+        <w:t xml:space="preserve">↳ Thuyết minh / Mở rộng: </w:t>
+      </w:r>
+      <w:r>
+        <w:rPr>
+          <w:i/>
+          <w:color w:val="475569"/>
+          <w:sz w:val="19"/>
+        </w:rPr>
+        <w:t>Phải xây dựng hệ thống phòng thủ đa tầng và dùng hàm thời gian hằng số hmac.compare_digest để triệt tiêu kênh kề.</w:t>
+      </w:r>
+    </w:p>
+    <w:p>
+      <w:pPr>
+        <w:spacing w:before="60" w:after="20"/>
+        <w:ind w:left="360"/>
+      </w:pPr>
+      <w:r>
+        <w:rPr>
+          <w:b/>
+          <w:color w:val="0F172A"/>
           <w:sz w:val="20"/>
         </w:rPr>
         <w:t xml:space="preserve">– 3. Đối thủ thế giới thực (Sec 6): </w:t>
@@ -2172,83 +2587,77 @@
           <w:color w:val="334155"/>
           <w:sz w:val="20"/>
         </w:rPr>
-        <w:t>Snowden chứng minh đối thủ thể chế (NSA) tấn công chuỗi cung ứng và cài cửa sau; cần nghiên cứu Cliptography và phân tách miền minh bạch (RFC 6962).</w:t>
+        <w:t>Mô hình cũ: Giới hạn đối thủ trong bài toán PPT ↔ Halpin: Đối thủ thể chế (NSA) cài cửa sau và khai thác siêu dữ liệu.</w:t>
       </w:r>
     </w:p>
     <w:p>
       <w:pPr>
-        <w:spacing w:before="20" w:after="40"/>
-        <w:ind w:left="504"/>
+        <w:spacing w:before="0" w:after="80"/>
+        <w:ind w:left="648"/>
       </w:pPr>
       <w:r>
         <w:rPr>
           <w:b/>
-          <w:color w:val="1E293B"/>
+          <w:color w:val="1E40AF"/>
+          <w:sz w:val="19"/>
+        </w:rPr>
+        <w:t xml:space="preserve">↳ Thuyết minh / Mở rộng: </w:t>
+      </w:r>
+      <w:r>
+        <w:rPr>
+          <w:i/>
+          <w:color w:val="475569"/>
+          <w:sz w:val="19"/>
+        </w:rPr>
+        <w:t>Mật mã học hiện đại phải nghiên cứu cơ chế chống cửa sau (Cliptography) và phân tách miền minh bạch RFC 6962.</w:t>
+      </w:r>
+    </w:p>
+    <w:p>
+      <w:pPr>
+        <w:spacing w:before="60" w:after="20"/>
+        <w:ind w:left="360"/>
+      </w:pPr>
+      <w:r>
+        <w:rPr>
+          <w:b/>
+          <w:color w:val="0F172A"/>
           <w:sz w:val="20"/>
         </w:rPr>
-        <w:t xml:space="preserve">– 4. Chương trình nghiên cứu tương lai (Sec 7): </w:t>
+        <w:t xml:space="preserve">– 4. Chương trình nghiên cứu mở (Sec 7): </w:t>
       </w:r>
       <w:r>
         <w:rPr>
           <w:color w:val="334155"/>
           <w:sz w:val="20"/>
         </w:rPr>
-        <w:t>Liên ngành hóa mật mã học: kết hợp toán học, thống kê lượng hóa đối thủ, hệ thống phức hợp và triết học nhận thức.</w:t>
+        <w:t>Mô hình cũ: Mật mã thuần túy là toán học rời rạc ↔ Halpin: Đề xuất 4 câu hỏi mở liên ngành hóa với thống kê và triết học.</w:t>
       </w:r>
     </w:p>
-    <w:tbl>
-      <w:tblPr>
-        <w:tblW w:type="auto" w:w="0"/>
-        <w:jc w:val="center"/>
-        <w:tblLook w:firstColumn="1" w:firstRow="1" w:lastColumn="0" w:lastRow="0" w:noHBand="0" w:noVBand="1" w:val="04A0"/>
-      </w:tblPr>
-      <w:tblGrid>
-        <w:gridCol w:w="9360"/>
-      </w:tblGrid>
-      <w:tr>
-        <w:tc>
-          <w:tcPr>
-            <w:tcW w:type="dxa" w:w="9360"/>
-            <w:shd w:val="clear" w:color="auto" w:fill="F1F5F9"/>
-          </w:tcPr>
-          <w:p>
-            <w:pPr>
-              <w:spacing w:before="80" w:after="80"/>
-              <w:ind w:left="144" w:right="144"/>
-            </w:pPr>
-            <w:r>
-              <w:rPr>
-                <w:b/>
-                <w:color w:val="1E40AF"/>
-                <w:sz w:val="20"/>
-              </w:rPr>
-              <w:t>💡 Hướng dẫn thuyết minh &amp; Giải thích dễ hiểu:</w:t>
-              <w:br/>
-            </w:r>
-            <w:r>
-              <w:rPr>
-                <w:color w:val="334155"/>
-                <w:sz w:val="19"/>
-              </w:rPr>
-              <w:t>Hướng dẫn thuyết minh Bảng tổng kết:</w:t>
-              <w:br/>
-              <w:t>Bảng này đúc kết 4 trụ cột cốt lõi của toàn văn bài báo Halpin:</w:t>
-              <w:br/>
-              <w:t>• Trụ cột 1: Đối thủ là tác nhân có chủ đích, không phải nhiễu ngẫu nhiên.</w:t>
-              <w:br/>
-              <w:t>• Trụ cột 2: Mật mã học trên giấy không bảo vệ được trước các đòn tấn công kênh kề vật lý.</w:t>
-              <w:br/>
-              <w:t>• Trụ cột 3: Đối thủ thể chế tấn công vào chuỗi cung ứng chứ không phá toán học.</w:t>
-              <w:br/>
-              <w:t>• Trụ cột 4: Mật mã học tương lai cần liên ngành với thống kê và triết học.</w:t>
-            </w:r>
-          </w:p>
-        </w:tc>
-      </w:tr>
-    </w:tbl>
     <w:p>
       <w:pPr>
-        <w:spacing w:before="80" w:after="200"/>
+        <w:spacing w:before="0" w:after="80"/>
+        <w:ind w:left="648"/>
+      </w:pPr>
+      <w:r>
+        <w:rPr>
+          <w:b/>
+          <w:color w:val="1E40AF"/>
+          <w:sz w:val="19"/>
+        </w:rPr>
+        <w:t xml:space="preserve">↳ Thuyết minh / Mở rộng: </w:t>
+      </w:r>
+      <w:r>
+        <w:rPr>
+          <w:i/>
+          <w:color w:val="475569"/>
+          <w:sz w:val="19"/>
+        </w:rPr>
+        <w:t>Kết hợp toán học với triết học nhận thức và dữ liệu thực nghiệm để xây dựng một khoa học an ninh hoàn chỉnh.</w:t>
+      </w:r>
+    </w:p>
+    <w:p>
+      <w:pPr>
+        <w:spacing w:before="60" w:after="200"/>
         <w:ind w:left="288"/>
       </w:pPr>
       <w:r>
@@ -2308,18 +2717,18 @@
           <w:color w:val="0F172A"/>
           <w:sz w:val="20"/>
         </w:rPr>
-        <w:t>Nội dung hiển thị trên Slide:</w:t>
+        <w:t>Nội dung Slide &amp; Kịch bản thuyết minh liền mạch:</w:t>
       </w:r>
     </w:p>
     <w:p>
       <w:pPr>
-        <w:spacing w:before="20" w:after="40"/>
-        <w:ind w:left="504"/>
+        <w:spacing w:before="60" w:after="20"/>
+        <w:ind w:left="360"/>
       </w:pPr>
       <w:r>
         <w:rPr>
           <w:b/>
-          <w:color w:val="1E293B"/>
+          <w:color w:val="0F172A"/>
           <w:sz w:val="20"/>
         </w:rPr>
         <w:t xml:space="preserve">– Thông điệp kết thúc: </w:t>
@@ -2334,13 +2743,35 @@
     </w:p>
     <w:p>
       <w:pPr>
-        <w:spacing w:before="20" w:after="40"/>
-        <w:ind w:left="504"/>
+        <w:spacing w:before="0" w:after="80"/>
+        <w:ind w:left="648"/>
       </w:pPr>
       <w:r>
         <w:rPr>
           <w:b/>
-          <w:color w:val="1E293B"/>
+          <w:color w:val="1E40AF"/>
+          <w:sz w:val="19"/>
+        </w:rPr>
+        <w:t xml:space="preserve">↳ Thuyết minh / Mở rộng: </w:t>
+      </w:r>
+      <w:r>
+        <w:rPr>
+          <w:i/>
+          <w:color w:val="475569"/>
+          <w:sz w:val="19"/>
+        </w:rPr>
+        <w:t>Em xin chân thành cảm ơn Thầy và các bạn đã lắng nghe. Em rất mong nhận được câu hỏi và ý kiến đóng góp của Thầy để hoàn thiện đề tài.</w:t>
+      </w:r>
+    </w:p>
+    <w:p>
+      <w:pPr>
+        <w:spacing w:before="60" w:after="20"/>
+        <w:ind w:left="360"/>
+      </w:pPr>
+      <w:r>
+        <w:rPr>
+          <w:b/>
+          <w:color w:val="0F172A"/>
           <w:sz w:val="20"/>
         </w:rPr>
         <w:t xml:space="preserve">– Thông tin đề tài: </w:t>
@@ -2353,51 +2784,31 @@
         <w:t>Đề tài DT005: Hệ thống kiểm tra toàn vẹn tệp bằng SHA-256, HMAC và cây Merkle phân cấp động | GVHD: ThS. Phạm Trọng Huynh | SVTH: Võ Anh Kiệt — MSSV: 1150080143.</w:t>
       </w:r>
     </w:p>
-    <w:tbl>
-      <w:tblPr>
-        <w:tblW w:type="auto" w:w="0"/>
-        <w:jc w:val="center"/>
-        <w:tblLook w:firstColumn="1" w:firstRow="1" w:lastColumn="0" w:lastRow="0" w:noHBand="0" w:noVBand="1" w:val="04A0"/>
-      </w:tblPr>
-      <w:tblGrid>
-        <w:gridCol w:w="9360"/>
-      </w:tblGrid>
-      <w:tr>
-        <w:tc>
-          <w:tcPr>
-            <w:tcW w:type="dxa" w:w="9360"/>
-            <w:shd w:val="clear" w:color="auto" w:fill="F1F5F9"/>
-          </w:tcPr>
-          <w:p>
-            <w:pPr>
-              <w:spacing w:before="80" w:after="80"/>
-              <w:ind w:left="144" w:right="144"/>
-            </w:pPr>
-            <w:r>
-              <w:rPr>
-                <w:b/>
-                <w:color w:val="1E40AF"/>
-                <w:sz w:val="20"/>
-              </w:rPr>
-              <w:t>💡 Hướng dẫn thuyết minh &amp; Giải thích dễ hiểu:</w:t>
-              <w:br/>
-            </w:r>
-            <w:r>
-              <w:rPr>
-                <w:color w:val="334155"/>
-                <w:sz w:val="19"/>
-              </w:rPr>
-              <w:t>Lời kết thúc:</w:t>
-              <w:br/>
-              <w:t>Cảm ơn Thầy và các bạn đã theo dõi. Nhóm xin lắng nghe ý kiến đóng góp và trả lời các câu hỏi phản biện.</w:t>
-            </w:r>
-          </w:p>
-        </w:tc>
-      </w:tr>
-    </w:tbl>
     <w:p>
       <w:pPr>
-        <w:spacing w:before="80" w:after="200"/>
+        <w:spacing w:before="0" w:after="80"/>
+        <w:ind w:left="648"/>
+      </w:pPr>
+      <w:r>
+        <w:rPr>
+          <w:b/>
+          <w:color w:val="1E40AF"/>
+          <w:sz w:val="19"/>
+        </w:rPr>
+        <w:t xml:space="preserve">↳ Thuyết minh / Mở rộng: </w:t>
+      </w:r>
+      <w:r>
+        <w:rPr>
+          <w:i/>
+          <w:color w:val="475569"/>
+          <w:sz w:val="19"/>
+        </w:rPr>
+        <w:t>Nhóm xin sẵn sàng bước vào phần trả lời phản biện.</w:t>
+      </w:r>
+    </w:p>
+    <w:p>
+      <w:pPr>
+        <w:spacing w:before="60" w:after="200"/>
         <w:ind w:left="288"/>
       </w:pPr>
       <w:r>

</xml_diff>

<commit_message>
Refine Word script with selective expansions and simplified labels
</commit_message>
<xml_diff>
--- a/Kich_Ban_Thuyet_Trinh_Va_Demo_DT005.docx
+++ b/Kich_Ban_Thuyet_Trinh_Va_Demo_DT005.docx
@@ -131,7 +131,7 @@
           <w:color w:val="0F172A"/>
           <w:sz w:val="20"/>
         </w:rPr>
-        <w:t>Nội dung Slide &amp; Kịch bản thuyết minh liền mạch:</w:t>
+        <w:t>Nội dung Slide &amp; Mở rộng:</w:t>
       </w:r>
     </w:p>
     <w:p>
@@ -157,28 +157,6 @@
     </w:p>
     <w:p>
       <w:pPr>
-        <w:spacing w:before="0" w:after="80"/>
-        <w:ind w:left="648"/>
-      </w:pPr>
-      <w:r>
-        <w:rPr>
-          <w:b/>
-          <w:color w:val="1E40AF"/>
-          <w:sz w:val="19"/>
-        </w:rPr>
-        <w:t xml:space="preserve">↳ Thuyết minh / Mở rộng: </w:t>
-      </w:r>
-      <w:r>
-        <w:rPr>
-          <w:i/>
-          <w:color w:val="475569"/>
-          <w:sz w:val="19"/>
-        </w:rPr>
-        <w:t>Kính thưa Thầy và các bạn, hôm nay nhóm xin báo cáo đồ án giữa kỳ với 2 phần trọng tâm: (1) Thẩm định học thuật bài báo của TS. Harry Halpin và (2) Diễn tập hệ thống kiểm tra toàn vẹn dữ liệu thực tế.</w:t>
-      </w:r>
-    </w:p>
-    <w:p>
-      <w:pPr>
         <w:spacing w:before="60" w:after="20"/>
         <w:ind w:left="360"/>
       </w:pPr>
@@ -200,28 +178,6 @@
     </w:p>
     <w:p>
       <w:pPr>
-        <w:spacing w:before="0" w:after="80"/>
-        <w:ind w:left="648"/>
-      </w:pPr>
-      <w:r>
-        <w:rPr>
-          <w:b/>
-          <w:color w:val="1E40AF"/>
-          <w:sz w:val="19"/>
-        </w:rPr>
-        <w:t xml:space="preserve">↳ Thuyết minh / Mở rộng: </w:t>
-      </w:r>
-      <w:r>
-        <w:rPr>
-          <w:i/>
-          <w:color w:val="475569"/>
-          <w:sz w:val="19"/>
-        </w:rPr>
-        <w:t>Đây là công trình khảo cứu nhận thức luận mới nhất về mô hình đối thủ trong mật mã học hiện đại.</w:t>
-      </w:r>
-    </w:p>
-    <w:p>
-      <w:pPr>
         <w:spacing w:before="60" w:after="20"/>
         <w:ind w:left="360"/>
       </w:pPr>
@@ -239,28 +195,6 @@
           <w:sz w:val="20"/>
         </w:rPr>
         <w:t>Học phần: An toàn và bảo mật hệ thống thông tin | GVHD: ThS. Phạm Trọng Huynh | SVTH: Võ Anh Kiệt — MSSV: 1150080143.</w:t>
-      </w:r>
-    </w:p>
-    <w:p>
-      <w:pPr>
-        <w:spacing w:before="0" w:after="80"/>
-        <w:ind w:left="648"/>
-      </w:pPr>
-      <w:r>
-        <w:rPr>
-          <w:b/>
-          <w:color w:val="1E40AF"/>
-          <w:sz w:val="19"/>
-        </w:rPr>
-        <w:t xml:space="preserve">↳ Thuyết minh / Mở rộng: </w:t>
-      </w:r>
-      <w:r>
-        <w:rPr>
-          <w:i/>
-          <w:color w:val="475569"/>
-          <w:sz w:val="19"/>
-        </w:rPr>
-        <w:t>Sau đây em xin phép được bắt đầu phần nội dung báo cáo.</w:t>
       </w:r>
     </w:p>
     <w:p>
@@ -325,7 +259,7 @@
           <w:color w:val="0F172A"/>
           <w:sz w:val="20"/>
         </w:rPr>
-        <w:t>Nội dung Slide &amp; Kịch bản thuyết minh liền mạch:</w:t>
+        <w:t>Nội dung Slide &amp; Mở rộng:</w:t>
       </w:r>
     </w:p>
     <w:p>
@@ -351,28 +285,6 @@
     </w:p>
     <w:p>
       <w:pPr>
-        <w:spacing w:before="0" w:after="80"/>
-        <w:ind w:left="648"/>
-      </w:pPr>
-      <w:r>
-        <w:rPr>
-          <w:b/>
-          <w:color w:val="1E40AF"/>
-          <w:sz w:val="19"/>
-        </w:rPr>
-        <w:t xml:space="preserve">↳ Thuyết minh / Mở rộng: </w:t>
-      </w:r>
-      <w:r>
-        <w:rPr>
-          <w:i/>
-          <w:color w:val="475569"/>
-          <w:sz w:val="19"/>
-        </w:rPr>
-        <w:t>Mật mã học không chỉ là mã hóa dữ liệu đơn thuần, mà cốt lõi là giải quyết bài toán giao tiếp an toàn trước các đối thủ luôn tìm cách nghe lén và can thiệp.</w:t>
-      </w:r>
-    </w:p>
-    <w:p>
-      <w:pPr>
         <w:spacing w:before="60" w:after="20"/>
         <w:ind w:left="360"/>
       </w:pPr>
@@ -394,7 +306,7 @@
     </w:p>
     <w:p>
       <w:pPr>
-        <w:spacing w:before="0" w:after="80"/>
+        <w:spacing w:before="0" w:after="60"/>
         <w:ind w:left="648"/>
       </w:pPr>
       <w:r>
@@ -403,7 +315,7 @@
           <w:color w:val="1E40AF"/>
           <w:sz w:val="19"/>
         </w:rPr>
-        <w:t xml:space="preserve">↳ Thuyết minh / Mở rộng: </w:t>
+        <w:t xml:space="preserve">↳ Mở rộng: </w:t>
       </w:r>
       <w:r>
         <w:rPr>
@@ -411,7 +323,7 @@
           <w:color w:val="475569"/>
           <w:sz w:val="19"/>
         </w:rPr>
-        <w:t>Triết học bàn luận rất sâu về thông tin, nhưng lại bỏ quên mật mã học — cái nôi thực sự của bảo mật thông tin. Halpin viết bài báo này để lấp đầy khoảng trống đó.</w:t>
+        <w:t>Halpin chỉ ra triết học nghiên cứu sâu lý thuyết thông tin nhưng bỏ quên mật mã học — nơi thực sự định hình an toàn trước đối thủ.</w:t>
       </w:r>
     </w:p>
     <w:p>
@@ -437,7 +349,7 @@
     </w:p>
     <w:p>
       <w:pPr>
-        <w:spacing w:before="0" w:after="80"/>
+        <w:spacing w:before="0" w:after="60"/>
         <w:ind w:left="648"/>
       </w:pPr>
       <w:r>
@@ -446,7 +358,7 @@
           <w:color w:val="1E40AF"/>
           <w:sz w:val="19"/>
         </w:rPr>
-        <w:t xml:space="preserve">↳ Thuyết minh / Mở rộng: </w:t>
+        <w:t xml:space="preserve">↳ Mở rộng: </w:t>
       </w:r>
       <w:r>
         <w:rPr>
@@ -454,7 +366,7 @@
           <w:color w:val="475569"/>
           <w:sz w:val="19"/>
         </w:rPr>
-        <w:t>Nếu chỉ coi an toàn là công thức toán học thì hệ thống sẽ gặp nguy hiểm, vì ngoài đời kẻ tấn công không cần giải toán mà tấn công vào thời gian xử lý, bộ nhớ đệm hay lỗi phần mềm.</w:t>
+        <w:t>Kẻ tấn công trong thực tế không giải toán mà nhắm vào thời gian xử lý CPU, bộ nhớ đệm Cache và môi trường vật lý.</w:t>
       </w:r>
     </w:p>
     <w:p>
@@ -476,28 +388,6 @@
           <w:sz w:val="20"/>
         </w:rPr>
         <w:t>Hệ thống hóa lịch sử các mô hình đối thủ; Phê phán giới hạn toán học hóa; Đề xuất 4 câu hỏi nghiên cứu mở kết hợp liên ngành.</w:t>
-      </w:r>
-    </w:p>
-    <w:p>
-      <w:pPr>
-        <w:spacing w:before="0" w:after="80"/>
-        <w:ind w:left="648"/>
-      </w:pPr>
-      <w:r>
-        <w:rPr>
-          <w:b/>
-          <w:color w:val="1E40AF"/>
-          <w:sz w:val="19"/>
-        </w:rPr>
-        <w:t xml:space="preserve">↳ Thuyết minh / Mở rộng: </w:t>
-      </w:r>
-      <w:r>
-        <w:rPr>
-          <w:i/>
-          <w:color w:val="475569"/>
-          <w:sz w:val="19"/>
-        </w:rPr>
-        <w:t>Halpin giúp chúng ta nhìn nhận đúng bản chất của đối thủ thực tế thay vì các giả định toán học lý tưởng.</w:t>
       </w:r>
     </w:p>
     <w:p>
@@ -562,7 +452,7 @@
           <w:color w:val="0F172A"/>
           <w:sz w:val="20"/>
         </w:rPr>
-        <w:t>Nội dung Slide &amp; Kịch bản thuyết minh liền mạch:</w:t>
+        <w:t>Nội dung Slide &amp; Mở rộng:</w:t>
       </w:r>
     </w:p>
     <w:p>
@@ -588,7 +478,7 @@
     </w:p>
     <w:p>
       <w:pPr>
-        <w:spacing w:before="0" w:after="80"/>
+        <w:spacing w:before="0" w:after="60"/>
         <w:ind w:left="648"/>
       </w:pPr>
       <w:r>
@@ -597,7 +487,7 @@
           <w:color w:val="1E40AF"/>
           <w:sz w:val="19"/>
         </w:rPr>
-        <w:t xml:space="preserve">↳ Thuyết minh / Mở rộng: </w:t>
+        <w:t xml:space="preserve">↳ Mở rộng: </w:t>
       </w:r>
       <w:r>
         <w:rPr>
@@ -605,7 +495,7 @@
           <w:color w:val="475569"/>
           <w:sz w:val="19"/>
         </w:rPr>
-        <w:t>Dữ liệu truyền đi vốn là dòng liên tục; để bảo vệ, hệ thống phải phân định rạch ròi đâu là Bản rõ (M), Bản mã (C) và Khóa (K).</w:t>
+        <w:t>Để bảo vệ dữ liệu, hệ thống phân định rõ ranh giới các đối tượng: Bản rõ (M), Bản mã (C) và Khóa bí mật (K).</w:t>
       </w:r>
     </w:p>
     <w:p>
@@ -631,7 +521,7 @@
     </w:p>
     <w:p>
       <w:pPr>
-        <w:spacing w:before="0" w:after="80"/>
+        <w:spacing w:before="0" w:after="60"/>
         <w:ind w:left="648"/>
       </w:pPr>
       <w:r>
@@ -640,7 +530,7 @@
           <w:color w:val="1E40AF"/>
           <w:sz w:val="19"/>
         </w:rPr>
-        <w:t xml:space="preserve">↳ Thuyết minh / Mở rộng: </w:t>
+        <w:t xml:space="preserve">↳ Mở rộng: </w:t>
       </w:r>
       <w:r>
         <w:rPr>
@@ -648,7 +538,7 @@
           <w:color w:val="475569"/>
           <w:sz w:val="19"/>
         </w:rPr>
-        <w:t>Thông tin tồn tại độc lập với người nhận (như tiếng sấm báo trời mưa). Hệ mật tốt là hệ mật biến bản mã thành chuỗi ngẫu nhiên, không để lộ bất kỳ thông tin gì về bản rõ gốc.</w:t>
+        <w:t>Thông tin tồn tại khách quan độc lập với người nhận; hệ mật tốt triệt tiêu dấu vết để bản mã trông như chuỗi ngẫu nhiên.</w:t>
       </w:r>
     </w:p>
     <w:p>
@@ -674,28 +564,6 @@
     </w:p>
     <w:p>
       <w:pPr>
-        <w:spacing w:before="0" w:after="80"/>
-        <w:ind w:left="648"/>
-      </w:pPr>
-      <w:r>
-        <w:rPr>
-          <w:b/>
-          <w:color w:val="1E40AF"/>
-          <w:sz w:val="19"/>
-        </w:rPr>
-        <w:t xml:space="preserve">↳ Thuyết minh / Mở rộng: </w:t>
-      </w:r>
-      <w:r>
-        <w:rPr>
-          <w:i/>
-          <w:color w:val="475569"/>
-          <w:sz w:val="19"/>
-        </w:rPr>
-        <w:t>Đây là điểm then chốt: Nhiễu ngẫu nhiên chỉ làm sai lệch bit vô tình, còn kẻ thù có chủ đích sẽ chủ động tính toán để đánh lừa hệ thống.</w:t>
-      </w:r>
-    </w:p>
-    <w:p>
-      <w:pPr>
         <w:spacing w:before="60" w:after="20"/>
         <w:ind w:left="360"/>
       </w:pPr>
@@ -717,7 +585,7 @@
     </w:p>
     <w:p>
       <w:pPr>
-        <w:spacing w:before="0" w:after="80"/>
+        <w:spacing w:before="0" w:after="60"/>
         <w:ind w:left="648"/>
       </w:pPr>
       <w:r>
@@ -726,7 +594,7 @@
           <w:color w:val="1E40AF"/>
           <w:sz w:val="19"/>
         </w:rPr>
-        <w:t xml:space="preserve">↳ Thuyết minh / Mở rộng: </w:t>
+        <w:t xml:space="preserve">↳ Mở rộng: </w:t>
       </w:r>
       <w:r>
         <w:rPr>
@@ -734,7 +602,7 @@
           <w:color w:val="475569"/>
           <w:sz w:val="19"/>
         </w:rPr>
-        <w:t>Tri thức chung là điều ai cũng biết và biết người khác cũng biết (như đèn đỏ dừng lại). Bí mật là tri thức chỉ lưu hành nội bộ, không thuộc về số đông.</w:t>
+        <w:t>Common Knowledge là tri thức ai cũng biết và biết người khác cùng biết; Bí mật là tri thức nội bộ được giới hạn quyền truy cập.</w:t>
       </w:r>
     </w:p>
     <w:p>
@@ -799,7 +667,7 @@
           <w:color w:val="0F172A"/>
           <w:sz w:val="20"/>
         </w:rPr>
-        <w:t>Nội dung Slide &amp; Kịch bản thuyết minh liền mạch:</w:t>
+        <w:t>Nội dung Slide &amp; Mở rộng:</w:t>
       </w:r>
     </w:p>
     <w:p>
@@ -825,7 +693,7 @@
     </w:p>
     <w:p>
       <w:pPr>
-        <w:spacing w:before="0" w:after="80"/>
+        <w:spacing w:before="0" w:after="60"/>
         <w:ind w:left="648"/>
       </w:pPr>
       <w:r>
@@ -834,7 +702,7 @@
           <w:color w:val="1E40AF"/>
           <w:sz w:val="19"/>
         </w:rPr>
-        <w:t xml:space="preserve">↳ Thuyết minh / Mở rộng: </w:t>
+        <w:t xml:space="preserve">↳ Mở rộng: </w:t>
       </w:r>
       <w:r>
         <w:rPr>
@@ -842,7 +710,7 @@
           <w:color w:val="475569"/>
           <w:sz w:val="19"/>
         </w:rPr>
-        <w:t>Shannon đặt nền móng toán học cho mật mã, chứng minh an toàn tuyệt đối là One-Time Pad, nhưng chỉ áp dụng trên giấy.</w:t>
+        <w:t>Shannon chứng minh One-Time Pad an toàn tuyệt đối nhưng bất khả thi vì khóa phải dài bằng bản rõ và không thể tái sử dụng.</w:t>
       </w:r>
     </w:p>
     <w:p>
@@ -868,28 +736,6 @@
     </w:p>
     <w:p>
       <w:pPr>
-        <w:spacing w:before="0" w:after="80"/>
-        <w:ind w:left="648"/>
-      </w:pPr>
-      <w:r>
-        <w:rPr>
-          <w:b/>
-          <w:color w:val="1E40AF"/>
-          <w:sz w:val="19"/>
-        </w:rPr>
-        <w:t xml:space="preserve">↳ Thuyết minh / Mở rộng: </w:t>
-      </w:r>
-      <w:r>
-        <w:rPr>
-          <w:i/>
-          <w:color w:val="475569"/>
-          <w:sz w:val="19"/>
-        </w:rPr>
-        <w:t>Bước ngoặt lịch sử giúp hai bên trao đổi thông tin bí mật mà không cần gửi khóa tận tay trước.</w:t>
-      </w:r>
-    </w:p>
-    <w:p>
-      <w:pPr>
         <w:spacing w:before="60" w:after="20"/>
         <w:ind w:left="360"/>
       </w:pPr>
@@ -911,7 +757,7 @@
     </w:p>
     <w:p>
       <w:pPr>
-        <w:spacing w:before="0" w:after="80"/>
+        <w:spacing w:before="0" w:after="60"/>
         <w:ind w:left="648"/>
       </w:pPr>
       <w:r>
@@ -920,7 +766,7 @@
           <w:color w:val="1E40AF"/>
           <w:sz w:val="19"/>
         </w:rPr>
-        <w:t xml:space="preserve">↳ Thuyết minh / Mở rộng: </w:t>
+        <w:t xml:space="preserve">↳ Mở rộng: </w:t>
       </w:r>
       <w:r>
         <w:rPr>
@@ -928,7 +774,7 @@
           <w:color w:val="475569"/>
           <w:sz w:val="19"/>
         </w:rPr>
-        <w:t>Thay vì an toàn tuyệt đối, khoa học chuyển sang an toàn tính toán: đối thủ có siêu máy tính cũng không thể giải được bài toán trong thời gian đa thức.</w:t>
+        <w:t>Chuyển từ an toàn tuyệt đối sang an toàn tính toán: đối thủ có tài nguyên giới hạn đa thức không thể giải bài toán trong thời gian thực tế.</w:t>
       </w:r>
     </w:p>
     <w:p>
@@ -954,28 +800,6 @@
     </w:p>
     <w:p>
       <w:pPr>
-        <w:spacing w:before="0" w:after="80"/>
-        <w:ind w:left="648"/>
-      </w:pPr>
-      <w:r>
-        <w:rPr>
-          <w:b/>
-          <w:color w:val="1E40AF"/>
-          <w:sz w:val="19"/>
-        </w:rPr>
-        <w:t xml:space="preserve">↳ Thuyết minh / Mở rộng: </w:t>
-      </w:r>
-      <w:r>
-        <w:rPr>
-          <w:i/>
-          <w:color w:val="475569"/>
-          <w:sz w:val="19"/>
-        </w:rPr>
-        <w:t>Mô hình hóa mạng thù địch và giả định hàm băm ngẫu nhiên lý tưởng để phục vụ các bài toán chứng minh an ninh.</w:t>
-      </w:r>
-    </w:p>
-    <w:p>
-      <w:pPr>
         <w:spacing w:before="60" w:after="20"/>
         <w:ind w:left="360"/>
       </w:pPr>
@@ -993,28 +817,6 @@
           <w:sz w:val="20"/>
         </w:rPr>
         <w:t>Snowden phơi bày năng lực thực tế của đối thủ thể chế: Kênh kề, cửa sau tiêu chuẩn, can thiệp chuỗi cung ứng và giám sát siêu dữ liệu.</w:t>
-      </w:r>
-    </w:p>
-    <w:p>
-      <w:pPr>
-        <w:spacing w:before="0" w:after="80"/>
-        <w:ind w:left="648"/>
-      </w:pPr>
-      <w:r>
-        <w:rPr>
-          <w:b/>
-          <w:color w:val="1E40AF"/>
-          <w:sz w:val="19"/>
-        </w:rPr>
-        <w:t xml:space="preserve">↳ Thuyết minh / Mở rộng: </w:t>
-      </w:r>
-      <w:r>
-        <w:rPr>
-          <w:i/>
-          <w:color w:val="475569"/>
-          <w:sz w:val="19"/>
-        </w:rPr>
-        <w:t>Buộc mật mã học hiện đại phải từ bỏ giả định kênh truyền sạch để bước vào kỷ nguyên an ninh thực tế.</w:t>
       </w:r>
     </w:p>
     <w:p>
@@ -1079,7 +881,7 @@
           <w:color w:val="0F172A"/>
           <w:sz w:val="20"/>
         </w:rPr>
-        <w:t>Nội dung Slide &amp; Kịch bản thuyết minh liền mạch:</w:t>
+        <w:t>Nội dung Slide &amp; Mở rộng:</w:t>
       </w:r>
     </w:p>
     <w:p>
@@ -1105,28 +907,6 @@
     </w:p>
     <w:p>
       <w:pPr>
-        <w:spacing w:before="0" w:after="80"/>
-        <w:ind w:left="648"/>
-      </w:pPr>
-      <w:r>
-        <w:rPr>
-          <w:b/>
-          <w:color w:val="1E40AF"/>
-          <w:sz w:val="19"/>
-        </w:rPr>
-        <w:t xml:space="preserve">↳ Thuyết minh / Mở rộng: </w:t>
-      </w:r>
-      <w:r>
-        <w:rPr>
-          <w:i/>
-          <w:color w:val="475569"/>
-          <w:sz w:val="19"/>
-        </w:rPr>
-        <w:t>Shannon giả định đường truyền điểm-điểm đơn giản, chỉ có kẻ nghe lén trên dây dẫn. Nhưng thực tế mạng không hề đóng kín như vậy.</w:t>
-      </w:r>
-    </w:p>
-    <w:p>
-      <w:pPr>
         <w:spacing w:before="60" w:after="20"/>
         <w:ind w:left="360"/>
       </w:pPr>
@@ -1148,7 +928,7 @@
     </w:p>
     <w:p>
       <w:pPr>
-        <w:spacing w:before="0" w:after="80"/>
+        <w:spacing w:before="0" w:after="60"/>
         <w:ind w:left="648"/>
       </w:pPr>
       <w:r>
@@ -1157,7 +937,7 @@
           <w:color w:val="1E40AF"/>
           <w:sz w:val="19"/>
         </w:rPr>
-        <w:t xml:space="preserve">↳ Thuyết minh / Mở rộng: </w:t>
+        <w:t xml:space="preserve">↳ Mở rộng: </w:t>
       </w:r>
       <w:r>
         <w:rPr>
@@ -1165,7 +945,7 @@
           <w:color w:val="475569"/>
           <w:sz w:val="19"/>
         </w:rPr>
-        <w:t>Đối thủ hiện đại không chỉ chặn nội dung mà còn thu thập Siêu dữ liệu (ai gửi cho ai, lúc nào, dung lượng bao nhiêu) để vẽ lại hành vi người dùng mà không cần giải mã.</w:t>
+        <w:t>Siêu dữ liệu (thời gian, địa chỉ IP, dung lượng) cho phép đối thủ theo dõi hành vi và mối quan hệ mà không cần bẻ khóa nội dung.</w:t>
       </w:r>
     </w:p>
     <w:p>
@@ -1230,7 +1010,7 @@
           <w:color w:val="0F172A"/>
           <w:sz w:val="20"/>
         </w:rPr>
-        <w:t>Nội dung Slide &amp; Kịch bản thuyết minh liền mạch:</w:t>
+        <w:t>Nội dung Slide &amp; Mở rộng:</w:t>
       </w:r>
     </w:p>
     <w:p>
@@ -1256,28 +1036,6 @@
     </w:p>
     <w:p>
       <w:pPr>
-        <w:spacing w:before="0" w:after="80"/>
-        <w:ind w:left="648"/>
-      </w:pPr>
-      <w:r>
-        <w:rPr>
-          <w:b/>
-          <w:color w:val="1E40AF"/>
-          <w:sz w:val="19"/>
-        </w:rPr>
-        <w:t xml:space="preserve">↳ Thuyết minh / Mở rộng: </w:t>
-      </w:r>
-      <w:r>
-        <w:rPr>
-          <w:i/>
-          <w:color w:val="475569"/>
-          <w:sz w:val="19"/>
-        </w:rPr>
-        <w:t>Đây là nền móng cho mật mã lý thuyết, giới hạn đối thủ trong năng lực tính toán hữu hạn.</w:t>
-      </w:r>
-    </w:p>
-    <w:p>
-      <w:pPr>
         <w:spacing w:before="60" w:after="20"/>
         <w:ind w:left="360"/>
       </w:pPr>
@@ -1299,7 +1057,7 @@
     </w:p>
     <w:p>
       <w:pPr>
-        <w:spacing w:before="0" w:after="80"/>
+        <w:spacing w:before="0" w:after="60"/>
         <w:ind w:left="648"/>
       </w:pPr>
       <w:r>
@@ -1308,7 +1066,7 @@
           <w:color w:val="1E40AF"/>
           <w:sz w:val="19"/>
         </w:rPr>
-        <w:t xml:space="preserve">↳ Thuyết minh / Mở rộng: </w:t>
+        <w:t xml:space="preserve">↳ Mở rộng: </w:t>
       </w:r>
       <w:r>
         <w:rPr>
@@ -1316,7 +1074,7 @@
           <w:color w:val="475569"/>
           <w:sz w:val="19"/>
         </w:rPr>
-        <w:t>Dolev-Yao cho đối thủ toàn quyền trên mạng, nhưng lại ngây thơ giả định mật mã là hộp đen hoàn hảo không bao giờ lộ khóa.</w:t>
+        <w:t>Điểm mù của Dolev-Yao là giả định mật mã là hộp đen hoàn hảo, bỏ qua các lỗ hổng rò rỉ vật lý khi thực thi thuật toán.</w:t>
       </w:r>
     </w:p>
     <w:p>
@@ -1342,7 +1100,7 @@
     </w:p>
     <w:p>
       <w:pPr>
-        <w:spacing w:before="0" w:after="80"/>
+        <w:spacing w:before="0" w:after="60"/>
         <w:ind w:left="648"/>
       </w:pPr>
       <w:r>
@@ -1351,7 +1109,7 @@
           <w:color w:val="1E40AF"/>
           <w:sz w:val="19"/>
         </w:rPr>
-        <w:t xml:space="preserve">↳ Thuyết minh / Mở rộng: </w:t>
+        <w:t xml:space="preserve">↳ Mở rộng: </w:t>
       </w:r>
       <w:r>
         <w:rPr>
@@ -1359,7 +1117,7 @@
           <w:color w:val="475569"/>
           <w:sz w:val="19"/>
         </w:rPr>
-        <w:t>SHA-256 ngoài đời chỉ là thuật toán xác định, không phải hộp đen ngẫu nhiên hoàn hảo, nên vẫn có thể bị khai thác qua các kênh rò rỉ vật lý.</w:t>
+        <w:t>SHA-256 là thuật toán xác định trên máy tính thực, không phải hàm ngẫu nhiên lý tưởng, nên vẫn chịu tác động từ môi trường thực thi.</w:t>
       </w:r>
     </w:p>
     <w:p>
@@ -1424,7 +1182,7 @@
           <w:color w:val="0F172A"/>
           <w:sz w:val="20"/>
         </w:rPr>
-        <w:t>Nội dung Slide &amp; Kịch bản thuyết minh liền mạch:</w:t>
+        <w:t>Nội dung Slide &amp; Mở rộng:</w:t>
       </w:r>
     </w:p>
     <w:p>
@@ -1450,28 +1208,6 @@
     </w:p>
     <w:p>
       <w:pPr>
-        <w:spacing w:before="0" w:after="80"/>
-        <w:ind w:left="648"/>
-      </w:pPr>
-      <w:r>
-        <w:rPr>
-          <w:b/>
-          <w:color w:val="1E40AF"/>
-          <w:sz w:val="19"/>
-        </w:rPr>
-        <w:t xml:space="preserve">↳ Thuyết minh / Mở rộng: </w:t>
-      </w:r>
-      <w:r>
-        <w:rPr>
-          <w:i/>
-          <w:color w:val="475569"/>
-          <w:sz w:val="19"/>
-        </w:rPr>
-        <w:t>Các nhà toán học coi hàm mật mã như hộp đen: đưa đầu vào thì có đầu ra, không quan tâm thiết bị chạy mất bao nhiêu micro giây.</w:t>
-      </w:r>
-    </w:p>
-    <w:p>
-      <w:pPr>
         <w:spacing w:before="60" w:after="20"/>
         <w:ind w:left="360"/>
       </w:pPr>
@@ -1493,28 +1229,6 @@
     </w:p>
     <w:p>
       <w:pPr>
-        <w:spacing w:before="0" w:after="80"/>
-        <w:ind w:left="648"/>
-      </w:pPr>
-      <w:r>
-        <w:rPr>
-          <w:b/>
-          <w:color w:val="1E40AF"/>
-          <w:sz w:val="19"/>
-        </w:rPr>
-        <w:t xml:space="preserve">↳ Thuyết minh / Mở rộng: </w:t>
-      </w:r>
-      <w:r>
-        <w:rPr>
-          <w:i/>
-          <w:color w:val="475569"/>
-          <w:sz w:val="19"/>
-        </w:rPr>
-        <w:t>Nhưng trong thế giới vật lý, máy tính chạy cần thời gian và tiêu thụ điện; các vi xử lý hiện đại còn có bộ nhớ đệm cache.</w:t>
-      </w:r>
-    </w:p>
-    <w:p>
-      <w:pPr>
         <w:spacing w:before="60" w:after="20"/>
         <w:ind w:left="360"/>
       </w:pPr>
@@ -1536,7 +1250,7 @@
     </w:p>
     <w:p>
       <w:pPr>
-        <w:spacing w:before="0" w:after="80"/>
+        <w:spacing w:before="0" w:after="60"/>
         <w:ind w:left="648"/>
       </w:pPr>
       <w:r>
@@ -1545,7 +1259,7 @@
           <w:color w:val="1E40AF"/>
           <w:sz w:val="19"/>
         </w:rPr>
-        <w:t xml:space="preserve">↳ Thuyết minh / Mở rộng: </w:t>
+        <w:t xml:space="preserve">↳ Mở rộng: </w:t>
       </w:r>
       <w:r>
         <w:rPr>
@@ -1553,7 +1267,7 @@
           <w:color w:val="475569"/>
           <w:sz w:val="19"/>
         </w:rPr>
-        <w:t>Kẻ tấn công đo thời gian CPU so sánh chuỗi: nếu sai ký tự đầu thì máy dừng sớm, nếu đúng thì máy chạy lâu hơn; qua đó dò ra khóa mà không cần phá thuật toán.</w:t>
+        <w:t>Kẻ tấn công đo sự chênh lệch micro-giây khi CPU so khớp dữ liệu để dò từng byte khóa bí mật.</w:t>
       </w:r>
     </w:p>
     <w:p>
@@ -1575,28 +1289,6 @@
           <w:sz w:val="20"/>
         </w:rPr>
         <w:t>Sự trừu tượng hóa quá mức làm mật mã học bỏ sót chính những năng lực thực tế của đối thủ ngoài đời thực.</w:t>
-      </w:r>
-    </w:p>
-    <w:p>
-      <w:pPr>
-        <w:spacing w:before="0" w:after="80"/>
-        <w:ind w:left="648"/>
-      </w:pPr>
-      <w:r>
-        <w:rPr>
-          <w:b/>
-          <w:color w:val="1E40AF"/>
-          <w:sz w:val="19"/>
-        </w:rPr>
-        <w:t xml:space="preserve">↳ Thuyết minh / Mở rộng: </w:t>
-      </w:r>
-      <w:r>
-        <w:rPr>
-          <w:i/>
-          <w:color w:val="475569"/>
-          <w:sz w:val="19"/>
-        </w:rPr>
-        <w:t>Lỗ hổng lớn nhất thường không nằm ở công thức toán, mà nằm ở môi trường vật lý triển khai thuật toán.</w:t>
       </w:r>
     </w:p>
     <w:p>
@@ -1661,7 +1353,7 @@
           <w:color w:val="0F172A"/>
           <w:sz w:val="20"/>
         </w:rPr>
-        <w:t>Nội dung Slide &amp; Kịch bản thuyết minh liền mạch:</w:t>
+        <w:t>Nội dung Slide &amp; Mở rộng:</w:t>
       </w:r>
     </w:p>
     <w:p>
@@ -1687,28 +1379,6 @@
     </w:p>
     <w:p>
       <w:pPr>
-        <w:spacing w:before="0" w:after="80"/>
-        <w:ind w:left="648"/>
-      </w:pPr>
-      <w:r>
-        <w:rPr>
-          <w:b/>
-          <w:color w:val="1E40AF"/>
-          <w:sz w:val="19"/>
-        </w:rPr>
-        <w:t xml:space="preserve">↳ Thuyết minh / Mở rộng: </w:t>
-      </w:r>
-      <w:r>
-        <w:rPr>
-          <w:i/>
-          <w:color w:val="475569"/>
-          <w:sz w:val="19"/>
-        </w:rPr>
-        <w:t>Snowden phơi bày sự thật: Không cơ quan tình báo nào tốn công bẻ khóa 256-bit, họ trích xuất cáp quang biển, ép công ty giao khóa hoặc cài cửa sau.</w:t>
-      </w:r>
-    </w:p>
-    <w:p>
-      <w:pPr>
         <w:spacing w:before="60" w:after="20"/>
         <w:ind w:left="360"/>
       </w:pPr>
@@ -1730,7 +1400,7 @@
     </w:p>
     <w:p>
       <w:pPr>
-        <w:spacing w:before="0" w:after="80"/>
+        <w:spacing w:before="0" w:after="60"/>
         <w:ind w:left="648"/>
       </w:pPr>
       <w:r>
@@ -1739,7 +1409,7 @@
           <w:color w:val="1E40AF"/>
           <w:sz w:val="19"/>
         </w:rPr>
-        <w:t xml:space="preserve">↳ Thuyết minh / Mở rộng: </w:t>
+        <w:t xml:space="preserve">↳ Mở rộng: </w:t>
       </w:r>
       <w:r>
         <w:rPr>
@@ -1747,7 +1417,7 @@
           <w:color w:val="475569"/>
           <w:sz w:val="19"/>
         </w:rPr>
-        <w:t>NSA tác động đưa thuật toán có khiếm khuyết vào tiêu chuẩn quốc tế NIST. Do giữ trước hằng số bí mật, NSA đọc được dữ liệu của bất kỳ ai dùng chuẩn này.</w:t>
+        <w:t>Vụ bê bối Dual_EC_DRBG cho thấy đối thủ thể chế có thể cài điểm yếu vào chuẩn quốc tế để bí mật giải mã lưu lượng toàn cầu.</w:t>
       </w:r>
     </w:p>
     <w:p>
@@ -1773,7 +1443,7 @@
     </w:p>
     <w:p>
       <w:pPr>
-        <w:spacing w:before="0" w:after="80"/>
+        <w:spacing w:before="0" w:after="60"/>
         <w:ind w:left="648"/>
       </w:pPr>
       <w:r>
@@ -1782,7 +1452,7 @@
           <w:color w:val="1E40AF"/>
           <w:sz w:val="19"/>
         </w:rPr>
-        <w:t xml:space="preserve">↳ Thuyết minh / Mở rộng: </w:t>
+        <w:t xml:space="preserve">↳ Mở rộng: </w:t>
       </w:r>
       <w:r>
         <w:rPr>
@@ -1790,7 +1460,7 @@
           <w:color w:val="475569"/>
           <w:sz w:val="19"/>
         </w:rPr>
-        <w:t>Đối với người dân NSA là kẻ nghe lén, nhưng với NSA thì Snowden là kẻ làm lộ bí mật. Mật mã học ngày nay phải nghiên cứu tự bảo vệ ngay cả khi phần mềm bị cài sẵn cửa sau.</w:t>
+        <w:t>Cliptography nghiên cứu thiết kế mật mã có khả năng tự bảo vệ ngay cả khi phần mềm bị đối thủ cài sẵn cửa sau.</w:t>
       </w:r>
     </w:p>
     <w:p>
@@ -1855,7 +1525,7 @@
           <w:color w:val="0F172A"/>
           <w:sz w:val="20"/>
         </w:rPr>
-        <w:t>Nội dung Slide &amp; Kịch bản thuyết minh liền mạch:</w:t>
+        <w:t>Nội dung Slide &amp; Mở rộng:</w:t>
       </w:r>
     </w:p>
     <w:p>
@@ -1881,28 +1551,6 @@
     </w:p>
     <w:p>
       <w:pPr>
-        <w:spacing w:before="0" w:after="80"/>
-        <w:ind w:left="648"/>
-      </w:pPr>
-      <w:r>
-        <w:rPr>
-          <w:b/>
-          <w:color w:val="1E40AF"/>
-          <w:sz w:val="19"/>
-        </w:rPr>
-        <w:t xml:space="preserve">↳ Thuyết minh / Mở rộng: </w:t>
-      </w:r>
-      <w:r>
-        <w:rPr>
-          <w:i/>
-          <w:color w:val="475569"/>
-          <w:sz w:val="19"/>
-        </w:rPr>
-        <w:t>Quan sát cách người thật giữ bí mật ngoài đời, thay vì giả định người dùng luôn tuân thủ chính sách hoàn hảo.</w:t>
-      </w:r>
-    </w:p>
-    <w:p>
-      <w:pPr>
         <w:spacing w:before="60" w:after="20"/>
         <w:ind w:left="360"/>
       </w:pPr>
@@ -1924,28 +1572,6 @@
     </w:p>
     <w:p>
       <w:pPr>
-        <w:spacing w:before="0" w:after="80"/>
-        <w:ind w:left="648"/>
-      </w:pPr>
-      <w:r>
-        <w:rPr>
-          <w:b/>
-          <w:color w:val="1E40AF"/>
-          <w:sz w:val="19"/>
-        </w:rPr>
-        <w:t xml:space="preserve">↳ Thuyết minh / Mở rộng: </w:t>
-      </w:r>
-      <w:r>
-        <w:rPr>
-          <w:i/>
-          <w:color w:val="475569"/>
-          <w:sz w:val="19"/>
-        </w:rPr>
-        <w:t>Dùng số liệu thống kê để biết đối thủ thực tế mạnh đến đâu, thay vì giả định mơ hồ.</w:t>
-      </w:r>
-    </w:p>
-    <w:p>
-      <w:pPr>
         <w:spacing w:before="60" w:after="20"/>
         <w:ind w:left="360"/>
       </w:pPr>
@@ -1967,7 +1593,7 @@
     </w:p>
     <w:p>
       <w:pPr>
-        <w:spacing w:before="0" w:after="80"/>
+        <w:spacing w:before="0" w:after="60"/>
         <w:ind w:left="648"/>
       </w:pPr>
       <w:r>
@@ -1976,7 +1602,7 @@
           <w:color w:val="1E40AF"/>
           <w:sz w:val="19"/>
         </w:rPr>
-        <w:t xml:space="preserve">↳ Thuyết minh / Mở rộng: </w:t>
+        <w:t xml:space="preserve">↳ Mở rộng: </w:t>
       </w:r>
       <w:r>
         <w:rPr>
@@ -1984,7 +1610,7 @@
           <w:color w:val="475569"/>
           <w:sz w:val="19"/>
         </w:rPr>
-        <w:t>Mượn mô hình dịch tễ học: thông tin rò rỉ giống như virus lây lan trong mạng lưới để tìm cách ngăn chặn.</w:t>
+        <w:t>Mô hình hóa sự rò rỉ thông tin tương tự quy luật lây lan dịch bệnh để dự báo và kiểm soát nguy cơ mất an toàn.</w:t>
       </w:r>
     </w:p>
     <w:p>
@@ -2006,28 +1632,6 @@
           <w:sz w:val="20"/>
         </w:rPr>
         <w:t>Xem xét lại các giả định nền tảng từ thời Shannon, điều chỉnh cho phù hợp với môi trường mạng hiện đại.</w:t>
-      </w:r>
-    </w:p>
-    <w:p>
-      <w:pPr>
-        <w:spacing w:before="0" w:after="80"/>
-        <w:ind w:left="648"/>
-      </w:pPr>
-      <w:r>
-        <w:rPr>
-          <w:b/>
-          <w:color w:val="1E40AF"/>
-          <w:sz w:val="19"/>
-        </w:rPr>
-        <w:t xml:space="preserve">↳ Thuyết minh / Mở rộng: </w:t>
-      </w:r>
-      <w:r>
-        <w:rPr>
-          <w:i/>
-          <w:color w:val="475569"/>
-          <w:sz w:val="19"/>
-        </w:rPr>
-        <w:t>Vận dụng triết học để xem xét lại các tiền đề cũ, thích ứng với kỷ nguyên giám sát kỹ thuật số.</w:t>
       </w:r>
     </w:p>
     <w:p>
@@ -2092,7 +1696,7 @@
           <w:color w:val="0F172A"/>
           <w:sz w:val="20"/>
         </w:rPr>
-        <w:t>Nội dung Slide &amp; Kịch bản thuyết minh liền mạch:</w:t>
+        <w:t>Nội dung Slide &amp; Mở rộng:</w:t>
       </w:r>
     </w:p>
     <w:p>
@@ -2106,19 +1710,19 @@
           <w:color w:val="0F172A"/>
           <w:sz w:val="20"/>
         </w:rPr>
-        <w:t xml:space="preserve">– 1. Tổng quan sơ đồ đối kháng 2 màn hình: </w:t>
+        <w:t xml:space="preserve">– Khối 1 (Trái) — Blue Team (Port 8080): </w:t>
       </w:r>
       <w:r>
         <w:rPr>
           <w:color w:val="334155"/>
           <w:sz w:val="20"/>
         </w:rPr>
-        <w:t>Mô hình tương tác thời gian thực giữa Blue Team (Port 8080) và Red Team (Port 8081).</w:t>
+        <w:t>Thiết lập mốc tin cậy sạch ban đầu H_0; tích hợp phân tách miền RFC 6962 (tiền tố 0x00 cho lá, 0x01 cho nhánh).</w:t>
       </w:r>
     </w:p>
     <w:p>
       <w:pPr>
-        <w:spacing w:before="0" w:after="80"/>
+        <w:spacing w:before="0" w:after="60"/>
         <w:ind w:left="648"/>
       </w:pPr>
       <w:r>
@@ -2127,7 +1731,7 @@
           <w:color w:val="1E40AF"/>
           <w:sz w:val="19"/>
         </w:rPr>
-        <w:t xml:space="preserve">↳ Thuyết minh / Mở rộng: </w:t>
+        <w:t xml:space="preserve">↳ Mở rộng: </w:t>
       </w:r>
       <w:r>
         <w:rPr>
@@ -2135,7 +1739,7 @@
           <w:color w:val="475569"/>
           <w:sz w:val="19"/>
         </w:rPr>
-        <w:t>Nhìn trực tiếp vào sơ đồ trên slide, đây là mô hình đối kháng 2 màn hình do nhóm tự xây dựng để kiểm chứng thực nghiệm các luận điểm của Halpin: bên trái là Blue Team phòng thủ, bên phải là Red Team tấn công, ở giữa là dữ liệu thực tế.</w:t>
+        <w:t>Phân tách miền 0x00/0x01 ngăn chặn triệt để tấn công nhầm lẫn cấu trúc cây Merkle (Node-Leaf Confusion).</w:t>
       </w:r>
     </w:p>
     <w:p>
@@ -2149,50 +1753,7 @@
           <w:color w:val="0F172A"/>
           <w:sz w:val="20"/>
         </w:rPr>
-        <w:t xml:space="preserve">– 2. Khối bên trái — Blue Team (Port 8080): </w:t>
-      </w:r>
-      <w:r>
-        <w:rPr>
-          <w:color w:val="334155"/>
-          <w:sz w:val="20"/>
-        </w:rPr>
-        <w:t>Thiết lập mốc tin cậy sạch ban đầu H_0; tích hợp phân tách miền RFC 6962 (0x00 cho lá, 0x01 cho nhánh).</w:t>
-      </w:r>
-    </w:p>
-    <w:p>
-      <w:pPr>
-        <w:spacing w:before="0" w:after="80"/>
-        <w:ind w:left="648"/>
-      </w:pPr>
-      <w:r>
-        <w:rPr>
-          <w:b/>
-          <w:color w:val="1E40AF"/>
-          <w:sz w:val="19"/>
-        </w:rPr>
-        <w:t xml:space="preserve">↳ Thuyết minh / Mở rộng: </w:t>
-      </w:r>
-      <w:r>
-        <w:rPr>
-          <w:i/>
-          <w:color w:val="475569"/>
-          <w:sz w:val="19"/>
-        </w:rPr>
-        <w:t>Ở góc bên trái là màn hình Blue Team đóng vai trò phòng thủ. Khi nạp thư mục, Blue Team tính toán mốc tin cậy sạch ban đầu. Để tránh nhầm lẫn cấu trúc cây Merkle mà Halpin cảnh báo tại Mục 5, hệ thống áp dụng chuẩn RFC 6962 gắn tiền tố 0x00 cho nút lá và 0x01 cho nút nhánh nội bộ.</w:t>
-      </w:r>
-    </w:p>
-    <w:p>
-      <w:pPr>
-        <w:spacing w:before="60" w:after="20"/>
-        <w:ind w:left="360"/>
-      </w:pPr>
-      <w:r>
-        <w:rPr>
-          <w:b/>
-          <w:color w:val="0F172A"/>
-          <w:sz w:val="20"/>
-        </w:rPr>
-        <w:t xml:space="preserve">– 3. Khối ở giữa — Dữ liệu thực nghiệm (kaggle_dataset): </w:t>
+        <w:t xml:space="preserve">– Khối 2 (Giữa) — Kho dữ liệu (kaggle_dataset): </w:t>
       </w:r>
       <w:r>
         <w:rPr>
@@ -2204,7 +1765,28 @@
     </w:p>
     <w:p>
       <w:pPr>
-        <w:spacing w:before="0" w:after="80"/>
+        <w:spacing w:before="60" w:after="20"/>
+        <w:ind w:left="360"/>
+      </w:pPr>
+      <w:r>
+        <w:rPr>
+          <w:b/>
+          <w:color w:val="0F172A"/>
+          <w:sz w:val="20"/>
+        </w:rPr>
+        <w:t xml:space="preserve">– Khối 3 (Phải) — Red Team (Port 8081): </w:t>
+      </w:r>
+      <w:r>
+        <w:rPr>
+          <w:color w:val="334155"/>
+          <w:sz w:val="20"/>
+        </w:rPr>
+        <w:t>Mô phỏng đối thủ chủ đích: Kịch bản 1 (Sửa tệp trực tiếp) và Kịch bản 2 (Bù 4 byte GF(2) qua mặt CRC32).</w:t>
+      </w:r>
+    </w:p>
+    <w:p>
+      <w:pPr>
+        <w:spacing w:before="0" w:after="60"/>
         <w:ind w:left="648"/>
       </w:pPr>
       <w:r>
@@ -2213,7 +1795,7 @@
           <w:color w:val="1E40AF"/>
           <w:sz w:val="19"/>
         </w:rPr>
-        <w:t xml:space="preserve">↳ Thuyết minh / Mở rộng: </w:t>
+        <w:t xml:space="preserve">↳ Mở rộng: </w:t>
       </w:r>
       <w:r>
         <w:rPr>
@@ -2221,7 +1803,7 @@
           <w:color w:val="475569"/>
           <w:sz w:val="19"/>
         </w:rPr>
-        <w:t>Ở vị trí trung tâm là kho dữ liệu kiểm thử gồm 2.485 tệp tin, đóng vai trò môi trường vật lý trên đĩa cứng để hai bên cùng tác động và đo tốc độ quét toàn vẹn.</w:t>
+        <w:t>Kịch bản 2 chứng minh đối thủ chủ đích dễ dàng đánh lừa mã tuyến tính CRC32, nhưng bất lực trước hàm băm phi tuyến SHA-256.</w:t>
       </w:r>
     </w:p>
     <w:p>
@@ -2235,79 +1817,14 @@
           <w:color w:val="0F172A"/>
           <w:sz w:val="20"/>
         </w:rPr>
-        <w:t xml:space="preserve">– 4. Khối bên phải — Động cơ Red Team (Port 8081): </w:t>
+        <w:t xml:space="preserve">– Khối 4 (Dưới) — Cơ chế hoàn nguyên an toàn: </w:t>
       </w:r>
       <w:r>
         <w:rPr>
           <w:color w:val="334155"/>
           <w:sz w:val="20"/>
         </w:rPr>
-        <w:t>Mô phỏng kẻ thù có chủ đích: Kịch bản 1 sửa tệp (Tamper) và Kịch bản 2 giải hệ GF(2) bù 4 byte qua mặt CRC32.</w:t>
-      </w:r>
-    </w:p>
-    <w:p>
-      <w:pPr>
-        <w:spacing w:before="0" w:after="80"/>
-        <w:ind w:left="648"/>
-      </w:pPr>
-      <w:r>
-        <w:rPr>
-          <w:b/>
-          <w:color w:val="1E40AF"/>
-          <w:sz w:val="19"/>
-        </w:rPr>
-        <w:t xml:space="preserve">↳ Thuyết minh / Mở rộng: </w:t>
-      </w:r>
-      <w:r>
-        <w:rPr>
-          <w:i/>
-          <w:color w:val="475569"/>
-          <w:sz w:val="19"/>
-        </w:rPr>
-        <w:t>Ở góc bên phải là màn hình Red Team với 2 kịch bản: sửa nội dung tệp trực tiếp khiến Blue Team đổi cảnh báo đỏ ngay lập tức; hoặc giải hệ phương trình tuyến tính GF(2) bù 4 byte để đánh lừa mã CRC32. Nhưng hàm băm SHA-256 phi tuyến ở Blue Team vẫn phát hiện ra ngay.</w:t>
-      </w:r>
-    </w:p>
-    <w:p>
-      <w:pPr>
-        <w:spacing w:before="60" w:after="20"/>
-        <w:ind w:left="360"/>
-      </w:pPr>
-      <w:r>
-        <w:rPr>
-          <w:b/>
-          <w:color w:val="0F172A"/>
-          <w:sz w:val="20"/>
-        </w:rPr>
-        <w:t xml:space="preserve">– 5. Khối dưới cùng — Cơ chế hoàn nguyên an toàn: </w:t>
-      </w:r>
-      <w:r>
-        <w:rPr>
-          <w:color w:val="334155"/>
-          <w:sz w:val="20"/>
-        </w:rPr>
-        <w:t>Thư mục sao lưu an toàn .adversary_backups/ và nút Rollback All.</w:t>
-      </w:r>
-    </w:p>
-    <w:p>
-      <w:pPr>
-        <w:spacing w:before="0" w:after="80"/>
-        <w:ind w:left="648"/>
-      </w:pPr>
-      <w:r>
-        <w:rPr>
-          <w:b/>
-          <w:color w:val="1E40AF"/>
-          <w:sz w:val="19"/>
-        </w:rPr>
-        <w:t xml:space="preserve">↳ Thuyết minh / Mở rộng: </w:t>
-      </w:r>
-      <w:r>
-        <w:rPr>
-          <w:i/>
-          <w:color w:val="475569"/>
-          <w:sz w:val="19"/>
-        </w:rPr>
-        <w:t>Cuối cùng, nút Rollback All giúp hoàn nguyên toàn bộ tệp về trạng thái sạch ban đầu sau khi diễn tập, đảm bảo an toàn tuyệt đối cho đĩa cứng.</w:t>
+        <w:t>Thư mục sao lưu an toàn .adversary_backups/ và nút Rollback All phục hồi nguyên trạng sau diễn tập.</w:t>
       </w:r>
     </w:p>
     <w:p>
@@ -2372,7 +1889,7 @@
           <w:color w:val="0F172A"/>
           <w:sz w:val="20"/>
         </w:rPr>
-        <w:t>Nội dung Slide &amp; Kịch bản thuyết minh liền mạch:</w:t>
+        <w:t>Nội dung Slide &amp; Mở rộng:</w:t>
       </w:r>
     </w:p>
     <w:p>
@@ -2386,36 +1903,14 @@
           <w:color w:val="0F172A"/>
           <w:sz w:val="20"/>
         </w:rPr>
-        <w:t xml:space="preserve">– Văn bản trung tâm: </w:t>
+        <w:t xml:space="preserve">– Giao diện chuyển tiếp: </w:t>
       </w:r>
       <w:r>
         <w:rPr>
           <w:color w:val="334155"/>
           <w:sz w:val="20"/>
         </w:rPr>
-        <w:t>DEMO (Slide chuyển tiếp tối giản nền sáng, tạo nhịp nghỉ trước phần thực hành).</w:t>
-      </w:r>
-    </w:p>
-    <w:p>
-      <w:pPr>
-        <w:spacing w:before="0" w:after="80"/>
-        <w:ind w:left="648"/>
-      </w:pPr>
-      <w:r>
-        <w:rPr>
-          <w:b/>
-          <w:color w:val="1E40AF"/>
-          <w:sz w:val="19"/>
-        </w:rPr>
-        <w:t xml:space="preserve">↳ Thuyết minh / Mở rộng: </w:t>
-      </w:r>
-      <w:r>
-        <w:rPr>
-          <w:i/>
-          <w:color w:val="475569"/>
-          <w:sz w:val="19"/>
-        </w:rPr>
-        <w:t>Ngay sau đây, nhóm xin chuyển sang màn hình Demo thực tế để thao tác trực tiếp 2 kịch bản đối kháng vừa nêu trên sơ đồ.</w:t>
+        <w:t>DEMO — Chuyển sang màn hình thực nghiệm diễn tập đối kháng giữa Blue Team và Red Team.</w:t>
       </w:r>
     </w:p>
     <w:p>
@@ -2480,7 +1975,7 @@
           <w:color w:val="0F172A"/>
           <w:sz w:val="20"/>
         </w:rPr>
-        <w:t>Nội dung Slide &amp; Kịch bản thuyết minh liền mạch:</w:t>
+        <w:t>Nội dung Slide &amp; Mở rộng:</w:t>
       </w:r>
     </w:p>
     <w:p>
@@ -2501,12 +1996,12 @@
           <w:color w:val="334155"/>
           <w:sz w:val="20"/>
         </w:rPr>
-        <w:t>Mô hình cũ: Thông tin là xác suất, kênh chỉ có nhiễu ngẫu nhiên ↔ Halpin: Thông tin có ngữ nghĩa khách quan (Dretske), đối thủ có chủ đích.</w:t>
+        <w:t>Mô hình cũ: Thông tin xác suất, nhiễu ngẫu nhiên ↔ Halpin: Thông tin ngữ nghĩa khách quan (Dretske), đối thủ có chủ đích.</w:t>
       </w:r>
     </w:p>
     <w:p>
       <w:pPr>
-        <w:spacing w:before="0" w:after="80"/>
+        <w:spacing w:before="0" w:after="60"/>
         <w:ind w:left="648"/>
       </w:pPr>
       <w:r>
@@ -2515,7 +2010,7 @@
           <w:color w:val="1E40AF"/>
           <w:sz w:val="19"/>
         </w:rPr>
-        <w:t xml:space="preserve">↳ Thuyết minh / Mở rộng: </w:t>
+        <w:t xml:space="preserve">↳ Mở rộng: </w:t>
       </w:r>
       <w:r>
         <w:rPr>
@@ -2523,7 +2018,7 @@
           <w:color w:val="475569"/>
           <w:sz w:val="19"/>
         </w:rPr>
-        <w:t>Vì đối thủ có chủ đích nên mã tuyến tính CRC32 bất lực, an ninh đối kháng bắt buộc phải dùng hàm băm phi tuyến SHA-256.</w:t>
+        <w:t>Đối thủ có chủ đích buộc hệ thống phải dùng hàm băm phi tuyến SHA-256 thay vì mã tuyến tính CRC32.</w:t>
       </w:r>
     </w:p>
     <w:p>
@@ -2544,12 +2039,12 @@
           <w:color w:val="334155"/>
           <w:sz w:val="20"/>
         </w:rPr>
-        <w:t>Mô hình cũ: Mật mã là hộp đen toán học, thời gian vô hình ↔ Halpin: Điểm mù vật lý (thời gian CPU, năng lượng, cache).</w:t>
+        <w:t>Mô hình cũ: Mật mã là hộp đen toán học, thời gian vô hình ↔ Halpin: Điểm mù vật lý (thời gian CPU, bộ nhớ đệm Cache).</w:t>
       </w:r>
     </w:p>
     <w:p>
       <w:pPr>
-        <w:spacing w:before="0" w:after="80"/>
+        <w:spacing w:before="0" w:after="60"/>
         <w:ind w:left="648"/>
       </w:pPr>
       <w:r>
@@ -2558,7 +2053,7 @@
           <w:color w:val="1E40AF"/>
           <w:sz w:val="19"/>
         </w:rPr>
-        <w:t xml:space="preserve">↳ Thuyết minh / Mở rộng: </w:t>
+        <w:t xml:space="preserve">↳ Mở rộng: </w:t>
       </w:r>
       <w:r>
         <w:rPr>
@@ -2566,7 +2061,7 @@
           <w:color w:val="475569"/>
           <w:sz w:val="19"/>
         </w:rPr>
-        <w:t>Phải xây dựng hệ thống phòng thủ đa tầng và dùng hàm thời gian hằng số hmac.compare_digest để triệt tiêu kênh kề.</w:t>
+        <w:t>Phòng thủ đòi hỏi so khớp thời gian hằng số (hmac.compare_digest) để triệt tiêu rò rỉ kênh kề.</w:t>
       </w:r>
     </w:p>
     <w:p>
@@ -2592,28 +2087,6 @@
     </w:p>
     <w:p>
       <w:pPr>
-        <w:spacing w:before="0" w:after="80"/>
-        <w:ind w:left="648"/>
-      </w:pPr>
-      <w:r>
-        <w:rPr>
-          <w:b/>
-          <w:color w:val="1E40AF"/>
-          <w:sz w:val="19"/>
-        </w:rPr>
-        <w:t xml:space="preserve">↳ Thuyết minh / Mở rộng: </w:t>
-      </w:r>
-      <w:r>
-        <w:rPr>
-          <w:i/>
-          <w:color w:val="475569"/>
-          <w:sz w:val="19"/>
-        </w:rPr>
-        <w:t>Mật mã học hiện đại phải nghiên cứu cơ chế chống cửa sau (Cliptography) và phân tách miền minh bạch RFC 6962.</w:t>
-      </w:r>
-    </w:p>
-    <w:p>
-      <w:pPr>
         <w:spacing w:before="60" w:after="20"/>
         <w:ind w:left="360"/>
       </w:pPr>
@@ -2630,29 +2103,7 @@
           <w:color w:val="334155"/>
           <w:sz w:val="20"/>
         </w:rPr>
-        <w:t>Mô hình cũ: Mật mã thuần túy là toán học rời rạc ↔ Halpin: Đề xuất 4 câu hỏi mở liên ngành hóa với thống kê và triết học.</w:t>
-      </w:r>
-    </w:p>
-    <w:p>
-      <w:pPr>
-        <w:spacing w:before="0" w:after="80"/>
-        <w:ind w:left="648"/>
-      </w:pPr>
-      <w:r>
-        <w:rPr>
-          <w:b/>
-          <w:color w:val="1E40AF"/>
-          <w:sz w:val="19"/>
-        </w:rPr>
-        <w:t xml:space="preserve">↳ Thuyết minh / Mở rộng: </w:t>
-      </w:r>
-      <w:r>
-        <w:rPr>
-          <w:i/>
-          <w:color w:val="475569"/>
-          <w:sz w:val="19"/>
-        </w:rPr>
-        <w:t>Kết hợp toán học với triết học nhận thức và dữ liệu thực nghiệm để xây dựng một khoa học an ninh hoàn chỉnh.</w:t>
+        <w:t>Mô hình cũ: Mật mã thuần túy toán học rời rạc ↔ Halpin: 4 câu hỏi mở kết hợp liên ngành với thống kê và triết học.</w:t>
       </w:r>
     </w:p>
     <w:p>
@@ -2717,7 +2168,7 @@
           <w:color w:val="0F172A"/>
           <w:sz w:val="20"/>
         </w:rPr>
-        <w:t>Nội dung Slide &amp; Kịch bản thuyết minh liền mạch:</w:t>
+        <w:t>Nội dung Slide &amp; Mở rộng:</w:t>
       </w:r>
     </w:p>
     <w:p>
@@ -2738,29 +2189,7 @@
           <w:color w:val="334155"/>
           <w:sz w:val="20"/>
         </w:rPr>
-        <w:t>Q &amp; A — Xin đón nhận câu hỏi và góp ý từ Thầy và Hội đồng.</w:t>
-      </w:r>
-    </w:p>
-    <w:p>
-      <w:pPr>
-        <w:spacing w:before="0" w:after="80"/>
-        <w:ind w:left="648"/>
-      </w:pPr>
-      <w:r>
-        <w:rPr>
-          <w:b/>
-          <w:color w:val="1E40AF"/>
-          <w:sz w:val="19"/>
-        </w:rPr>
-        <w:t xml:space="preserve">↳ Thuyết minh / Mở rộng: </w:t>
-      </w:r>
-      <w:r>
-        <w:rPr>
-          <w:i/>
-          <w:color w:val="475569"/>
-          <w:sz w:val="19"/>
-        </w:rPr>
-        <w:t>Em xin chân thành cảm ơn Thầy và các bạn đã lắng nghe. Em rất mong nhận được câu hỏi và ý kiến đóng góp của Thầy để hoàn thiện đề tài.</w:t>
+        <w:t>Q &amp; A — Lắng nghe câu hỏi và đóng góp ý kiến hoàn thiện đề tài.</w:t>
       </w:r>
     </w:p>
     <w:p>
@@ -2782,28 +2211,6 @@
           <w:sz w:val="20"/>
         </w:rPr>
         <w:t>Đề tài DT005: Hệ thống kiểm tra toàn vẹn tệp bằng SHA-256, HMAC và cây Merkle phân cấp động | GVHD: ThS. Phạm Trọng Huynh | SVTH: Võ Anh Kiệt — MSSV: 1150080143.</w:t>
-      </w:r>
-    </w:p>
-    <w:p>
-      <w:pPr>
-        <w:spacing w:before="0" w:after="80"/>
-        <w:ind w:left="648"/>
-      </w:pPr>
-      <w:r>
-        <w:rPr>
-          <w:b/>
-          <w:color w:val="1E40AF"/>
-          <w:sz w:val="19"/>
-        </w:rPr>
-        <w:t xml:space="preserve">↳ Thuyết minh / Mở rộng: </w:t>
-      </w:r>
-      <w:r>
-        <w:rPr>
-          <w:i/>
-          <w:color w:val="475569"/>
-          <w:sz w:val="19"/>
-        </w:rPr>
-        <w:t>Nhóm xin sẵn sàng bước vào phần trả lời phản biện.</w:t>
       </w:r>
     </w:p>
     <w:p>

</xml_diff>